<commit_message>
Adding search notes & add Jest notes with code
</commit_message>
<xml_diff>
--- a/Search-Topics-01.docx
+++ b/Search-Topics-01.docx
@@ -28,7 +28,7 @@
             <w:pPr>
               <w:jc w:val="center"/>
               <w:rPr>
-                <w:rFonts w:ascii="Sakkal Majalla" w:hAnsi="Sakkal Majalla" w:cs="Sakkal Majalla" w:hint="cs"/>
+                <w:rFonts w:ascii="Sakkal Majalla" w:hAnsi="Sakkal Majalla" w:cs="Sakkal Majalla"/>
               </w:rPr>
             </w:pPr>
             <w:r>
@@ -48,7 +48,7 @@
               <w:jc w:val="center"/>
               <w:cnfStyle w:val="100000000000" w:firstRow="1" w:lastRow="0" w:firstColumn="0" w:lastColumn="0" w:oddVBand="0" w:evenVBand="0" w:oddHBand="0" w:evenHBand="0" w:firstRowFirstColumn="0" w:firstRowLastColumn="0" w:lastRowFirstColumn="0" w:lastRowLastColumn="0"/>
               <w:rPr>
-                <w:rFonts w:ascii="Sakkal Majalla" w:hAnsi="Sakkal Majalla" w:cs="Sakkal Majalla" w:hint="cs"/>
+                <w:rFonts w:ascii="Sakkal Majalla" w:hAnsi="Sakkal Majalla" w:cs="Sakkal Majalla"/>
               </w:rPr>
             </w:pPr>
             <w:r>
@@ -68,7 +68,7 @@
               <w:jc w:val="center"/>
               <w:cnfStyle w:val="100000000000" w:firstRow="1" w:lastRow="0" w:firstColumn="0" w:lastColumn="0" w:oddVBand="0" w:evenVBand="0" w:oddHBand="0" w:evenHBand="0" w:firstRowFirstColumn="0" w:firstRowLastColumn="0" w:lastRowFirstColumn="0" w:lastRowLastColumn="0"/>
               <w:rPr>
-                <w:rFonts w:ascii="Sakkal Majalla" w:hAnsi="Sakkal Majalla" w:cs="Sakkal Majalla" w:hint="cs"/>
+                <w:rFonts w:ascii="Sakkal Majalla" w:hAnsi="Sakkal Majalla" w:cs="Sakkal Majalla"/>
               </w:rPr>
             </w:pPr>
             <w:r>
@@ -88,7 +88,7 @@
               <w:jc w:val="center"/>
               <w:cnfStyle w:val="100000000000" w:firstRow="1" w:lastRow="0" w:firstColumn="0" w:lastColumn="0" w:oddVBand="0" w:evenVBand="0" w:oddHBand="0" w:evenHBand="0" w:firstRowFirstColumn="0" w:firstRowLastColumn="0" w:lastRowFirstColumn="0" w:lastRowLastColumn="0"/>
               <w:rPr>
-                <w:rFonts w:ascii="Sakkal Majalla" w:hAnsi="Sakkal Majalla" w:cs="Sakkal Majalla" w:hint="cs"/>
+                <w:rFonts w:ascii="Sakkal Majalla" w:hAnsi="Sakkal Majalla" w:cs="Sakkal Majalla"/>
               </w:rPr>
             </w:pPr>
             <w:r>
@@ -113,7 +113,7 @@
             <w:pPr>
               <w:jc w:val="center"/>
               <w:rPr>
-                <w:rFonts w:ascii="Sakkal Majalla" w:hAnsi="Sakkal Majalla" w:cs="Sakkal Majalla" w:hint="cs"/>
+                <w:rFonts w:ascii="Sakkal Majalla" w:hAnsi="Sakkal Majalla" w:cs="Sakkal Majalla"/>
               </w:rPr>
             </w:pPr>
             <w:r>
@@ -132,7 +132,7 @@
             <w:pPr>
               <w:cnfStyle w:val="000000100000" w:firstRow="0" w:lastRow="0" w:firstColumn="0" w:lastColumn="0" w:oddVBand="0" w:evenVBand="0" w:oddHBand="1" w:evenHBand="0" w:firstRowFirstColumn="0" w:firstRowLastColumn="0" w:lastRowFirstColumn="0" w:lastRowLastColumn="0"/>
               <w:rPr>
-                <w:rFonts w:ascii="Sakkal Majalla" w:hAnsi="Sakkal Majalla" w:cs="Sakkal Majalla" w:hint="cs"/>
+                <w:rFonts w:ascii="Sakkal Majalla" w:hAnsi="Sakkal Majalla" w:cs="Sakkal Majalla"/>
               </w:rPr>
             </w:pPr>
             <w:r>
@@ -176,7 +176,7 @@
               <w:jc w:val="center"/>
               <w:cnfStyle w:val="000000100000" w:firstRow="0" w:lastRow="0" w:firstColumn="0" w:lastColumn="0" w:oddVBand="0" w:evenVBand="0" w:oddHBand="1" w:evenHBand="0" w:firstRowFirstColumn="0" w:firstRowLastColumn="0" w:lastRowFirstColumn="0" w:lastRowLastColumn="0"/>
               <w:rPr>
-                <w:rFonts w:ascii="Sakkal Majalla" w:hAnsi="Sakkal Majalla" w:cs="Sakkal Majalla" w:hint="cs"/>
+                <w:rFonts w:ascii="Sakkal Majalla" w:hAnsi="Sakkal Majalla" w:cs="Sakkal Majalla"/>
               </w:rPr>
             </w:pPr>
             <w:r>
@@ -195,7 +195,7 @@
             <w:pPr>
               <w:cnfStyle w:val="000000100000" w:firstRow="0" w:lastRow="0" w:firstColumn="0" w:lastColumn="0" w:oddVBand="0" w:evenVBand="0" w:oddHBand="1" w:evenHBand="0" w:firstRowFirstColumn="0" w:firstRowLastColumn="0" w:lastRowFirstColumn="0" w:lastRowLastColumn="0"/>
               <w:rPr>
-                <w:rFonts w:ascii="Sakkal Majalla" w:hAnsi="Sakkal Majalla" w:cs="Sakkal Majalla" w:hint="cs"/>
+                <w:rFonts w:ascii="Sakkal Majalla" w:hAnsi="Sakkal Majalla" w:cs="Sakkal Majalla"/>
               </w:rPr>
             </w:pPr>
           </w:p>
@@ -211,7 +211,7 @@
             <w:pPr>
               <w:jc w:val="center"/>
               <w:rPr>
-                <w:rFonts w:ascii="Sakkal Majalla" w:hAnsi="Sakkal Majalla" w:cs="Sakkal Majalla" w:hint="cs"/>
+                <w:rFonts w:ascii="Sakkal Majalla" w:hAnsi="Sakkal Majalla" w:cs="Sakkal Majalla"/>
               </w:rPr>
             </w:pPr>
             <w:r>
@@ -230,7 +230,7 @@
             <w:pPr>
               <w:cnfStyle w:val="000000000000" w:firstRow="0" w:lastRow="0" w:firstColumn="0" w:lastColumn="0" w:oddVBand="0" w:evenVBand="0" w:oddHBand="0" w:evenHBand="0" w:firstRowFirstColumn="0" w:firstRowLastColumn="0" w:lastRowFirstColumn="0" w:lastRowLastColumn="0"/>
               <w:rPr>
-                <w:rFonts w:ascii="Sakkal Majalla" w:hAnsi="Sakkal Majalla" w:cs="Sakkal Majalla" w:hint="cs"/>
+                <w:rFonts w:ascii="Sakkal Majalla" w:hAnsi="Sakkal Majalla" w:cs="Sakkal Majalla"/>
               </w:rPr>
             </w:pPr>
             <w:r>
@@ -292,7 +292,7 @@
               <w:jc w:val="center"/>
               <w:cnfStyle w:val="000000000000" w:firstRow="0" w:lastRow="0" w:firstColumn="0" w:lastColumn="0" w:oddVBand="0" w:evenVBand="0" w:oddHBand="0" w:evenHBand="0" w:firstRowFirstColumn="0" w:firstRowLastColumn="0" w:lastRowFirstColumn="0" w:lastRowLastColumn="0"/>
               <w:rPr>
-                <w:rFonts w:ascii="Sakkal Majalla" w:hAnsi="Sakkal Majalla" w:cs="Sakkal Majalla" w:hint="cs"/>
+                <w:rFonts w:ascii="Sakkal Majalla" w:hAnsi="Sakkal Majalla" w:cs="Sakkal Majalla"/>
               </w:rPr>
             </w:pPr>
             <w:r>
@@ -311,7 +311,7 @@
             <w:pPr>
               <w:cnfStyle w:val="000000000000" w:firstRow="0" w:lastRow="0" w:firstColumn="0" w:lastColumn="0" w:oddVBand="0" w:evenVBand="0" w:oddHBand="0" w:evenHBand="0" w:firstRowFirstColumn="0" w:firstRowLastColumn="0" w:lastRowFirstColumn="0" w:lastRowLastColumn="0"/>
               <w:rPr>
-                <w:rFonts w:ascii="Sakkal Majalla" w:hAnsi="Sakkal Majalla" w:cs="Sakkal Majalla" w:hint="cs"/>
+                <w:rFonts w:ascii="Sakkal Majalla" w:hAnsi="Sakkal Majalla" w:cs="Sakkal Majalla"/>
               </w:rPr>
             </w:pPr>
           </w:p>
@@ -330,7 +330,7 @@
             <w:pPr>
               <w:jc w:val="center"/>
               <w:rPr>
-                <w:rFonts w:ascii="Sakkal Majalla" w:hAnsi="Sakkal Majalla" w:cs="Sakkal Majalla" w:hint="cs"/>
+                <w:rFonts w:ascii="Sakkal Majalla" w:hAnsi="Sakkal Majalla" w:cs="Sakkal Majalla"/>
               </w:rPr>
             </w:pPr>
             <w:r>
@@ -349,7 +349,7 @@
             <w:pPr>
               <w:cnfStyle w:val="000000100000" w:firstRow="0" w:lastRow="0" w:firstColumn="0" w:lastColumn="0" w:oddVBand="0" w:evenVBand="0" w:oddHBand="1" w:evenHBand="0" w:firstRowFirstColumn="0" w:firstRowLastColumn="0" w:lastRowFirstColumn="0" w:lastRowLastColumn="0"/>
               <w:rPr>
-                <w:rFonts w:ascii="Sakkal Majalla" w:hAnsi="Sakkal Majalla" w:cs="Sakkal Majalla" w:hint="cs"/>
+                <w:rFonts w:ascii="Sakkal Majalla" w:hAnsi="Sakkal Majalla" w:cs="Sakkal Majalla"/>
               </w:rPr>
             </w:pPr>
             <w:r>
@@ -381,7 +381,7 @@
               <w:jc w:val="center"/>
               <w:cnfStyle w:val="000000100000" w:firstRow="0" w:lastRow="0" w:firstColumn="0" w:lastColumn="0" w:oddVBand="0" w:evenVBand="0" w:oddHBand="1" w:evenHBand="0" w:firstRowFirstColumn="0" w:firstRowLastColumn="0" w:lastRowFirstColumn="0" w:lastRowLastColumn="0"/>
               <w:rPr>
-                <w:rFonts w:ascii="Sakkal Majalla" w:hAnsi="Sakkal Majalla" w:cs="Sakkal Majalla" w:hint="cs"/>
+                <w:rFonts w:ascii="Sakkal Majalla" w:hAnsi="Sakkal Majalla" w:cs="Sakkal Majalla"/>
               </w:rPr>
             </w:pPr>
             <w:r>
@@ -400,7 +400,7 @@
             <w:pPr>
               <w:cnfStyle w:val="000000100000" w:firstRow="0" w:lastRow="0" w:firstColumn="0" w:lastColumn="0" w:oddVBand="0" w:evenVBand="0" w:oddHBand="1" w:evenHBand="0" w:firstRowFirstColumn="0" w:firstRowLastColumn="0" w:lastRowFirstColumn="0" w:lastRowLastColumn="0"/>
               <w:rPr>
-                <w:rFonts w:ascii="Sakkal Majalla" w:hAnsi="Sakkal Majalla" w:cs="Sakkal Majalla" w:hint="cs"/>
+                <w:rFonts w:ascii="Sakkal Majalla" w:hAnsi="Sakkal Majalla" w:cs="Sakkal Majalla"/>
               </w:rPr>
             </w:pPr>
           </w:p>
@@ -416,7 +416,7 @@
             <w:pPr>
               <w:jc w:val="center"/>
               <w:rPr>
-                <w:rFonts w:ascii="Sakkal Majalla" w:hAnsi="Sakkal Majalla" w:cs="Sakkal Majalla" w:hint="cs"/>
+                <w:rFonts w:ascii="Sakkal Majalla" w:hAnsi="Sakkal Majalla" w:cs="Sakkal Majalla"/>
               </w:rPr>
             </w:pPr>
             <w:r>
@@ -435,7 +435,7 @@
             <w:pPr>
               <w:cnfStyle w:val="000000000000" w:firstRow="0" w:lastRow="0" w:firstColumn="0" w:lastColumn="0" w:oddVBand="0" w:evenVBand="0" w:oddHBand="0" w:evenHBand="0" w:firstRowFirstColumn="0" w:firstRowLastColumn="0" w:lastRowFirstColumn="0" w:lastRowLastColumn="0"/>
               <w:rPr>
-                <w:rFonts w:ascii="Sakkal Majalla" w:hAnsi="Sakkal Majalla" w:cs="Sakkal Majalla" w:hint="cs"/>
+                <w:rFonts w:ascii="Sakkal Majalla" w:hAnsi="Sakkal Majalla" w:cs="Sakkal Majalla"/>
               </w:rPr>
             </w:pPr>
             <w:r>
@@ -467,7 +467,7 @@
               <w:jc w:val="center"/>
               <w:cnfStyle w:val="000000000000" w:firstRow="0" w:lastRow="0" w:firstColumn="0" w:lastColumn="0" w:oddVBand="0" w:evenVBand="0" w:oddHBand="0" w:evenHBand="0" w:firstRowFirstColumn="0" w:firstRowLastColumn="0" w:lastRowFirstColumn="0" w:lastRowLastColumn="0"/>
               <w:rPr>
-                <w:rFonts w:ascii="Sakkal Majalla" w:hAnsi="Sakkal Majalla" w:cs="Sakkal Majalla" w:hint="cs"/>
+                <w:rFonts w:ascii="Sakkal Majalla" w:hAnsi="Sakkal Majalla" w:cs="Sakkal Majalla"/>
               </w:rPr>
             </w:pPr>
             <w:r>
@@ -486,7 +486,7 @@
             <w:pPr>
               <w:cnfStyle w:val="000000000000" w:firstRow="0" w:lastRow="0" w:firstColumn="0" w:lastColumn="0" w:oddVBand="0" w:evenVBand="0" w:oddHBand="0" w:evenHBand="0" w:firstRowFirstColumn="0" w:firstRowLastColumn="0" w:lastRowFirstColumn="0" w:lastRowLastColumn="0"/>
               <w:rPr>
-                <w:rFonts w:ascii="Sakkal Majalla" w:hAnsi="Sakkal Majalla" w:cs="Sakkal Majalla" w:hint="cs"/>
+                <w:rFonts w:ascii="Sakkal Majalla" w:hAnsi="Sakkal Majalla" w:cs="Sakkal Majalla"/>
               </w:rPr>
             </w:pPr>
           </w:p>
@@ -505,7 +505,7 @@
             <w:pPr>
               <w:jc w:val="center"/>
               <w:rPr>
-                <w:rFonts w:ascii="Sakkal Majalla" w:hAnsi="Sakkal Majalla" w:cs="Sakkal Majalla" w:hint="cs"/>
+                <w:rFonts w:ascii="Sakkal Majalla" w:hAnsi="Sakkal Majalla" w:cs="Sakkal Majalla"/>
               </w:rPr>
             </w:pPr>
             <w:r>
@@ -524,7 +524,7 @@
             <w:pPr>
               <w:cnfStyle w:val="000000100000" w:firstRow="0" w:lastRow="0" w:firstColumn="0" w:lastColumn="0" w:oddVBand="0" w:evenVBand="0" w:oddHBand="1" w:evenHBand="0" w:firstRowFirstColumn="0" w:firstRowLastColumn="0" w:lastRowFirstColumn="0" w:lastRowLastColumn="0"/>
               <w:rPr>
-                <w:rFonts w:ascii="Sakkal Majalla" w:hAnsi="Sakkal Majalla" w:cs="Sakkal Majalla" w:hint="cs"/>
+                <w:rFonts w:ascii="Sakkal Majalla" w:hAnsi="Sakkal Majalla" w:cs="Sakkal Majalla"/>
               </w:rPr>
             </w:pPr>
             <w:r>
@@ -568,7 +568,7 @@
               <w:jc w:val="center"/>
               <w:cnfStyle w:val="000000100000" w:firstRow="0" w:lastRow="0" w:firstColumn="0" w:lastColumn="0" w:oddVBand="0" w:evenVBand="0" w:oddHBand="1" w:evenHBand="0" w:firstRowFirstColumn="0" w:firstRowLastColumn="0" w:lastRowFirstColumn="0" w:lastRowLastColumn="0"/>
               <w:rPr>
-                <w:rFonts w:ascii="Sakkal Majalla" w:hAnsi="Sakkal Majalla" w:cs="Sakkal Majalla" w:hint="cs"/>
+                <w:rFonts w:ascii="Sakkal Majalla" w:hAnsi="Sakkal Majalla" w:cs="Sakkal Majalla"/>
               </w:rPr>
             </w:pPr>
             <w:r>
@@ -587,7 +587,7 @@
             <w:pPr>
               <w:cnfStyle w:val="000000100000" w:firstRow="0" w:lastRow="0" w:firstColumn="0" w:lastColumn="0" w:oddVBand="0" w:evenVBand="0" w:oddHBand="1" w:evenHBand="0" w:firstRowFirstColumn="0" w:firstRowLastColumn="0" w:lastRowFirstColumn="0" w:lastRowLastColumn="0"/>
               <w:rPr>
-                <w:rFonts w:ascii="Sakkal Majalla" w:hAnsi="Sakkal Majalla" w:cs="Sakkal Majalla" w:hint="cs"/>
+                <w:rFonts w:ascii="Sakkal Majalla" w:hAnsi="Sakkal Majalla" w:cs="Sakkal Majalla"/>
               </w:rPr>
             </w:pPr>
           </w:p>
@@ -603,7 +603,7 @@
             <w:pPr>
               <w:jc w:val="center"/>
               <w:rPr>
-                <w:rFonts w:ascii="Sakkal Majalla" w:hAnsi="Sakkal Majalla" w:cs="Sakkal Majalla" w:hint="cs"/>
+                <w:rFonts w:ascii="Sakkal Majalla" w:hAnsi="Sakkal Majalla" w:cs="Sakkal Majalla"/>
               </w:rPr>
             </w:pPr>
             <w:r>
@@ -622,7 +622,7 @@
             <w:pPr>
               <w:cnfStyle w:val="000000000000" w:firstRow="0" w:lastRow="0" w:firstColumn="0" w:lastColumn="0" w:oddVBand="0" w:evenVBand="0" w:oddHBand="0" w:evenHBand="0" w:firstRowFirstColumn="0" w:firstRowLastColumn="0" w:lastRowFirstColumn="0" w:lastRowLastColumn="0"/>
               <w:rPr>
-                <w:rFonts w:ascii="Sakkal Majalla" w:hAnsi="Sakkal Majalla" w:cs="Sakkal Majalla" w:hint="cs"/>
+                <w:rFonts w:ascii="Sakkal Majalla" w:hAnsi="Sakkal Majalla" w:cs="Sakkal Majalla"/>
               </w:rPr>
             </w:pPr>
             <w:r>
@@ -642,7 +642,7 @@
               <w:jc w:val="center"/>
               <w:cnfStyle w:val="000000000000" w:firstRow="0" w:lastRow="0" w:firstColumn="0" w:lastColumn="0" w:oddVBand="0" w:evenVBand="0" w:oddHBand="0" w:evenHBand="0" w:firstRowFirstColumn="0" w:firstRowLastColumn="0" w:lastRowFirstColumn="0" w:lastRowLastColumn="0"/>
               <w:rPr>
-                <w:rFonts w:ascii="Sakkal Majalla" w:hAnsi="Sakkal Majalla" w:cs="Sakkal Majalla" w:hint="cs"/>
+                <w:rFonts w:ascii="Sakkal Majalla" w:hAnsi="Sakkal Majalla" w:cs="Sakkal Majalla"/>
               </w:rPr>
             </w:pPr>
             <w:r>
@@ -661,7 +661,7 @@
             <w:pPr>
               <w:cnfStyle w:val="000000000000" w:firstRow="0" w:lastRow="0" w:firstColumn="0" w:lastColumn="0" w:oddVBand="0" w:evenVBand="0" w:oddHBand="0" w:evenHBand="0" w:firstRowFirstColumn="0" w:firstRowLastColumn="0" w:lastRowFirstColumn="0" w:lastRowLastColumn="0"/>
               <w:rPr>
-                <w:rFonts w:ascii="Sakkal Majalla" w:hAnsi="Sakkal Majalla" w:cs="Sakkal Majalla" w:hint="cs"/>
+                <w:rFonts w:ascii="Sakkal Majalla" w:hAnsi="Sakkal Majalla" w:cs="Sakkal Majalla"/>
               </w:rPr>
             </w:pPr>
           </w:p>
@@ -680,7 +680,7 @@
             <w:pPr>
               <w:jc w:val="center"/>
               <w:rPr>
-                <w:rFonts w:ascii="Sakkal Majalla" w:hAnsi="Sakkal Majalla" w:cs="Sakkal Majalla" w:hint="cs"/>
+                <w:rFonts w:ascii="Sakkal Majalla" w:hAnsi="Sakkal Majalla" w:cs="Sakkal Majalla"/>
               </w:rPr>
             </w:pPr>
             <w:r>
@@ -699,7 +699,7 @@
             <w:pPr>
               <w:cnfStyle w:val="000000100000" w:firstRow="0" w:lastRow="0" w:firstColumn="0" w:lastColumn="0" w:oddVBand="0" w:evenVBand="0" w:oddHBand="1" w:evenHBand="0" w:firstRowFirstColumn="0" w:firstRowLastColumn="0" w:lastRowFirstColumn="0" w:lastRowLastColumn="0"/>
               <w:rPr>
-                <w:rFonts w:ascii="Sakkal Majalla" w:hAnsi="Sakkal Majalla" w:cs="Sakkal Majalla" w:hint="cs"/>
+                <w:rFonts w:ascii="Sakkal Majalla" w:hAnsi="Sakkal Majalla" w:cs="Sakkal Majalla"/>
               </w:rPr>
             </w:pPr>
             <w:r>
@@ -719,7 +719,7 @@
               <w:jc w:val="center"/>
               <w:cnfStyle w:val="000000100000" w:firstRow="0" w:lastRow="0" w:firstColumn="0" w:lastColumn="0" w:oddVBand="0" w:evenVBand="0" w:oddHBand="1" w:evenHBand="0" w:firstRowFirstColumn="0" w:firstRowLastColumn="0" w:lastRowFirstColumn="0" w:lastRowLastColumn="0"/>
               <w:rPr>
-                <w:rFonts w:ascii="Sakkal Majalla" w:hAnsi="Sakkal Majalla" w:cs="Sakkal Majalla" w:hint="cs"/>
+                <w:rFonts w:ascii="Sakkal Majalla" w:hAnsi="Sakkal Majalla" w:cs="Sakkal Majalla"/>
               </w:rPr>
             </w:pPr>
             <w:r>
@@ -738,7 +738,7 @@
             <w:pPr>
               <w:cnfStyle w:val="000000100000" w:firstRow="0" w:lastRow="0" w:firstColumn="0" w:lastColumn="0" w:oddVBand="0" w:evenVBand="0" w:oddHBand="1" w:evenHBand="0" w:firstRowFirstColumn="0" w:firstRowLastColumn="0" w:lastRowFirstColumn="0" w:lastRowLastColumn="0"/>
               <w:rPr>
-                <w:rFonts w:ascii="Sakkal Majalla" w:hAnsi="Sakkal Majalla" w:cs="Sakkal Majalla" w:hint="cs"/>
+                <w:rFonts w:ascii="Sakkal Majalla" w:hAnsi="Sakkal Majalla" w:cs="Sakkal Majalla"/>
               </w:rPr>
             </w:pPr>
           </w:p>
@@ -754,7 +754,7 @@
             <w:pPr>
               <w:jc w:val="center"/>
               <w:rPr>
-                <w:rFonts w:ascii="Sakkal Majalla" w:hAnsi="Sakkal Majalla" w:cs="Sakkal Majalla" w:hint="cs"/>
+                <w:rFonts w:ascii="Sakkal Majalla" w:hAnsi="Sakkal Majalla" w:cs="Sakkal Majalla"/>
               </w:rPr>
             </w:pPr>
             <w:r>
@@ -773,7 +773,7 @@
             <w:pPr>
               <w:cnfStyle w:val="000000000000" w:firstRow="0" w:lastRow="0" w:firstColumn="0" w:lastColumn="0" w:oddVBand="0" w:evenVBand="0" w:oddHBand="0" w:evenHBand="0" w:firstRowFirstColumn="0" w:firstRowLastColumn="0" w:lastRowFirstColumn="0" w:lastRowLastColumn="0"/>
               <w:rPr>
-                <w:rFonts w:ascii="Sakkal Majalla" w:hAnsi="Sakkal Majalla" w:cs="Sakkal Majalla" w:hint="cs"/>
+                <w:rFonts w:ascii="Sakkal Majalla" w:hAnsi="Sakkal Majalla" w:cs="Sakkal Majalla"/>
               </w:rPr>
             </w:pPr>
             <w:r>
@@ -793,7 +793,7 @@
               <w:jc w:val="center"/>
               <w:cnfStyle w:val="000000000000" w:firstRow="0" w:lastRow="0" w:firstColumn="0" w:lastColumn="0" w:oddVBand="0" w:evenVBand="0" w:oddHBand="0" w:evenHBand="0" w:firstRowFirstColumn="0" w:firstRowLastColumn="0" w:lastRowFirstColumn="0" w:lastRowLastColumn="0"/>
               <w:rPr>
-                <w:rFonts w:ascii="Sakkal Majalla" w:hAnsi="Sakkal Majalla" w:cs="Sakkal Majalla" w:hint="cs"/>
+                <w:rFonts w:ascii="Sakkal Majalla" w:hAnsi="Sakkal Majalla" w:cs="Sakkal Majalla"/>
               </w:rPr>
             </w:pPr>
             <w:r>
@@ -812,7 +812,7 @@
             <w:pPr>
               <w:cnfStyle w:val="000000000000" w:firstRow="0" w:lastRow="0" w:firstColumn="0" w:lastColumn="0" w:oddVBand="0" w:evenVBand="0" w:oddHBand="0" w:evenHBand="0" w:firstRowFirstColumn="0" w:firstRowLastColumn="0" w:lastRowFirstColumn="0" w:lastRowLastColumn="0"/>
               <w:rPr>
-                <w:rFonts w:ascii="Sakkal Majalla" w:hAnsi="Sakkal Majalla" w:cs="Sakkal Majalla" w:hint="cs"/>
+                <w:rFonts w:ascii="Sakkal Majalla" w:hAnsi="Sakkal Majalla" w:cs="Sakkal Majalla"/>
               </w:rPr>
             </w:pPr>
           </w:p>
@@ -831,7 +831,7 @@
             <w:pPr>
               <w:jc w:val="center"/>
               <w:rPr>
-                <w:rFonts w:ascii="Sakkal Majalla" w:hAnsi="Sakkal Majalla" w:cs="Sakkal Majalla" w:hint="cs"/>
+                <w:rFonts w:ascii="Sakkal Majalla" w:hAnsi="Sakkal Majalla" w:cs="Sakkal Majalla"/>
               </w:rPr>
             </w:pPr>
             <w:r>
@@ -850,7 +850,7 @@
             <w:pPr>
               <w:cnfStyle w:val="000000100000" w:firstRow="0" w:lastRow="0" w:firstColumn="0" w:lastColumn="0" w:oddVBand="0" w:evenVBand="0" w:oddHBand="1" w:evenHBand="0" w:firstRowFirstColumn="0" w:firstRowLastColumn="0" w:lastRowFirstColumn="0" w:lastRowLastColumn="0"/>
               <w:rPr>
-                <w:rFonts w:ascii="Sakkal Majalla" w:hAnsi="Sakkal Majalla" w:cs="Sakkal Majalla" w:hint="cs"/>
+                <w:rFonts w:ascii="Sakkal Majalla" w:hAnsi="Sakkal Majalla" w:cs="Sakkal Majalla"/>
               </w:rPr>
             </w:pPr>
             <w:r>
@@ -870,7 +870,7 @@
               <w:jc w:val="center"/>
               <w:cnfStyle w:val="000000100000" w:firstRow="0" w:lastRow="0" w:firstColumn="0" w:lastColumn="0" w:oddVBand="0" w:evenVBand="0" w:oddHBand="1" w:evenHBand="0" w:firstRowFirstColumn="0" w:firstRowLastColumn="0" w:lastRowFirstColumn="0" w:lastRowLastColumn="0"/>
               <w:rPr>
-                <w:rFonts w:ascii="Sakkal Majalla" w:hAnsi="Sakkal Majalla" w:cs="Sakkal Majalla" w:hint="cs"/>
+                <w:rFonts w:ascii="Sakkal Majalla" w:hAnsi="Sakkal Majalla" w:cs="Sakkal Majalla"/>
               </w:rPr>
             </w:pPr>
             <w:r>
@@ -889,7 +889,7 @@
             <w:pPr>
               <w:cnfStyle w:val="000000100000" w:firstRow="0" w:lastRow="0" w:firstColumn="0" w:lastColumn="0" w:oddVBand="0" w:evenVBand="0" w:oddHBand="1" w:evenHBand="0" w:firstRowFirstColumn="0" w:firstRowLastColumn="0" w:lastRowFirstColumn="0" w:lastRowLastColumn="0"/>
               <w:rPr>
-                <w:rFonts w:ascii="Sakkal Majalla" w:hAnsi="Sakkal Majalla" w:cs="Sakkal Majalla" w:hint="cs"/>
+                <w:rFonts w:ascii="Sakkal Majalla" w:hAnsi="Sakkal Majalla" w:cs="Sakkal Majalla"/>
               </w:rPr>
             </w:pPr>
           </w:p>
@@ -905,7 +905,7 @@
             <w:pPr>
               <w:jc w:val="center"/>
               <w:rPr>
-                <w:rFonts w:ascii="Sakkal Majalla" w:hAnsi="Sakkal Majalla" w:cs="Sakkal Majalla" w:hint="cs"/>
+                <w:rFonts w:ascii="Sakkal Majalla" w:hAnsi="Sakkal Majalla" w:cs="Sakkal Majalla"/>
               </w:rPr>
             </w:pPr>
             <w:r>
@@ -924,7 +924,7 @@
             <w:pPr>
               <w:cnfStyle w:val="000000000000" w:firstRow="0" w:lastRow="0" w:firstColumn="0" w:lastColumn="0" w:oddVBand="0" w:evenVBand="0" w:oddHBand="0" w:evenHBand="0" w:firstRowFirstColumn="0" w:firstRowLastColumn="0" w:lastRowFirstColumn="0" w:lastRowLastColumn="0"/>
               <w:rPr>
-                <w:rFonts w:ascii="Sakkal Majalla" w:hAnsi="Sakkal Majalla" w:cs="Sakkal Majalla" w:hint="cs"/>
+                <w:rFonts w:ascii="Sakkal Majalla" w:hAnsi="Sakkal Majalla" w:cs="Sakkal Majalla"/>
               </w:rPr>
             </w:pPr>
             <w:r>
@@ -944,7 +944,7 @@
               <w:jc w:val="center"/>
               <w:cnfStyle w:val="000000000000" w:firstRow="0" w:lastRow="0" w:firstColumn="0" w:lastColumn="0" w:oddVBand="0" w:evenVBand="0" w:oddHBand="0" w:evenHBand="0" w:firstRowFirstColumn="0" w:firstRowLastColumn="0" w:lastRowFirstColumn="0" w:lastRowLastColumn="0"/>
               <w:rPr>
-                <w:rFonts w:ascii="Sakkal Majalla" w:hAnsi="Sakkal Majalla" w:cs="Sakkal Majalla" w:hint="cs"/>
+                <w:rFonts w:ascii="Sakkal Majalla" w:hAnsi="Sakkal Majalla" w:cs="Sakkal Majalla"/>
               </w:rPr>
             </w:pPr>
             <w:r>
@@ -963,7 +963,7 @@
             <w:pPr>
               <w:cnfStyle w:val="000000000000" w:firstRow="0" w:lastRow="0" w:firstColumn="0" w:lastColumn="0" w:oddVBand="0" w:evenVBand="0" w:oddHBand="0" w:evenHBand="0" w:firstRowFirstColumn="0" w:firstRowLastColumn="0" w:lastRowFirstColumn="0" w:lastRowLastColumn="0"/>
               <w:rPr>
-                <w:rFonts w:ascii="Sakkal Majalla" w:hAnsi="Sakkal Majalla" w:cs="Sakkal Majalla" w:hint="cs"/>
+                <w:rFonts w:ascii="Sakkal Majalla" w:hAnsi="Sakkal Majalla" w:cs="Sakkal Majalla"/>
               </w:rPr>
             </w:pPr>
           </w:p>
@@ -982,7 +982,7 @@
             <w:pPr>
               <w:jc w:val="center"/>
               <w:rPr>
-                <w:rFonts w:ascii="Sakkal Majalla" w:hAnsi="Sakkal Majalla" w:cs="Sakkal Majalla" w:hint="cs"/>
+                <w:rFonts w:ascii="Sakkal Majalla" w:hAnsi="Sakkal Majalla" w:cs="Sakkal Majalla"/>
               </w:rPr>
             </w:pPr>
             <w:r>
@@ -1001,7 +1001,7 @@
             <w:pPr>
               <w:cnfStyle w:val="000000100000" w:firstRow="0" w:lastRow="0" w:firstColumn="0" w:lastColumn="0" w:oddVBand="0" w:evenVBand="0" w:oddHBand="1" w:evenHBand="0" w:firstRowFirstColumn="0" w:firstRowLastColumn="0" w:lastRowFirstColumn="0" w:lastRowLastColumn="0"/>
               <w:rPr>
-                <w:rFonts w:ascii="Sakkal Majalla" w:hAnsi="Sakkal Majalla" w:cs="Sakkal Majalla" w:hint="cs"/>
+                <w:rFonts w:ascii="Sakkal Majalla" w:hAnsi="Sakkal Majalla" w:cs="Sakkal Majalla"/>
               </w:rPr>
             </w:pPr>
             <w:r>
@@ -1033,7 +1033,7 @@
               <w:jc w:val="center"/>
               <w:cnfStyle w:val="000000100000" w:firstRow="0" w:lastRow="0" w:firstColumn="0" w:lastColumn="0" w:oddVBand="0" w:evenVBand="0" w:oddHBand="1" w:evenHBand="0" w:firstRowFirstColumn="0" w:firstRowLastColumn="0" w:lastRowFirstColumn="0" w:lastRowLastColumn="0"/>
               <w:rPr>
-                <w:rFonts w:ascii="Sakkal Majalla" w:hAnsi="Sakkal Majalla" w:cs="Sakkal Majalla" w:hint="cs"/>
+                <w:rFonts w:ascii="Sakkal Majalla" w:hAnsi="Sakkal Majalla" w:cs="Sakkal Majalla"/>
               </w:rPr>
             </w:pPr>
             <w:r>
@@ -1052,7 +1052,7 @@
             <w:pPr>
               <w:cnfStyle w:val="000000100000" w:firstRow="0" w:lastRow="0" w:firstColumn="0" w:lastColumn="0" w:oddVBand="0" w:evenVBand="0" w:oddHBand="1" w:evenHBand="0" w:firstRowFirstColumn="0" w:firstRowLastColumn="0" w:lastRowFirstColumn="0" w:lastRowLastColumn="0"/>
               <w:rPr>
-                <w:rFonts w:ascii="Sakkal Majalla" w:hAnsi="Sakkal Majalla" w:cs="Sakkal Majalla" w:hint="cs"/>
+                <w:rFonts w:ascii="Sakkal Majalla" w:hAnsi="Sakkal Majalla" w:cs="Sakkal Majalla"/>
               </w:rPr>
             </w:pPr>
           </w:p>
@@ -1068,7 +1068,7 @@
             <w:pPr>
               <w:jc w:val="center"/>
               <w:rPr>
-                <w:rFonts w:ascii="Sakkal Majalla" w:hAnsi="Sakkal Majalla" w:cs="Sakkal Majalla" w:hint="cs"/>
+                <w:rFonts w:ascii="Sakkal Majalla" w:hAnsi="Sakkal Majalla" w:cs="Sakkal Majalla"/>
               </w:rPr>
             </w:pPr>
             <w:r>
@@ -1087,7 +1087,7 @@
             <w:pPr>
               <w:cnfStyle w:val="000000000000" w:firstRow="0" w:lastRow="0" w:firstColumn="0" w:lastColumn="0" w:oddVBand="0" w:evenVBand="0" w:oddHBand="0" w:evenHBand="0" w:firstRowFirstColumn="0" w:firstRowLastColumn="0" w:lastRowFirstColumn="0" w:lastRowLastColumn="0"/>
               <w:rPr>
-                <w:rFonts w:ascii="Sakkal Majalla" w:hAnsi="Sakkal Majalla" w:cs="Sakkal Majalla" w:hint="cs"/>
+                <w:rFonts w:ascii="Sakkal Majalla" w:hAnsi="Sakkal Majalla" w:cs="Sakkal Majalla"/>
               </w:rPr>
             </w:pPr>
             <w:r>
@@ -1115,7 +1115,7 @@
               <w:jc w:val="center"/>
               <w:cnfStyle w:val="000000000000" w:firstRow="0" w:lastRow="0" w:firstColumn="0" w:lastColumn="0" w:oddVBand="0" w:evenVBand="0" w:oddHBand="0" w:evenHBand="0" w:firstRowFirstColumn="0" w:firstRowLastColumn="0" w:lastRowFirstColumn="0" w:lastRowLastColumn="0"/>
               <w:rPr>
-                <w:rFonts w:ascii="Sakkal Majalla" w:hAnsi="Sakkal Majalla" w:cs="Sakkal Majalla" w:hint="cs"/>
+                <w:rFonts w:ascii="Sakkal Majalla" w:hAnsi="Sakkal Majalla" w:cs="Sakkal Majalla"/>
               </w:rPr>
             </w:pPr>
           </w:p>
@@ -1128,7 +1128,7 @@
             <w:pPr>
               <w:cnfStyle w:val="000000000000" w:firstRow="0" w:lastRow="0" w:firstColumn="0" w:lastColumn="0" w:oddVBand="0" w:evenVBand="0" w:oddHBand="0" w:evenHBand="0" w:firstRowFirstColumn="0" w:firstRowLastColumn="0" w:lastRowFirstColumn="0" w:lastRowLastColumn="0"/>
               <w:rPr>
-                <w:rFonts w:ascii="Sakkal Majalla" w:hAnsi="Sakkal Majalla" w:cs="Sakkal Majalla" w:hint="cs"/>
+                <w:rFonts w:ascii="Sakkal Majalla" w:hAnsi="Sakkal Majalla" w:cs="Sakkal Majalla"/>
               </w:rPr>
             </w:pPr>
           </w:p>
@@ -1147,7 +1147,7 @@
             <w:pPr>
               <w:jc w:val="center"/>
               <w:rPr>
-                <w:rFonts w:ascii="Sakkal Majalla" w:hAnsi="Sakkal Majalla" w:cs="Sakkal Majalla" w:hint="cs"/>
+                <w:rFonts w:ascii="Sakkal Majalla" w:hAnsi="Sakkal Majalla" w:cs="Sakkal Majalla"/>
               </w:rPr>
             </w:pPr>
             <w:r>
@@ -1166,7 +1166,7 @@
             <w:pPr>
               <w:cnfStyle w:val="000000100000" w:firstRow="0" w:lastRow="0" w:firstColumn="0" w:lastColumn="0" w:oddVBand="0" w:evenVBand="0" w:oddHBand="1" w:evenHBand="0" w:firstRowFirstColumn="0" w:firstRowLastColumn="0" w:lastRowFirstColumn="0" w:lastRowLastColumn="0"/>
               <w:rPr>
-                <w:rFonts w:ascii="Sakkal Majalla" w:hAnsi="Sakkal Majalla" w:cs="Sakkal Majalla" w:hint="cs"/>
+                <w:rFonts w:ascii="Sakkal Majalla" w:hAnsi="Sakkal Majalla" w:cs="Sakkal Majalla"/>
               </w:rPr>
             </w:pPr>
             <w:r>
@@ -1180,7 +1180,7 @@
             <w:pPr>
               <w:cnfStyle w:val="000000100000" w:firstRow="0" w:lastRow="0" w:firstColumn="0" w:lastColumn="0" w:oddVBand="0" w:evenVBand="0" w:oddHBand="1" w:evenHBand="0" w:firstRowFirstColumn="0" w:firstRowLastColumn="0" w:lastRowFirstColumn="0" w:lastRowLastColumn="0"/>
               <w:rPr>
-                <w:rFonts w:ascii="Sakkal Majalla" w:hAnsi="Sakkal Majalla" w:cs="Sakkal Majalla" w:hint="cs"/>
+                <w:rFonts w:ascii="Sakkal Majalla" w:hAnsi="Sakkal Majalla" w:cs="Sakkal Majalla"/>
               </w:rPr>
             </w:pPr>
             <w:r>
@@ -1208,15 +1208,15 @@
             <w:pPr>
               <w:cnfStyle w:val="000000100000" w:firstRow="0" w:lastRow="0" w:firstColumn="0" w:lastColumn="0" w:oddVBand="0" w:evenVBand="0" w:oddHBand="1" w:evenHBand="0" w:firstRowFirstColumn="0" w:firstRowLastColumn="0" w:lastRowFirstColumn="0" w:lastRowLastColumn="0"/>
               <w:rPr>
-                <w:rFonts w:ascii="Sakkal Majalla" w:hAnsi="Sakkal Majalla" w:cs="Sakkal Majalla" w:hint="cs"/>
-              </w:rPr>
-            </w:pPr>
-          </w:p>
-          <w:p>
-            <w:pPr>
-              <w:cnfStyle w:val="000000100000" w:firstRow="0" w:lastRow="0" w:firstColumn="0" w:lastColumn="0" w:oddVBand="0" w:evenVBand="0" w:oddHBand="1" w:evenHBand="0" w:firstRowFirstColumn="0" w:firstRowLastColumn="0" w:lastRowFirstColumn="0" w:lastRowLastColumn="0"/>
-              <w:rPr>
-                <w:rFonts w:ascii="Sakkal Majalla" w:hAnsi="Sakkal Majalla" w:cs="Sakkal Majalla" w:hint="cs"/>
+                <w:rFonts w:ascii="Sakkal Majalla" w:hAnsi="Sakkal Majalla" w:cs="Sakkal Majalla"/>
+              </w:rPr>
+            </w:pPr>
+          </w:p>
+          <w:p>
+            <w:pPr>
+              <w:cnfStyle w:val="000000100000" w:firstRow="0" w:lastRow="0" w:firstColumn="0" w:lastColumn="0" w:oddVBand="0" w:evenVBand="0" w:oddHBand="1" w:evenHBand="0" w:firstRowFirstColumn="0" w:firstRowLastColumn="0" w:lastRowFirstColumn="0" w:lastRowLastColumn="0"/>
+              <w:rPr>
+                <w:rFonts w:ascii="Sakkal Majalla" w:hAnsi="Sakkal Majalla" w:cs="Sakkal Majalla"/>
               </w:rPr>
             </w:pPr>
             <w:r>
@@ -1244,7 +1244,7 @@
             <w:pPr>
               <w:cnfStyle w:val="000000100000" w:firstRow="0" w:lastRow="0" w:firstColumn="0" w:lastColumn="0" w:oddVBand="0" w:evenVBand="0" w:oddHBand="1" w:evenHBand="0" w:firstRowFirstColumn="0" w:firstRowLastColumn="0" w:lastRowFirstColumn="0" w:lastRowLastColumn="0"/>
               <w:rPr>
-                <w:rFonts w:ascii="Sakkal Majalla" w:hAnsi="Sakkal Majalla" w:cs="Sakkal Majalla" w:hint="cs"/>
+                <w:rFonts w:ascii="Sakkal Majalla" w:hAnsi="Sakkal Majalla" w:cs="Sakkal Majalla"/>
               </w:rPr>
             </w:pPr>
             <w:r>
@@ -1258,7 +1258,7 @@
             <w:pPr>
               <w:cnfStyle w:val="000000100000" w:firstRow="0" w:lastRow="0" w:firstColumn="0" w:lastColumn="0" w:oddVBand="0" w:evenVBand="0" w:oddHBand="1" w:evenHBand="0" w:firstRowFirstColumn="0" w:firstRowLastColumn="0" w:lastRowFirstColumn="0" w:lastRowLastColumn="0"/>
               <w:rPr>
-                <w:rFonts w:ascii="Sakkal Majalla" w:hAnsi="Sakkal Majalla" w:cs="Sakkal Majalla" w:hint="cs"/>
+                <w:rFonts w:ascii="Sakkal Majalla" w:hAnsi="Sakkal Majalla" w:cs="Sakkal Majalla"/>
               </w:rPr>
             </w:pPr>
             <w:r>
@@ -1300,7 +1300,7 @@
             <w:pPr>
               <w:cnfStyle w:val="000000100000" w:firstRow="0" w:lastRow="0" w:firstColumn="0" w:lastColumn="0" w:oddVBand="0" w:evenVBand="0" w:oddHBand="1" w:evenHBand="0" w:firstRowFirstColumn="0" w:firstRowLastColumn="0" w:lastRowFirstColumn="0" w:lastRowLastColumn="0"/>
               <w:rPr>
-                <w:rFonts w:ascii="Sakkal Majalla" w:hAnsi="Sakkal Majalla" w:cs="Sakkal Majalla" w:hint="cs"/>
+                <w:rFonts w:ascii="Sakkal Majalla" w:hAnsi="Sakkal Majalla" w:cs="Sakkal Majalla"/>
               </w:rPr>
             </w:pPr>
             <w:r>
@@ -1314,7 +1314,7 @@
             <w:pPr>
               <w:cnfStyle w:val="000000100000" w:firstRow="0" w:lastRow="0" w:firstColumn="0" w:lastColumn="0" w:oddVBand="0" w:evenVBand="0" w:oddHBand="1" w:evenHBand="0" w:firstRowFirstColumn="0" w:firstRowLastColumn="0" w:lastRowFirstColumn="0" w:lastRowLastColumn="0"/>
               <w:rPr>
-                <w:rFonts w:ascii="Sakkal Majalla" w:hAnsi="Sakkal Majalla" w:cs="Sakkal Majalla" w:hint="cs"/>
+                <w:rFonts w:ascii="Sakkal Majalla" w:hAnsi="Sakkal Majalla" w:cs="Sakkal Majalla"/>
               </w:rPr>
             </w:pPr>
             <w:r>
@@ -1328,7 +1328,7 @@
             <w:pPr>
               <w:cnfStyle w:val="000000100000" w:firstRow="0" w:lastRow="0" w:firstColumn="0" w:lastColumn="0" w:oddVBand="0" w:evenVBand="0" w:oddHBand="1" w:evenHBand="0" w:firstRowFirstColumn="0" w:firstRowLastColumn="0" w:lastRowFirstColumn="0" w:lastRowLastColumn="0"/>
               <w:rPr>
-                <w:rFonts w:ascii="Sakkal Majalla" w:hAnsi="Sakkal Majalla" w:cs="Sakkal Majalla" w:hint="cs"/>
+                <w:rFonts w:ascii="Sakkal Majalla" w:hAnsi="Sakkal Majalla" w:cs="Sakkal Majalla"/>
               </w:rPr>
             </w:pPr>
             <w:r>
@@ -1356,7 +1356,7 @@
             <w:pPr>
               <w:cnfStyle w:val="000000100000" w:firstRow="0" w:lastRow="0" w:firstColumn="0" w:lastColumn="0" w:oddVBand="0" w:evenVBand="0" w:oddHBand="1" w:evenHBand="0" w:firstRowFirstColumn="0" w:firstRowLastColumn="0" w:lastRowFirstColumn="0" w:lastRowLastColumn="0"/>
               <w:rPr>
-                <w:rFonts w:ascii="Sakkal Majalla" w:hAnsi="Sakkal Majalla" w:cs="Sakkal Majalla" w:hint="cs"/>
+                <w:rFonts w:ascii="Sakkal Majalla" w:hAnsi="Sakkal Majalla" w:cs="Sakkal Majalla"/>
               </w:rPr>
             </w:pPr>
             <w:r>
@@ -1384,7 +1384,7 @@
             <w:pPr>
               <w:cnfStyle w:val="000000100000" w:firstRow="0" w:lastRow="0" w:firstColumn="0" w:lastColumn="0" w:oddVBand="0" w:evenVBand="0" w:oddHBand="1" w:evenHBand="0" w:firstRowFirstColumn="0" w:firstRowLastColumn="0" w:lastRowFirstColumn="0" w:lastRowLastColumn="0"/>
               <w:rPr>
-                <w:rFonts w:ascii="Sakkal Majalla" w:hAnsi="Sakkal Majalla" w:cs="Sakkal Majalla" w:hint="cs"/>
+                <w:rFonts w:ascii="Sakkal Majalla" w:hAnsi="Sakkal Majalla" w:cs="Sakkal Majalla"/>
               </w:rPr>
             </w:pPr>
             <w:r>
@@ -1398,7 +1398,7 @@
             <w:pPr>
               <w:cnfStyle w:val="000000100000" w:firstRow="0" w:lastRow="0" w:firstColumn="0" w:lastColumn="0" w:oddVBand="0" w:evenVBand="0" w:oddHBand="1" w:evenHBand="0" w:firstRowFirstColumn="0" w:firstRowLastColumn="0" w:lastRowFirstColumn="0" w:lastRowLastColumn="0"/>
               <w:rPr>
-                <w:rFonts w:ascii="Sakkal Majalla" w:hAnsi="Sakkal Majalla" w:cs="Sakkal Majalla" w:hint="cs"/>
+                <w:rFonts w:ascii="Sakkal Majalla" w:hAnsi="Sakkal Majalla" w:cs="Sakkal Majalla"/>
               </w:rPr>
             </w:pPr>
             <w:r>
@@ -1412,7 +1412,7 @@
             <w:pPr>
               <w:cnfStyle w:val="000000100000" w:firstRow="0" w:lastRow="0" w:firstColumn="0" w:lastColumn="0" w:oddVBand="0" w:evenVBand="0" w:oddHBand="1" w:evenHBand="0" w:firstRowFirstColumn="0" w:firstRowLastColumn="0" w:lastRowFirstColumn="0" w:lastRowLastColumn="0"/>
               <w:rPr>
-                <w:rFonts w:ascii="Sakkal Majalla" w:hAnsi="Sakkal Majalla" w:cs="Sakkal Majalla" w:hint="cs"/>
+                <w:rFonts w:ascii="Sakkal Majalla" w:hAnsi="Sakkal Majalla" w:cs="Sakkal Majalla"/>
               </w:rPr>
             </w:pPr>
             <w:r>
@@ -1440,7 +1440,7 @@
             <w:pPr>
               <w:cnfStyle w:val="000000100000" w:firstRow="0" w:lastRow="0" w:firstColumn="0" w:lastColumn="0" w:oddVBand="0" w:evenVBand="0" w:oddHBand="1" w:evenHBand="0" w:firstRowFirstColumn="0" w:firstRowLastColumn="0" w:lastRowFirstColumn="0" w:lastRowLastColumn="0"/>
               <w:rPr>
-                <w:rFonts w:ascii="Sakkal Majalla" w:hAnsi="Sakkal Majalla" w:cs="Sakkal Majalla" w:hint="cs"/>
+                <w:rFonts w:ascii="Sakkal Majalla" w:hAnsi="Sakkal Majalla" w:cs="Sakkal Majalla"/>
                 <w:b/>
                 <w:bCs/>
               </w:rPr>
@@ -1476,7 +1476,7 @@
               <w:jc w:val="center"/>
               <w:cnfStyle w:val="000000100000" w:firstRow="0" w:lastRow="0" w:firstColumn="0" w:lastColumn="0" w:oddVBand="0" w:evenVBand="0" w:oddHBand="1" w:evenHBand="0" w:firstRowFirstColumn="0" w:firstRowLastColumn="0" w:lastRowFirstColumn="0" w:lastRowLastColumn="0"/>
               <w:rPr>
-                <w:rFonts w:ascii="Sakkal Majalla" w:hAnsi="Sakkal Majalla" w:cs="Sakkal Majalla" w:hint="cs"/>
+                <w:rFonts w:ascii="Sakkal Majalla" w:hAnsi="Sakkal Majalla" w:cs="Sakkal Majalla"/>
               </w:rPr>
             </w:pPr>
             <w:r>
@@ -1507,7 +1507,7 @@
             <w:pPr>
               <w:cnfStyle w:val="000000100000" w:firstRow="0" w:lastRow="0" w:firstColumn="0" w:lastColumn="0" w:oddVBand="0" w:evenVBand="0" w:oddHBand="1" w:evenHBand="0" w:firstRowFirstColumn="0" w:firstRowLastColumn="0" w:lastRowFirstColumn="0" w:lastRowLastColumn="0"/>
               <w:rPr>
-                <w:rFonts w:ascii="Sakkal Majalla" w:hAnsi="Sakkal Majalla" w:cs="Sakkal Majalla" w:hint="cs"/>
+                <w:rFonts w:ascii="Sakkal Majalla" w:hAnsi="Sakkal Majalla" w:cs="Sakkal Majalla"/>
               </w:rPr>
             </w:pPr>
           </w:p>
@@ -1523,7 +1523,7 @@
             <w:pPr>
               <w:jc w:val="center"/>
               <w:rPr>
-                <w:rFonts w:ascii="Sakkal Majalla" w:hAnsi="Sakkal Majalla" w:cs="Sakkal Majalla" w:hint="cs"/>
+                <w:rFonts w:ascii="Sakkal Majalla" w:hAnsi="Sakkal Majalla" w:cs="Sakkal Majalla"/>
               </w:rPr>
             </w:pPr>
             <w:r>
@@ -1542,7 +1542,7 @@
             <w:pPr>
               <w:cnfStyle w:val="000000000000" w:firstRow="0" w:lastRow="0" w:firstColumn="0" w:lastColumn="0" w:oddVBand="0" w:evenVBand="0" w:oddHBand="0" w:evenHBand="0" w:firstRowFirstColumn="0" w:firstRowLastColumn="0" w:lastRowFirstColumn="0" w:lastRowLastColumn="0"/>
               <w:rPr>
-                <w:rFonts w:ascii="Sakkal Majalla" w:hAnsi="Sakkal Majalla" w:cs="Sakkal Majalla" w:hint="cs"/>
+                <w:rFonts w:ascii="Sakkal Majalla" w:hAnsi="Sakkal Majalla" w:cs="Sakkal Majalla"/>
               </w:rPr>
             </w:pPr>
             <w:r>
@@ -1576,7 +1576,7 @@
               <w:jc w:val="center"/>
               <w:cnfStyle w:val="000000000000" w:firstRow="0" w:lastRow="0" w:firstColumn="0" w:lastColumn="0" w:oddVBand="0" w:evenVBand="0" w:oddHBand="0" w:evenHBand="0" w:firstRowFirstColumn="0" w:firstRowLastColumn="0" w:lastRowFirstColumn="0" w:lastRowLastColumn="0"/>
               <w:rPr>
-                <w:rFonts w:ascii="Sakkal Majalla" w:hAnsi="Sakkal Majalla" w:cs="Sakkal Majalla" w:hint="cs"/>
+                <w:rFonts w:ascii="Sakkal Majalla" w:hAnsi="Sakkal Majalla" w:cs="Sakkal Majalla"/>
               </w:rPr>
             </w:pPr>
             <w:r>
@@ -1595,7 +1595,7 @@
             <w:pPr>
               <w:cnfStyle w:val="000000000000" w:firstRow="0" w:lastRow="0" w:firstColumn="0" w:lastColumn="0" w:oddVBand="0" w:evenVBand="0" w:oddHBand="0" w:evenHBand="0" w:firstRowFirstColumn="0" w:firstRowLastColumn="0" w:lastRowFirstColumn="0" w:lastRowLastColumn="0"/>
               <w:rPr>
-                <w:rFonts w:ascii="Sakkal Majalla" w:hAnsi="Sakkal Majalla" w:cs="Sakkal Majalla" w:hint="cs"/>
+                <w:rFonts w:ascii="Sakkal Majalla" w:hAnsi="Sakkal Majalla" w:cs="Sakkal Majalla"/>
               </w:rPr>
             </w:pPr>
           </w:p>
@@ -1614,7 +1614,7 @@
             <w:pPr>
               <w:jc w:val="center"/>
               <w:rPr>
-                <w:rFonts w:ascii="Sakkal Majalla" w:hAnsi="Sakkal Majalla" w:cs="Sakkal Majalla" w:hint="cs"/>
+                <w:rFonts w:ascii="Sakkal Majalla" w:hAnsi="Sakkal Majalla" w:cs="Sakkal Majalla"/>
               </w:rPr>
             </w:pPr>
             <w:r>
@@ -1633,7 +1633,7 @@
             <w:pPr>
               <w:cnfStyle w:val="000000100000" w:firstRow="0" w:lastRow="0" w:firstColumn="0" w:lastColumn="0" w:oddVBand="0" w:evenVBand="0" w:oddHBand="1" w:evenHBand="0" w:firstRowFirstColumn="0" w:firstRowLastColumn="0" w:lastRowFirstColumn="0" w:lastRowLastColumn="0"/>
               <w:rPr>
-                <w:rFonts w:ascii="Sakkal Majalla" w:hAnsi="Sakkal Majalla" w:cs="Sakkal Majalla" w:hint="cs"/>
+                <w:rFonts w:ascii="Sakkal Majalla" w:hAnsi="Sakkal Majalla" w:cs="Sakkal Majalla"/>
               </w:rPr>
             </w:pPr>
             <w:r>
@@ -1652,7 +1652,7 @@
               </w:numPr>
               <w:cnfStyle w:val="000000100000" w:firstRow="0" w:lastRow="0" w:firstColumn="0" w:lastColumn="0" w:oddVBand="0" w:evenVBand="0" w:oddHBand="1" w:evenHBand="0" w:firstRowFirstColumn="0" w:firstRowLastColumn="0" w:lastRowFirstColumn="0" w:lastRowLastColumn="0"/>
               <w:rPr>
-                <w:rFonts w:ascii="Sakkal Majalla" w:hAnsi="Sakkal Majalla" w:cs="Sakkal Majalla" w:hint="cs"/>
+                <w:rFonts w:ascii="Sakkal Majalla" w:hAnsi="Sakkal Majalla" w:cs="Sakkal Majalla"/>
               </w:rPr>
             </w:pPr>
             <w:r>
@@ -1671,7 +1671,7 @@
               </w:numPr>
               <w:cnfStyle w:val="000000100000" w:firstRow="0" w:lastRow="0" w:firstColumn="0" w:lastColumn="0" w:oddVBand="0" w:evenVBand="0" w:oddHBand="1" w:evenHBand="0" w:firstRowFirstColumn="0" w:firstRowLastColumn="0" w:lastRowFirstColumn="0" w:lastRowLastColumn="0"/>
               <w:rPr>
-                <w:rFonts w:ascii="Sakkal Majalla" w:hAnsi="Sakkal Majalla" w:cs="Sakkal Majalla" w:hint="cs"/>
+                <w:rFonts w:ascii="Sakkal Majalla" w:hAnsi="Sakkal Majalla" w:cs="Sakkal Majalla"/>
               </w:rPr>
             </w:pPr>
             <w:r>
@@ -1685,7 +1685,7 @@
             <w:pPr>
               <w:cnfStyle w:val="000000100000" w:firstRow="0" w:lastRow="0" w:firstColumn="0" w:lastColumn="0" w:oddVBand="0" w:evenVBand="0" w:oddHBand="1" w:evenHBand="0" w:firstRowFirstColumn="0" w:firstRowLastColumn="0" w:lastRowFirstColumn="0" w:lastRowLastColumn="0"/>
               <w:rPr>
-                <w:rFonts w:ascii="Sakkal Majalla" w:hAnsi="Sakkal Majalla" w:cs="Sakkal Majalla" w:hint="cs"/>
+                <w:rFonts w:ascii="Sakkal Majalla" w:hAnsi="Sakkal Majalla" w:cs="Sakkal Majalla"/>
               </w:rPr>
             </w:pPr>
           </w:p>
@@ -1699,7 +1699,7 @@
               <w:jc w:val="center"/>
               <w:cnfStyle w:val="000000100000" w:firstRow="0" w:lastRow="0" w:firstColumn="0" w:lastColumn="0" w:oddVBand="0" w:evenVBand="0" w:oddHBand="1" w:evenHBand="0" w:firstRowFirstColumn="0" w:firstRowLastColumn="0" w:lastRowFirstColumn="0" w:lastRowLastColumn="0"/>
               <w:rPr>
-                <w:rFonts w:ascii="Sakkal Majalla" w:hAnsi="Sakkal Majalla" w:cs="Sakkal Majalla" w:hint="cs"/>
+                <w:rFonts w:ascii="Sakkal Majalla" w:hAnsi="Sakkal Majalla" w:cs="Sakkal Majalla"/>
               </w:rPr>
             </w:pPr>
             <w:r>
@@ -1730,7 +1730,7 @@
             <w:pPr>
               <w:cnfStyle w:val="000000100000" w:firstRow="0" w:lastRow="0" w:firstColumn="0" w:lastColumn="0" w:oddVBand="0" w:evenVBand="0" w:oddHBand="1" w:evenHBand="0" w:firstRowFirstColumn="0" w:firstRowLastColumn="0" w:lastRowFirstColumn="0" w:lastRowLastColumn="0"/>
               <w:rPr>
-                <w:rFonts w:ascii="Sakkal Majalla" w:hAnsi="Sakkal Majalla" w:cs="Sakkal Majalla" w:hint="cs"/>
+                <w:rFonts w:ascii="Sakkal Majalla" w:hAnsi="Sakkal Majalla" w:cs="Sakkal Majalla"/>
               </w:rPr>
             </w:pPr>
           </w:p>
@@ -1740,7 +1740,7 @@
     <w:p>
       <w:pPr>
         <w:rPr>
-          <w:rFonts w:ascii="Sakkal Majalla" w:hAnsi="Sakkal Majalla" w:cs="Sakkal Majalla" w:hint="cs"/>
+          <w:rFonts w:ascii="Sakkal Majalla" w:hAnsi="Sakkal Majalla" w:cs="Sakkal Majalla"/>
         </w:rPr>
       </w:pPr>
     </w:p>
@@ -1770,7 +1770,7 @@
             <w:pPr>
               <w:jc w:val="center"/>
               <w:rPr>
-                <w:rFonts w:ascii="Sakkal Majalla" w:hAnsi="Sakkal Majalla" w:cs="Sakkal Majalla" w:hint="cs"/>
+                <w:rFonts w:ascii="Sakkal Majalla" w:hAnsi="Sakkal Majalla" w:cs="Sakkal Majalla"/>
               </w:rPr>
             </w:pPr>
             <w:r>
@@ -1791,7 +1791,7 @@
               <w:jc w:val="center"/>
               <w:cnfStyle w:val="100000000000" w:firstRow="1" w:lastRow="0" w:firstColumn="0" w:lastColumn="0" w:oddVBand="0" w:evenVBand="0" w:oddHBand="0" w:evenHBand="0" w:firstRowFirstColumn="0" w:firstRowLastColumn="0" w:lastRowFirstColumn="0" w:lastRowLastColumn="0"/>
               <w:rPr>
-                <w:rFonts w:ascii="Sakkal Majalla" w:hAnsi="Sakkal Majalla" w:cs="Sakkal Majalla" w:hint="cs"/>
+                <w:rFonts w:ascii="Sakkal Majalla" w:hAnsi="Sakkal Majalla" w:cs="Sakkal Majalla"/>
               </w:rPr>
             </w:pPr>
             <w:r>
@@ -1811,7 +1811,7 @@
               <w:jc w:val="center"/>
               <w:cnfStyle w:val="100000000000" w:firstRow="1" w:lastRow="0" w:firstColumn="0" w:lastColumn="0" w:oddVBand="0" w:evenVBand="0" w:oddHBand="0" w:evenHBand="0" w:firstRowFirstColumn="0" w:firstRowLastColumn="0" w:lastRowFirstColumn="0" w:lastRowLastColumn="0"/>
               <w:rPr>
-                <w:rFonts w:ascii="Sakkal Majalla" w:hAnsi="Sakkal Majalla" w:cs="Sakkal Majalla" w:hint="cs"/>
+                <w:rFonts w:ascii="Sakkal Majalla" w:hAnsi="Sakkal Majalla" w:cs="Sakkal Majalla"/>
               </w:rPr>
             </w:pPr>
             <w:r>
@@ -1831,7 +1831,7 @@
               <w:jc w:val="center"/>
               <w:cnfStyle w:val="100000000000" w:firstRow="1" w:lastRow="0" w:firstColumn="0" w:lastColumn="0" w:oddVBand="0" w:evenVBand="0" w:oddHBand="0" w:evenHBand="0" w:firstRowFirstColumn="0" w:firstRowLastColumn="0" w:lastRowFirstColumn="0" w:lastRowLastColumn="0"/>
               <w:rPr>
-                <w:rFonts w:ascii="Sakkal Majalla" w:hAnsi="Sakkal Majalla" w:cs="Sakkal Majalla" w:hint="cs"/>
+                <w:rFonts w:ascii="Sakkal Majalla" w:hAnsi="Sakkal Majalla" w:cs="Sakkal Majalla"/>
               </w:rPr>
             </w:pPr>
             <w:r>
@@ -1856,7 +1856,7 @@
             <w:pPr>
               <w:jc w:val="center"/>
               <w:rPr>
-                <w:rFonts w:ascii="Sakkal Majalla" w:hAnsi="Sakkal Majalla" w:cs="Sakkal Majalla" w:hint="cs"/>
+                <w:rFonts w:ascii="Sakkal Majalla" w:hAnsi="Sakkal Majalla" w:cs="Sakkal Majalla"/>
               </w:rPr>
             </w:pPr>
             <w:r>
@@ -1875,7 +1875,7 @@
             <w:pPr>
               <w:cnfStyle w:val="000000100000" w:firstRow="0" w:lastRow="0" w:firstColumn="0" w:lastColumn="0" w:oddVBand="0" w:evenVBand="0" w:oddHBand="1" w:evenHBand="0" w:firstRowFirstColumn="0" w:firstRowLastColumn="0" w:lastRowFirstColumn="0" w:lastRowLastColumn="0"/>
               <w:rPr>
-                <w:rFonts w:ascii="Sakkal Majalla" w:hAnsi="Sakkal Majalla" w:cs="Sakkal Majalla" w:hint="cs"/>
+                <w:rFonts w:ascii="Sakkal Majalla" w:hAnsi="Sakkal Majalla" w:cs="Sakkal Majalla"/>
               </w:rPr>
             </w:pPr>
             <w:r>
@@ -1894,7 +1894,7 @@
               </w:numPr>
               <w:cnfStyle w:val="000000100000" w:firstRow="0" w:lastRow="0" w:firstColumn="0" w:lastColumn="0" w:oddVBand="0" w:evenVBand="0" w:oddHBand="1" w:evenHBand="0" w:firstRowFirstColumn="0" w:firstRowLastColumn="0" w:lastRowFirstColumn="0" w:lastRowLastColumn="0"/>
               <w:rPr>
-                <w:rFonts w:ascii="Sakkal Majalla" w:hAnsi="Sakkal Majalla" w:cs="Sakkal Majalla" w:hint="cs"/>
+                <w:rFonts w:ascii="Sakkal Majalla" w:hAnsi="Sakkal Majalla" w:cs="Sakkal Majalla"/>
               </w:rPr>
             </w:pPr>
             <w:r>
@@ -1927,7 +1927,7 @@
               </w:numPr>
               <w:cnfStyle w:val="000000100000" w:firstRow="0" w:lastRow="0" w:firstColumn="0" w:lastColumn="0" w:oddVBand="0" w:evenVBand="0" w:oddHBand="1" w:evenHBand="0" w:firstRowFirstColumn="0" w:firstRowLastColumn="0" w:lastRowFirstColumn="0" w:lastRowLastColumn="0"/>
               <w:rPr>
-                <w:rFonts w:ascii="Sakkal Majalla" w:hAnsi="Sakkal Majalla" w:cs="Sakkal Majalla" w:hint="cs"/>
+                <w:rFonts w:ascii="Sakkal Majalla" w:hAnsi="Sakkal Majalla" w:cs="Sakkal Majalla"/>
               </w:rPr>
             </w:pPr>
             <w:r>
@@ -1947,7 +1947,7 @@
               <w:jc w:val="center"/>
               <w:cnfStyle w:val="000000100000" w:firstRow="0" w:lastRow="0" w:firstColumn="0" w:lastColumn="0" w:oddVBand="0" w:evenVBand="0" w:oddHBand="1" w:evenHBand="0" w:firstRowFirstColumn="0" w:firstRowLastColumn="0" w:lastRowFirstColumn="0" w:lastRowLastColumn="0"/>
               <w:rPr>
-                <w:rFonts w:ascii="Sakkal Majalla" w:hAnsi="Sakkal Majalla" w:cs="Sakkal Majalla" w:hint="cs"/>
+                <w:rFonts w:ascii="Sakkal Majalla" w:hAnsi="Sakkal Majalla" w:cs="Sakkal Majalla"/>
               </w:rPr>
             </w:pPr>
             <w:r>
@@ -1966,7 +1966,7 @@
             <w:pPr>
               <w:cnfStyle w:val="000000100000" w:firstRow="0" w:lastRow="0" w:firstColumn="0" w:lastColumn="0" w:oddVBand="0" w:evenVBand="0" w:oddHBand="1" w:evenHBand="0" w:firstRowFirstColumn="0" w:firstRowLastColumn="0" w:lastRowFirstColumn="0" w:lastRowLastColumn="0"/>
               <w:rPr>
-                <w:rFonts w:ascii="Sakkal Majalla" w:hAnsi="Sakkal Majalla" w:cs="Sakkal Majalla" w:hint="cs"/>
+                <w:rFonts w:ascii="Sakkal Majalla" w:hAnsi="Sakkal Majalla" w:cs="Sakkal Majalla"/>
               </w:rPr>
             </w:pPr>
           </w:p>
@@ -1982,7 +1982,7 @@
             <w:pPr>
               <w:jc w:val="center"/>
               <w:rPr>
-                <w:rFonts w:ascii="Sakkal Majalla" w:hAnsi="Sakkal Majalla" w:cs="Sakkal Majalla" w:hint="cs"/>
+                <w:rFonts w:ascii="Sakkal Majalla" w:hAnsi="Sakkal Majalla" w:cs="Sakkal Majalla"/>
               </w:rPr>
             </w:pPr>
             <w:r>
@@ -2001,7 +2001,7 @@
             <w:pPr>
               <w:cnfStyle w:val="000000000000" w:firstRow="0" w:lastRow="0" w:firstColumn="0" w:lastColumn="0" w:oddVBand="0" w:evenVBand="0" w:oddHBand="0" w:evenHBand="0" w:firstRowFirstColumn="0" w:firstRowLastColumn="0" w:lastRowFirstColumn="0" w:lastRowLastColumn="0"/>
               <w:rPr>
-                <w:rFonts w:ascii="Sakkal Majalla" w:hAnsi="Sakkal Majalla" w:cs="Sakkal Majalla" w:hint="cs"/>
+                <w:rFonts w:ascii="Sakkal Majalla" w:hAnsi="Sakkal Majalla" w:cs="Sakkal Majalla"/>
               </w:rPr>
             </w:pPr>
             <w:r>
@@ -2020,7 +2020,7 @@
               </w:numPr>
               <w:cnfStyle w:val="000000000000" w:firstRow="0" w:lastRow="0" w:firstColumn="0" w:lastColumn="0" w:oddVBand="0" w:evenVBand="0" w:oddHBand="0" w:evenHBand="0" w:firstRowFirstColumn="0" w:firstRowLastColumn="0" w:lastRowFirstColumn="0" w:lastRowLastColumn="0"/>
               <w:rPr>
-                <w:rFonts w:ascii="Sakkal Majalla" w:hAnsi="Sakkal Majalla" w:cs="Sakkal Majalla" w:hint="cs"/>
+                <w:rFonts w:ascii="Sakkal Majalla" w:hAnsi="Sakkal Majalla" w:cs="Sakkal Majalla"/>
               </w:rPr>
             </w:pPr>
             <w:r>
@@ -2106,7 +2106,7 @@
               </w:numPr>
               <w:cnfStyle w:val="000000000000" w:firstRow="0" w:lastRow="0" w:firstColumn="0" w:lastColumn="0" w:oddVBand="0" w:evenVBand="0" w:oddHBand="0" w:evenHBand="0" w:firstRowFirstColumn="0" w:firstRowLastColumn="0" w:lastRowFirstColumn="0" w:lastRowLastColumn="0"/>
               <w:rPr>
-                <w:rFonts w:ascii="Sakkal Majalla" w:hAnsi="Sakkal Majalla" w:cs="Sakkal Majalla" w:hint="cs"/>
+                <w:rFonts w:ascii="Sakkal Majalla" w:hAnsi="Sakkal Majalla" w:cs="Sakkal Majalla"/>
               </w:rPr>
             </w:pPr>
             <w:r>
@@ -2126,7 +2126,7 @@
               <w:jc w:val="center"/>
               <w:cnfStyle w:val="000000000000" w:firstRow="0" w:lastRow="0" w:firstColumn="0" w:lastColumn="0" w:oddVBand="0" w:evenVBand="0" w:oddHBand="0" w:evenHBand="0" w:firstRowFirstColumn="0" w:firstRowLastColumn="0" w:lastRowFirstColumn="0" w:lastRowLastColumn="0"/>
               <w:rPr>
-                <w:rFonts w:ascii="Sakkal Majalla" w:hAnsi="Sakkal Majalla" w:cs="Sakkal Majalla" w:hint="cs"/>
+                <w:rFonts w:ascii="Sakkal Majalla" w:hAnsi="Sakkal Majalla" w:cs="Sakkal Majalla"/>
               </w:rPr>
             </w:pPr>
             <w:r>
@@ -2141,7 +2141,7 @@
               <w:jc w:val="center"/>
               <w:cnfStyle w:val="000000000000" w:firstRow="0" w:lastRow="0" w:firstColumn="0" w:lastColumn="0" w:oddVBand="0" w:evenVBand="0" w:oddHBand="0" w:evenHBand="0" w:firstRowFirstColumn="0" w:firstRowLastColumn="0" w:lastRowFirstColumn="0" w:lastRowLastColumn="0"/>
               <w:rPr>
-                <w:rFonts w:ascii="Sakkal Majalla" w:hAnsi="Sakkal Majalla" w:cs="Sakkal Majalla" w:hint="cs"/>
+                <w:rFonts w:ascii="Sakkal Majalla" w:hAnsi="Sakkal Majalla" w:cs="Sakkal Majalla"/>
               </w:rPr>
             </w:pPr>
             <w:r>
@@ -2184,7 +2184,7 @@
             <w:pPr>
               <w:cnfStyle w:val="000000000000" w:firstRow="0" w:lastRow="0" w:firstColumn="0" w:lastColumn="0" w:oddVBand="0" w:evenVBand="0" w:oddHBand="0" w:evenHBand="0" w:firstRowFirstColumn="0" w:firstRowLastColumn="0" w:lastRowFirstColumn="0" w:lastRowLastColumn="0"/>
               <w:rPr>
-                <w:rFonts w:ascii="Sakkal Majalla" w:hAnsi="Sakkal Majalla" w:cs="Sakkal Majalla" w:hint="cs"/>
+                <w:rFonts w:ascii="Sakkal Majalla" w:hAnsi="Sakkal Majalla" w:cs="Sakkal Majalla"/>
               </w:rPr>
             </w:pPr>
           </w:p>
@@ -2203,7 +2203,7 @@
             <w:pPr>
               <w:jc w:val="center"/>
               <w:rPr>
-                <w:rFonts w:ascii="Sakkal Majalla" w:hAnsi="Sakkal Majalla" w:cs="Sakkal Majalla" w:hint="cs"/>
+                <w:rFonts w:ascii="Sakkal Majalla" w:hAnsi="Sakkal Majalla" w:cs="Sakkal Majalla"/>
               </w:rPr>
             </w:pPr>
             <w:r>
@@ -2222,7 +2222,7 @@
             <w:pPr>
               <w:cnfStyle w:val="000000100000" w:firstRow="0" w:lastRow="0" w:firstColumn="0" w:lastColumn="0" w:oddVBand="0" w:evenVBand="0" w:oddHBand="1" w:evenHBand="0" w:firstRowFirstColumn="0" w:firstRowLastColumn="0" w:lastRowFirstColumn="0" w:lastRowLastColumn="0"/>
               <w:rPr>
-                <w:rFonts w:ascii="Sakkal Majalla" w:hAnsi="Sakkal Majalla" w:cs="Sakkal Majalla" w:hint="cs"/>
+                <w:rFonts w:ascii="Sakkal Majalla" w:hAnsi="Sakkal Majalla" w:cs="Sakkal Majalla"/>
               </w:rPr>
             </w:pPr>
             <w:r>
@@ -2242,7 +2242,7 @@
               <w:jc w:val="center"/>
               <w:cnfStyle w:val="000000100000" w:firstRow="0" w:lastRow="0" w:firstColumn="0" w:lastColumn="0" w:oddVBand="0" w:evenVBand="0" w:oddHBand="1" w:evenHBand="0" w:firstRowFirstColumn="0" w:firstRowLastColumn="0" w:lastRowFirstColumn="0" w:lastRowLastColumn="0"/>
               <w:rPr>
-                <w:rFonts w:ascii="Sakkal Majalla" w:hAnsi="Sakkal Majalla" w:cs="Sakkal Majalla" w:hint="cs"/>
+                <w:rFonts w:ascii="Sakkal Majalla" w:hAnsi="Sakkal Majalla" w:cs="Sakkal Majalla"/>
               </w:rPr>
             </w:pPr>
             <w:r>
@@ -2267,7 +2267,7 @@
             <w:pPr>
               <w:cnfStyle w:val="000000100000" w:firstRow="0" w:lastRow="0" w:firstColumn="0" w:lastColumn="0" w:oddVBand="0" w:evenVBand="0" w:oddHBand="1" w:evenHBand="0" w:firstRowFirstColumn="0" w:firstRowLastColumn="0" w:lastRowFirstColumn="0" w:lastRowLastColumn="0"/>
               <w:rPr>
-                <w:rFonts w:ascii="Sakkal Majalla" w:hAnsi="Sakkal Majalla" w:cs="Sakkal Majalla" w:hint="cs"/>
+                <w:rFonts w:ascii="Sakkal Majalla" w:hAnsi="Sakkal Majalla" w:cs="Sakkal Majalla"/>
               </w:rPr>
             </w:pPr>
           </w:p>
@@ -2286,7 +2286,7 @@
             <w:pPr>
               <w:jc w:val="center"/>
               <w:rPr>
-                <w:rFonts w:ascii="Sakkal Majalla" w:hAnsi="Sakkal Majalla" w:cs="Sakkal Majalla" w:hint="cs"/>
+                <w:rFonts w:ascii="Sakkal Majalla" w:hAnsi="Sakkal Majalla" w:cs="Sakkal Majalla"/>
               </w:rPr>
             </w:pPr>
             <w:r>
@@ -2305,7 +2305,7 @@
             <w:pPr>
               <w:cnfStyle w:val="000000000000" w:firstRow="0" w:lastRow="0" w:firstColumn="0" w:lastColumn="0" w:oddVBand="0" w:evenVBand="0" w:oddHBand="0" w:evenHBand="0" w:firstRowFirstColumn="0" w:firstRowLastColumn="0" w:lastRowFirstColumn="0" w:lastRowLastColumn="0"/>
               <w:rPr>
-                <w:rFonts w:ascii="Sakkal Majalla" w:hAnsi="Sakkal Majalla" w:cs="Sakkal Majalla" w:hint="cs"/>
+                <w:rFonts w:ascii="Sakkal Majalla" w:hAnsi="Sakkal Majalla" w:cs="Sakkal Majalla"/>
               </w:rPr>
             </w:pPr>
             <w:r>
@@ -2339,7 +2339,7 @@
               <w:jc w:val="center"/>
               <w:cnfStyle w:val="000000000000" w:firstRow="0" w:lastRow="0" w:firstColumn="0" w:lastColumn="0" w:oddVBand="0" w:evenVBand="0" w:oddHBand="0" w:evenHBand="0" w:firstRowFirstColumn="0" w:firstRowLastColumn="0" w:lastRowFirstColumn="0" w:lastRowLastColumn="0"/>
               <w:rPr>
-                <w:rFonts w:ascii="Sakkal Majalla" w:hAnsi="Sakkal Majalla" w:cs="Sakkal Majalla" w:hint="cs"/>
+                <w:rFonts w:ascii="Sakkal Majalla" w:hAnsi="Sakkal Majalla" w:cs="Sakkal Majalla"/>
               </w:rPr>
             </w:pPr>
             <w:r>
@@ -2358,7 +2358,7 @@
             <w:pPr>
               <w:cnfStyle w:val="000000000000" w:firstRow="0" w:lastRow="0" w:firstColumn="0" w:lastColumn="0" w:oddVBand="0" w:evenVBand="0" w:oddHBand="0" w:evenHBand="0" w:firstRowFirstColumn="0" w:firstRowLastColumn="0" w:lastRowFirstColumn="0" w:lastRowLastColumn="0"/>
               <w:rPr>
-                <w:rFonts w:ascii="Sakkal Majalla" w:hAnsi="Sakkal Majalla" w:cs="Sakkal Majalla" w:hint="cs"/>
+                <w:rFonts w:ascii="Sakkal Majalla" w:hAnsi="Sakkal Majalla" w:cs="Sakkal Majalla"/>
               </w:rPr>
             </w:pPr>
           </w:p>
@@ -2377,7 +2377,7 @@
             <w:pPr>
               <w:jc w:val="center"/>
               <w:rPr>
-                <w:rFonts w:ascii="Sakkal Majalla" w:hAnsi="Sakkal Majalla" w:cs="Sakkal Majalla" w:hint="cs"/>
+                <w:rFonts w:ascii="Sakkal Majalla" w:hAnsi="Sakkal Majalla" w:cs="Sakkal Majalla"/>
               </w:rPr>
             </w:pPr>
             <w:r>
@@ -2396,7 +2396,7 @@
             <w:pPr>
               <w:cnfStyle w:val="000000100000" w:firstRow="0" w:lastRow="0" w:firstColumn="0" w:lastColumn="0" w:oddVBand="0" w:evenVBand="0" w:oddHBand="1" w:evenHBand="0" w:firstRowFirstColumn="0" w:firstRowLastColumn="0" w:lastRowFirstColumn="0" w:lastRowLastColumn="0"/>
               <w:rPr>
-                <w:rFonts w:ascii="Sakkal Majalla" w:hAnsi="Sakkal Majalla" w:cs="Sakkal Majalla" w:hint="cs"/>
+                <w:rFonts w:ascii="Sakkal Majalla" w:hAnsi="Sakkal Majalla" w:cs="Sakkal Majalla"/>
               </w:rPr>
             </w:pPr>
             <w:r>
@@ -2416,7 +2416,7 @@
               <w:jc w:val="center"/>
               <w:cnfStyle w:val="000000100000" w:firstRow="0" w:lastRow="0" w:firstColumn="0" w:lastColumn="0" w:oddVBand="0" w:evenVBand="0" w:oddHBand="1" w:evenHBand="0" w:firstRowFirstColumn="0" w:firstRowLastColumn="0" w:lastRowFirstColumn="0" w:lastRowLastColumn="0"/>
               <w:rPr>
-                <w:rFonts w:ascii="Sakkal Majalla" w:hAnsi="Sakkal Majalla" w:cs="Sakkal Majalla" w:hint="cs"/>
+                <w:rFonts w:ascii="Sakkal Majalla" w:hAnsi="Sakkal Majalla" w:cs="Sakkal Majalla"/>
               </w:rPr>
             </w:pPr>
             <w:hyperlink r:id="rId5" w:history="1">
@@ -2434,7 +2434,7 @@
               <w:jc w:val="center"/>
               <w:cnfStyle w:val="000000100000" w:firstRow="0" w:lastRow="0" w:firstColumn="0" w:lastColumn="0" w:oddVBand="0" w:evenVBand="0" w:oddHBand="1" w:evenHBand="0" w:firstRowFirstColumn="0" w:firstRowLastColumn="0" w:lastRowFirstColumn="0" w:lastRowLastColumn="0"/>
               <w:rPr>
-                <w:rFonts w:ascii="Sakkal Majalla" w:hAnsi="Sakkal Majalla" w:cs="Sakkal Majalla" w:hint="cs"/>
+                <w:rFonts w:ascii="Sakkal Majalla" w:hAnsi="Sakkal Majalla" w:cs="Sakkal Majalla"/>
               </w:rPr>
             </w:pPr>
             <w:hyperlink r:id="rId6" w:history="1">
@@ -2468,7 +2468,7 @@
               <w:jc w:val="center"/>
               <w:cnfStyle w:val="000000100000" w:firstRow="0" w:lastRow="0" w:firstColumn="0" w:lastColumn="0" w:oddVBand="0" w:evenVBand="0" w:oddHBand="1" w:evenHBand="0" w:firstRowFirstColumn="0" w:firstRowLastColumn="0" w:lastRowFirstColumn="0" w:lastRowLastColumn="0"/>
               <w:rPr>
-                <w:rFonts w:ascii="Sakkal Majalla" w:hAnsi="Sakkal Majalla" w:cs="Sakkal Majalla" w:hint="cs"/>
+                <w:rFonts w:ascii="Sakkal Majalla" w:hAnsi="Sakkal Majalla" w:cs="Sakkal Majalla"/>
               </w:rPr>
             </w:pPr>
             <w:hyperlink r:id="rId7" w:history="1">
@@ -2486,7 +2486,7 @@
               <w:jc w:val="center"/>
               <w:cnfStyle w:val="000000100000" w:firstRow="0" w:lastRow="0" w:firstColumn="0" w:lastColumn="0" w:oddVBand="0" w:evenVBand="0" w:oddHBand="1" w:evenHBand="0" w:firstRowFirstColumn="0" w:firstRowLastColumn="0" w:lastRowFirstColumn="0" w:lastRowLastColumn="0"/>
               <w:rPr>
-                <w:rFonts w:ascii="Sakkal Majalla" w:hAnsi="Sakkal Majalla" w:cs="Sakkal Majalla" w:hint="cs"/>
+                <w:rFonts w:ascii="Sakkal Majalla" w:hAnsi="Sakkal Majalla" w:cs="Sakkal Majalla"/>
               </w:rPr>
             </w:pPr>
             <w:hyperlink r:id="rId8" w:history="1">
@@ -2520,7 +2520,7 @@
               <w:jc w:val="center"/>
               <w:cnfStyle w:val="000000100000" w:firstRow="0" w:lastRow="0" w:firstColumn="0" w:lastColumn="0" w:oddVBand="0" w:evenVBand="0" w:oddHBand="1" w:evenHBand="0" w:firstRowFirstColumn="0" w:firstRowLastColumn="0" w:lastRowFirstColumn="0" w:lastRowLastColumn="0"/>
               <w:rPr>
-                <w:rFonts w:ascii="Sakkal Majalla" w:hAnsi="Sakkal Majalla" w:cs="Sakkal Majalla" w:hint="cs"/>
+                <w:rFonts w:ascii="Sakkal Majalla" w:hAnsi="Sakkal Majalla" w:cs="Sakkal Majalla"/>
               </w:rPr>
             </w:pPr>
             <w:hyperlink r:id="rId9" w:history="1">
@@ -2542,7 +2542,7 @@
             <w:pPr>
               <w:cnfStyle w:val="000000100000" w:firstRow="0" w:lastRow="0" w:firstColumn="0" w:lastColumn="0" w:oddVBand="0" w:evenVBand="0" w:oddHBand="1" w:evenHBand="0" w:firstRowFirstColumn="0" w:firstRowLastColumn="0" w:lastRowFirstColumn="0" w:lastRowLastColumn="0"/>
               <w:rPr>
-                <w:rFonts w:ascii="Sakkal Majalla" w:hAnsi="Sakkal Majalla" w:cs="Sakkal Majalla" w:hint="cs"/>
+                <w:rFonts w:ascii="Sakkal Majalla" w:hAnsi="Sakkal Majalla" w:cs="Sakkal Majalla"/>
               </w:rPr>
             </w:pPr>
           </w:p>
@@ -2558,7 +2558,7 @@
             <w:pPr>
               <w:jc w:val="center"/>
               <w:rPr>
-                <w:rFonts w:ascii="Sakkal Majalla" w:hAnsi="Sakkal Majalla" w:cs="Sakkal Majalla" w:hint="cs"/>
+                <w:rFonts w:ascii="Sakkal Majalla" w:hAnsi="Sakkal Majalla" w:cs="Sakkal Majalla"/>
               </w:rPr>
             </w:pPr>
             <w:r>
@@ -2577,7 +2577,7 @@
             <w:pPr>
               <w:cnfStyle w:val="000000000000" w:firstRow="0" w:lastRow="0" w:firstColumn="0" w:lastColumn="0" w:oddVBand="0" w:evenVBand="0" w:oddHBand="0" w:evenHBand="0" w:firstRowFirstColumn="0" w:firstRowLastColumn="0" w:lastRowFirstColumn="0" w:lastRowLastColumn="0"/>
               <w:rPr>
-                <w:rFonts w:ascii="Sakkal Majalla" w:hAnsi="Sakkal Majalla" w:cs="Sakkal Majalla" w:hint="cs"/>
+                <w:rFonts w:ascii="Sakkal Majalla" w:hAnsi="Sakkal Majalla" w:cs="Sakkal Majalla"/>
               </w:rPr>
             </w:pPr>
             <w:r>
@@ -2597,7 +2597,7 @@
               <w:jc w:val="center"/>
               <w:cnfStyle w:val="000000000000" w:firstRow="0" w:lastRow="0" w:firstColumn="0" w:lastColumn="0" w:oddVBand="0" w:evenVBand="0" w:oddHBand="0" w:evenHBand="0" w:firstRowFirstColumn="0" w:firstRowLastColumn="0" w:lastRowFirstColumn="0" w:lastRowLastColumn="0"/>
               <w:rPr>
-                <w:rFonts w:ascii="Sakkal Majalla" w:hAnsi="Sakkal Majalla" w:cs="Sakkal Majalla" w:hint="cs"/>
+                <w:rFonts w:ascii="Sakkal Majalla" w:hAnsi="Sakkal Majalla" w:cs="Sakkal Majalla"/>
               </w:rPr>
             </w:pPr>
             <w:hyperlink r:id="rId10" w:history="1">
@@ -2615,7 +2615,7 @@
               <w:jc w:val="center"/>
               <w:cnfStyle w:val="000000000000" w:firstRow="0" w:lastRow="0" w:firstColumn="0" w:lastColumn="0" w:oddVBand="0" w:evenVBand="0" w:oddHBand="0" w:evenHBand="0" w:firstRowFirstColumn="0" w:firstRowLastColumn="0" w:lastRowFirstColumn="0" w:lastRowLastColumn="0"/>
               <w:rPr>
-                <w:rFonts w:ascii="Sakkal Majalla" w:hAnsi="Sakkal Majalla" w:cs="Sakkal Majalla" w:hint="cs"/>
+                <w:rFonts w:ascii="Sakkal Majalla" w:hAnsi="Sakkal Majalla" w:cs="Sakkal Majalla"/>
               </w:rPr>
             </w:pPr>
             <w:hyperlink r:id="rId11" w:history="1">
@@ -2633,7 +2633,7 @@
               <w:jc w:val="center"/>
               <w:cnfStyle w:val="000000000000" w:firstRow="0" w:lastRow="0" w:firstColumn="0" w:lastColumn="0" w:oddVBand="0" w:evenVBand="0" w:oddHBand="0" w:evenHBand="0" w:firstRowFirstColumn="0" w:firstRowLastColumn="0" w:lastRowFirstColumn="0" w:lastRowLastColumn="0"/>
               <w:rPr>
-                <w:rFonts w:ascii="Sakkal Majalla" w:hAnsi="Sakkal Majalla" w:cs="Sakkal Majalla" w:hint="cs"/>
+                <w:rFonts w:ascii="Sakkal Majalla" w:hAnsi="Sakkal Majalla" w:cs="Sakkal Majalla"/>
               </w:rPr>
             </w:pPr>
           </w:p>
@@ -2646,7 +2646,7 @@
             <w:pPr>
               <w:cnfStyle w:val="000000000000" w:firstRow="0" w:lastRow="0" w:firstColumn="0" w:lastColumn="0" w:oddVBand="0" w:evenVBand="0" w:oddHBand="0" w:evenHBand="0" w:firstRowFirstColumn="0" w:firstRowLastColumn="0" w:lastRowFirstColumn="0" w:lastRowLastColumn="0"/>
               <w:rPr>
-                <w:rFonts w:ascii="Sakkal Majalla" w:hAnsi="Sakkal Majalla" w:cs="Sakkal Majalla" w:hint="cs"/>
+                <w:rFonts w:ascii="Sakkal Majalla" w:hAnsi="Sakkal Majalla" w:cs="Sakkal Majalla"/>
               </w:rPr>
             </w:pPr>
           </w:p>
@@ -2665,7 +2665,7 @@
             <w:pPr>
               <w:jc w:val="center"/>
               <w:rPr>
-                <w:rFonts w:ascii="Sakkal Majalla" w:hAnsi="Sakkal Majalla" w:cs="Sakkal Majalla" w:hint="cs"/>
+                <w:rFonts w:ascii="Sakkal Majalla" w:hAnsi="Sakkal Majalla" w:cs="Sakkal Majalla"/>
               </w:rPr>
             </w:pPr>
             <w:r>
@@ -2684,7 +2684,7 @@
             <w:pPr>
               <w:cnfStyle w:val="000000100000" w:firstRow="0" w:lastRow="0" w:firstColumn="0" w:lastColumn="0" w:oddVBand="0" w:evenVBand="0" w:oddHBand="1" w:evenHBand="0" w:firstRowFirstColumn="0" w:firstRowLastColumn="0" w:lastRowFirstColumn="0" w:lastRowLastColumn="0"/>
               <w:rPr>
-                <w:rFonts w:ascii="Sakkal Majalla" w:hAnsi="Sakkal Majalla" w:cs="Sakkal Majalla" w:hint="cs"/>
+                <w:rFonts w:ascii="Sakkal Majalla" w:hAnsi="Sakkal Majalla" w:cs="Sakkal Majalla"/>
               </w:rPr>
             </w:pPr>
             <w:r>
@@ -2704,7 +2704,7 @@
               <w:jc w:val="center"/>
               <w:cnfStyle w:val="000000100000" w:firstRow="0" w:lastRow="0" w:firstColumn="0" w:lastColumn="0" w:oddVBand="0" w:evenVBand="0" w:oddHBand="1" w:evenHBand="0" w:firstRowFirstColumn="0" w:firstRowLastColumn="0" w:lastRowFirstColumn="0" w:lastRowLastColumn="0"/>
               <w:rPr>
-                <w:rFonts w:ascii="Sakkal Majalla" w:hAnsi="Sakkal Majalla" w:cs="Sakkal Majalla" w:hint="cs"/>
+                <w:rFonts w:ascii="Sakkal Majalla" w:hAnsi="Sakkal Majalla" w:cs="Sakkal Majalla"/>
               </w:rPr>
             </w:pPr>
           </w:p>
@@ -2717,7 +2717,7 @@
             <w:pPr>
               <w:cnfStyle w:val="000000100000" w:firstRow="0" w:lastRow="0" w:firstColumn="0" w:lastColumn="0" w:oddVBand="0" w:evenVBand="0" w:oddHBand="1" w:evenHBand="0" w:firstRowFirstColumn="0" w:firstRowLastColumn="0" w:lastRowFirstColumn="0" w:lastRowLastColumn="0"/>
               <w:rPr>
-                <w:rFonts w:ascii="Sakkal Majalla" w:hAnsi="Sakkal Majalla" w:cs="Sakkal Majalla" w:hint="cs"/>
+                <w:rFonts w:ascii="Sakkal Majalla" w:hAnsi="Sakkal Majalla" w:cs="Sakkal Majalla"/>
               </w:rPr>
             </w:pPr>
           </w:p>
@@ -2733,7 +2733,7 @@
             <w:pPr>
               <w:jc w:val="center"/>
               <w:rPr>
-                <w:rFonts w:ascii="Sakkal Majalla" w:hAnsi="Sakkal Majalla" w:cs="Sakkal Majalla" w:hint="cs"/>
+                <w:rFonts w:ascii="Sakkal Majalla" w:hAnsi="Sakkal Majalla" w:cs="Sakkal Majalla"/>
               </w:rPr>
             </w:pPr>
             <w:r>
@@ -2752,7 +2752,7 @@
             <w:pPr>
               <w:cnfStyle w:val="000000000000" w:firstRow="0" w:lastRow="0" w:firstColumn="0" w:lastColumn="0" w:oddVBand="0" w:evenVBand="0" w:oddHBand="0" w:evenHBand="0" w:firstRowFirstColumn="0" w:firstRowLastColumn="0" w:lastRowFirstColumn="0" w:lastRowLastColumn="0"/>
               <w:rPr>
-                <w:rFonts w:ascii="Sakkal Majalla" w:hAnsi="Sakkal Majalla" w:cs="Sakkal Majalla" w:hint="cs"/>
+                <w:rFonts w:ascii="Sakkal Majalla" w:hAnsi="Sakkal Majalla" w:cs="Sakkal Majalla"/>
               </w:rPr>
             </w:pPr>
             <w:r>
@@ -2786,7 +2786,7 @@
               <w:jc w:val="center"/>
               <w:cnfStyle w:val="000000000000" w:firstRow="0" w:lastRow="0" w:firstColumn="0" w:lastColumn="0" w:oddVBand="0" w:evenVBand="0" w:oddHBand="0" w:evenHBand="0" w:firstRowFirstColumn="0" w:firstRowLastColumn="0" w:lastRowFirstColumn="0" w:lastRowLastColumn="0"/>
               <w:rPr>
-                <w:rFonts w:ascii="Sakkal Majalla" w:hAnsi="Sakkal Majalla" w:cs="Sakkal Majalla" w:hint="cs"/>
+                <w:rFonts w:ascii="Sakkal Majalla" w:hAnsi="Sakkal Majalla" w:cs="Sakkal Majalla"/>
               </w:rPr>
             </w:pPr>
             <w:hyperlink r:id="rId12" w:history="1">
@@ -2808,7 +2808,7 @@
             <w:pPr>
               <w:cnfStyle w:val="000000000000" w:firstRow="0" w:lastRow="0" w:firstColumn="0" w:lastColumn="0" w:oddVBand="0" w:evenVBand="0" w:oddHBand="0" w:evenHBand="0" w:firstRowFirstColumn="0" w:firstRowLastColumn="0" w:lastRowFirstColumn="0" w:lastRowLastColumn="0"/>
               <w:rPr>
-                <w:rFonts w:ascii="Sakkal Majalla" w:hAnsi="Sakkal Majalla" w:cs="Sakkal Majalla" w:hint="cs"/>
+                <w:rFonts w:ascii="Sakkal Majalla" w:hAnsi="Sakkal Majalla" w:cs="Sakkal Majalla"/>
               </w:rPr>
             </w:pPr>
           </w:p>
@@ -2827,7 +2827,7 @@
             <w:pPr>
               <w:jc w:val="center"/>
               <w:rPr>
-                <w:rFonts w:ascii="Sakkal Majalla" w:hAnsi="Sakkal Majalla" w:cs="Sakkal Majalla" w:hint="cs"/>
+                <w:rFonts w:ascii="Sakkal Majalla" w:hAnsi="Sakkal Majalla" w:cs="Sakkal Majalla"/>
               </w:rPr>
             </w:pPr>
             <w:r>
@@ -2846,7 +2846,7 @@
             <w:pPr>
               <w:cnfStyle w:val="000000100000" w:firstRow="0" w:lastRow="0" w:firstColumn="0" w:lastColumn="0" w:oddVBand="0" w:evenVBand="0" w:oddHBand="1" w:evenHBand="0" w:firstRowFirstColumn="0" w:firstRowLastColumn="0" w:lastRowFirstColumn="0" w:lastRowLastColumn="0"/>
               <w:rPr>
-                <w:rFonts w:ascii="Sakkal Majalla" w:hAnsi="Sakkal Majalla" w:cs="Sakkal Majalla" w:hint="cs"/>
+                <w:rFonts w:ascii="Sakkal Majalla" w:hAnsi="Sakkal Majalla" w:cs="Sakkal Majalla"/>
               </w:rPr>
             </w:pPr>
             <w:r>
@@ -2866,7 +2866,7 @@
               <w:jc w:val="center"/>
               <w:cnfStyle w:val="000000100000" w:firstRow="0" w:lastRow="0" w:firstColumn="0" w:lastColumn="0" w:oddVBand="0" w:evenVBand="0" w:oddHBand="1" w:evenHBand="0" w:firstRowFirstColumn="0" w:firstRowLastColumn="0" w:lastRowFirstColumn="0" w:lastRowLastColumn="0"/>
               <w:rPr>
-                <w:rFonts w:ascii="Sakkal Majalla" w:hAnsi="Sakkal Majalla" w:cs="Sakkal Majalla" w:hint="cs"/>
+                <w:rFonts w:ascii="Sakkal Majalla" w:hAnsi="Sakkal Majalla" w:cs="Sakkal Majalla"/>
               </w:rPr>
             </w:pPr>
             <w:hyperlink r:id="rId13" w:history="1">
@@ -2902,7 +2902,7 @@
             <w:pPr>
               <w:cnfStyle w:val="000000100000" w:firstRow="0" w:lastRow="0" w:firstColumn="0" w:lastColumn="0" w:oddVBand="0" w:evenVBand="0" w:oddHBand="1" w:evenHBand="0" w:firstRowFirstColumn="0" w:firstRowLastColumn="0" w:lastRowFirstColumn="0" w:lastRowLastColumn="0"/>
               <w:rPr>
-                <w:rFonts w:ascii="Sakkal Majalla" w:hAnsi="Sakkal Majalla" w:cs="Sakkal Majalla" w:hint="cs"/>
+                <w:rFonts w:ascii="Sakkal Majalla" w:hAnsi="Sakkal Majalla" w:cs="Sakkal Majalla"/>
               </w:rPr>
             </w:pPr>
           </w:p>
@@ -2918,7 +2918,7 @@
             <w:pPr>
               <w:jc w:val="center"/>
               <w:rPr>
-                <w:rFonts w:ascii="Sakkal Majalla" w:hAnsi="Sakkal Majalla" w:cs="Sakkal Majalla" w:hint="cs"/>
+                <w:rFonts w:ascii="Sakkal Majalla" w:hAnsi="Sakkal Majalla" w:cs="Sakkal Majalla"/>
               </w:rPr>
             </w:pPr>
             <w:r>
@@ -2937,7 +2937,7 @@
             <w:pPr>
               <w:cnfStyle w:val="000000000000" w:firstRow="0" w:lastRow="0" w:firstColumn="0" w:lastColumn="0" w:oddVBand="0" w:evenVBand="0" w:oddHBand="0" w:evenHBand="0" w:firstRowFirstColumn="0" w:firstRowLastColumn="0" w:lastRowFirstColumn="0" w:lastRowLastColumn="0"/>
               <w:rPr>
-                <w:rFonts w:ascii="Sakkal Majalla" w:hAnsi="Sakkal Majalla" w:cs="Sakkal Majalla" w:hint="cs"/>
+                <w:rFonts w:ascii="Sakkal Majalla" w:hAnsi="Sakkal Majalla" w:cs="Sakkal Majalla"/>
               </w:rPr>
             </w:pPr>
             <w:r>
@@ -2957,7 +2957,7 @@
               <w:jc w:val="center"/>
               <w:cnfStyle w:val="000000000000" w:firstRow="0" w:lastRow="0" w:firstColumn="0" w:lastColumn="0" w:oddVBand="0" w:evenVBand="0" w:oddHBand="0" w:evenHBand="0" w:firstRowFirstColumn="0" w:firstRowLastColumn="0" w:lastRowFirstColumn="0" w:lastRowLastColumn="0"/>
               <w:rPr>
-                <w:rFonts w:ascii="Sakkal Majalla" w:hAnsi="Sakkal Majalla" w:cs="Sakkal Majalla" w:hint="cs"/>
+                <w:rFonts w:ascii="Sakkal Majalla" w:hAnsi="Sakkal Majalla" w:cs="Sakkal Majalla"/>
               </w:rPr>
             </w:pPr>
             <w:hyperlink r:id="rId14" w:history="1">
@@ -2979,7 +2979,7 @@
             <w:pPr>
               <w:cnfStyle w:val="000000000000" w:firstRow="0" w:lastRow="0" w:firstColumn="0" w:lastColumn="0" w:oddVBand="0" w:evenVBand="0" w:oddHBand="0" w:evenHBand="0" w:firstRowFirstColumn="0" w:firstRowLastColumn="0" w:lastRowFirstColumn="0" w:lastRowLastColumn="0"/>
               <w:rPr>
-                <w:rFonts w:ascii="Sakkal Majalla" w:hAnsi="Sakkal Majalla" w:cs="Sakkal Majalla" w:hint="cs"/>
+                <w:rFonts w:ascii="Sakkal Majalla" w:hAnsi="Sakkal Majalla" w:cs="Sakkal Majalla"/>
               </w:rPr>
             </w:pPr>
           </w:p>
@@ -2998,7 +2998,7 @@
             <w:pPr>
               <w:jc w:val="center"/>
               <w:rPr>
-                <w:rFonts w:ascii="Sakkal Majalla" w:hAnsi="Sakkal Majalla" w:cs="Sakkal Majalla" w:hint="cs"/>
+                <w:rFonts w:ascii="Sakkal Majalla" w:hAnsi="Sakkal Majalla" w:cs="Sakkal Majalla"/>
               </w:rPr>
             </w:pPr>
             <w:r>
@@ -3017,7 +3017,7 @@
             <w:pPr>
               <w:cnfStyle w:val="000000100000" w:firstRow="0" w:lastRow="0" w:firstColumn="0" w:lastColumn="0" w:oddVBand="0" w:evenVBand="0" w:oddHBand="1" w:evenHBand="0" w:firstRowFirstColumn="0" w:firstRowLastColumn="0" w:lastRowFirstColumn="0" w:lastRowLastColumn="0"/>
               <w:rPr>
-                <w:rFonts w:ascii="Sakkal Majalla" w:hAnsi="Sakkal Majalla" w:cs="Sakkal Majalla" w:hint="cs"/>
+                <w:rFonts w:ascii="Sakkal Majalla" w:hAnsi="Sakkal Majalla" w:cs="Sakkal Majalla"/>
               </w:rPr>
             </w:pPr>
             <w:r>
@@ -3051,7 +3051,7 @@
               <w:jc w:val="center"/>
               <w:cnfStyle w:val="000000100000" w:firstRow="0" w:lastRow="0" w:firstColumn="0" w:lastColumn="0" w:oddVBand="0" w:evenVBand="0" w:oddHBand="1" w:evenHBand="0" w:firstRowFirstColumn="0" w:firstRowLastColumn="0" w:lastRowFirstColumn="0" w:lastRowLastColumn="0"/>
               <w:rPr>
-                <w:rFonts w:ascii="Sakkal Majalla" w:hAnsi="Sakkal Majalla" w:cs="Sakkal Majalla" w:hint="cs"/>
+                <w:rFonts w:ascii="Sakkal Majalla" w:hAnsi="Sakkal Majalla" w:cs="Sakkal Majalla"/>
               </w:rPr>
             </w:pPr>
             <w:r>
@@ -3070,7 +3070,75 @@
             <w:pPr>
               <w:cnfStyle w:val="000000100000" w:firstRow="0" w:lastRow="0" w:firstColumn="0" w:lastColumn="0" w:oddVBand="0" w:evenVBand="0" w:oddHBand="1" w:evenHBand="0" w:firstRowFirstColumn="0" w:firstRowLastColumn="0" w:lastRowFirstColumn="0" w:lastRowLastColumn="0"/>
               <w:rPr>
-                <w:rFonts w:ascii="Sakkal Majalla" w:hAnsi="Sakkal Majalla" w:cs="Sakkal Majalla" w:hint="cs"/>
+                <w:rFonts w:ascii="Sakkal Majalla" w:hAnsi="Sakkal Majalla" w:cs="Sakkal Majalla"/>
+              </w:rPr>
+            </w:pPr>
+          </w:p>
+        </w:tc>
+      </w:tr>
+      <w:tr>
+        <w:tc>
+          <w:tcPr>
+            <w:cnfStyle w:val="001000000000" w:firstRow="0" w:lastRow="0" w:firstColumn="1" w:lastColumn="0" w:oddVBand="0" w:evenVBand="0" w:oddHBand="0" w:evenHBand="0" w:firstRowFirstColumn="0" w:firstRowLastColumn="0" w:lastRowFirstColumn="0" w:lastRowLastColumn="0"/>
+            <w:tcW w:w="810" w:type="dxa"/>
+          </w:tcPr>
+          <w:p>
+            <w:pPr>
+              <w:jc w:val="center"/>
+              <w:rPr>
+                <w:rFonts w:ascii="Sakkal Majalla" w:hAnsi="Sakkal Majalla" w:cs="Sakkal Majalla"/>
+              </w:rPr>
+            </w:pPr>
+            <w:r>
+              <w:rPr>
+                <w:rFonts w:ascii="Sakkal Majalla" w:hAnsi="Sakkal Majalla" w:cs="Sakkal Majalla"/>
+              </w:rPr>
+              <w:t>27</w:t>
+            </w:r>
+          </w:p>
+        </w:tc>
+        <w:tc>
+          <w:tcPr>
+            <w:tcW w:w="5400" w:type="dxa"/>
+          </w:tcPr>
+          <w:p>
+            <w:pPr>
+              <w:cnfStyle w:val="000000000000" w:firstRow="0" w:lastRow="0" w:firstColumn="0" w:lastColumn="0" w:oddVBand="0" w:evenVBand="0" w:oddHBand="0" w:evenHBand="0" w:firstRowFirstColumn="0" w:firstRowLastColumn="0" w:lastRowFirstColumn="0" w:lastRowLastColumn="0"/>
+              <w:rPr>
+                <w:rFonts w:ascii="Sakkal Majalla" w:hAnsi="Sakkal Majalla" w:cs="Sakkal Majalla"/>
+              </w:rPr>
+            </w:pPr>
+            <w:r>
+              <w:rPr>
+                <w:rFonts w:ascii="Sakkal Majalla" w:hAnsi="Sakkal Majalla" w:cs="Sakkal Majalla"/>
+              </w:rPr>
+              <w:t>VS Code Recipes</w:t>
+            </w:r>
+          </w:p>
+        </w:tc>
+        <w:tc>
+          <w:tcPr>
+            <w:tcW w:w="4860" w:type="dxa"/>
+          </w:tcPr>
+          <w:p>
+            <w:pPr>
+              <w:jc w:val="center"/>
+              <w:cnfStyle w:val="000000000000" w:firstRow="0" w:lastRow="0" w:firstColumn="0" w:lastColumn="0" w:oddVBand="0" w:evenVBand="0" w:oddHBand="0" w:evenHBand="0" w:firstRowFirstColumn="0" w:firstRowLastColumn="0" w:lastRowFirstColumn="0" w:lastRowLastColumn="0"/>
+              <w:rPr>
+                <w:rFonts w:ascii="Sakkal Majalla" w:hAnsi="Sakkal Majalla" w:cs="Sakkal Majalla"/>
+              </w:rPr>
+            </w:pPr>
+          </w:p>
+        </w:tc>
+        <w:tc>
+          <w:tcPr>
+            <w:tcW w:w="990" w:type="dxa"/>
+          </w:tcPr>
+          <w:p>
+            <w:pPr>
+              <w:cnfStyle w:val="000000000000" w:firstRow="0" w:lastRow="0" w:firstColumn="0" w:lastColumn="0" w:oddVBand="0" w:evenVBand="0" w:oddHBand="0" w:evenHBand="0" w:firstRowFirstColumn="0" w:firstRowLastColumn="0" w:lastRowFirstColumn="0" w:lastRowLastColumn="0"/>
+              <w:rPr>
+                <w:rFonts w:ascii="Sakkal Majalla" w:hAnsi="Sakkal Majalla" w:cs="Sakkal Majalla"/>
               </w:rPr>
             </w:pPr>
           </w:p>
@@ -3080,35 +3148,35 @@
     <w:p>
       <w:pPr>
         <w:rPr>
-          <w:rFonts w:ascii="Sakkal Majalla" w:hAnsi="Sakkal Majalla" w:cs="Sakkal Majalla" w:hint="cs"/>
+          <w:rFonts w:ascii="Sakkal Majalla" w:hAnsi="Sakkal Majalla" w:cs="Sakkal Majalla"/>
         </w:rPr>
       </w:pPr>
     </w:p>
     <w:p>
       <w:pPr>
         <w:rPr>
-          <w:rFonts w:ascii="Sakkal Majalla" w:hAnsi="Sakkal Majalla" w:cs="Sakkal Majalla" w:hint="cs"/>
+          <w:rFonts w:ascii="Sakkal Majalla" w:hAnsi="Sakkal Majalla" w:cs="Sakkal Majalla"/>
         </w:rPr>
       </w:pPr>
     </w:p>
     <w:p>
       <w:pPr>
         <w:rPr>
-          <w:rFonts w:ascii="Sakkal Majalla" w:hAnsi="Sakkal Majalla" w:cs="Sakkal Majalla" w:hint="cs"/>
+          <w:rFonts w:ascii="Sakkal Majalla" w:hAnsi="Sakkal Majalla" w:cs="Sakkal Majalla"/>
         </w:rPr>
       </w:pPr>
     </w:p>
     <w:p>
       <w:pPr>
         <w:rPr>
-          <w:rFonts w:ascii="Sakkal Majalla" w:hAnsi="Sakkal Majalla" w:cs="Sakkal Majalla" w:hint="cs"/>
+          <w:rFonts w:ascii="Sakkal Majalla" w:hAnsi="Sakkal Majalla" w:cs="Sakkal Majalla"/>
         </w:rPr>
       </w:pPr>
     </w:p>
     <w:p>
       <w:pPr>
         <w:rPr>
-          <w:rFonts w:ascii="Sakkal Majalla" w:hAnsi="Sakkal Majalla" w:cs="Sakkal Majalla" w:hint="cs"/>
+          <w:rFonts w:ascii="Sakkal Majalla" w:hAnsi="Sakkal Majalla" w:cs="Sakkal Majalla"/>
         </w:rPr>
       </w:pPr>
     </w:p>
@@ -3137,7 +3205,7 @@
             <w:pPr>
               <w:jc w:val="center"/>
               <w:rPr>
-                <w:rFonts w:ascii="Sakkal Majalla" w:hAnsi="Sakkal Majalla" w:cs="Sakkal Majalla" w:hint="cs"/>
+                <w:rFonts w:ascii="Sakkal Majalla" w:hAnsi="Sakkal Majalla" w:cs="Sakkal Majalla"/>
               </w:rPr>
             </w:pPr>
             <w:r>
@@ -3157,7 +3225,7 @@
               <w:jc w:val="center"/>
               <w:cnfStyle w:val="100000000000" w:firstRow="1" w:lastRow="0" w:firstColumn="0" w:lastColumn="0" w:oddVBand="0" w:evenVBand="0" w:oddHBand="0" w:evenHBand="0" w:firstRowFirstColumn="0" w:firstRowLastColumn="0" w:lastRowFirstColumn="0" w:lastRowLastColumn="0"/>
               <w:rPr>
-                <w:rFonts w:ascii="Sakkal Majalla" w:hAnsi="Sakkal Majalla" w:cs="Sakkal Majalla" w:hint="cs"/>
+                <w:rFonts w:ascii="Sakkal Majalla" w:hAnsi="Sakkal Majalla" w:cs="Sakkal Majalla"/>
               </w:rPr>
             </w:pPr>
             <w:r>
@@ -3177,7 +3245,7 @@
               <w:jc w:val="center"/>
               <w:cnfStyle w:val="100000000000" w:firstRow="1" w:lastRow="0" w:firstColumn="0" w:lastColumn="0" w:oddVBand="0" w:evenVBand="0" w:oddHBand="0" w:evenHBand="0" w:firstRowFirstColumn="0" w:firstRowLastColumn="0" w:lastRowFirstColumn="0" w:lastRowLastColumn="0"/>
               <w:rPr>
-                <w:rFonts w:ascii="Sakkal Majalla" w:hAnsi="Sakkal Majalla" w:cs="Sakkal Majalla" w:hint="cs"/>
+                <w:rFonts w:ascii="Sakkal Majalla" w:hAnsi="Sakkal Majalla" w:cs="Sakkal Majalla"/>
               </w:rPr>
             </w:pPr>
             <w:r>
@@ -3199,7 +3267,7 @@
             <w:pPr>
               <w:jc w:val="center"/>
               <w:rPr>
-                <w:rFonts w:ascii="Sakkal Majalla" w:hAnsi="Sakkal Majalla" w:cs="Sakkal Majalla" w:hint="cs"/>
+                <w:rFonts w:ascii="Sakkal Majalla" w:hAnsi="Sakkal Majalla" w:cs="Sakkal Majalla"/>
               </w:rPr>
             </w:pPr>
             <w:r>
@@ -3219,7 +3287,7 @@
               <w:jc w:val="center"/>
               <w:cnfStyle w:val="000000000000" w:firstRow="0" w:lastRow="0" w:firstColumn="0" w:lastColumn="0" w:oddVBand="0" w:evenVBand="0" w:oddHBand="0" w:evenHBand="0" w:firstRowFirstColumn="0" w:firstRowLastColumn="0" w:lastRowFirstColumn="0" w:lastRowLastColumn="0"/>
               <w:rPr>
-                <w:rFonts w:ascii="Sakkal Majalla" w:hAnsi="Sakkal Majalla" w:cs="Sakkal Majalla" w:hint="cs"/>
+                <w:rFonts w:ascii="Sakkal Majalla" w:hAnsi="Sakkal Majalla" w:cs="Sakkal Majalla"/>
               </w:rPr>
             </w:pPr>
             <w:hyperlink r:id="rId15" w:history="1">
@@ -3241,7 +3309,7 @@
             <w:pPr>
               <w:cnfStyle w:val="000000000000" w:firstRow="0" w:lastRow="0" w:firstColumn="0" w:lastColumn="0" w:oddVBand="0" w:evenVBand="0" w:oddHBand="0" w:evenHBand="0" w:firstRowFirstColumn="0" w:firstRowLastColumn="0" w:lastRowFirstColumn="0" w:lastRowLastColumn="0"/>
               <w:rPr>
-                <w:rFonts w:ascii="Sakkal Majalla" w:hAnsi="Sakkal Majalla" w:cs="Sakkal Majalla" w:hint="cs"/>
+                <w:rFonts w:ascii="Sakkal Majalla" w:hAnsi="Sakkal Majalla" w:cs="Sakkal Majalla"/>
               </w:rPr>
             </w:pPr>
           </w:p>
@@ -3257,7 +3325,7 @@
             <w:pPr>
               <w:jc w:val="center"/>
               <w:rPr>
-                <w:rFonts w:ascii="Sakkal Majalla" w:hAnsi="Sakkal Majalla" w:cs="Sakkal Majalla" w:hint="cs"/>
+                <w:rFonts w:ascii="Sakkal Majalla" w:hAnsi="Sakkal Majalla" w:cs="Sakkal Majalla"/>
               </w:rPr>
             </w:pPr>
             <w:r>
@@ -3277,7 +3345,7 @@
               <w:jc w:val="center"/>
               <w:cnfStyle w:val="000000000000" w:firstRow="0" w:lastRow="0" w:firstColumn="0" w:lastColumn="0" w:oddVBand="0" w:evenVBand="0" w:oddHBand="0" w:evenHBand="0" w:firstRowFirstColumn="0" w:firstRowLastColumn="0" w:lastRowFirstColumn="0" w:lastRowLastColumn="0"/>
               <w:rPr>
-                <w:rFonts w:ascii="Sakkal Majalla" w:hAnsi="Sakkal Majalla" w:cs="Sakkal Majalla" w:hint="cs"/>
+                <w:rFonts w:ascii="Sakkal Majalla" w:hAnsi="Sakkal Majalla" w:cs="Sakkal Majalla"/>
               </w:rPr>
             </w:pPr>
             <w:hyperlink r:id="rId16" w:history="1">
@@ -3299,7 +3367,7 @@
             <w:pPr>
               <w:cnfStyle w:val="000000000000" w:firstRow="0" w:lastRow="0" w:firstColumn="0" w:lastColumn="0" w:oddVBand="0" w:evenVBand="0" w:oddHBand="0" w:evenHBand="0" w:firstRowFirstColumn="0" w:firstRowLastColumn="0" w:lastRowFirstColumn="0" w:lastRowLastColumn="0"/>
               <w:rPr>
-                <w:rFonts w:ascii="Sakkal Majalla" w:hAnsi="Sakkal Majalla" w:cs="Sakkal Majalla" w:hint="cs"/>
+                <w:rFonts w:ascii="Sakkal Majalla" w:hAnsi="Sakkal Majalla" w:cs="Sakkal Majalla"/>
               </w:rPr>
             </w:pPr>
           </w:p>
@@ -3315,7 +3383,7 @@
             <w:pPr>
               <w:jc w:val="center"/>
               <w:rPr>
-                <w:rFonts w:ascii="Sakkal Majalla" w:hAnsi="Sakkal Majalla" w:cs="Sakkal Majalla" w:hint="cs"/>
+                <w:rFonts w:ascii="Sakkal Majalla" w:hAnsi="Sakkal Majalla" w:cs="Sakkal Majalla"/>
               </w:rPr>
             </w:pPr>
             <w:r>
@@ -3335,7 +3403,7 @@
               <w:jc w:val="center"/>
               <w:cnfStyle w:val="000000000000" w:firstRow="0" w:lastRow="0" w:firstColumn="0" w:lastColumn="0" w:oddVBand="0" w:evenVBand="0" w:oddHBand="0" w:evenHBand="0" w:firstRowFirstColumn="0" w:firstRowLastColumn="0" w:lastRowFirstColumn="0" w:lastRowLastColumn="0"/>
               <w:rPr>
-                <w:rFonts w:ascii="Sakkal Majalla" w:hAnsi="Sakkal Majalla" w:cs="Sakkal Majalla" w:hint="cs"/>
+                <w:rFonts w:ascii="Sakkal Majalla" w:hAnsi="Sakkal Majalla" w:cs="Sakkal Majalla"/>
               </w:rPr>
             </w:pPr>
             <w:hyperlink r:id="rId17" w:history="1">
@@ -3357,7 +3425,7 @@
             <w:pPr>
               <w:cnfStyle w:val="000000000000" w:firstRow="0" w:lastRow="0" w:firstColumn="0" w:lastColumn="0" w:oddVBand="0" w:evenVBand="0" w:oddHBand="0" w:evenHBand="0" w:firstRowFirstColumn="0" w:firstRowLastColumn="0" w:lastRowFirstColumn="0" w:lastRowLastColumn="0"/>
               <w:rPr>
-                <w:rFonts w:ascii="Sakkal Majalla" w:hAnsi="Sakkal Majalla" w:cs="Sakkal Majalla" w:hint="cs"/>
+                <w:rFonts w:ascii="Sakkal Majalla" w:hAnsi="Sakkal Majalla" w:cs="Sakkal Majalla"/>
               </w:rPr>
             </w:pPr>
           </w:p>
@@ -3373,7 +3441,7 @@
             <w:pPr>
               <w:jc w:val="center"/>
               <w:rPr>
-                <w:rFonts w:ascii="Sakkal Majalla" w:hAnsi="Sakkal Majalla" w:cs="Sakkal Majalla" w:hint="cs"/>
+                <w:rFonts w:ascii="Sakkal Majalla" w:hAnsi="Sakkal Majalla" w:cs="Sakkal Majalla"/>
               </w:rPr>
             </w:pPr>
             <w:r>
@@ -3393,7 +3461,7 @@
               <w:jc w:val="center"/>
               <w:cnfStyle w:val="000000000000" w:firstRow="0" w:lastRow="0" w:firstColumn="0" w:lastColumn="0" w:oddVBand="0" w:evenVBand="0" w:oddHBand="0" w:evenHBand="0" w:firstRowFirstColumn="0" w:firstRowLastColumn="0" w:lastRowFirstColumn="0" w:lastRowLastColumn="0"/>
               <w:rPr>
-                <w:rFonts w:ascii="Sakkal Majalla" w:hAnsi="Sakkal Majalla" w:cs="Sakkal Majalla" w:hint="cs"/>
+                <w:rFonts w:ascii="Sakkal Majalla" w:hAnsi="Sakkal Majalla" w:cs="Sakkal Majalla"/>
               </w:rPr>
             </w:pPr>
             <w:hyperlink r:id="rId18" w:history="1">
@@ -3431,7 +3499,7 @@
             <w:pPr>
               <w:cnfStyle w:val="000000000000" w:firstRow="0" w:lastRow="0" w:firstColumn="0" w:lastColumn="0" w:oddVBand="0" w:evenVBand="0" w:oddHBand="0" w:evenHBand="0" w:firstRowFirstColumn="0" w:firstRowLastColumn="0" w:lastRowFirstColumn="0" w:lastRowLastColumn="0"/>
               <w:rPr>
-                <w:rFonts w:ascii="Sakkal Majalla" w:hAnsi="Sakkal Majalla" w:cs="Sakkal Majalla" w:hint="cs"/>
+                <w:rFonts w:ascii="Sakkal Majalla" w:hAnsi="Sakkal Majalla" w:cs="Sakkal Majalla"/>
               </w:rPr>
             </w:pPr>
           </w:p>
@@ -3447,7 +3515,7 @@
             <w:pPr>
               <w:jc w:val="center"/>
               <w:rPr>
-                <w:rFonts w:ascii="Sakkal Majalla" w:hAnsi="Sakkal Majalla" w:cs="Sakkal Majalla" w:hint="cs"/>
+                <w:rFonts w:ascii="Sakkal Majalla" w:hAnsi="Sakkal Majalla" w:cs="Sakkal Majalla"/>
               </w:rPr>
             </w:pPr>
             <w:r>
@@ -3467,7 +3535,7 @@
               <w:jc w:val="center"/>
               <w:cnfStyle w:val="000000000000" w:firstRow="0" w:lastRow="0" w:firstColumn="0" w:lastColumn="0" w:oddVBand="0" w:evenVBand="0" w:oddHBand="0" w:evenHBand="0" w:firstRowFirstColumn="0" w:firstRowLastColumn="0" w:lastRowFirstColumn="0" w:lastRowLastColumn="0"/>
               <w:rPr>
-                <w:rFonts w:ascii="Sakkal Majalla" w:hAnsi="Sakkal Majalla" w:cs="Sakkal Majalla" w:hint="cs"/>
+                <w:rFonts w:ascii="Sakkal Majalla" w:hAnsi="Sakkal Majalla" w:cs="Sakkal Majalla"/>
               </w:rPr>
             </w:pPr>
             <w:hyperlink r:id="rId19" w:history="1">
@@ -3495,7 +3563,7 @@
             <w:pPr>
               <w:cnfStyle w:val="000000000000" w:firstRow="0" w:lastRow="0" w:firstColumn="0" w:lastColumn="0" w:oddVBand="0" w:evenVBand="0" w:oddHBand="0" w:evenHBand="0" w:firstRowFirstColumn="0" w:firstRowLastColumn="0" w:lastRowFirstColumn="0" w:lastRowLastColumn="0"/>
               <w:rPr>
-                <w:rFonts w:ascii="Sakkal Majalla" w:hAnsi="Sakkal Majalla" w:cs="Sakkal Majalla" w:hint="cs"/>
+                <w:rFonts w:ascii="Sakkal Majalla" w:hAnsi="Sakkal Majalla" w:cs="Sakkal Majalla"/>
               </w:rPr>
             </w:pPr>
           </w:p>
@@ -3511,7 +3579,7 @@
             <w:pPr>
               <w:jc w:val="center"/>
               <w:rPr>
-                <w:rFonts w:ascii="Sakkal Majalla" w:hAnsi="Sakkal Majalla" w:cs="Sakkal Majalla" w:hint="cs"/>
+                <w:rFonts w:ascii="Sakkal Majalla" w:hAnsi="Sakkal Majalla" w:cs="Sakkal Majalla"/>
               </w:rPr>
             </w:pPr>
             <w:r>
@@ -3531,7 +3599,7 @@
               <w:jc w:val="center"/>
               <w:cnfStyle w:val="000000000000" w:firstRow="0" w:lastRow="0" w:firstColumn="0" w:lastColumn="0" w:oddVBand="0" w:evenVBand="0" w:oddHBand="0" w:evenHBand="0" w:firstRowFirstColumn="0" w:firstRowLastColumn="0" w:lastRowFirstColumn="0" w:lastRowLastColumn="0"/>
               <w:rPr>
-                <w:rFonts w:ascii="Sakkal Majalla" w:hAnsi="Sakkal Majalla" w:cs="Sakkal Majalla" w:hint="cs"/>
+                <w:rFonts w:ascii="Sakkal Majalla" w:hAnsi="Sakkal Majalla" w:cs="Sakkal Majalla"/>
               </w:rPr>
             </w:pPr>
             <w:hyperlink r:id="rId20" w:history="1">
@@ -3569,7 +3637,7 @@
             <w:pPr>
               <w:cnfStyle w:val="000000000000" w:firstRow="0" w:lastRow="0" w:firstColumn="0" w:lastColumn="0" w:oddVBand="0" w:evenVBand="0" w:oddHBand="0" w:evenHBand="0" w:firstRowFirstColumn="0" w:firstRowLastColumn="0" w:lastRowFirstColumn="0" w:lastRowLastColumn="0"/>
               <w:rPr>
-                <w:rFonts w:ascii="Sakkal Majalla" w:hAnsi="Sakkal Majalla" w:cs="Sakkal Majalla" w:hint="cs"/>
+                <w:rFonts w:ascii="Sakkal Majalla" w:hAnsi="Sakkal Majalla" w:cs="Sakkal Majalla"/>
               </w:rPr>
             </w:pPr>
           </w:p>
@@ -3579,7 +3647,7 @@
     <w:p>
       <w:pPr>
         <w:rPr>
-          <w:rFonts w:ascii="Sakkal Majalla" w:hAnsi="Sakkal Majalla" w:cs="Sakkal Majalla" w:hint="cs"/>
+          <w:rFonts w:ascii="Sakkal Majalla" w:hAnsi="Sakkal Majalla" w:cs="Sakkal Majalla"/>
         </w:rPr>
       </w:pPr>
     </w:p>

</xml_diff>

<commit_message>
Adding Search Topic And Delete Unused search topic
</commit_message>
<xml_diff>
--- a/Search-Topics-01.docx
+++ b/Search-Topics-01.docx
@@ -3144,6 +3144,95 @@
           </w:p>
         </w:tc>
       </w:tr>
+      <w:tr>
+        <w:trPr>
+          <w:cnfStyle w:val="000000100000" w:firstRow="0" w:lastRow="0" w:firstColumn="0" w:lastColumn="0" w:oddVBand="0" w:evenVBand="0" w:oddHBand="1" w:evenHBand="0" w:firstRowFirstColumn="0" w:firstRowLastColumn="0" w:lastRowFirstColumn="0" w:lastRowLastColumn="0"/>
+        </w:trPr>
+        <w:tc>
+          <w:tcPr>
+            <w:cnfStyle w:val="001000000000" w:firstRow="0" w:lastRow="0" w:firstColumn="1" w:lastColumn="0" w:oddVBand="0" w:evenVBand="0" w:oddHBand="0" w:evenHBand="0" w:firstRowFirstColumn="0" w:firstRowLastColumn="0" w:lastRowFirstColumn="0" w:lastRowLastColumn="0"/>
+            <w:tcW w:w="810" w:type="dxa"/>
+          </w:tcPr>
+          <w:p>
+            <w:pPr>
+              <w:jc w:val="center"/>
+              <w:rPr>
+                <w:rFonts w:ascii="Sakkal Majalla" w:hAnsi="Sakkal Majalla" w:cs="Sakkal Majalla"/>
+              </w:rPr>
+            </w:pPr>
+            <w:r>
+              <w:rPr>
+                <w:rFonts w:ascii="Sakkal Majalla" w:hAnsi="Sakkal Majalla" w:cs="Sakkal Majalla"/>
+              </w:rPr>
+              <w:t>28</w:t>
+            </w:r>
+          </w:p>
+        </w:tc>
+        <w:tc>
+          <w:tcPr>
+            <w:tcW w:w="5400" w:type="dxa"/>
+          </w:tcPr>
+          <w:p>
+            <w:pPr>
+              <w:cnfStyle w:val="000000100000" w:firstRow="0" w:lastRow="0" w:firstColumn="0" w:lastColumn="0" w:oddVBand="0" w:evenVBand="0" w:oddHBand="1" w:evenHBand="0" w:firstRowFirstColumn="0" w:firstRowLastColumn="0" w:lastRowFirstColumn="0" w:lastRowLastColumn="0"/>
+              <w:rPr>
+                <w:rFonts w:ascii="Sakkal Majalla" w:hAnsi="Sakkal Majalla" w:cs="Sakkal Majalla"/>
+              </w:rPr>
+            </w:pPr>
+            <w:r>
+              <w:rPr>
+                <w:rFonts w:ascii="Sakkal Majalla" w:hAnsi="Sakkal Majalla" w:cs="Sakkal Majalla"/>
+              </w:rPr>
+              <w:t>Scrapy with Splash tutorial</w:t>
+            </w:r>
+          </w:p>
+        </w:tc>
+        <w:tc>
+          <w:tcPr>
+            <w:tcW w:w="4860" w:type="dxa"/>
+          </w:tcPr>
+          <w:p>
+            <w:pPr>
+              <w:jc w:val="center"/>
+              <w:cnfStyle w:val="000000100000" w:firstRow="0" w:lastRow="0" w:firstColumn="0" w:lastColumn="0" w:oddVBand="0" w:evenVBand="0" w:oddHBand="1" w:evenHBand="0" w:firstRowFirstColumn="0" w:firstRowLastColumn="0" w:lastRowFirstColumn="0" w:lastRowLastColumn="0"/>
+              <w:rPr>
+                <w:rFonts w:ascii="Sakkal Majalla" w:hAnsi="Sakkal Majalla" w:cs="Sakkal Majalla"/>
+              </w:rPr>
+            </w:pPr>
+            <w:hyperlink r:id="rId15" w:history="1">
+              <w:proofErr w:type="spellStart"/>
+              <w:r>
+                <w:rPr>
+                  <w:rStyle w:val="Hyperlink"/>
+                  <w:rFonts w:ascii="Sakkal Majalla" w:hAnsi="Sakkal Majalla" w:cs="Sakkal Majalla"/>
+                </w:rPr>
+                <w:t>Zenrows</w:t>
+              </w:r>
+              <w:proofErr w:type="spellEnd"/>
+              <w:r>
+                <w:rPr>
+                  <w:rStyle w:val="Hyperlink"/>
+                  <w:rFonts w:ascii="Sakkal Majalla" w:hAnsi="Sakkal Majalla" w:cs="Sakkal Majalla"/>
+                </w:rPr>
+                <w:t xml:space="preserve"> Scrapy Splash</w:t>
+              </w:r>
+            </w:hyperlink>
+          </w:p>
+        </w:tc>
+        <w:tc>
+          <w:tcPr>
+            <w:tcW w:w="990" w:type="dxa"/>
+          </w:tcPr>
+          <w:p>
+            <w:pPr>
+              <w:cnfStyle w:val="000000100000" w:firstRow="0" w:lastRow="0" w:firstColumn="0" w:lastColumn="0" w:oddVBand="0" w:evenVBand="0" w:oddHBand="1" w:evenHBand="0" w:firstRowFirstColumn="0" w:firstRowLastColumn="0" w:lastRowFirstColumn="0" w:lastRowLastColumn="0"/>
+              <w:rPr>
+                <w:rFonts w:ascii="Sakkal Majalla" w:hAnsi="Sakkal Majalla" w:cs="Sakkal Majalla"/>
+              </w:rPr>
+            </w:pPr>
+          </w:p>
+        </w:tc>
+      </w:tr>
     </w:tbl>
     <w:p>
       <w:pPr>
@@ -3290,7 +3379,7 @@
                 <w:rFonts w:ascii="Sakkal Majalla" w:hAnsi="Sakkal Majalla" w:cs="Sakkal Majalla"/>
               </w:rPr>
             </w:pPr>
-            <w:hyperlink r:id="rId15" w:history="1">
+            <w:hyperlink r:id="rId16" w:history="1">
               <w:r>
                 <w:rPr>
                   <w:rStyle w:val="Hyperlink"/>
@@ -3348,7 +3437,7 @@
                 <w:rFonts w:ascii="Sakkal Majalla" w:hAnsi="Sakkal Majalla" w:cs="Sakkal Majalla"/>
               </w:rPr>
             </w:pPr>
-            <w:hyperlink r:id="rId16" w:history="1">
+            <w:hyperlink r:id="rId17" w:history="1">
               <w:r>
                 <w:rPr>
                   <w:rStyle w:val="Hyperlink"/>
@@ -3406,7 +3495,7 @@
                 <w:rFonts w:ascii="Sakkal Majalla" w:hAnsi="Sakkal Majalla" w:cs="Sakkal Majalla"/>
               </w:rPr>
             </w:pPr>
-            <w:hyperlink r:id="rId17" w:history="1">
+            <w:hyperlink r:id="rId18" w:history="1">
               <w:r>
                 <w:rPr>
                   <w:rStyle w:val="Hyperlink"/>
@@ -3464,7 +3553,7 @@
                 <w:rFonts w:ascii="Sakkal Majalla" w:hAnsi="Sakkal Majalla" w:cs="Sakkal Majalla"/>
               </w:rPr>
             </w:pPr>
-            <w:hyperlink r:id="rId18" w:history="1">
+            <w:hyperlink r:id="rId19" w:history="1">
               <w:r>
                 <w:rPr>
                   <w:rStyle w:val="Hyperlink"/>
@@ -3538,7 +3627,7 @@
                 <w:rFonts w:ascii="Sakkal Majalla" w:hAnsi="Sakkal Majalla" w:cs="Sakkal Majalla"/>
               </w:rPr>
             </w:pPr>
-            <w:hyperlink r:id="rId19" w:history="1">
+            <w:hyperlink r:id="rId20" w:history="1">
               <w:r>
                 <w:rPr>
                   <w:rStyle w:val="Hyperlink"/>
@@ -3553,80 +3642,6 @@
               </w:rPr>
               <w:t xml:space="preserve"> =&gt; for paper research and AI data</w:t>
             </w:r>
-          </w:p>
-        </w:tc>
-        <w:tc>
-          <w:tcPr>
-            <w:tcW w:w="3155" w:type="dxa"/>
-          </w:tcPr>
-          <w:p>
-            <w:pPr>
-              <w:cnfStyle w:val="000000000000" w:firstRow="0" w:lastRow="0" w:firstColumn="0" w:lastColumn="0" w:oddVBand="0" w:evenVBand="0" w:oddHBand="0" w:evenHBand="0" w:firstRowFirstColumn="0" w:firstRowLastColumn="0" w:lastRowFirstColumn="0" w:lastRowLastColumn="0"/>
-              <w:rPr>
-                <w:rFonts w:ascii="Sakkal Majalla" w:hAnsi="Sakkal Majalla" w:cs="Sakkal Majalla"/>
-              </w:rPr>
-            </w:pPr>
-          </w:p>
-        </w:tc>
-      </w:tr>
-      <w:tr>
-        <w:tc>
-          <w:tcPr>
-            <w:cnfStyle w:val="001000000000" w:firstRow="0" w:lastRow="0" w:firstColumn="1" w:lastColumn="0" w:oddVBand="0" w:evenVBand="0" w:oddHBand="0" w:evenHBand="0" w:firstRowFirstColumn="0" w:firstRowLastColumn="0" w:lastRowFirstColumn="0" w:lastRowLastColumn="0"/>
-            <w:tcW w:w="1170" w:type="dxa"/>
-          </w:tcPr>
-          <w:p>
-            <w:pPr>
-              <w:jc w:val="center"/>
-              <w:rPr>
-                <w:rFonts w:ascii="Sakkal Majalla" w:hAnsi="Sakkal Majalla" w:cs="Sakkal Majalla"/>
-              </w:rPr>
-            </w:pPr>
-            <w:r>
-              <w:rPr>
-                <w:rFonts w:ascii="Sakkal Majalla" w:hAnsi="Sakkal Majalla" w:cs="Sakkal Majalla" w:hint="cs"/>
-              </w:rPr>
-              <w:t>6</w:t>
-            </w:r>
-          </w:p>
-        </w:tc>
-        <w:tc>
-          <w:tcPr>
-            <w:tcW w:w="7735" w:type="dxa"/>
-          </w:tcPr>
-          <w:p>
-            <w:pPr>
-              <w:jc w:val="center"/>
-              <w:cnfStyle w:val="000000000000" w:firstRow="0" w:lastRow="0" w:firstColumn="0" w:lastColumn="0" w:oddVBand="0" w:evenVBand="0" w:oddHBand="0" w:evenHBand="0" w:firstRowFirstColumn="0" w:firstRowLastColumn="0" w:lastRowFirstColumn="0" w:lastRowLastColumn="0"/>
-              <w:rPr>
-                <w:rFonts w:ascii="Sakkal Majalla" w:hAnsi="Sakkal Majalla" w:cs="Sakkal Majalla"/>
-              </w:rPr>
-            </w:pPr>
-            <w:hyperlink r:id="rId20" w:history="1">
-              <w:r>
-                <w:rPr>
-                  <w:rStyle w:val="Hyperlink"/>
-                  <w:rFonts w:ascii="Sakkal Majalla" w:hAnsi="Sakkal Majalla" w:cs="Sakkal Majalla"/>
-                </w:rPr>
-                <w:t xml:space="preserve">YouTube channel for QA automation, including </w:t>
-              </w:r>
-              <w:proofErr w:type="spellStart"/>
-              <w:r>
-                <w:rPr>
-                  <w:rStyle w:val="Hyperlink"/>
-                  <w:rFonts w:ascii="Sakkal Majalla" w:hAnsi="Sakkal Majalla" w:cs="Sakkal Majalla"/>
-                </w:rPr>
-                <w:t>Pytest</w:t>
-              </w:r>
-              <w:proofErr w:type="spellEnd"/>
-              <w:r>
-                <w:rPr>
-                  <w:rStyle w:val="Hyperlink"/>
-                  <w:rFonts w:ascii="Sakkal Majalla" w:hAnsi="Sakkal Majalla" w:cs="Sakkal Majalla"/>
-                </w:rPr>
-                <w:t xml:space="preserve"> hooks</w:t>
-              </w:r>
-            </w:hyperlink>
           </w:p>
         </w:tc>
         <w:tc>

</xml_diff>

<commit_message>
Adding NodeJS && Socket.IO Notes --without the client section
</commit_message>
<xml_diff>
--- a/Search-Topics-01.docx
+++ b/Search-Topics-01.docx
@@ -28,7 +28,7 @@
             <w:pPr>
               <w:jc w:val="center"/>
               <w:rPr>
-                <w:rFonts w:ascii="Sakkal Majalla" w:hAnsi="Sakkal Majalla" w:cs="Sakkal Majalla"/>
+                <w:rFonts w:ascii="Sakkal Majalla" w:hAnsi="Sakkal Majalla" w:cs="Sakkal Majalla" w:hint="cs"/>
               </w:rPr>
             </w:pPr>
             <w:r>
@@ -48,7 +48,7 @@
               <w:jc w:val="center"/>
               <w:cnfStyle w:val="100000000000" w:firstRow="1" w:lastRow="0" w:firstColumn="0" w:lastColumn="0" w:oddVBand="0" w:evenVBand="0" w:oddHBand="0" w:evenHBand="0" w:firstRowFirstColumn="0" w:firstRowLastColumn="0" w:lastRowFirstColumn="0" w:lastRowLastColumn="0"/>
               <w:rPr>
-                <w:rFonts w:ascii="Sakkal Majalla" w:hAnsi="Sakkal Majalla" w:cs="Sakkal Majalla"/>
+                <w:rFonts w:ascii="Sakkal Majalla" w:hAnsi="Sakkal Majalla" w:cs="Sakkal Majalla" w:hint="cs"/>
               </w:rPr>
             </w:pPr>
             <w:r>
@@ -68,7 +68,7 @@
               <w:jc w:val="center"/>
               <w:cnfStyle w:val="100000000000" w:firstRow="1" w:lastRow="0" w:firstColumn="0" w:lastColumn="0" w:oddVBand="0" w:evenVBand="0" w:oddHBand="0" w:evenHBand="0" w:firstRowFirstColumn="0" w:firstRowLastColumn="0" w:lastRowFirstColumn="0" w:lastRowLastColumn="0"/>
               <w:rPr>
-                <w:rFonts w:ascii="Sakkal Majalla" w:hAnsi="Sakkal Majalla" w:cs="Sakkal Majalla"/>
+                <w:rFonts w:ascii="Sakkal Majalla" w:hAnsi="Sakkal Majalla" w:cs="Sakkal Majalla" w:hint="cs"/>
               </w:rPr>
             </w:pPr>
             <w:r>
@@ -88,7 +88,7 @@
               <w:jc w:val="center"/>
               <w:cnfStyle w:val="100000000000" w:firstRow="1" w:lastRow="0" w:firstColumn="0" w:lastColumn="0" w:oddVBand="0" w:evenVBand="0" w:oddHBand="0" w:evenHBand="0" w:firstRowFirstColumn="0" w:firstRowLastColumn="0" w:lastRowFirstColumn="0" w:lastRowLastColumn="0"/>
               <w:rPr>
-                <w:rFonts w:ascii="Sakkal Majalla" w:hAnsi="Sakkal Majalla" w:cs="Sakkal Majalla"/>
+                <w:rFonts w:ascii="Sakkal Majalla" w:hAnsi="Sakkal Majalla" w:cs="Sakkal Majalla" w:hint="cs"/>
               </w:rPr>
             </w:pPr>
             <w:r>
@@ -113,7 +113,7 @@
             <w:pPr>
               <w:jc w:val="center"/>
               <w:rPr>
-                <w:rFonts w:ascii="Sakkal Majalla" w:hAnsi="Sakkal Majalla" w:cs="Sakkal Majalla"/>
+                <w:rFonts w:ascii="Sakkal Majalla" w:hAnsi="Sakkal Majalla" w:cs="Sakkal Majalla" w:hint="cs"/>
               </w:rPr>
             </w:pPr>
             <w:r>
@@ -132,7 +132,7 @@
             <w:pPr>
               <w:cnfStyle w:val="000000100000" w:firstRow="0" w:lastRow="0" w:firstColumn="0" w:lastColumn="0" w:oddVBand="0" w:evenVBand="0" w:oddHBand="1" w:evenHBand="0" w:firstRowFirstColumn="0" w:firstRowLastColumn="0" w:lastRowFirstColumn="0" w:lastRowLastColumn="0"/>
               <w:rPr>
-                <w:rFonts w:ascii="Sakkal Majalla" w:hAnsi="Sakkal Majalla" w:cs="Sakkal Majalla"/>
+                <w:rFonts w:ascii="Sakkal Majalla" w:hAnsi="Sakkal Majalla" w:cs="Sakkal Majalla" w:hint="cs"/>
               </w:rPr>
             </w:pPr>
             <w:r>
@@ -176,7 +176,7 @@
               <w:jc w:val="center"/>
               <w:cnfStyle w:val="000000100000" w:firstRow="0" w:lastRow="0" w:firstColumn="0" w:lastColumn="0" w:oddVBand="0" w:evenVBand="0" w:oddHBand="1" w:evenHBand="0" w:firstRowFirstColumn="0" w:firstRowLastColumn="0" w:lastRowFirstColumn="0" w:lastRowLastColumn="0"/>
               <w:rPr>
-                <w:rFonts w:ascii="Sakkal Majalla" w:hAnsi="Sakkal Majalla" w:cs="Sakkal Majalla"/>
+                <w:rFonts w:ascii="Sakkal Majalla" w:hAnsi="Sakkal Majalla" w:cs="Sakkal Majalla" w:hint="cs"/>
               </w:rPr>
             </w:pPr>
             <w:r>
@@ -195,7 +195,7 @@
             <w:pPr>
               <w:cnfStyle w:val="000000100000" w:firstRow="0" w:lastRow="0" w:firstColumn="0" w:lastColumn="0" w:oddVBand="0" w:evenVBand="0" w:oddHBand="1" w:evenHBand="0" w:firstRowFirstColumn="0" w:firstRowLastColumn="0" w:lastRowFirstColumn="0" w:lastRowLastColumn="0"/>
               <w:rPr>
-                <w:rFonts w:ascii="Sakkal Majalla" w:hAnsi="Sakkal Majalla" w:cs="Sakkal Majalla"/>
+                <w:rFonts w:ascii="Sakkal Majalla" w:hAnsi="Sakkal Majalla" w:cs="Sakkal Majalla" w:hint="cs"/>
               </w:rPr>
             </w:pPr>
           </w:p>
@@ -211,7 +211,7 @@
             <w:pPr>
               <w:jc w:val="center"/>
               <w:rPr>
-                <w:rFonts w:ascii="Sakkal Majalla" w:hAnsi="Sakkal Majalla" w:cs="Sakkal Majalla"/>
+                <w:rFonts w:ascii="Sakkal Majalla" w:hAnsi="Sakkal Majalla" w:cs="Sakkal Majalla" w:hint="cs"/>
               </w:rPr>
             </w:pPr>
             <w:r>
@@ -230,7 +230,7 @@
             <w:pPr>
               <w:cnfStyle w:val="000000000000" w:firstRow="0" w:lastRow="0" w:firstColumn="0" w:lastColumn="0" w:oddVBand="0" w:evenVBand="0" w:oddHBand="0" w:evenHBand="0" w:firstRowFirstColumn="0" w:firstRowLastColumn="0" w:lastRowFirstColumn="0" w:lastRowLastColumn="0"/>
               <w:rPr>
-                <w:rFonts w:ascii="Sakkal Majalla" w:hAnsi="Sakkal Majalla" w:cs="Sakkal Majalla"/>
+                <w:rFonts w:ascii="Sakkal Majalla" w:hAnsi="Sakkal Majalla" w:cs="Sakkal Majalla" w:hint="cs"/>
               </w:rPr>
             </w:pPr>
             <w:r>
@@ -292,7 +292,7 @@
               <w:jc w:val="center"/>
               <w:cnfStyle w:val="000000000000" w:firstRow="0" w:lastRow="0" w:firstColumn="0" w:lastColumn="0" w:oddVBand="0" w:evenVBand="0" w:oddHBand="0" w:evenHBand="0" w:firstRowFirstColumn="0" w:firstRowLastColumn="0" w:lastRowFirstColumn="0" w:lastRowLastColumn="0"/>
               <w:rPr>
-                <w:rFonts w:ascii="Sakkal Majalla" w:hAnsi="Sakkal Majalla" w:cs="Sakkal Majalla"/>
+                <w:rFonts w:ascii="Sakkal Majalla" w:hAnsi="Sakkal Majalla" w:cs="Sakkal Majalla" w:hint="cs"/>
               </w:rPr>
             </w:pPr>
             <w:r>
@@ -311,7 +311,7 @@
             <w:pPr>
               <w:cnfStyle w:val="000000000000" w:firstRow="0" w:lastRow="0" w:firstColumn="0" w:lastColumn="0" w:oddVBand="0" w:evenVBand="0" w:oddHBand="0" w:evenHBand="0" w:firstRowFirstColumn="0" w:firstRowLastColumn="0" w:lastRowFirstColumn="0" w:lastRowLastColumn="0"/>
               <w:rPr>
-                <w:rFonts w:ascii="Sakkal Majalla" w:hAnsi="Sakkal Majalla" w:cs="Sakkal Majalla"/>
+                <w:rFonts w:ascii="Sakkal Majalla" w:hAnsi="Sakkal Majalla" w:cs="Sakkal Majalla" w:hint="cs"/>
               </w:rPr>
             </w:pPr>
           </w:p>
@@ -330,7 +330,7 @@
             <w:pPr>
               <w:jc w:val="center"/>
               <w:rPr>
-                <w:rFonts w:ascii="Sakkal Majalla" w:hAnsi="Sakkal Majalla" w:cs="Sakkal Majalla"/>
+                <w:rFonts w:ascii="Sakkal Majalla" w:hAnsi="Sakkal Majalla" w:cs="Sakkal Majalla" w:hint="cs"/>
               </w:rPr>
             </w:pPr>
             <w:r>
@@ -349,7 +349,7 @@
             <w:pPr>
               <w:cnfStyle w:val="000000100000" w:firstRow="0" w:lastRow="0" w:firstColumn="0" w:lastColumn="0" w:oddVBand="0" w:evenVBand="0" w:oddHBand="1" w:evenHBand="0" w:firstRowFirstColumn="0" w:firstRowLastColumn="0" w:lastRowFirstColumn="0" w:lastRowLastColumn="0"/>
               <w:rPr>
-                <w:rFonts w:ascii="Sakkal Majalla" w:hAnsi="Sakkal Majalla" w:cs="Sakkal Majalla"/>
+                <w:rFonts w:ascii="Sakkal Majalla" w:hAnsi="Sakkal Majalla" w:cs="Sakkal Majalla" w:hint="cs"/>
               </w:rPr>
             </w:pPr>
             <w:r>
@@ -381,7 +381,7 @@
               <w:jc w:val="center"/>
               <w:cnfStyle w:val="000000100000" w:firstRow="0" w:lastRow="0" w:firstColumn="0" w:lastColumn="0" w:oddVBand="0" w:evenVBand="0" w:oddHBand="1" w:evenHBand="0" w:firstRowFirstColumn="0" w:firstRowLastColumn="0" w:lastRowFirstColumn="0" w:lastRowLastColumn="0"/>
               <w:rPr>
-                <w:rFonts w:ascii="Sakkal Majalla" w:hAnsi="Sakkal Majalla" w:cs="Sakkal Majalla"/>
+                <w:rFonts w:ascii="Sakkal Majalla" w:hAnsi="Sakkal Majalla" w:cs="Sakkal Majalla" w:hint="cs"/>
               </w:rPr>
             </w:pPr>
             <w:r>
@@ -400,7 +400,7 @@
             <w:pPr>
               <w:cnfStyle w:val="000000100000" w:firstRow="0" w:lastRow="0" w:firstColumn="0" w:lastColumn="0" w:oddVBand="0" w:evenVBand="0" w:oddHBand="1" w:evenHBand="0" w:firstRowFirstColumn="0" w:firstRowLastColumn="0" w:lastRowFirstColumn="0" w:lastRowLastColumn="0"/>
               <w:rPr>
-                <w:rFonts w:ascii="Sakkal Majalla" w:hAnsi="Sakkal Majalla" w:cs="Sakkal Majalla"/>
+                <w:rFonts w:ascii="Sakkal Majalla" w:hAnsi="Sakkal Majalla" w:cs="Sakkal Majalla" w:hint="cs"/>
               </w:rPr>
             </w:pPr>
           </w:p>
@@ -416,7 +416,7 @@
             <w:pPr>
               <w:jc w:val="center"/>
               <w:rPr>
-                <w:rFonts w:ascii="Sakkal Majalla" w:hAnsi="Sakkal Majalla" w:cs="Sakkal Majalla"/>
+                <w:rFonts w:ascii="Sakkal Majalla" w:hAnsi="Sakkal Majalla" w:cs="Sakkal Majalla" w:hint="cs"/>
               </w:rPr>
             </w:pPr>
             <w:r>
@@ -435,7 +435,7 @@
             <w:pPr>
               <w:cnfStyle w:val="000000000000" w:firstRow="0" w:lastRow="0" w:firstColumn="0" w:lastColumn="0" w:oddVBand="0" w:evenVBand="0" w:oddHBand="0" w:evenHBand="0" w:firstRowFirstColumn="0" w:firstRowLastColumn="0" w:lastRowFirstColumn="0" w:lastRowLastColumn="0"/>
               <w:rPr>
-                <w:rFonts w:ascii="Sakkal Majalla" w:hAnsi="Sakkal Majalla" w:cs="Sakkal Majalla"/>
+                <w:rFonts w:ascii="Sakkal Majalla" w:hAnsi="Sakkal Majalla" w:cs="Sakkal Majalla" w:hint="cs"/>
               </w:rPr>
             </w:pPr>
             <w:r>
@@ -467,7 +467,7 @@
               <w:jc w:val="center"/>
               <w:cnfStyle w:val="000000000000" w:firstRow="0" w:lastRow="0" w:firstColumn="0" w:lastColumn="0" w:oddVBand="0" w:evenVBand="0" w:oddHBand="0" w:evenHBand="0" w:firstRowFirstColumn="0" w:firstRowLastColumn="0" w:lastRowFirstColumn="0" w:lastRowLastColumn="0"/>
               <w:rPr>
-                <w:rFonts w:ascii="Sakkal Majalla" w:hAnsi="Sakkal Majalla" w:cs="Sakkal Majalla"/>
+                <w:rFonts w:ascii="Sakkal Majalla" w:hAnsi="Sakkal Majalla" w:cs="Sakkal Majalla" w:hint="cs"/>
               </w:rPr>
             </w:pPr>
             <w:r>
@@ -486,7 +486,7 @@
             <w:pPr>
               <w:cnfStyle w:val="000000000000" w:firstRow="0" w:lastRow="0" w:firstColumn="0" w:lastColumn="0" w:oddVBand="0" w:evenVBand="0" w:oddHBand="0" w:evenHBand="0" w:firstRowFirstColumn="0" w:firstRowLastColumn="0" w:lastRowFirstColumn="0" w:lastRowLastColumn="0"/>
               <w:rPr>
-                <w:rFonts w:ascii="Sakkal Majalla" w:hAnsi="Sakkal Majalla" w:cs="Sakkal Majalla"/>
+                <w:rFonts w:ascii="Sakkal Majalla" w:hAnsi="Sakkal Majalla" w:cs="Sakkal Majalla" w:hint="cs"/>
               </w:rPr>
             </w:pPr>
           </w:p>
@@ -505,7 +505,7 @@
             <w:pPr>
               <w:jc w:val="center"/>
               <w:rPr>
-                <w:rFonts w:ascii="Sakkal Majalla" w:hAnsi="Sakkal Majalla" w:cs="Sakkal Majalla"/>
+                <w:rFonts w:ascii="Sakkal Majalla" w:hAnsi="Sakkal Majalla" w:cs="Sakkal Majalla" w:hint="cs"/>
               </w:rPr>
             </w:pPr>
             <w:r>
@@ -524,7 +524,7 @@
             <w:pPr>
               <w:cnfStyle w:val="000000100000" w:firstRow="0" w:lastRow="0" w:firstColumn="0" w:lastColumn="0" w:oddVBand="0" w:evenVBand="0" w:oddHBand="1" w:evenHBand="0" w:firstRowFirstColumn="0" w:firstRowLastColumn="0" w:lastRowFirstColumn="0" w:lastRowLastColumn="0"/>
               <w:rPr>
-                <w:rFonts w:ascii="Sakkal Majalla" w:hAnsi="Sakkal Majalla" w:cs="Sakkal Majalla"/>
+                <w:rFonts w:ascii="Sakkal Majalla" w:hAnsi="Sakkal Majalla" w:cs="Sakkal Majalla" w:hint="cs"/>
               </w:rPr>
             </w:pPr>
             <w:r>
@@ -568,7 +568,7 @@
               <w:jc w:val="center"/>
               <w:cnfStyle w:val="000000100000" w:firstRow="0" w:lastRow="0" w:firstColumn="0" w:lastColumn="0" w:oddVBand="0" w:evenVBand="0" w:oddHBand="1" w:evenHBand="0" w:firstRowFirstColumn="0" w:firstRowLastColumn="0" w:lastRowFirstColumn="0" w:lastRowLastColumn="0"/>
               <w:rPr>
-                <w:rFonts w:ascii="Sakkal Majalla" w:hAnsi="Sakkal Majalla" w:cs="Sakkal Majalla"/>
+                <w:rFonts w:ascii="Sakkal Majalla" w:hAnsi="Sakkal Majalla" w:cs="Sakkal Majalla" w:hint="cs"/>
               </w:rPr>
             </w:pPr>
             <w:r>
@@ -587,7 +587,7 @@
             <w:pPr>
               <w:cnfStyle w:val="000000100000" w:firstRow="0" w:lastRow="0" w:firstColumn="0" w:lastColumn="0" w:oddVBand="0" w:evenVBand="0" w:oddHBand="1" w:evenHBand="0" w:firstRowFirstColumn="0" w:firstRowLastColumn="0" w:lastRowFirstColumn="0" w:lastRowLastColumn="0"/>
               <w:rPr>
-                <w:rFonts w:ascii="Sakkal Majalla" w:hAnsi="Sakkal Majalla" w:cs="Sakkal Majalla"/>
+                <w:rFonts w:ascii="Sakkal Majalla" w:hAnsi="Sakkal Majalla" w:cs="Sakkal Majalla" w:hint="cs"/>
               </w:rPr>
             </w:pPr>
           </w:p>
@@ -603,7 +603,7 @@
             <w:pPr>
               <w:jc w:val="center"/>
               <w:rPr>
-                <w:rFonts w:ascii="Sakkal Majalla" w:hAnsi="Sakkal Majalla" w:cs="Sakkal Majalla"/>
+                <w:rFonts w:ascii="Sakkal Majalla" w:hAnsi="Sakkal Majalla" w:cs="Sakkal Majalla" w:hint="cs"/>
               </w:rPr>
             </w:pPr>
             <w:r>
@@ -622,7 +622,7 @@
             <w:pPr>
               <w:cnfStyle w:val="000000000000" w:firstRow="0" w:lastRow="0" w:firstColumn="0" w:lastColumn="0" w:oddVBand="0" w:evenVBand="0" w:oddHBand="0" w:evenHBand="0" w:firstRowFirstColumn="0" w:firstRowLastColumn="0" w:lastRowFirstColumn="0" w:lastRowLastColumn="0"/>
               <w:rPr>
-                <w:rFonts w:ascii="Sakkal Majalla" w:hAnsi="Sakkal Majalla" w:cs="Sakkal Majalla"/>
+                <w:rFonts w:ascii="Sakkal Majalla" w:hAnsi="Sakkal Majalla" w:cs="Sakkal Majalla" w:hint="cs"/>
               </w:rPr>
             </w:pPr>
             <w:r>
@@ -642,7 +642,7 @@
               <w:jc w:val="center"/>
               <w:cnfStyle w:val="000000000000" w:firstRow="0" w:lastRow="0" w:firstColumn="0" w:lastColumn="0" w:oddVBand="0" w:evenVBand="0" w:oddHBand="0" w:evenHBand="0" w:firstRowFirstColumn="0" w:firstRowLastColumn="0" w:lastRowFirstColumn="0" w:lastRowLastColumn="0"/>
               <w:rPr>
-                <w:rFonts w:ascii="Sakkal Majalla" w:hAnsi="Sakkal Majalla" w:cs="Sakkal Majalla"/>
+                <w:rFonts w:ascii="Sakkal Majalla" w:hAnsi="Sakkal Majalla" w:cs="Sakkal Majalla" w:hint="cs"/>
               </w:rPr>
             </w:pPr>
             <w:r>
@@ -661,7 +661,7 @@
             <w:pPr>
               <w:cnfStyle w:val="000000000000" w:firstRow="0" w:lastRow="0" w:firstColumn="0" w:lastColumn="0" w:oddVBand="0" w:evenVBand="0" w:oddHBand="0" w:evenHBand="0" w:firstRowFirstColumn="0" w:firstRowLastColumn="0" w:lastRowFirstColumn="0" w:lastRowLastColumn="0"/>
               <w:rPr>
-                <w:rFonts w:ascii="Sakkal Majalla" w:hAnsi="Sakkal Majalla" w:cs="Sakkal Majalla"/>
+                <w:rFonts w:ascii="Sakkal Majalla" w:hAnsi="Sakkal Majalla" w:cs="Sakkal Majalla" w:hint="cs"/>
               </w:rPr>
             </w:pPr>
           </w:p>
@@ -680,7 +680,7 @@
             <w:pPr>
               <w:jc w:val="center"/>
               <w:rPr>
-                <w:rFonts w:ascii="Sakkal Majalla" w:hAnsi="Sakkal Majalla" w:cs="Sakkal Majalla"/>
+                <w:rFonts w:ascii="Sakkal Majalla" w:hAnsi="Sakkal Majalla" w:cs="Sakkal Majalla" w:hint="cs"/>
               </w:rPr>
             </w:pPr>
             <w:r>
@@ -699,7 +699,7 @@
             <w:pPr>
               <w:cnfStyle w:val="000000100000" w:firstRow="0" w:lastRow="0" w:firstColumn="0" w:lastColumn="0" w:oddVBand="0" w:evenVBand="0" w:oddHBand="1" w:evenHBand="0" w:firstRowFirstColumn="0" w:firstRowLastColumn="0" w:lastRowFirstColumn="0" w:lastRowLastColumn="0"/>
               <w:rPr>
-                <w:rFonts w:ascii="Sakkal Majalla" w:hAnsi="Sakkal Majalla" w:cs="Sakkal Majalla"/>
+                <w:rFonts w:ascii="Sakkal Majalla" w:hAnsi="Sakkal Majalla" w:cs="Sakkal Majalla" w:hint="cs"/>
               </w:rPr>
             </w:pPr>
             <w:r>
@@ -719,7 +719,7 @@
               <w:jc w:val="center"/>
               <w:cnfStyle w:val="000000100000" w:firstRow="0" w:lastRow="0" w:firstColumn="0" w:lastColumn="0" w:oddVBand="0" w:evenVBand="0" w:oddHBand="1" w:evenHBand="0" w:firstRowFirstColumn="0" w:firstRowLastColumn="0" w:lastRowFirstColumn="0" w:lastRowLastColumn="0"/>
               <w:rPr>
-                <w:rFonts w:ascii="Sakkal Majalla" w:hAnsi="Sakkal Majalla" w:cs="Sakkal Majalla"/>
+                <w:rFonts w:ascii="Sakkal Majalla" w:hAnsi="Sakkal Majalla" w:cs="Sakkal Majalla" w:hint="cs"/>
               </w:rPr>
             </w:pPr>
             <w:r>
@@ -738,7 +738,7 @@
             <w:pPr>
               <w:cnfStyle w:val="000000100000" w:firstRow="0" w:lastRow="0" w:firstColumn="0" w:lastColumn="0" w:oddVBand="0" w:evenVBand="0" w:oddHBand="1" w:evenHBand="0" w:firstRowFirstColumn="0" w:firstRowLastColumn="0" w:lastRowFirstColumn="0" w:lastRowLastColumn="0"/>
               <w:rPr>
-                <w:rFonts w:ascii="Sakkal Majalla" w:hAnsi="Sakkal Majalla" w:cs="Sakkal Majalla"/>
+                <w:rFonts w:ascii="Sakkal Majalla" w:hAnsi="Sakkal Majalla" w:cs="Sakkal Majalla" w:hint="cs"/>
               </w:rPr>
             </w:pPr>
           </w:p>
@@ -754,7 +754,7 @@
             <w:pPr>
               <w:jc w:val="center"/>
               <w:rPr>
-                <w:rFonts w:ascii="Sakkal Majalla" w:hAnsi="Sakkal Majalla" w:cs="Sakkal Majalla"/>
+                <w:rFonts w:ascii="Sakkal Majalla" w:hAnsi="Sakkal Majalla" w:cs="Sakkal Majalla" w:hint="cs"/>
               </w:rPr>
             </w:pPr>
             <w:r>
@@ -773,7 +773,7 @@
             <w:pPr>
               <w:cnfStyle w:val="000000000000" w:firstRow="0" w:lastRow="0" w:firstColumn="0" w:lastColumn="0" w:oddVBand="0" w:evenVBand="0" w:oddHBand="0" w:evenHBand="0" w:firstRowFirstColumn="0" w:firstRowLastColumn="0" w:lastRowFirstColumn="0" w:lastRowLastColumn="0"/>
               <w:rPr>
-                <w:rFonts w:ascii="Sakkal Majalla" w:hAnsi="Sakkal Majalla" w:cs="Sakkal Majalla"/>
+                <w:rFonts w:ascii="Sakkal Majalla" w:hAnsi="Sakkal Majalla" w:cs="Sakkal Majalla" w:hint="cs"/>
               </w:rPr>
             </w:pPr>
             <w:r>
@@ -793,7 +793,7 @@
               <w:jc w:val="center"/>
               <w:cnfStyle w:val="000000000000" w:firstRow="0" w:lastRow="0" w:firstColumn="0" w:lastColumn="0" w:oddVBand="0" w:evenVBand="0" w:oddHBand="0" w:evenHBand="0" w:firstRowFirstColumn="0" w:firstRowLastColumn="0" w:lastRowFirstColumn="0" w:lastRowLastColumn="0"/>
               <w:rPr>
-                <w:rFonts w:ascii="Sakkal Majalla" w:hAnsi="Sakkal Majalla" w:cs="Sakkal Majalla"/>
+                <w:rFonts w:ascii="Sakkal Majalla" w:hAnsi="Sakkal Majalla" w:cs="Sakkal Majalla" w:hint="cs"/>
               </w:rPr>
             </w:pPr>
             <w:r>
@@ -812,7 +812,7 @@
             <w:pPr>
               <w:cnfStyle w:val="000000000000" w:firstRow="0" w:lastRow="0" w:firstColumn="0" w:lastColumn="0" w:oddVBand="0" w:evenVBand="0" w:oddHBand="0" w:evenHBand="0" w:firstRowFirstColumn="0" w:firstRowLastColumn="0" w:lastRowFirstColumn="0" w:lastRowLastColumn="0"/>
               <w:rPr>
-                <w:rFonts w:ascii="Sakkal Majalla" w:hAnsi="Sakkal Majalla" w:cs="Sakkal Majalla"/>
+                <w:rFonts w:ascii="Sakkal Majalla" w:hAnsi="Sakkal Majalla" w:cs="Sakkal Majalla" w:hint="cs"/>
               </w:rPr>
             </w:pPr>
           </w:p>
@@ -831,7 +831,7 @@
             <w:pPr>
               <w:jc w:val="center"/>
               <w:rPr>
-                <w:rFonts w:ascii="Sakkal Majalla" w:hAnsi="Sakkal Majalla" w:cs="Sakkal Majalla"/>
+                <w:rFonts w:ascii="Sakkal Majalla" w:hAnsi="Sakkal Majalla" w:cs="Sakkal Majalla" w:hint="cs"/>
               </w:rPr>
             </w:pPr>
             <w:r>
@@ -850,7 +850,7 @@
             <w:pPr>
               <w:cnfStyle w:val="000000100000" w:firstRow="0" w:lastRow="0" w:firstColumn="0" w:lastColumn="0" w:oddVBand="0" w:evenVBand="0" w:oddHBand="1" w:evenHBand="0" w:firstRowFirstColumn="0" w:firstRowLastColumn="0" w:lastRowFirstColumn="0" w:lastRowLastColumn="0"/>
               <w:rPr>
-                <w:rFonts w:ascii="Sakkal Majalla" w:hAnsi="Sakkal Majalla" w:cs="Sakkal Majalla"/>
+                <w:rFonts w:ascii="Sakkal Majalla" w:hAnsi="Sakkal Majalla" w:cs="Sakkal Majalla" w:hint="cs"/>
               </w:rPr>
             </w:pPr>
             <w:r>
@@ -870,7 +870,7 @@
               <w:jc w:val="center"/>
               <w:cnfStyle w:val="000000100000" w:firstRow="0" w:lastRow="0" w:firstColumn="0" w:lastColumn="0" w:oddVBand="0" w:evenVBand="0" w:oddHBand="1" w:evenHBand="0" w:firstRowFirstColumn="0" w:firstRowLastColumn="0" w:lastRowFirstColumn="0" w:lastRowLastColumn="0"/>
               <w:rPr>
-                <w:rFonts w:ascii="Sakkal Majalla" w:hAnsi="Sakkal Majalla" w:cs="Sakkal Majalla"/>
+                <w:rFonts w:ascii="Sakkal Majalla" w:hAnsi="Sakkal Majalla" w:cs="Sakkal Majalla" w:hint="cs"/>
               </w:rPr>
             </w:pPr>
             <w:r>
@@ -889,7 +889,7 @@
             <w:pPr>
               <w:cnfStyle w:val="000000100000" w:firstRow="0" w:lastRow="0" w:firstColumn="0" w:lastColumn="0" w:oddVBand="0" w:evenVBand="0" w:oddHBand="1" w:evenHBand="0" w:firstRowFirstColumn="0" w:firstRowLastColumn="0" w:lastRowFirstColumn="0" w:lastRowLastColumn="0"/>
               <w:rPr>
-                <w:rFonts w:ascii="Sakkal Majalla" w:hAnsi="Sakkal Majalla" w:cs="Sakkal Majalla"/>
+                <w:rFonts w:ascii="Sakkal Majalla" w:hAnsi="Sakkal Majalla" w:cs="Sakkal Majalla" w:hint="cs"/>
               </w:rPr>
             </w:pPr>
           </w:p>
@@ -905,7 +905,7 @@
             <w:pPr>
               <w:jc w:val="center"/>
               <w:rPr>
-                <w:rFonts w:ascii="Sakkal Majalla" w:hAnsi="Sakkal Majalla" w:cs="Sakkal Majalla"/>
+                <w:rFonts w:ascii="Sakkal Majalla" w:hAnsi="Sakkal Majalla" w:cs="Sakkal Majalla" w:hint="cs"/>
               </w:rPr>
             </w:pPr>
             <w:r>
@@ -924,7 +924,7 @@
             <w:pPr>
               <w:cnfStyle w:val="000000000000" w:firstRow="0" w:lastRow="0" w:firstColumn="0" w:lastColumn="0" w:oddVBand="0" w:evenVBand="0" w:oddHBand="0" w:evenHBand="0" w:firstRowFirstColumn="0" w:firstRowLastColumn="0" w:lastRowFirstColumn="0" w:lastRowLastColumn="0"/>
               <w:rPr>
-                <w:rFonts w:ascii="Sakkal Majalla" w:hAnsi="Sakkal Majalla" w:cs="Sakkal Majalla"/>
+                <w:rFonts w:ascii="Sakkal Majalla" w:hAnsi="Sakkal Majalla" w:cs="Sakkal Majalla" w:hint="cs"/>
               </w:rPr>
             </w:pPr>
             <w:r>
@@ -944,7 +944,7 @@
               <w:jc w:val="center"/>
               <w:cnfStyle w:val="000000000000" w:firstRow="0" w:lastRow="0" w:firstColumn="0" w:lastColumn="0" w:oddVBand="0" w:evenVBand="0" w:oddHBand="0" w:evenHBand="0" w:firstRowFirstColumn="0" w:firstRowLastColumn="0" w:lastRowFirstColumn="0" w:lastRowLastColumn="0"/>
               <w:rPr>
-                <w:rFonts w:ascii="Sakkal Majalla" w:hAnsi="Sakkal Majalla" w:cs="Sakkal Majalla"/>
+                <w:rFonts w:ascii="Sakkal Majalla" w:hAnsi="Sakkal Majalla" w:cs="Sakkal Majalla" w:hint="cs"/>
               </w:rPr>
             </w:pPr>
             <w:r>
@@ -963,7 +963,7 @@
             <w:pPr>
               <w:cnfStyle w:val="000000000000" w:firstRow="0" w:lastRow="0" w:firstColumn="0" w:lastColumn="0" w:oddVBand="0" w:evenVBand="0" w:oddHBand="0" w:evenHBand="0" w:firstRowFirstColumn="0" w:firstRowLastColumn="0" w:lastRowFirstColumn="0" w:lastRowLastColumn="0"/>
               <w:rPr>
-                <w:rFonts w:ascii="Sakkal Majalla" w:hAnsi="Sakkal Majalla" w:cs="Sakkal Majalla"/>
+                <w:rFonts w:ascii="Sakkal Majalla" w:hAnsi="Sakkal Majalla" w:cs="Sakkal Majalla" w:hint="cs"/>
               </w:rPr>
             </w:pPr>
           </w:p>
@@ -982,7 +982,7 @@
             <w:pPr>
               <w:jc w:val="center"/>
               <w:rPr>
-                <w:rFonts w:ascii="Sakkal Majalla" w:hAnsi="Sakkal Majalla" w:cs="Sakkal Majalla"/>
+                <w:rFonts w:ascii="Sakkal Majalla" w:hAnsi="Sakkal Majalla" w:cs="Sakkal Majalla" w:hint="cs"/>
               </w:rPr>
             </w:pPr>
             <w:r>
@@ -1001,7 +1001,7 @@
             <w:pPr>
               <w:cnfStyle w:val="000000100000" w:firstRow="0" w:lastRow="0" w:firstColumn="0" w:lastColumn="0" w:oddVBand="0" w:evenVBand="0" w:oddHBand="1" w:evenHBand="0" w:firstRowFirstColumn="0" w:firstRowLastColumn="0" w:lastRowFirstColumn="0" w:lastRowLastColumn="0"/>
               <w:rPr>
-                <w:rFonts w:ascii="Sakkal Majalla" w:hAnsi="Sakkal Majalla" w:cs="Sakkal Majalla"/>
+                <w:rFonts w:ascii="Sakkal Majalla" w:hAnsi="Sakkal Majalla" w:cs="Sakkal Majalla" w:hint="cs"/>
               </w:rPr>
             </w:pPr>
             <w:r>
@@ -1033,7 +1033,7 @@
               <w:jc w:val="center"/>
               <w:cnfStyle w:val="000000100000" w:firstRow="0" w:lastRow="0" w:firstColumn="0" w:lastColumn="0" w:oddVBand="0" w:evenVBand="0" w:oddHBand="1" w:evenHBand="0" w:firstRowFirstColumn="0" w:firstRowLastColumn="0" w:lastRowFirstColumn="0" w:lastRowLastColumn="0"/>
               <w:rPr>
-                <w:rFonts w:ascii="Sakkal Majalla" w:hAnsi="Sakkal Majalla" w:cs="Sakkal Majalla"/>
+                <w:rFonts w:ascii="Sakkal Majalla" w:hAnsi="Sakkal Majalla" w:cs="Sakkal Majalla" w:hint="cs"/>
               </w:rPr>
             </w:pPr>
             <w:r>
@@ -1052,7 +1052,7 @@
             <w:pPr>
               <w:cnfStyle w:val="000000100000" w:firstRow="0" w:lastRow="0" w:firstColumn="0" w:lastColumn="0" w:oddVBand="0" w:evenVBand="0" w:oddHBand="1" w:evenHBand="0" w:firstRowFirstColumn="0" w:firstRowLastColumn="0" w:lastRowFirstColumn="0" w:lastRowLastColumn="0"/>
               <w:rPr>
-                <w:rFonts w:ascii="Sakkal Majalla" w:hAnsi="Sakkal Majalla" w:cs="Sakkal Majalla"/>
+                <w:rFonts w:ascii="Sakkal Majalla" w:hAnsi="Sakkal Majalla" w:cs="Sakkal Majalla" w:hint="cs"/>
               </w:rPr>
             </w:pPr>
           </w:p>
@@ -1068,7 +1068,7 @@
             <w:pPr>
               <w:jc w:val="center"/>
               <w:rPr>
-                <w:rFonts w:ascii="Sakkal Majalla" w:hAnsi="Sakkal Majalla" w:cs="Sakkal Majalla"/>
+                <w:rFonts w:ascii="Sakkal Majalla" w:hAnsi="Sakkal Majalla" w:cs="Sakkal Majalla" w:hint="cs"/>
               </w:rPr>
             </w:pPr>
             <w:r>
@@ -1087,7 +1087,7 @@
             <w:pPr>
               <w:cnfStyle w:val="000000000000" w:firstRow="0" w:lastRow="0" w:firstColumn="0" w:lastColumn="0" w:oddVBand="0" w:evenVBand="0" w:oddHBand="0" w:evenHBand="0" w:firstRowFirstColumn="0" w:firstRowLastColumn="0" w:lastRowFirstColumn="0" w:lastRowLastColumn="0"/>
               <w:rPr>
-                <w:rFonts w:ascii="Sakkal Majalla" w:hAnsi="Sakkal Majalla" w:cs="Sakkal Majalla"/>
+                <w:rFonts w:ascii="Sakkal Majalla" w:hAnsi="Sakkal Majalla" w:cs="Sakkal Majalla" w:hint="cs"/>
               </w:rPr>
             </w:pPr>
             <w:r>
@@ -1115,7 +1115,7 @@
               <w:jc w:val="center"/>
               <w:cnfStyle w:val="000000000000" w:firstRow="0" w:lastRow="0" w:firstColumn="0" w:lastColumn="0" w:oddVBand="0" w:evenVBand="0" w:oddHBand="0" w:evenHBand="0" w:firstRowFirstColumn="0" w:firstRowLastColumn="0" w:lastRowFirstColumn="0" w:lastRowLastColumn="0"/>
               <w:rPr>
-                <w:rFonts w:ascii="Sakkal Majalla" w:hAnsi="Sakkal Majalla" w:cs="Sakkal Majalla"/>
+                <w:rFonts w:ascii="Sakkal Majalla" w:hAnsi="Sakkal Majalla" w:cs="Sakkal Majalla" w:hint="cs"/>
               </w:rPr>
             </w:pPr>
           </w:p>
@@ -1128,7 +1128,7 @@
             <w:pPr>
               <w:cnfStyle w:val="000000000000" w:firstRow="0" w:lastRow="0" w:firstColumn="0" w:lastColumn="0" w:oddVBand="0" w:evenVBand="0" w:oddHBand="0" w:evenHBand="0" w:firstRowFirstColumn="0" w:firstRowLastColumn="0" w:lastRowFirstColumn="0" w:lastRowLastColumn="0"/>
               <w:rPr>
-                <w:rFonts w:ascii="Sakkal Majalla" w:hAnsi="Sakkal Majalla" w:cs="Sakkal Majalla"/>
+                <w:rFonts w:ascii="Sakkal Majalla" w:hAnsi="Sakkal Majalla" w:cs="Sakkal Majalla" w:hint="cs"/>
               </w:rPr>
             </w:pPr>
           </w:p>
@@ -1147,7 +1147,7 @@
             <w:pPr>
               <w:jc w:val="center"/>
               <w:rPr>
-                <w:rFonts w:ascii="Sakkal Majalla" w:hAnsi="Sakkal Majalla" w:cs="Sakkal Majalla"/>
+                <w:rFonts w:ascii="Sakkal Majalla" w:hAnsi="Sakkal Majalla" w:cs="Sakkal Majalla" w:hint="cs"/>
               </w:rPr>
             </w:pPr>
             <w:r>
@@ -1166,7 +1166,7 @@
             <w:pPr>
               <w:cnfStyle w:val="000000100000" w:firstRow="0" w:lastRow="0" w:firstColumn="0" w:lastColumn="0" w:oddVBand="0" w:evenVBand="0" w:oddHBand="1" w:evenHBand="0" w:firstRowFirstColumn="0" w:firstRowLastColumn="0" w:lastRowFirstColumn="0" w:lastRowLastColumn="0"/>
               <w:rPr>
-                <w:rFonts w:ascii="Sakkal Majalla" w:hAnsi="Sakkal Majalla" w:cs="Sakkal Majalla"/>
+                <w:rFonts w:ascii="Sakkal Majalla" w:hAnsi="Sakkal Majalla" w:cs="Sakkal Majalla" w:hint="cs"/>
               </w:rPr>
             </w:pPr>
             <w:r>
@@ -1180,7 +1180,7 @@
             <w:pPr>
               <w:cnfStyle w:val="000000100000" w:firstRow="0" w:lastRow="0" w:firstColumn="0" w:lastColumn="0" w:oddVBand="0" w:evenVBand="0" w:oddHBand="1" w:evenHBand="0" w:firstRowFirstColumn="0" w:firstRowLastColumn="0" w:lastRowFirstColumn="0" w:lastRowLastColumn="0"/>
               <w:rPr>
-                <w:rFonts w:ascii="Sakkal Majalla" w:hAnsi="Sakkal Majalla" w:cs="Sakkal Majalla"/>
+                <w:rFonts w:ascii="Sakkal Majalla" w:hAnsi="Sakkal Majalla" w:cs="Sakkal Majalla" w:hint="cs"/>
               </w:rPr>
             </w:pPr>
             <w:r>
@@ -1194,15 +1194,15 @@
             <w:pPr>
               <w:cnfStyle w:val="000000100000" w:firstRow="0" w:lastRow="0" w:firstColumn="0" w:lastColumn="0" w:oddVBand="0" w:evenVBand="0" w:oddHBand="1" w:evenHBand="0" w:firstRowFirstColumn="0" w:firstRowLastColumn="0" w:lastRowFirstColumn="0" w:lastRowLastColumn="0"/>
               <w:rPr>
-                <w:rFonts w:ascii="Sakkal Majalla" w:hAnsi="Sakkal Majalla" w:cs="Sakkal Majalla"/>
-              </w:rPr>
-            </w:pPr>
-          </w:p>
-          <w:p>
-            <w:pPr>
-              <w:cnfStyle w:val="000000100000" w:firstRow="0" w:lastRow="0" w:firstColumn="0" w:lastColumn="0" w:oddVBand="0" w:evenVBand="0" w:oddHBand="1" w:evenHBand="0" w:firstRowFirstColumn="0" w:firstRowLastColumn="0" w:lastRowFirstColumn="0" w:lastRowLastColumn="0"/>
-              <w:rPr>
-                <w:rFonts w:ascii="Sakkal Majalla" w:hAnsi="Sakkal Majalla" w:cs="Sakkal Majalla"/>
+                <w:rFonts w:ascii="Sakkal Majalla" w:hAnsi="Sakkal Majalla" w:cs="Sakkal Majalla" w:hint="cs"/>
+              </w:rPr>
+            </w:pPr>
+          </w:p>
+          <w:p>
+            <w:pPr>
+              <w:cnfStyle w:val="000000100000" w:firstRow="0" w:lastRow="0" w:firstColumn="0" w:lastColumn="0" w:oddVBand="0" w:evenVBand="0" w:oddHBand="1" w:evenHBand="0" w:firstRowFirstColumn="0" w:firstRowLastColumn="0" w:lastRowFirstColumn="0" w:lastRowLastColumn="0"/>
+              <w:rPr>
+                <w:rFonts w:ascii="Sakkal Majalla" w:hAnsi="Sakkal Majalla" w:cs="Sakkal Majalla" w:hint="cs"/>
               </w:rPr>
             </w:pPr>
             <w:r>
@@ -1216,7 +1216,7 @@
             <w:pPr>
               <w:cnfStyle w:val="000000100000" w:firstRow="0" w:lastRow="0" w:firstColumn="0" w:lastColumn="0" w:oddVBand="0" w:evenVBand="0" w:oddHBand="1" w:evenHBand="0" w:firstRowFirstColumn="0" w:firstRowLastColumn="0" w:lastRowFirstColumn="0" w:lastRowLastColumn="0"/>
               <w:rPr>
-                <w:rFonts w:ascii="Sakkal Majalla" w:hAnsi="Sakkal Majalla" w:cs="Sakkal Majalla"/>
+                <w:rFonts w:ascii="Sakkal Majalla" w:hAnsi="Sakkal Majalla" w:cs="Sakkal Majalla" w:hint="cs"/>
               </w:rPr>
             </w:pPr>
             <w:r>
@@ -1230,7 +1230,7 @@
             <w:pPr>
               <w:cnfStyle w:val="000000100000" w:firstRow="0" w:lastRow="0" w:firstColumn="0" w:lastColumn="0" w:oddVBand="0" w:evenVBand="0" w:oddHBand="1" w:evenHBand="0" w:firstRowFirstColumn="0" w:firstRowLastColumn="0" w:lastRowFirstColumn="0" w:lastRowLastColumn="0"/>
               <w:rPr>
-                <w:rFonts w:ascii="Sakkal Majalla" w:hAnsi="Sakkal Majalla" w:cs="Sakkal Majalla"/>
+                <w:rFonts w:ascii="Sakkal Majalla" w:hAnsi="Sakkal Majalla" w:cs="Sakkal Majalla" w:hint="cs"/>
               </w:rPr>
             </w:pPr>
             <w:r>
@@ -1244,7 +1244,7 @@
             <w:pPr>
               <w:cnfStyle w:val="000000100000" w:firstRow="0" w:lastRow="0" w:firstColumn="0" w:lastColumn="0" w:oddVBand="0" w:evenVBand="0" w:oddHBand="1" w:evenHBand="0" w:firstRowFirstColumn="0" w:firstRowLastColumn="0" w:lastRowFirstColumn="0" w:lastRowLastColumn="0"/>
               <w:rPr>
-                <w:rFonts w:ascii="Sakkal Majalla" w:hAnsi="Sakkal Majalla" w:cs="Sakkal Majalla"/>
+                <w:rFonts w:ascii="Sakkal Majalla" w:hAnsi="Sakkal Majalla" w:cs="Sakkal Majalla" w:hint="cs"/>
               </w:rPr>
             </w:pPr>
             <w:r>
@@ -1258,7 +1258,7 @@
             <w:pPr>
               <w:cnfStyle w:val="000000100000" w:firstRow="0" w:lastRow="0" w:firstColumn="0" w:lastColumn="0" w:oddVBand="0" w:evenVBand="0" w:oddHBand="1" w:evenHBand="0" w:firstRowFirstColumn="0" w:firstRowLastColumn="0" w:lastRowFirstColumn="0" w:lastRowLastColumn="0"/>
               <w:rPr>
-                <w:rFonts w:ascii="Sakkal Majalla" w:hAnsi="Sakkal Majalla" w:cs="Sakkal Majalla"/>
+                <w:rFonts w:ascii="Sakkal Majalla" w:hAnsi="Sakkal Majalla" w:cs="Sakkal Majalla" w:hint="cs"/>
               </w:rPr>
             </w:pPr>
             <w:r>
@@ -1272,7 +1272,7 @@
             <w:pPr>
               <w:cnfStyle w:val="000000100000" w:firstRow="0" w:lastRow="0" w:firstColumn="0" w:lastColumn="0" w:oddVBand="0" w:evenVBand="0" w:oddHBand="1" w:evenHBand="0" w:firstRowFirstColumn="0" w:firstRowLastColumn="0" w:lastRowFirstColumn="0" w:lastRowLastColumn="0"/>
               <w:rPr>
-                <w:rFonts w:ascii="Sakkal Majalla" w:hAnsi="Sakkal Majalla" w:cs="Sakkal Majalla"/>
+                <w:rFonts w:ascii="Sakkal Majalla" w:hAnsi="Sakkal Majalla" w:cs="Sakkal Majalla" w:hint="cs"/>
               </w:rPr>
             </w:pPr>
             <w:r>
@@ -1286,7 +1286,7 @@
             <w:pPr>
               <w:cnfStyle w:val="000000100000" w:firstRow="0" w:lastRow="0" w:firstColumn="0" w:lastColumn="0" w:oddVBand="0" w:evenVBand="0" w:oddHBand="1" w:evenHBand="0" w:firstRowFirstColumn="0" w:firstRowLastColumn="0" w:lastRowFirstColumn="0" w:lastRowLastColumn="0"/>
               <w:rPr>
-                <w:rFonts w:ascii="Sakkal Majalla" w:hAnsi="Sakkal Majalla" w:cs="Sakkal Majalla"/>
+                <w:rFonts w:ascii="Sakkal Majalla" w:hAnsi="Sakkal Majalla" w:cs="Sakkal Majalla" w:hint="cs"/>
               </w:rPr>
             </w:pPr>
             <w:r>
@@ -1300,7 +1300,7 @@
             <w:pPr>
               <w:cnfStyle w:val="000000100000" w:firstRow="0" w:lastRow="0" w:firstColumn="0" w:lastColumn="0" w:oddVBand="0" w:evenVBand="0" w:oddHBand="1" w:evenHBand="0" w:firstRowFirstColumn="0" w:firstRowLastColumn="0" w:lastRowFirstColumn="0" w:lastRowLastColumn="0"/>
               <w:rPr>
-                <w:rFonts w:ascii="Sakkal Majalla" w:hAnsi="Sakkal Majalla" w:cs="Sakkal Majalla"/>
+                <w:rFonts w:ascii="Sakkal Majalla" w:hAnsi="Sakkal Majalla" w:cs="Sakkal Majalla" w:hint="cs"/>
               </w:rPr>
             </w:pPr>
             <w:r>
@@ -1314,7 +1314,7 @@
             <w:pPr>
               <w:cnfStyle w:val="000000100000" w:firstRow="0" w:lastRow="0" w:firstColumn="0" w:lastColumn="0" w:oddVBand="0" w:evenVBand="0" w:oddHBand="1" w:evenHBand="0" w:firstRowFirstColumn="0" w:firstRowLastColumn="0" w:lastRowFirstColumn="0" w:lastRowLastColumn="0"/>
               <w:rPr>
-                <w:rFonts w:ascii="Sakkal Majalla" w:hAnsi="Sakkal Majalla" w:cs="Sakkal Majalla"/>
+                <w:rFonts w:ascii="Sakkal Majalla" w:hAnsi="Sakkal Majalla" w:cs="Sakkal Majalla" w:hint="cs"/>
               </w:rPr>
             </w:pPr>
             <w:r>
@@ -1328,7 +1328,7 @@
             <w:pPr>
               <w:cnfStyle w:val="000000100000" w:firstRow="0" w:lastRow="0" w:firstColumn="0" w:lastColumn="0" w:oddVBand="0" w:evenVBand="0" w:oddHBand="1" w:evenHBand="0" w:firstRowFirstColumn="0" w:firstRowLastColumn="0" w:lastRowFirstColumn="0" w:lastRowLastColumn="0"/>
               <w:rPr>
-                <w:rFonts w:ascii="Sakkal Majalla" w:hAnsi="Sakkal Majalla" w:cs="Sakkal Majalla"/>
+                <w:rFonts w:ascii="Sakkal Majalla" w:hAnsi="Sakkal Majalla" w:cs="Sakkal Majalla" w:hint="cs"/>
               </w:rPr>
             </w:pPr>
             <w:r>
@@ -1342,7 +1342,7 @@
             <w:pPr>
               <w:cnfStyle w:val="000000100000" w:firstRow="0" w:lastRow="0" w:firstColumn="0" w:lastColumn="0" w:oddVBand="0" w:evenVBand="0" w:oddHBand="1" w:evenHBand="0" w:firstRowFirstColumn="0" w:firstRowLastColumn="0" w:lastRowFirstColumn="0" w:lastRowLastColumn="0"/>
               <w:rPr>
-                <w:rFonts w:ascii="Sakkal Majalla" w:hAnsi="Sakkal Majalla" w:cs="Sakkal Majalla"/>
+                <w:rFonts w:ascii="Sakkal Majalla" w:hAnsi="Sakkal Majalla" w:cs="Sakkal Majalla" w:hint="cs"/>
                 <w:b/>
                 <w:bCs/>
               </w:rPr>
@@ -1364,7 +1364,7 @@
               <w:jc w:val="center"/>
               <w:cnfStyle w:val="000000100000" w:firstRow="0" w:lastRow="0" w:firstColumn="0" w:lastColumn="0" w:oddVBand="0" w:evenVBand="0" w:oddHBand="1" w:evenHBand="0" w:firstRowFirstColumn="0" w:firstRowLastColumn="0" w:lastRowFirstColumn="0" w:lastRowLastColumn="0"/>
               <w:rPr>
-                <w:rFonts w:ascii="Sakkal Majalla" w:hAnsi="Sakkal Majalla" w:cs="Sakkal Majalla"/>
+                <w:rFonts w:ascii="Sakkal Majalla" w:hAnsi="Sakkal Majalla" w:cs="Sakkal Majalla" w:hint="cs"/>
               </w:rPr>
             </w:pPr>
             <w:r>
@@ -1395,7 +1395,7 @@
             <w:pPr>
               <w:cnfStyle w:val="000000100000" w:firstRow="0" w:lastRow="0" w:firstColumn="0" w:lastColumn="0" w:oddVBand="0" w:evenVBand="0" w:oddHBand="1" w:evenHBand="0" w:firstRowFirstColumn="0" w:firstRowLastColumn="0" w:lastRowFirstColumn="0" w:lastRowLastColumn="0"/>
               <w:rPr>
-                <w:rFonts w:ascii="Sakkal Majalla" w:hAnsi="Sakkal Majalla" w:cs="Sakkal Majalla"/>
+                <w:rFonts w:ascii="Sakkal Majalla" w:hAnsi="Sakkal Majalla" w:cs="Sakkal Majalla" w:hint="cs"/>
               </w:rPr>
             </w:pPr>
           </w:p>
@@ -1411,7 +1411,7 @@
             <w:pPr>
               <w:jc w:val="center"/>
               <w:rPr>
-                <w:rFonts w:ascii="Sakkal Majalla" w:hAnsi="Sakkal Majalla" w:cs="Sakkal Majalla"/>
+                <w:rFonts w:ascii="Sakkal Majalla" w:hAnsi="Sakkal Majalla" w:cs="Sakkal Majalla" w:hint="cs"/>
               </w:rPr>
             </w:pPr>
             <w:r>
@@ -1430,28 +1430,14 @@
             <w:pPr>
               <w:cnfStyle w:val="000000000000" w:firstRow="0" w:lastRow="0" w:firstColumn="0" w:lastColumn="0" w:oddVBand="0" w:evenVBand="0" w:oddHBand="0" w:evenHBand="0" w:firstRowFirstColumn="0" w:firstRowLastColumn="0" w:lastRowFirstColumn="0" w:lastRowLastColumn="0"/>
               <w:rPr>
-                <w:rFonts w:ascii="Sakkal Majalla" w:hAnsi="Sakkal Majalla" w:cs="Sakkal Majalla"/>
-              </w:rPr>
-            </w:pPr>
-            <w:r>
-              <w:rPr>
-                <w:rFonts w:ascii="Sakkal Majalla" w:hAnsi="Sakkal Majalla" w:cs="Sakkal Majalla" w:hint="cs"/>
-              </w:rPr>
-              <w:t xml:space="preserve">Network Latency Simulation: Use tools like </w:t>
-            </w:r>
-            <w:proofErr w:type="spellStart"/>
-            <w:r>
-              <w:rPr>
-                <w:rFonts w:ascii="Sakkal Majalla" w:hAnsi="Sakkal Majalla" w:cs="Sakkal Majalla" w:hint="cs"/>
-              </w:rPr>
-              <w:t>tc</w:t>
-            </w:r>
-            <w:proofErr w:type="spellEnd"/>
-            <w:r>
-              <w:rPr>
-                <w:rFonts w:ascii="Sakkal Majalla" w:hAnsi="Sakkal Majalla" w:cs="Sakkal Majalla" w:hint="cs"/>
-              </w:rPr>
-              <w:t xml:space="preserve"> (Linux) or Network Link Conditioner (macOS) to simulate slow networks if testing mobile-first apps (relevant if you later combine with Flutter frontend testing).</w:t>
+                <w:rFonts w:ascii="Sakkal Majalla" w:hAnsi="Sakkal Majalla" w:cs="Sakkal Majalla" w:hint="cs"/>
+              </w:rPr>
+            </w:pPr>
+            <w:r>
+              <w:rPr>
+                <w:rFonts w:ascii="Sakkal Majalla" w:hAnsi="Sakkal Majalla" w:cs="Sakkal Majalla" w:hint="cs"/>
+              </w:rPr>
+              <w:t>Network Latency Simulation: Use tools like tc (Linux) or Network Link Conditioner (macOS) to simulate slow networks if testing mobile-first apps (relevant if you later combine with Flutter frontend testing).</w:t>
             </w:r>
           </w:p>
         </w:tc>
@@ -1464,7 +1450,7 @@
               <w:jc w:val="center"/>
               <w:cnfStyle w:val="000000000000" w:firstRow="0" w:lastRow="0" w:firstColumn="0" w:lastColumn="0" w:oddVBand="0" w:evenVBand="0" w:oddHBand="0" w:evenHBand="0" w:firstRowFirstColumn="0" w:firstRowLastColumn="0" w:lastRowFirstColumn="0" w:lastRowLastColumn="0"/>
               <w:rPr>
-                <w:rFonts w:ascii="Sakkal Majalla" w:hAnsi="Sakkal Majalla" w:cs="Sakkal Majalla"/>
+                <w:rFonts w:ascii="Sakkal Majalla" w:hAnsi="Sakkal Majalla" w:cs="Sakkal Majalla" w:hint="cs"/>
               </w:rPr>
             </w:pPr>
             <w:r>
@@ -1483,7 +1469,7 @@
             <w:pPr>
               <w:cnfStyle w:val="000000000000" w:firstRow="0" w:lastRow="0" w:firstColumn="0" w:lastColumn="0" w:oddVBand="0" w:evenVBand="0" w:oddHBand="0" w:evenHBand="0" w:firstRowFirstColumn="0" w:firstRowLastColumn="0" w:lastRowFirstColumn="0" w:lastRowLastColumn="0"/>
               <w:rPr>
-                <w:rFonts w:ascii="Sakkal Majalla" w:hAnsi="Sakkal Majalla" w:cs="Sakkal Majalla"/>
+                <w:rFonts w:ascii="Sakkal Majalla" w:hAnsi="Sakkal Majalla" w:cs="Sakkal Majalla" w:hint="cs"/>
               </w:rPr>
             </w:pPr>
           </w:p>
@@ -1502,7 +1488,7 @@
             <w:pPr>
               <w:jc w:val="center"/>
               <w:rPr>
-                <w:rFonts w:ascii="Sakkal Majalla" w:hAnsi="Sakkal Majalla" w:cs="Sakkal Majalla"/>
+                <w:rFonts w:ascii="Sakkal Majalla" w:hAnsi="Sakkal Majalla" w:cs="Sakkal Majalla" w:hint="cs"/>
               </w:rPr>
             </w:pPr>
             <w:r>
@@ -1521,7 +1507,7 @@
             <w:pPr>
               <w:cnfStyle w:val="000000100000" w:firstRow="0" w:lastRow="0" w:firstColumn="0" w:lastColumn="0" w:oddVBand="0" w:evenVBand="0" w:oddHBand="1" w:evenHBand="0" w:firstRowFirstColumn="0" w:firstRowLastColumn="0" w:lastRowFirstColumn="0" w:lastRowLastColumn="0"/>
               <w:rPr>
-                <w:rFonts w:ascii="Sakkal Majalla" w:hAnsi="Sakkal Majalla" w:cs="Sakkal Majalla"/>
+                <w:rFonts w:ascii="Sakkal Majalla" w:hAnsi="Sakkal Majalla" w:cs="Sakkal Majalla" w:hint="cs"/>
               </w:rPr>
             </w:pPr>
             <w:r>
@@ -1540,7 +1526,7 @@
               </w:numPr>
               <w:cnfStyle w:val="000000100000" w:firstRow="0" w:lastRow="0" w:firstColumn="0" w:lastColumn="0" w:oddVBand="0" w:evenVBand="0" w:oddHBand="1" w:evenHBand="0" w:firstRowFirstColumn="0" w:firstRowLastColumn="0" w:lastRowFirstColumn="0" w:lastRowLastColumn="0"/>
               <w:rPr>
-                <w:rFonts w:ascii="Sakkal Majalla" w:hAnsi="Sakkal Majalla" w:cs="Sakkal Majalla"/>
+                <w:rFonts w:ascii="Sakkal Majalla" w:hAnsi="Sakkal Majalla" w:cs="Sakkal Majalla" w:hint="cs"/>
               </w:rPr>
             </w:pPr>
             <w:r>
@@ -1559,7 +1545,7 @@
               </w:numPr>
               <w:cnfStyle w:val="000000100000" w:firstRow="0" w:lastRow="0" w:firstColumn="0" w:lastColumn="0" w:oddVBand="0" w:evenVBand="0" w:oddHBand="1" w:evenHBand="0" w:firstRowFirstColumn="0" w:firstRowLastColumn="0" w:lastRowFirstColumn="0" w:lastRowLastColumn="0"/>
               <w:rPr>
-                <w:rFonts w:ascii="Sakkal Majalla" w:hAnsi="Sakkal Majalla" w:cs="Sakkal Majalla"/>
+                <w:rFonts w:ascii="Sakkal Majalla" w:hAnsi="Sakkal Majalla" w:cs="Sakkal Majalla" w:hint="cs"/>
               </w:rPr>
             </w:pPr>
             <w:r>
@@ -1573,7 +1559,7 @@
             <w:pPr>
               <w:cnfStyle w:val="000000100000" w:firstRow="0" w:lastRow="0" w:firstColumn="0" w:lastColumn="0" w:oddVBand="0" w:evenVBand="0" w:oddHBand="1" w:evenHBand="0" w:firstRowFirstColumn="0" w:firstRowLastColumn="0" w:lastRowFirstColumn="0" w:lastRowLastColumn="0"/>
               <w:rPr>
-                <w:rFonts w:ascii="Sakkal Majalla" w:hAnsi="Sakkal Majalla" w:cs="Sakkal Majalla"/>
+                <w:rFonts w:ascii="Sakkal Majalla" w:hAnsi="Sakkal Majalla" w:cs="Sakkal Majalla" w:hint="cs"/>
               </w:rPr>
             </w:pPr>
           </w:p>
@@ -1587,7 +1573,7 @@
               <w:jc w:val="center"/>
               <w:cnfStyle w:val="000000100000" w:firstRow="0" w:lastRow="0" w:firstColumn="0" w:lastColumn="0" w:oddVBand="0" w:evenVBand="0" w:oddHBand="1" w:evenHBand="0" w:firstRowFirstColumn="0" w:firstRowLastColumn="0" w:lastRowFirstColumn="0" w:lastRowLastColumn="0"/>
               <w:rPr>
-                <w:rFonts w:ascii="Sakkal Majalla" w:hAnsi="Sakkal Majalla" w:cs="Sakkal Majalla"/>
+                <w:rFonts w:ascii="Sakkal Majalla" w:hAnsi="Sakkal Majalla" w:cs="Sakkal Majalla" w:hint="cs"/>
               </w:rPr>
             </w:pPr>
             <w:r>
@@ -1618,7 +1604,7 @@
             <w:pPr>
               <w:cnfStyle w:val="000000100000" w:firstRow="0" w:lastRow="0" w:firstColumn="0" w:lastColumn="0" w:oddVBand="0" w:evenVBand="0" w:oddHBand="1" w:evenHBand="0" w:firstRowFirstColumn="0" w:firstRowLastColumn="0" w:lastRowFirstColumn="0" w:lastRowLastColumn="0"/>
               <w:rPr>
-                <w:rFonts w:ascii="Sakkal Majalla" w:hAnsi="Sakkal Majalla" w:cs="Sakkal Majalla"/>
+                <w:rFonts w:ascii="Sakkal Majalla" w:hAnsi="Sakkal Majalla" w:cs="Sakkal Majalla" w:hint="cs"/>
               </w:rPr>
             </w:pPr>
           </w:p>
@@ -1628,7 +1614,7 @@
     <w:p>
       <w:pPr>
         <w:rPr>
-          <w:rFonts w:ascii="Sakkal Majalla" w:hAnsi="Sakkal Majalla" w:cs="Sakkal Majalla"/>
+          <w:rFonts w:ascii="Sakkal Majalla" w:hAnsi="Sakkal Majalla" w:cs="Sakkal Majalla" w:hint="cs"/>
         </w:rPr>
       </w:pPr>
     </w:p>
@@ -1658,7 +1644,7 @@
             <w:pPr>
               <w:jc w:val="center"/>
               <w:rPr>
-                <w:rFonts w:ascii="Sakkal Majalla" w:hAnsi="Sakkal Majalla" w:cs="Sakkal Majalla"/>
+                <w:rFonts w:ascii="Sakkal Majalla" w:hAnsi="Sakkal Majalla" w:cs="Sakkal Majalla" w:hint="cs"/>
               </w:rPr>
             </w:pPr>
             <w:r>
@@ -1679,7 +1665,7 @@
               <w:jc w:val="center"/>
               <w:cnfStyle w:val="100000000000" w:firstRow="1" w:lastRow="0" w:firstColumn="0" w:lastColumn="0" w:oddVBand="0" w:evenVBand="0" w:oddHBand="0" w:evenHBand="0" w:firstRowFirstColumn="0" w:firstRowLastColumn="0" w:lastRowFirstColumn="0" w:lastRowLastColumn="0"/>
               <w:rPr>
-                <w:rFonts w:ascii="Sakkal Majalla" w:hAnsi="Sakkal Majalla" w:cs="Sakkal Majalla"/>
+                <w:rFonts w:ascii="Sakkal Majalla" w:hAnsi="Sakkal Majalla" w:cs="Sakkal Majalla" w:hint="cs"/>
               </w:rPr>
             </w:pPr>
             <w:r>
@@ -1699,7 +1685,7 @@
               <w:jc w:val="center"/>
               <w:cnfStyle w:val="100000000000" w:firstRow="1" w:lastRow="0" w:firstColumn="0" w:lastColumn="0" w:oddVBand="0" w:evenVBand="0" w:oddHBand="0" w:evenHBand="0" w:firstRowFirstColumn="0" w:firstRowLastColumn="0" w:lastRowFirstColumn="0" w:lastRowLastColumn="0"/>
               <w:rPr>
-                <w:rFonts w:ascii="Sakkal Majalla" w:hAnsi="Sakkal Majalla" w:cs="Sakkal Majalla"/>
+                <w:rFonts w:ascii="Sakkal Majalla" w:hAnsi="Sakkal Majalla" w:cs="Sakkal Majalla" w:hint="cs"/>
               </w:rPr>
             </w:pPr>
             <w:r>
@@ -1719,7 +1705,7 @@
               <w:jc w:val="center"/>
               <w:cnfStyle w:val="100000000000" w:firstRow="1" w:lastRow="0" w:firstColumn="0" w:lastColumn="0" w:oddVBand="0" w:evenVBand="0" w:oddHBand="0" w:evenHBand="0" w:firstRowFirstColumn="0" w:firstRowLastColumn="0" w:lastRowFirstColumn="0" w:lastRowLastColumn="0"/>
               <w:rPr>
-                <w:rFonts w:ascii="Sakkal Majalla" w:hAnsi="Sakkal Majalla" w:cs="Sakkal Majalla"/>
+                <w:rFonts w:ascii="Sakkal Majalla" w:hAnsi="Sakkal Majalla" w:cs="Sakkal Majalla" w:hint="cs"/>
               </w:rPr>
             </w:pPr>
             <w:r>
@@ -1744,7 +1730,7 @@
             <w:pPr>
               <w:jc w:val="center"/>
               <w:rPr>
-                <w:rFonts w:ascii="Sakkal Majalla" w:hAnsi="Sakkal Majalla" w:cs="Sakkal Majalla"/>
+                <w:rFonts w:ascii="Sakkal Majalla" w:hAnsi="Sakkal Majalla" w:cs="Sakkal Majalla" w:hint="cs"/>
               </w:rPr>
             </w:pPr>
             <w:r>
@@ -1763,7 +1749,7 @@
             <w:pPr>
               <w:cnfStyle w:val="000000100000" w:firstRow="0" w:lastRow="0" w:firstColumn="0" w:lastColumn="0" w:oddVBand="0" w:evenVBand="0" w:oddHBand="1" w:evenHBand="0" w:firstRowFirstColumn="0" w:firstRowLastColumn="0" w:lastRowFirstColumn="0" w:lastRowLastColumn="0"/>
               <w:rPr>
-                <w:rFonts w:ascii="Sakkal Majalla" w:hAnsi="Sakkal Majalla" w:cs="Sakkal Majalla"/>
+                <w:rFonts w:ascii="Sakkal Majalla" w:hAnsi="Sakkal Majalla" w:cs="Sakkal Majalla" w:hint="cs"/>
               </w:rPr>
             </w:pPr>
             <w:r>
@@ -1782,28 +1768,14 @@
               </w:numPr>
               <w:cnfStyle w:val="000000100000" w:firstRow="0" w:lastRow="0" w:firstColumn="0" w:lastColumn="0" w:oddVBand="0" w:evenVBand="0" w:oddHBand="1" w:evenHBand="0" w:firstRowFirstColumn="0" w:firstRowLastColumn="0" w:lastRowFirstColumn="0" w:lastRowLastColumn="0"/>
               <w:rPr>
-                <w:rFonts w:ascii="Sakkal Majalla" w:hAnsi="Sakkal Majalla" w:cs="Sakkal Majalla"/>
-              </w:rPr>
-            </w:pPr>
-            <w:r>
-              <w:rPr>
-                <w:rFonts w:ascii="Sakkal Majalla" w:hAnsi="Sakkal Majalla" w:cs="Sakkal Majalla" w:hint="cs"/>
-              </w:rPr>
-              <w:t xml:space="preserve">For global SaaS, run tests from multiple regions (AWS us-east, </w:t>
-            </w:r>
-            <w:proofErr w:type="spellStart"/>
-            <w:r>
-              <w:rPr>
-                <w:rFonts w:ascii="Sakkal Majalla" w:hAnsi="Sakkal Majalla" w:cs="Sakkal Majalla" w:hint="cs"/>
-              </w:rPr>
-              <w:t>eu</w:t>
-            </w:r>
-            <w:proofErr w:type="spellEnd"/>
-            <w:r>
-              <w:rPr>
-                <w:rFonts w:ascii="Sakkal Majalla" w:hAnsi="Sakkal Majalla" w:cs="Sakkal Majalla" w:hint="cs"/>
-              </w:rPr>
-              <w:t>-west, ap-south).</w:t>
+                <w:rFonts w:ascii="Sakkal Majalla" w:hAnsi="Sakkal Majalla" w:cs="Sakkal Majalla" w:hint="cs"/>
+              </w:rPr>
+            </w:pPr>
+            <w:r>
+              <w:rPr>
+                <w:rFonts w:ascii="Sakkal Majalla" w:hAnsi="Sakkal Majalla" w:cs="Sakkal Majalla" w:hint="cs"/>
+              </w:rPr>
+              <w:t>For global SaaS, run tests from multiple regions (AWS us-east, eu-west, ap-south).</w:t>
             </w:r>
           </w:p>
           <w:p>
@@ -1815,7 +1787,7 @@
               </w:numPr>
               <w:cnfStyle w:val="000000100000" w:firstRow="0" w:lastRow="0" w:firstColumn="0" w:lastColumn="0" w:oddVBand="0" w:evenVBand="0" w:oddHBand="1" w:evenHBand="0" w:firstRowFirstColumn="0" w:firstRowLastColumn="0" w:lastRowFirstColumn="0" w:lastRowLastColumn="0"/>
               <w:rPr>
-                <w:rFonts w:ascii="Sakkal Majalla" w:hAnsi="Sakkal Majalla" w:cs="Sakkal Majalla"/>
+                <w:rFonts w:ascii="Sakkal Majalla" w:hAnsi="Sakkal Majalla" w:cs="Sakkal Majalla" w:hint="cs"/>
               </w:rPr>
             </w:pPr>
             <w:r>
@@ -1835,7 +1807,7 @@
               <w:jc w:val="center"/>
               <w:cnfStyle w:val="000000100000" w:firstRow="0" w:lastRow="0" w:firstColumn="0" w:lastColumn="0" w:oddVBand="0" w:evenVBand="0" w:oddHBand="1" w:evenHBand="0" w:firstRowFirstColumn="0" w:firstRowLastColumn="0" w:lastRowFirstColumn="0" w:lastRowLastColumn="0"/>
               <w:rPr>
-                <w:rFonts w:ascii="Sakkal Majalla" w:hAnsi="Sakkal Majalla" w:cs="Sakkal Majalla"/>
+                <w:rFonts w:ascii="Sakkal Majalla" w:hAnsi="Sakkal Majalla" w:cs="Sakkal Majalla" w:hint="cs"/>
               </w:rPr>
             </w:pPr>
             <w:r>
@@ -1854,7 +1826,7 @@
             <w:pPr>
               <w:cnfStyle w:val="000000100000" w:firstRow="0" w:lastRow="0" w:firstColumn="0" w:lastColumn="0" w:oddVBand="0" w:evenVBand="0" w:oddHBand="1" w:evenHBand="0" w:firstRowFirstColumn="0" w:firstRowLastColumn="0" w:lastRowFirstColumn="0" w:lastRowLastColumn="0"/>
               <w:rPr>
-                <w:rFonts w:ascii="Sakkal Majalla" w:hAnsi="Sakkal Majalla" w:cs="Sakkal Majalla"/>
+                <w:rFonts w:ascii="Sakkal Majalla" w:hAnsi="Sakkal Majalla" w:cs="Sakkal Majalla" w:hint="cs"/>
               </w:rPr>
             </w:pPr>
           </w:p>
@@ -1870,7 +1842,7 @@
             <w:pPr>
               <w:jc w:val="center"/>
               <w:rPr>
-                <w:rFonts w:ascii="Sakkal Majalla" w:hAnsi="Sakkal Majalla" w:cs="Sakkal Majalla"/>
+                <w:rFonts w:ascii="Sakkal Majalla" w:hAnsi="Sakkal Majalla" w:cs="Sakkal Majalla" w:hint="cs"/>
               </w:rPr>
             </w:pPr>
             <w:r>
@@ -1889,7 +1861,7 @@
             <w:pPr>
               <w:cnfStyle w:val="000000000000" w:firstRow="0" w:lastRow="0" w:firstColumn="0" w:lastColumn="0" w:oddVBand="0" w:evenVBand="0" w:oddHBand="0" w:evenHBand="0" w:firstRowFirstColumn="0" w:firstRowLastColumn="0" w:lastRowFirstColumn="0" w:lastRowLastColumn="0"/>
               <w:rPr>
-                <w:rFonts w:ascii="Sakkal Majalla" w:hAnsi="Sakkal Majalla" w:cs="Sakkal Majalla"/>
+                <w:rFonts w:ascii="Sakkal Majalla" w:hAnsi="Sakkal Majalla" w:cs="Sakkal Majalla" w:hint="cs"/>
               </w:rPr>
             </w:pPr>
             <w:r>
@@ -1908,7 +1880,7 @@
               </w:numPr>
               <w:cnfStyle w:val="000000000000" w:firstRow="0" w:lastRow="0" w:firstColumn="0" w:lastColumn="0" w:oddVBand="0" w:evenVBand="0" w:oddHBand="0" w:evenHBand="0" w:firstRowFirstColumn="0" w:firstRowLastColumn="0" w:lastRowFirstColumn="0" w:lastRowLastColumn="0"/>
               <w:rPr>
-                <w:rFonts w:ascii="Sakkal Majalla" w:hAnsi="Sakkal Majalla" w:cs="Sakkal Majalla"/>
+                <w:rFonts w:ascii="Sakkal Majalla" w:hAnsi="Sakkal Majalla" w:cs="Sakkal Majalla" w:hint="cs"/>
               </w:rPr>
             </w:pPr>
             <w:r>
@@ -1994,7 +1966,7 @@
               </w:numPr>
               <w:cnfStyle w:val="000000000000" w:firstRow="0" w:lastRow="0" w:firstColumn="0" w:lastColumn="0" w:oddVBand="0" w:evenVBand="0" w:oddHBand="0" w:evenHBand="0" w:firstRowFirstColumn="0" w:firstRowLastColumn="0" w:lastRowFirstColumn="0" w:lastRowLastColumn="0"/>
               <w:rPr>
-                <w:rFonts w:ascii="Sakkal Majalla" w:hAnsi="Sakkal Majalla" w:cs="Sakkal Majalla"/>
+                <w:rFonts w:ascii="Sakkal Majalla" w:hAnsi="Sakkal Majalla" w:cs="Sakkal Majalla" w:hint="cs"/>
               </w:rPr>
             </w:pPr>
             <w:r>
@@ -2014,7 +1986,7 @@
               <w:jc w:val="center"/>
               <w:cnfStyle w:val="000000000000" w:firstRow="0" w:lastRow="0" w:firstColumn="0" w:lastColumn="0" w:oddVBand="0" w:evenVBand="0" w:oddHBand="0" w:evenHBand="0" w:firstRowFirstColumn="0" w:firstRowLastColumn="0" w:lastRowFirstColumn="0" w:lastRowLastColumn="0"/>
               <w:rPr>
-                <w:rFonts w:ascii="Sakkal Majalla" w:hAnsi="Sakkal Majalla" w:cs="Sakkal Majalla"/>
+                <w:rFonts w:ascii="Sakkal Majalla" w:hAnsi="Sakkal Majalla" w:cs="Sakkal Majalla" w:hint="cs"/>
               </w:rPr>
             </w:pPr>
             <w:r>
@@ -2029,7 +2001,7 @@
               <w:jc w:val="center"/>
               <w:cnfStyle w:val="000000000000" w:firstRow="0" w:lastRow="0" w:firstColumn="0" w:lastColumn="0" w:oddVBand="0" w:evenVBand="0" w:oddHBand="0" w:evenHBand="0" w:firstRowFirstColumn="0" w:firstRowLastColumn="0" w:lastRowFirstColumn="0" w:lastRowLastColumn="0"/>
               <w:rPr>
-                <w:rFonts w:ascii="Sakkal Majalla" w:hAnsi="Sakkal Majalla" w:cs="Sakkal Majalla"/>
+                <w:rFonts w:ascii="Sakkal Majalla" w:hAnsi="Sakkal Majalla" w:cs="Sakkal Majalla" w:hint="cs"/>
               </w:rPr>
             </w:pPr>
             <w:r>
@@ -2072,7 +2044,7 @@
             <w:pPr>
               <w:cnfStyle w:val="000000000000" w:firstRow="0" w:lastRow="0" w:firstColumn="0" w:lastColumn="0" w:oddVBand="0" w:evenVBand="0" w:oddHBand="0" w:evenHBand="0" w:firstRowFirstColumn="0" w:firstRowLastColumn="0" w:lastRowFirstColumn="0" w:lastRowLastColumn="0"/>
               <w:rPr>
-                <w:rFonts w:ascii="Sakkal Majalla" w:hAnsi="Sakkal Majalla" w:cs="Sakkal Majalla"/>
+                <w:rFonts w:ascii="Sakkal Majalla" w:hAnsi="Sakkal Majalla" w:cs="Sakkal Majalla" w:hint="cs"/>
               </w:rPr>
             </w:pPr>
           </w:p>
@@ -2091,7 +2063,7 @@
             <w:pPr>
               <w:jc w:val="center"/>
               <w:rPr>
-                <w:rFonts w:ascii="Sakkal Majalla" w:hAnsi="Sakkal Majalla" w:cs="Sakkal Majalla"/>
+                <w:rFonts w:ascii="Sakkal Majalla" w:hAnsi="Sakkal Majalla" w:cs="Sakkal Majalla" w:hint="cs"/>
               </w:rPr>
             </w:pPr>
             <w:r>
@@ -2110,7 +2082,7 @@
             <w:pPr>
               <w:cnfStyle w:val="000000100000" w:firstRow="0" w:lastRow="0" w:firstColumn="0" w:lastColumn="0" w:oddVBand="0" w:evenVBand="0" w:oddHBand="1" w:evenHBand="0" w:firstRowFirstColumn="0" w:firstRowLastColumn="0" w:lastRowFirstColumn="0" w:lastRowLastColumn="0"/>
               <w:rPr>
-                <w:rFonts w:ascii="Sakkal Majalla" w:hAnsi="Sakkal Majalla" w:cs="Sakkal Majalla"/>
+                <w:rFonts w:ascii="Sakkal Majalla" w:hAnsi="Sakkal Majalla" w:cs="Sakkal Majalla" w:hint="cs"/>
               </w:rPr>
             </w:pPr>
             <w:r>
@@ -2130,7 +2102,7 @@
               <w:jc w:val="center"/>
               <w:cnfStyle w:val="000000100000" w:firstRow="0" w:lastRow="0" w:firstColumn="0" w:lastColumn="0" w:oddVBand="0" w:evenVBand="0" w:oddHBand="1" w:evenHBand="0" w:firstRowFirstColumn="0" w:firstRowLastColumn="0" w:lastRowFirstColumn="0" w:lastRowLastColumn="0"/>
               <w:rPr>
-                <w:rFonts w:ascii="Sakkal Majalla" w:hAnsi="Sakkal Majalla" w:cs="Sakkal Majalla"/>
+                <w:rFonts w:ascii="Sakkal Majalla" w:hAnsi="Sakkal Majalla" w:cs="Sakkal Majalla" w:hint="cs"/>
               </w:rPr>
             </w:pPr>
             <w:r>
@@ -2155,7 +2127,7 @@
             <w:pPr>
               <w:cnfStyle w:val="000000100000" w:firstRow="0" w:lastRow="0" w:firstColumn="0" w:lastColumn="0" w:oddVBand="0" w:evenVBand="0" w:oddHBand="1" w:evenHBand="0" w:firstRowFirstColumn="0" w:firstRowLastColumn="0" w:lastRowFirstColumn="0" w:lastRowLastColumn="0"/>
               <w:rPr>
-                <w:rFonts w:ascii="Sakkal Majalla" w:hAnsi="Sakkal Majalla" w:cs="Sakkal Majalla"/>
+                <w:rFonts w:ascii="Sakkal Majalla" w:hAnsi="Sakkal Majalla" w:cs="Sakkal Majalla" w:hint="cs"/>
               </w:rPr>
             </w:pPr>
           </w:p>
@@ -2174,7 +2146,7 @@
             <w:pPr>
               <w:jc w:val="center"/>
               <w:rPr>
-                <w:rFonts w:ascii="Sakkal Majalla" w:hAnsi="Sakkal Majalla" w:cs="Sakkal Majalla"/>
+                <w:rFonts w:ascii="Sakkal Majalla" w:hAnsi="Sakkal Majalla" w:cs="Sakkal Majalla" w:hint="cs"/>
               </w:rPr>
             </w:pPr>
             <w:r>
@@ -2193,28 +2165,14 @@
             <w:pPr>
               <w:cnfStyle w:val="000000000000" w:firstRow="0" w:lastRow="0" w:firstColumn="0" w:lastColumn="0" w:oddVBand="0" w:evenVBand="0" w:oddHBand="0" w:evenHBand="0" w:firstRowFirstColumn="0" w:firstRowLastColumn="0" w:lastRowFirstColumn="0" w:lastRowLastColumn="0"/>
               <w:rPr>
-                <w:rFonts w:ascii="Sakkal Majalla" w:hAnsi="Sakkal Majalla" w:cs="Sakkal Majalla"/>
-              </w:rPr>
-            </w:pPr>
-            <w:r>
-              <w:rPr>
-                <w:rFonts w:ascii="Sakkal Majalla" w:hAnsi="Sakkal Majalla" w:cs="Sakkal Majalla" w:hint="cs"/>
-              </w:rPr>
-              <w:t>Profile Before Optimizing: Never guess bottlenecks. Use profilers (</w:t>
-            </w:r>
-            <w:proofErr w:type="spellStart"/>
-            <w:r>
-              <w:rPr>
-                <w:rFonts w:ascii="Sakkal Majalla" w:hAnsi="Sakkal Majalla" w:cs="Sakkal Majalla" w:hint="cs"/>
-              </w:rPr>
-              <w:t>cProfile</w:t>
-            </w:r>
-            <w:proofErr w:type="spellEnd"/>
-            <w:r>
-              <w:rPr>
-                <w:rFonts w:ascii="Sakkal Majalla" w:hAnsi="Sakkal Majalla" w:cs="Sakkal Majalla" w:hint="cs"/>
-              </w:rPr>
-              <w:t xml:space="preserve"> for Python, async-profiler for Java) during load tests to pinpoint exact lines of code causing delays.</w:t>
+                <w:rFonts w:ascii="Sakkal Majalla" w:hAnsi="Sakkal Majalla" w:cs="Sakkal Majalla" w:hint="cs"/>
+              </w:rPr>
+            </w:pPr>
+            <w:r>
+              <w:rPr>
+                <w:rFonts w:ascii="Sakkal Majalla" w:hAnsi="Sakkal Majalla" w:cs="Sakkal Majalla" w:hint="cs"/>
+              </w:rPr>
+              <w:t>Profile Before Optimizing: Never guess bottlenecks. Use profilers (cProfile for Python, async-profiler for Java) during load tests to pinpoint exact lines of code causing delays.</w:t>
             </w:r>
           </w:p>
         </w:tc>
@@ -2227,7 +2185,7 @@
               <w:jc w:val="center"/>
               <w:cnfStyle w:val="000000000000" w:firstRow="0" w:lastRow="0" w:firstColumn="0" w:lastColumn="0" w:oddVBand="0" w:evenVBand="0" w:oddHBand="0" w:evenHBand="0" w:firstRowFirstColumn="0" w:firstRowLastColumn="0" w:lastRowFirstColumn="0" w:lastRowLastColumn="0"/>
               <w:rPr>
-                <w:rFonts w:ascii="Sakkal Majalla" w:hAnsi="Sakkal Majalla" w:cs="Sakkal Majalla"/>
+                <w:rFonts w:ascii="Sakkal Majalla" w:hAnsi="Sakkal Majalla" w:cs="Sakkal Majalla" w:hint="cs"/>
               </w:rPr>
             </w:pPr>
             <w:r>
@@ -2246,7 +2204,7 @@
             <w:pPr>
               <w:cnfStyle w:val="000000000000" w:firstRow="0" w:lastRow="0" w:firstColumn="0" w:lastColumn="0" w:oddVBand="0" w:evenVBand="0" w:oddHBand="0" w:evenHBand="0" w:firstRowFirstColumn="0" w:firstRowLastColumn="0" w:lastRowFirstColumn="0" w:lastRowLastColumn="0"/>
               <w:rPr>
-                <w:rFonts w:ascii="Sakkal Majalla" w:hAnsi="Sakkal Majalla" w:cs="Sakkal Majalla"/>
+                <w:rFonts w:ascii="Sakkal Majalla" w:hAnsi="Sakkal Majalla" w:cs="Sakkal Majalla" w:hint="cs"/>
               </w:rPr>
             </w:pPr>
           </w:p>
@@ -2265,7 +2223,7 @@
             <w:pPr>
               <w:jc w:val="center"/>
               <w:rPr>
-                <w:rFonts w:ascii="Sakkal Majalla" w:hAnsi="Sakkal Majalla" w:cs="Sakkal Majalla"/>
+                <w:rFonts w:ascii="Sakkal Majalla" w:hAnsi="Sakkal Majalla" w:cs="Sakkal Majalla" w:hint="cs"/>
               </w:rPr>
             </w:pPr>
             <w:r>
@@ -2284,7 +2242,7 @@
             <w:pPr>
               <w:cnfStyle w:val="000000100000" w:firstRow="0" w:lastRow="0" w:firstColumn="0" w:lastColumn="0" w:oddVBand="0" w:evenVBand="0" w:oddHBand="1" w:evenHBand="0" w:firstRowFirstColumn="0" w:firstRowLastColumn="0" w:lastRowFirstColumn="0" w:lastRowLastColumn="0"/>
               <w:rPr>
-                <w:rFonts w:ascii="Sakkal Majalla" w:hAnsi="Sakkal Majalla" w:cs="Sakkal Majalla"/>
+                <w:rFonts w:ascii="Sakkal Majalla" w:hAnsi="Sakkal Majalla" w:cs="Sakkal Majalla" w:hint="cs"/>
               </w:rPr>
             </w:pPr>
             <w:r>
@@ -2304,7 +2262,7 @@
               <w:jc w:val="center"/>
               <w:cnfStyle w:val="000000100000" w:firstRow="0" w:lastRow="0" w:firstColumn="0" w:lastColumn="0" w:oddVBand="0" w:evenVBand="0" w:oddHBand="1" w:evenHBand="0" w:firstRowFirstColumn="0" w:firstRowLastColumn="0" w:lastRowFirstColumn="0" w:lastRowLastColumn="0"/>
               <w:rPr>
-                <w:rFonts w:ascii="Sakkal Majalla" w:hAnsi="Sakkal Majalla" w:cs="Sakkal Majalla"/>
+                <w:rFonts w:ascii="Sakkal Majalla" w:hAnsi="Sakkal Majalla" w:cs="Sakkal Majalla" w:hint="cs"/>
               </w:rPr>
             </w:pPr>
             <w:hyperlink r:id="rId5" w:history="1">
@@ -2322,7 +2280,7 @@
               <w:jc w:val="center"/>
               <w:cnfStyle w:val="000000100000" w:firstRow="0" w:lastRow="0" w:firstColumn="0" w:lastColumn="0" w:oddVBand="0" w:evenVBand="0" w:oddHBand="1" w:evenHBand="0" w:firstRowFirstColumn="0" w:firstRowLastColumn="0" w:lastRowFirstColumn="0" w:lastRowLastColumn="0"/>
               <w:rPr>
-                <w:rFonts w:ascii="Sakkal Majalla" w:hAnsi="Sakkal Majalla" w:cs="Sakkal Majalla"/>
+                <w:rFonts w:ascii="Sakkal Majalla" w:hAnsi="Sakkal Majalla" w:cs="Sakkal Majalla" w:hint="cs"/>
               </w:rPr>
             </w:pPr>
             <w:hyperlink r:id="rId6" w:history="1">
@@ -2340,7 +2298,7 @@
               <w:jc w:val="center"/>
               <w:cnfStyle w:val="000000100000" w:firstRow="0" w:lastRow="0" w:firstColumn="0" w:lastColumn="0" w:oddVBand="0" w:evenVBand="0" w:oddHBand="1" w:evenHBand="0" w:firstRowFirstColumn="0" w:firstRowLastColumn="0" w:lastRowFirstColumn="0" w:lastRowLastColumn="0"/>
               <w:rPr>
-                <w:rFonts w:ascii="Sakkal Majalla" w:hAnsi="Sakkal Majalla" w:cs="Sakkal Majalla"/>
+                <w:rFonts w:ascii="Sakkal Majalla" w:hAnsi="Sakkal Majalla" w:cs="Sakkal Majalla" w:hint="cs"/>
               </w:rPr>
             </w:pPr>
             <w:hyperlink r:id="rId7" w:history="1">
@@ -2358,7 +2316,7 @@
               <w:jc w:val="center"/>
               <w:cnfStyle w:val="000000100000" w:firstRow="0" w:lastRow="0" w:firstColumn="0" w:lastColumn="0" w:oddVBand="0" w:evenVBand="0" w:oddHBand="1" w:evenHBand="0" w:firstRowFirstColumn="0" w:firstRowLastColumn="0" w:lastRowFirstColumn="0" w:lastRowLastColumn="0"/>
               <w:rPr>
-                <w:rFonts w:ascii="Sakkal Majalla" w:hAnsi="Sakkal Majalla" w:cs="Sakkal Majalla"/>
+                <w:rFonts w:ascii="Sakkal Majalla" w:hAnsi="Sakkal Majalla" w:cs="Sakkal Majalla" w:hint="cs"/>
               </w:rPr>
             </w:pPr>
             <w:hyperlink r:id="rId8" w:history="1">
@@ -2376,7 +2334,7 @@
               <w:jc w:val="center"/>
               <w:cnfStyle w:val="000000100000" w:firstRow="0" w:lastRow="0" w:firstColumn="0" w:lastColumn="0" w:oddVBand="0" w:evenVBand="0" w:oddHBand="1" w:evenHBand="0" w:firstRowFirstColumn="0" w:firstRowLastColumn="0" w:lastRowFirstColumn="0" w:lastRowLastColumn="0"/>
               <w:rPr>
-                <w:rFonts w:ascii="Sakkal Majalla" w:hAnsi="Sakkal Majalla" w:cs="Sakkal Majalla"/>
+                <w:rFonts w:ascii="Sakkal Majalla" w:hAnsi="Sakkal Majalla" w:cs="Sakkal Majalla" w:hint="cs"/>
               </w:rPr>
             </w:pPr>
             <w:hyperlink r:id="rId9" w:history="1">
@@ -2398,7 +2356,7 @@
             <w:pPr>
               <w:cnfStyle w:val="000000100000" w:firstRow="0" w:lastRow="0" w:firstColumn="0" w:lastColumn="0" w:oddVBand="0" w:evenVBand="0" w:oddHBand="1" w:evenHBand="0" w:firstRowFirstColumn="0" w:firstRowLastColumn="0" w:lastRowFirstColumn="0" w:lastRowLastColumn="0"/>
               <w:rPr>
-                <w:rFonts w:ascii="Sakkal Majalla" w:hAnsi="Sakkal Majalla" w:cs="Sakkal Majalla"/>
+                <w:rFonts w:ascii="Sakkal Majalla" w:hAnsi="Sakkal Majalla" w:cs="Sakkal Majalla" w:hint="cs"/>
               </w:rPr>
             </w:pPr>
           </w:p>
@@ -2414,7 +2372,7 @@
             <w:pPr>
               <w:jc w:val="center"/>
               <w:rPr>
-                <w:rFonts w:ascii="Sakkal Majalla" w:hAnsi="Sakkal Majalla" w:cs="Sakkal Majalla"/>
+                <w:rFonts w:ascii="Sakkal Majalla" w:hAnsi="Sakkal Majalla" w:cs="Sakkal Majalla" w:hint="cs"/>
               </w:rPr>
             </w:pPr>
             <w:r>
@@ -2433,7 +2391,7 @@
             <w:pPr>
               <w:cnfStyle w:val="000000000000" w:firstRow="0" w:lastRow="0" w:firstColumn="0" w:lastColumn="0" w:oddVBand="0" w:evenVBand="0" w:oddHBand="0" w:evenHBand="0" w:firstRowFirstColumn="0" w:firstRowLastColumn="0" w:lastRowFirstColumn="0" w:lastRowLastColumn="0"/>
               <w:rPr>
-                <w:rFonts w:ascii="Sakkal Majalla" w:hAnsi="Sakkal Majalla" w:cs="Sakkal Majalla"/>
+                <w:rFonts w:ascii="Sakkal Majalla" w:hAnsi="Sakkal Majalla" w:cs="Sakkal Majalla" w:hint="cs"/>
               </w:rPr>
             </w:pPr>
             <w:r>
@@ -2453,7 +2411,7 @@
               <w:jc w:val="center"/>
               <w:cnfStyle w:val="000000000000" w:firstRow="0" w:lastRow="0" w:firstColumn="0" w:lastColumn="0" w:oddVBand="0" w:evenVBand="0" w:oddHBand="0" w:evenHBand="0" w:firstRowFirstColumn="0" w:firstRowLastColumn="0" w:lastRowFirstColumn="0" w:lastRowLastColumn="0"/>
               <w:rPr>
-                <w:rFonts w:ascii="Sakkal Majalla" w:hAnsi="Sakkal Majalla" w:cs="Sakkal Majalla"/>
+                <w:rFonts w:ascii="Sakkal Majalla" w:hAnsi="Sakkal Majalla" w:cs="Sakkal Majalla" w:hint="cs"/>
               </w:rPr>
             </w:pPr>
             <w:hyperlink r:id="rId10" w:history="1">
@@ -2471,7 +2429,7 @@
               <w:jc w:val="center"/>
               <w:cnfStyle w:val="000000000000" w:firstRow="0" w:lastRow="0" w:firstColumn="0" w:lastColumn="0" w:oddVBand="0" w:evenVBand="0" w:oddHBand="0" w:evenHBand="0" w:firstRowFirstColumn="0" w:firstRowLastColumn="0" w:lastRowFirstColumn="0" w:lastRowLastColumn="0"/>
               <w:rPr>
-                <w:rFonts w:ascii="Sakkal Majalla" w:hAnsi="Sakkal Majalla" w:cs="Sakkal Majalla"/>
+                <w:rFonts w:ascii="Sakkal Majalla" w:hAnsi="Sakkal Majalla" w:cs="Sakkal Majalla" w:hint="cs"/>
               </w:rPr>
             </w:pPr>
             <w:hyperlink r:id="rId11" w:history="1">
@@ -2489,7 +2447,7 @@
               <w:jc w:val="center"/>
               <w:cnfStyle w:val="000000000000" w:firstRow="0" w:lastRow="0" w:firstColumn="0" w:lastColumn="0" w:oddVBand="0" w:evenVBand="0" w:oddHBand="0" w:evenHBand="0" w:firstRowFirstColumn="0" w:firstRowLastColumn="0" w:lastRowFirstColumn="0" w:lastRowLastColumn="0"/>
               <w:rPr>
-                <w:rFonts w:ascii="Sakkal Majalla" w:hAnsi="Sakkal Majalla" w:cs="Sakkal Majalla"/>
+                <w:rFonts w:ascii="Sakkal Majalla" w:hAnsi="Sakkal Majalla" w:cs="Sakkal Majalla" w:hint="cs"/>
               </w:rPr>
             </w:pPr>
           </w:p>
@@ -2502,7 +2460,7 @@
             <w:pPr>
               <w:cnfStyle w:val="000000000000" w:firstRow="0" w:lastRow="0" w:firstColumn="0" w:lastColumn="0" w:oddVBand="0" w:evenVBand="0" w:oddHBand="0" w:evenHBand="0" w:firstRowFirstColumn="0" w:firstRowLastColumn="0" w:lastRowFirstColumn="0" w:lastRowLastColumn="0"/>
               <w:rPr>
-                <w:rFonts w:ascii="Sakkal Majalla" w:hAnsi="Sakkal Majalla" w:cs="Sakkal Majalla"/>
+                <w:rFonts w:ascii="Sakkal Majalla" w:hAnsi="Sakkal Majalla" w:cs="Sakkal Majalla" w:hint="cs"/>
               </w:rPr>
             </w:pPr>
           </w:p>
@@ -2521,7 +2479,7 @@
             <w:pPr>
               <w:jc w:val="center"/>
               <w:rPr>
-                <w:rFonts w:ascii="Sakkal Majalla" w:hAnsi="Sakkal Majalla" w:cs="Sakkal Majalla"/>
+                <w:rFonts w:ascii="Sakkal Majalla" w:hAnsi="Sakkal Majalla" w:cs="Sakkal Majalla" w:hint="cs"/>
               </w:rPr>
             </w:pPr>
             <w:r>
@@ -2540,7 +2498,7 @@
             <w:pPr>
               <w:cnfStyle w:val="000000100000" w:firstRow="0" w:lastRow="0" w:firstColumn="0" w:lastColumn="0" w:oddVBand="0" w:evenVBand="0" w:oddHBand="1" w:evenHBand="0" w:firstRowFirstColumn="0" w:firstRowLastColumn="0" w:lastRowFirstColumn="0" w:lastRowLastColumn="0"/>
               <w:rPr>
-                <w:rFonts w:ascii="Sakkal Majalla" w:hAnsi="Sakkal Majalla" w:cs="Sakkal Majalla"/>
+                <w:rFonts w:ascii="Sakkal Majalla" w:hAnsi="Sakkal Majalla" w:cs="Sakkal Majalla" w:hint="cs"/>
               </w:rPr>
             </w:pPr>
             <w:r>
@@ -2560,7 +2518,7 @@
               <w:jc w:val="center"/>
               <w:cnfStyle w:val="000000100000" w:firstRow="0" w:lastRow="0" w:firstColumn="0" w:lastColumn="0" w:oddVBand="0" w:evenVBand="0" w:oddHBand="1" w:evenHBand="0" w:firstRowFirstColumn="0" w:firstRowLastColumn="0" w:lastRowFirstColumn="0" w:lastRowLastColumn="0"/>
               <w:rPr>
-                <w:rFonts w:ascii="Sakkal Majalla" w:hAnsi="Sakkal Majalla" w:cs="Sakkal Majalla"/>
+                <w:rFonts w:ascii="Sakkal Majalla" w:hAnsi="Sakkal Majalla" w:cs="Sakkal Majalla" w:hint="cs"/>
               </w:rPr>
             </w:pPr>
           </w:p>
@@ -2573,7 +2531,7 @@
             <w:pPr>
               <w:cnfStyle w:val="000000100000" w:firstRow="0" w:lastRow="0" w:firstColumn="0" w:lastColumn="0" w:oddVBand="0" w:evenVBand="0" w:oddHBand="1" w:evenHBand="0" w:firstRowFirstColumn="0" w:firstRowLastColumn="0" w:lastRowFirstColumn="0" w:lastRowLastColumn="0"/>
               <w:rPr>
-                <w:rFonts w:ascii="Sakkal Majalla" w:hAnsi="Sakkal Majalla" w:cs="Sakkal Majalla"/>
+                <w:rFonts w:ascii="Sakkal Majalla" w:hAnsi="Sakkal Majalla" w:cs="Sakkal Majalla" w:hint="cs"/>
               </w:rPr>
             </w:pPr>
           </w:p>
@@ -2589,7 +2547,7 @@
             <w:pPr>
               <w:jc w:val="center"/>
               <w:rPr>
-                <w:rFonts w:ascii="Sakkal Majalla" w:hAnsi="Sakkal Majalla" w:cs="Sakkal Majalla"/>
+                <w:rFonts w:ascii="Sakkal Majalla" w:hAnsi="Sakkal Majalla" w:cs="Sakkal Majalla" w:hint="cs"/>
               </w:rPr>
             </w:pPr>
             <w:r>
@@ -2608,7 +2566,7 @@
             <w:pPr>
               <w:cnfStyle w:val="000000000000" w:firstRow="0" w:lastRow="0" w:firstColumn="0" w:lastColumn="0" w:oddVBand="0" w:evenVBand="0" w:oddHBand="0" w:evenHBand="0" w:firstRowFirstColumn="0" w:firstRowLastColumn="0" w:lastRowFirstColumn="0" w:lastRowLastColumn="0"/>
               <w:rPr>
-                <w:rFonts w:ascii="Sakkal Majalla" w:hAnsi="Sakkal Majalla" w:cs="Sakkal Majalla"/>
+                <w:rFonts w:ascii="Sakkal Majalla" w:hAnsi="Sakkal Majalla" w:cs="Sakkal Majalla" w:hint="cs"/>
               </w:rPr>
             </w:pPr>
             <w:r>
@@ -2628,7 +2586,7 @@
               <w:jc w:val="center"/>
               <w:cnfStyle w:val="000000000000" w:firstRow="0" w:lastRow="0" w:firstColumn="0" w:lastColumn="0" w:oddVBand="0" w:evenVBand="0" w:oddHBand="0" w:evenHBand="0" w:firstRowFirstColumn="0" w:firstRowLastColumn="0" w:lastRowFirstColumn="0" w:lastRowLastColumn="0"/>
               <w:rPr>
-                <w:rFonts w:ascii="Sakkal Majalla" w:hAnsi="Sakkal Majalla" w:cs="Sakkal Majalla"/>
+                <w:rFonts w:ascii="Sakkal Majalla" w:hAnsi="Sakkal Majalla" w:cs="Sakkal Majalla" w:hint="cs"/>
               </w:rPr>
             </w:pPr>
             <w:hyperlink r:id="rId12" w:history="1">
@@ -2650,7 +2608,7 @@
             <w:pPr>
               <w:cnfStyle w:val="000000000000" w:firstRow="0" w:lastRow="0" w:firstColumn="0" w:lastColumn="0" w:oddVBand="0" w:evenVBand="0" w:oddHBand="0" w:evenHBand="0" w:firstRowFirstColumn="0" w:firstRowLastColumn="0" w:lastRowFirstColumn="0" w:lastRowLastColumn="0"/>
               <w:rPr>
-                <w:rFonts w:ascii="Sakkal Majalla" w:hAnsi="Sakkal Majalla" w:cs="Sakkal Majalla"/>
+                <w:rFonts w:ascii="Sakkal Majalla" w:hAnsi="Sakkal Majalla" w:cs="Sakkal Majalla" w:hint="cs"/>
               </w:rPr>
             </w:pPr>
           </w:p>
@@ -2669,7 +2627,7 @@
             <w:pPr>
               <w:jc w:val="center"/>
               <w:rPr>
-                <w:rFonts w:ascii="Sakkal Majalla" w:hAnsi="Sakkal Majalla" w:cs="Sakkal Majalla"/>
+                <w:rFonts w:ascii="Sakkal Majalla" w:hAnsi="Sakkal Majalla" w:cs="Sakkal Majalla" w:hint="cs"/>
               </w:rPr>
             </w:pPr>
             <w:r>
@@ -2688,7 +2646,7 @@
             <w:pPr>
               <w:cnfStyle w:val="000000100000" w:firstRow="0" w:lastRow="0" w:firstColumn="0" w:lastColumn="0" w:oddVBand="0" w:evenVBand="0" w:oddHBand="1" w:evenHBand="0" w:firstRowFirstColumn="0" w:firstRowLastColumn="0" w:lastRowFirstColumn="0" w:lastRowLastColumn="0"/>
               <w:rPr>
-                <w:rFonts w:ascii="Sakkal Majalla" w:hAnsi="Sakkal Majalla" w:cs="Sakkal Majalla"/>
+                <w:rFonts w:ascii="Sakkal Majalla" w:hAnsi="Sakkal Majalla" w:cs="Sakkal Majalla" w:hint="cs"/>
               </w:rPr>
             </w:pPr>
             <w:r>
@@ -2708,7 +2666,7 @@
               <w:jc w:val="center"/>
               <w:cnfStyle w:val="000000100000" w:firstRow="0" w:lastRow="0" w:firstColumn="0" w:lastColumn="0" w:oddVBand="0" w:evenVBand="0" w:oddHBand="1" w:evenHBand="0" w:firstRowFirstColumn="0" w:firstRowLastColumn="0" w:lastRowFirstColumn="0" w:lastRowLastColumn="0"/>
               <w:rPr>
-                <w:rFonts w:ascii="Sakkal Majalla" w:hAnsi="Sakkal Majalla" w:cs="Sakkal Majalla"/>
+                <w:rFonts w:ascii="Sakkal Majalla" w:hAnsi="Sakkal Majalla" w:cs="Sakkal Majalla" w:hint="cs"/>
               </w:rPr>
             </w:pPr>
             <w:hyperlink r:id="rId13" w:history="1">
@@ -2744,7 +2702,7 @@
             <w:pPr>
               <w:cnfStyle w:val="000000100000" w:firstRow="0" w:lastRow="0" w:firstColumn="0" w:lastColumn="0" w:oddVBand="0" w:evenVBand="0" w:oddHBand="1" w:evenHBand="0" w:firstRowFirstColumn="0" w:firstRowLastColumn="0" w:lastRowFirstColumn="0" w:lastRowLastColumn="0"/>
               <w:rPr>
-                <w:rFonts w:ascii="Sakkal Majalla" w:hAnsi="Sakkal Majalla" w:cs="Sakkal Majalla"/>
+                <w:rFonts w:ascii="Sakkal Majalla" w:hAnsi="Sakkal Majalla" w:cs="Sakkal Majalla" w:hint="cs"/>
               </w:rPr>
             </w:pPr>
           </w:p>
@@ -2760,7 +2718,7 @@
             <w:pPr>
               <w:jc w:val="center"/>
               <w:rPr>
-                <w:rFonts w:ascii="Sakkal Majalla" w:hAnsi="Sakkal Majalla" w:cs="Sakkal Majalla"/>
+                <w:rFonts w:ascii="Sakkal Majalla" w:hAnsi="Sakkal Majalla" w:cs="Sakkal Majalla" w:hint="cs"/>
               </w:rPr>
             </w:pPr>
             <w:r>
@@ -2779,7 +2737,7 @@
             <w:pPr>
               <w:cnfStyle w:val="000000000000" w:firstRow="0" w:lastRow="0" w:firstColumn="0" w:lastColumn="0" w:oddVBand="0" w:evenVBand="0" w:oddHBand="0" w:evenHBand="0" w:firstRowFirstColumn="0" w:firstRowLastColumn="0" w:lastRowFirstColumn="0" w:lastRowLastColumn="0"/>
               <w:rPr>
-                <w:rFonts w:ascii="Sakkal Majalla" w:hAnsi="Sakkal Majalla" w:cs="Sakkal Majalla"/>
+                <w:rFonts w:ascii="Sakkal Majalla" w:hAnsi="Sakkal Majalla" w:cs="Sakkal Majalla" w:hint="cs"/>
               </w:rPr>
             </w:pPr>
             <w:r>
@@ -2799,7 +2757,7 @@
               <w:jc w:val="center"/>
               <w:cnfStyle w:val="000000000000" w:firstRow="0" w:lastRow="0" w:firstColumn="0" w:lastColumn="0" w:oddVBand="0" w:evenVBand="0" w:oddHBand="0" w:evenHBand="0" w:firstRowFirstColumn="0" w:firstRowLastColumn="0" w:lastRowFirstColumn="0" w:lastRowLastColumn="0"/>
               <w:rPr>
-                <w:rFonts w:ascii="Sakkal Majalla" w:hAnsi="Sakkal Majalla" w:cs="Sakkal Majalla"/>
+                <w:rFonts w:ascii="Sakkal Majalla" w:hAnsi="Sakkal Majalla" w:cs="Sakkal Majalla" w:hint="cs"/>
               </w:rPr>
             </w:pPr>
             <w:hyperlink r:id="rId14" w:history="1">
@@ -2821,7 +2779,7 @@
             <w:pPr>
               <w:cnfStyle w:val="000000000000" w:firstRow="0" w:lastRow="0" w:firstColumn="0" w:lastColumn="0" w:oddVBand="0" w:evenVBand="0" w:oddHBand="0" w:evenHBand="0" w:firstRowFirstColumn="0" w:firstRowLastColumn="0" w:lastRowFirstColumn="0" w:lastRowLastColumn="0"/>
               <w:rPr>
-                <w:rFonts w:ascii="Sakkal Majalla" w:hAnsi="Sakkal Majalla" w:cs="Sakkal Majalla"/>
+                <w:rFonts w:ascii="Sakkal Majalla" w:hAnsi="Sakkal Majalla" w:cs="Sakkal Majalla" w:hint="cs"/>
               </w:rPr>
             </w:pPr>
           </w:p>
@@ -2840,12 +2798,12 @@
             <w:pPr>
               <w:jc w:val="center"/>
               <w:rPr>
-                <w:rFonts w:ascii="Sakkal Majalla" w:hAnsi="Sakkal Majalla" w:cs="Sakkal Majalla"/>
-              </w:rPr>
-            </w:pPr>
-            <w:r>
-              <w:rPr>
-                <w:rFonts w:ascii="Sakkal Majalla" w:hAnsi="Sakkal Majalla" w:cs="Sakkal Majalla"/>
+                <w:rFonts w:ascii="Sakkal Majalla" w:hAnsi="Sakkal Majalla" w:cs="Sakkal Majalla" w:hint="cs"/>
+              </w:rPr>
+            </w:pPr>
+            <w:r>
+              <w:rPr>
+                <w:rFonts w:ascii="Sakkal Majalla" w:hAnsi="Sakkal Majalla" w:cs="Sakkal Majalla" w:hint="cs"/>
               </w:rPr>
               <w:t>26</w:t>
             </w:r>
@@ -2859,28 +2817,14 @@
             <w:pPr>
               <w:cnfStyle w:val="000000100000" w:firstRow="0" w:lastRow="0" w:firstColumn="0" w:lastColumn="0" w:oddVBand="0" w:evenVBand="0" w:oddHBand="1" w:evenHBand="0" w:firstRowFirstColumn="0" w:firstRowLastColumn="0" w:lastRowFirstColumn="0" w:lastRowLastColumn="0"/>
               <w:rPr>
-                <w:rFonts w:ascii="Sakkal Majalla" w:hAnsi="Sakkal Majalla" w:cs="Sakkal Majalla"/>
-              </w:rPr>
-            </w:pPr>
-            <w:r>
-              <w:rPr>
-                <w:rFonts w:ascii="Sakkal Majalla" w:hAnsi="Sakkal Majalla" w:cs="Sakkal Majalla"/>
-              </w:rPr>
-              <w:t xml:space="preserve">Elasticsearch for </w:t>
-            </w:r>
-            <w:proofErr w:type="spellStart"/>
-            <w:r>
-              <w:rPr>
-                <w:rFonts w:ascii="Sakkal Majalla" w:hAnsi="Sakkal Majalla" w:cs="Sakkal Majalla"/>
-              </w:rPr>
-              <w:t>geotemporal</w:t>
-            </w:r>
-            <w:proofErr w:type="spellEnd"/>
-            <w:r>
-              <w:rPr>
-                <w:rFonts w:ascii="Sakkal Majalla" w:hAnsi="Sakkal Majalla" w:cs="Sakkal Majalla"/>
-              </w:rPr>
-              <w:t xml:space="preserve"> data.</w:t>
+                <w:rFonts w:ascii="Sakkal Majalla" w:hAnsi="Sakkal Majalla" w:cs="Sakkal Majalla" w:hint="cs"/>
+              </w:rPr>
+            </w:pPr>
+            <w:r>
+              <w:rPr>
+                <w:rFonts w:ascii="Sakkal Majalla" w:hAnsi="Sakkal Majalla" w:cs="Sakkal Majalla" w:hint="cs"/>
+              </w:rPr>
+              <w:t>Elasticsearch for geotemporal data.</w:t>
             </w:r>
           </w:p>
         </w:tc>
@@ -2893,12 +2837,12 @@
               <w:jc w:val="center"/>
               <w:cnfStyle w:val="000000100000" w:firstRow="0" w:lastRow="0" w:firstColumn="0" w:lastColumn="0" w:oddVBand="0" w:evenVBand="0" w:oddHBand="1" w:evenHBand="0" w:firstRowFirstColumn="0" w:firstRowLastColumn="0" w:lastRowFirstColumn="0" w:lastRowLastColumn="0"/>
               <w:rPr>
-                <w:rFonts w:ascii="Sakkal Majalla" w:hAnsi="Sakkal Majalla" w:cs="Sakkal Majalla"/>
-              </w:rPr>
-            </w:pPr>
-            <w:r>
-              <w:rPr>
-                <w:rFonts w:ascii="Sakkal Majalla" w:hAnsi="Sakkal Majalla" w:cs="Sakkal Majalla"/>
+                <w:rFonts w:ascii="Sakkal Majalla" w:hAnsi="Sakkal Majalla" w:cs="Sakkal Majalla" w:hint="cs"/>
+              </w:rPr>
+            </w:pPr>
+            <w:r>
+              <w:rPr>
+                <w:rFonts w:ascii="Sakkal Majalla" w:hAnsi="Sakkal Majalla" w:cs="Sakkal Majalla" w:hint="cs"/>
               </w:rPr>
               <w:t>All Programming languages</w:t>
             </w:r>
@@ -2912,7 +2856,7 @@
             <w:pPr>
               <w:cnfStyle w:val="000000100000" w:firstRow="0" w:lastRow="0" w:firstColumn="0" w:lastColumn="0" w:oddVBand="0" w:evenVBand="0" w:oddHBand="1" w:evenHBand="0" w:firstRowFirstColumn="0" w:firstRowLastColumn="0" w:lastRowFirstColumn="0" w:lastRowLastColumn="0"/>
               <w:rPr>
-                <w:rFonts w:ascii="Sakkal Majalla" w:hAnsi="Sakkal Majalla" w:cs="Sakkal Majalla"/>
+                <w:rFonts w:ascii="Sakkal Majalla" w:hAnsi="Sakkal Majalla" w:cs="Sakkal Majalla" w:hint="cs"/>
               </w:rPr>
             </w:pPr>
           </w:p>
@@ -2928,14 +2872,20 @@
             <w:pPr>
               <w:jc w:val="center"/>
               <w:rPr>
+                <w:rFonts w:ascii="Sakkal Majalla" w:hAnsi="Sakkal Majalla" w:cs="Sakkal Majalla" w:hint="cs"/>
+              </w:rPr>
+            </w:pPr>
+            <w:r>
+              <w:rPr>
+                <w:rFonts w:ascii="Sakkal Majalla" w:hAnsi="Sakkal Majalla" w:cs="Sakkal Majalla" w:hint="cs"/>
+              </w:rPr>
+              <w:t>2</w:t>
+            </w:r>
+            <w:r>
+              <w:rPr>
                 <w:rFonts w:ascii="Sakkal Majalla" w:hAnsi="Sakkal Majalla" w:cs="Sakkal Majalla"/>
               </w:rPr>
-            </w:pPr>
-            <w:r>
-              <w:rPr>
-                <w:rFonts w:ascii="Sakkal Majalla" w:hAnsi="Sakkal Majalla" w:cs="Sakkal Majalla"/>
-              </w:rPr>
-              <w:t>27</w:t>
+              <w:t>7</w:t>
             </w:r>
           </w:p>
         </w:tc>
@@ -2947,14 +2897,14 @@
             <w:pPr>
               <w:cnfStyle w:val="000000000000" w:firstRow="0" w:lastRow="0" w:firstColumn="0" w:lastColumn="0" w:oddVBand="0" w:evenVBand="0" w:oddHBand="0" w:evenHBand="0" w:firstRowFirstColumn="0" w:firstRowLastColumn="0" w:lastRowFirstColumn="0" w:lastRowLastColumn="0"/>
               <w:rPr>
-                <w:rFonts w:ascii="Sakkal Majalla" w:hAnsi="Sakkal Majalla" w:cs="Sakkal Majalla"/>
-              </w:rPr>
-            </w:pPr>
-            <w:r>
-              <w:rPr>
-                <w:rFonts w:ascii="Sakkal Majalla" w:hAnsi="Sakkal Majalla" w:cs="Sakkal Majalla"/>
-              </w:rPr>
-              <w:t>VS Code Recipes</w:t>
+                <w:rFonts w:ascii="Sakkal Majalla" w:hAnsi="Sakkal Majalla" w:cs="Sakkal Majalla" w:hint="cs"/>
+              </w:rPr>
+            </w:pPr>
+            <w:r>
+              <w:rPr>
+                <w:rFonts w:ascii="Sakkal Majalla" w:hAnsi="Sakkal Majalla" w:cs="Sakkal Majalla" w:hint="cs"/>
+              </w:rPr>
+              <w:t>Scrapy with Splash tutorial</w:t>
             </w:r>
           </w:p>
         </w:tc>
@@ -2967,9 +2917,18 @@
               <w:jc w:val="center"/>
               <w:cnfStyle w:val="000000000000" w:firstRow="0" w:lastRow="0" w:firstColumn="0" w:lastColumn="0" w:oddVBand="0" w:evenVBand="0" w:oddHBand="0" w:evenHBand="0" w:firstRowFirstColumn="0" w:firstRowLastColumn="0" w:lastRowFirstColumn="0" w:lastRowLastColumn="0"/>
               <w:rPr>
-                <w:rFonts w:ascii="Sakkal Majalla" w:hAnsi="Sakkal Majalla" w:cs="Sakkal Majalla"/>
-              </w:rPr>
-            </w:pPr>
+                <w:rFonts w:ascii="Sakkal Majalla" w:hAnsi="Sakkal Majalla" w:cs="Sakkal Majalla" w:hint="cs"/>
+              </w:rPr>
+            </w:pPr>
+            <w:hyperlink r:id="rId15" w:history="1">
+              <w:r>
+                <w:rPr>
+                  <w:rStyle w:val="Hyperlink"/>
+                  <w:rFonts w:ascii="Sakkal Majalla" w:hAnsi="Sakkal Majalla" w:cs="Sakkal Majalla" w:hint="cs"/>
+                </w:rPr>
+                <w:t>Zenrows Scrapy Splash</w:t>
+              </w:r>
+            </w:hyperlink>
           </w:p>
         </w:tc>
         <w:tc>
@@ -2980,7 +2939,7 @@
             <w:pPr>
               <w:cnfStyle w:val="000000000000" w:firstRow="0" w:lastRow="0" w:firstColumn="0" w:lastColumn="0" w:oddVBand="0" w:evenVBand="0" w:oddHBand="0" w:evenHBand="0" w:firstRowFirstColumn="0" w:firstRowLastColumn="0" w:lastRowFirstColumn="0" w:lastRowLastColumn="0"/>
               <w:rPr>
-                <w:rFonts w:ascii="Sakkal Majalla" w:hAnsi="Sakkal Majalla" w:cs="Sakkal Majalla"/>
+                <w:rFonts w:ascii="Sakkal Majalla" w:hAnsi="Sakkal Majalla" w:cs="Sakkal Majalla" w:hint="cs"/>
               </w:rPr>
             </w:pPr>
           </w:p>
@@ -2999,14 +2958,124 @@
             <w:pPr>
               <w:jc w:val="center"/>
               <w:rPr>
+                <w:rFonts w:ascii="Sakkal Majalla" w:hAnsi="Sakkal Majalla" w:cs="Sakkal Majalla" w:hint="cs"/>
+              </w:rPr>
+            </w:pPr>
+            <w:r>
+              <w:rPr>
+                <w:rFonts w:ascii="Sakkal Majalla" w:hAnsi="Sakkal Majalla" w:cs="Sakkal Majalla" w:hint="cs"/>
+              </w:rPr>
+              <w:t>2</w:t>
+            </w:r>
+            <w:r>
+              <w:rPr>
                 <w:rFonts w:ascii="Sakkal Majalla" w:hAnsi="Sakkal Majalla" w:cs="Sakkal Majalla"/>
               </w:rPr>
-            </w:pPr>
+              <w:t>8</w:t>
+            </w:r>
+          </w:p>
+        </w:tc>
+        <w:tc>
+          <w:tcPr>
+            <w:tcW w:w="5400" w:type="dxa"/>
+          </w:tcPr>
+          <w:p>
+            <w:pPr>
+              <w:cnfStyle w:val="000000100000" w:firstRow="0" w:lastRow="0" w:firstColumn="0" w:lastColumn="0" w:oddVBand="0" w:evenVBand="0" w:oddHBand="1" w:evenHBand="0" w:firstRowFirstColumn="0" w:firstRowLastColumn="0" w:lastRowFirstColumn="0" w:lastRowLastColumn="0"/>
+              <w:rPr>
+                <w:rFonts w:ascii="Sakkal Majalla" w:hAnsi="Sakkal Majalla" w:cs="Sakkal Majalla" w:hint="cs"/>
+              </w:rPr>
+            </w:pPr>
+            <w:r>
+              <w:rPr>
+                <w:rFonts w:ascii="Sakkal Majalla" w:hAnsi="Sakkal Majalla" w:cs="Sakkal Majalla" w:hint="cs"/>
+              </w:rPr>
+              <w:t>Chat application with Socket.IO and Redis</w:t>
+            </w:r>
+          </w:p>
+        </w:tc>
+        <w:tc>
+          <w:tcPr>
+            <w:tcW w:w="4860" w:type="dxa"/>
+          </w:tcPr>
+          <w:p>
+            <w:pPr>
+              <w:jc w:val="center"/>
+              <w:cnfStyle w:val="000000100000" w:firstRow="0" w:lastRow="0" w:firstColumn="0" w:lastColumn="0" w:oddVBand="0" w:evenVBand="0" w:oddHBand="1" w:evenHBand="0" w:firstRowFirstColumn="0" w:firstRowLastColumn="0" w:lastRowFirstColumn="0" w:lastRowLastColumn="0"/>
+              <w:rPr>
+                <w:rFonts w:ascii="Sakkal Majalla" w:hAnsi="Sakkal Majalla" w:cs="Sakkal Majalla" w:hint="cs"/>
+              </w:rPr>
+            </w:pPr>
+            <w:r>
+              <w:rPr>
+                <w:rFonts w:ascii="Sakkal Majalla" w:hAnsi="Sakkal Majalla" w:cs="Sakkal Majalla" w:hint="cs"/>
+              </w:rPr>
+              <w:t xml:space="preserve">For </w:t>
+            </w:r>
             <w:r>
               <w:rPr>
                 <w:rFonts w:ascii="Sakkal Majalla" w:hAnsi="Sakkal Majalla" w:cs="Sakkal Majalla"/>
               </w:rPr>
-              <w:t>28</w:t>
+              <w:t>NodeJS</w:t>
+            </w:r>
+            <w:r>
+              <w:rPr>
+                <w:rFonts w:ascii="Sakkal Majalla" w:hAnsi="Sakkal Majalla" w:cs="Sakkal Majalla" w:hint="cs"/>
+              </w:rPr>
+              <w:t xml:space="preserve"> and </w:t>
+            </w:r>
+            <w:r>
+              <w:rPr>
+                <w:rFonts w:ascii="Sakkal Majalla" w:hAnsi="Sakkal Majalla" w:cs="Sakkal Majalla"/>
+              </w:rPr>
+              <w:t>FastAPI</w:t>
+            </w:r>
+            <w:r>
+              <w:rPr>
+                <w:rFonts w:ascii="Sakkal Majalla" w:hAnsi="Sakkal Majalla" w:cs="Sakkal Majalla"/>
+              </w:rPr>
+              <w:t xml:space="preserve"> applications</w:t>
+            </w:r>
+            <w:r>
+              <w:rPr>
+                <w:rFonts w:ascii="Sakkal Majalla" w:hAnsi="Sakkal Majalla" w:cs="Sakkal Majalla" w:hint="cs"/>
+              </w:rPr>
+              <w:t>.</w:t>
+            </w:r>
+          </w:p>
+        </w:tc>
+        <w:tc>
+          <w:tcPr>
+            <w:tcW w:w="990" w:type="dxa"/>
+          </w:tcPr>
+          <w:p>
+            <w:pPr>
+              <w:cnfStyle w:val="000000100000" w:firstRow="0" w:lastRow="0" w:firstColumn="0" w:lastColumn="0" w:oddVBand="0" w:evenVBand="0" w:oddHBand="1" w:evenHBand="0" w:firstRowFirstColumn="0" w:firstRowLastColumn="0" w:lastRowFirstColumn="0" w:lastRowLastColumn="0"/>
+              <w:rPr>
+                <w:rFonts w:ascii="Sakkal Majalla" w:hAnsi="Sakkal Majalla" w:cs="Sakkal Majalla" w:hint="cs"/>
+              </w:rPr>
+            </w:pPr>
+          </w:p>
+        </w:tc>
+      </w:tr>
+      <w:tr>
+        <w:tc>
+          <w:tcPr>
+            <w:cnfStyle w:val="001000000000" w:firstRow="0" w:lastRow="0" w:firstColumn="1" w:lastColumn="0" w:oddVBand="0" w:evenVBand="0" w:oddHBand="0" w:evenHBand="0" w:firstRowFirstColumn="0" w:firstRowLastColumn="0" w:lastRowFirstColumn="0" w:lastRowLastColumn="0"/>
+            <w:tcW w:w="810" w:type="dxa"/>
+          </w:tcPr>
+          <w:p>
+            <w:pPr>
+              <w:jc w:val="center"/>
+              <w:rPr>
+                <w:rFonts w:ascii="Sakkal Majalla" w:hAnsi="Sakkal Majalla" w:cs="Sakkal Majalla" w:hint="cs"/>
+              </w:rPr>
+            </w:pPr>
+            <w:r>
+              <w:rPr>
+                <w:rFonts w:ascii="Sakkal Majalla" w:hAnsi="Sakkal Majalla" w:cs="Sakkal Majalla"/>
+              </w:rPr>
+              <w:t>29</w:t>
             </w:r>
           </w:p>
         </w:tc>
@@ -3016,16 +3085,111 @@
           </w:tcPr>
           <w:p>
             <w:pPr>
-              <w:cnfStyle w:val="000000100000" w:firstRow="0" w:lastRow="0" w:firstColumn="0" w:lastColumn="0" w:oddVBand="0" w:evenVBand="0" w:oddHBand="1" w:evenHBand="0" w:firstRowFirstColumn="0" w:firstRowLastColumn="0" w:lastRowFirstColumn="0" w:lastRowLastColumn="0"/>
+              <w:cnfStyle w:val="000000000000" w:firstRow="0" w:lastRow="0" w:firstColumn="0" w:lastColumn="0" w:oddVBand="0" w:evenVBand="0" w:oddHBand="0" w:evenHBand="0" w:firstRowFirstColumn="0" w:firstRowLastColumn="0" w:lastRowFirstColumn="0" w:lastRowLastColumn="0"/>
+              <w:rPr>
+                <w:rFonts w:ascii="Sakkal Majalla" w:hAnsi="Sakkal Majalla" w:cs="Sakkal Majalla" w:hint="cs"/>
+              </w:rPr>
+            </w:pPr>
+            <w:r>
               <w:rPr>
                 <w:rFonts w:ascii="Sakkal Majalla" w:hAnsi="Sakkal Majalla" w:cs="Sakkal Majalla"/>
               </w:rPr>
+              <w:t>Chat application with SignalR and Redis</w:t>
+            </w:r>
+          </w:p>
+        </w:tc>
+        <w:tc>
+          <w:tcPr>
+            <w:tcW w:w="4860" w:type="dxa"/>
+          </w:tcPr>
+          <w:p>
+            <w:pPr>
+              <w:jc w:val="center"/>
+              <w:cnfStyle w:val="000000000000" w:firstRow="0" w:lastRow="0" w:firstColumn="0" w:lastColumn="0" w:oddVBand="0" w:evenVBand="0" w:oddHBand="0" w:evenHBand="0" w:firstRowFirstColumn="0" w:firstRowLastColumn="0" w:lastRowFirstColumn="0" w:lastRowLastColumn="0"/>
+              <w:rPr>
+                <w:rFonts w:ascii="Sakkal Majalla" w:hAnsi="Sakkal Majalla" w:cs="Sakkal Majalla" w:hint="cs"/>
+              </w:rPr>
             </w:pPr>
             <w:r>
               <w:rPr>
                 <w:rFonts w:ascii="Sakkal Majalla" w:hAnsi="Sakkal Majalla" w:cs="Sakkal Majalla"/>
               </w:rPr>
-              <w:t>Scrapy with Splash tutorial</w:t>
+              <w:t xml:space="preserve">For ASP.NET Core </w:t>
+            </w:r>
+            <w:r>
+              <w:rPr>
+                <w:rFonts w:ascii="Sakkal Majalla" w:hAnsi="Sakkal Majalla" w:cs="Sakkal Majalla"/>
+              </w:rPr>
+              <w:t>applications</w:t>
+            </w:r>
+            <w:r>
+              <w:rPr>
+                <w:rFonts w:ascii="Sakkal Majalla" w:hAnsi="Sakkal Majalla" w:cs="Sakkal Majalla"/>
+              </w:rPr>
+              <w:t>.</w:t>
+            </w:r>
+          </w:p>
+        </w:tc>
+        <w:tc>
+          <w:tcPr>
+            <w:tcW w:w="990" w:type="dxa"/>
+          </w:tcPr>
+          <w:p>
+            <w:pPr>
+              <w:cnfStyle w:val="000000000000" w:firstRow="0" w:lastRow="0" w:firstColumn="0" w:lastColumn="0" w:oddVBand="0" w:evenVBand="0" w:oddHBand="0" w:evenHBand="0" w:firstRowFirstColumn="0" w:firstRowLastColumn="0" w:lastRowFirstColumn="0" w:lastRowLastColumn="0"/>
+              <w:rPr>
+                <w:rFonts w:ascii="Sakkal Majalla" w:hAnsi="Sakkal Majalla" w:cs="Sakkal Majalla" w:hint="cs"/>
+              </w:rPr>
+            </w:pPr>
+          </w:p>
+        </w:tc>
+      </w:tr>
+      <w:tr>
+        <w:trPr>
+          <w:cnfStyle w:val="000000100000" w:firstRow="0" w:lastRow="0" w:firstColumn="0" w:lastColumn="0" w:oddVBand="0" w:evenVBand="0" w:oddHBand="1" w:evenHBand="0" w:firstRowFirstColumn="0" w:firstRowLastColumn="0" w:lastRowFirstColumn="0" w:lastRowLastColumn="0"/>
+        </w:trPr>
+        <w:tc>
+          <w:tcPr>
+            <w:cnfStyle w:val="001000000000" w:firstRow="0" w:lastRow="0" w:firstColumn="1" w:lastColumn="0" w:oddVBand="0" w:evenVBand="0" w:oddHBand="0" w:evenHBand="0" w:firstRowFirstColumn="0" w:firstRowLastColumn="0" w:lastRowFirstColumn="0" w:lastRowLastColumn="0"/>
+            <w:tcW w:w="810" w:type="dxa"/>
+          </w:tcPr>
+          <w:p>
+            <w:pPr>
+              <w:jc w:val="center"/>
+              <w:rPr>
+                <w:rFonts w:ascii="Sakkal Majalla" w:hAnsi="Sakkal Majalla" w:cs="Sakkal Majalla"/>
+              </w:rPr>
+            </w:pPr>
+            <w:r>
+              <w:rPr>
+                <w:rFonts w:ascii="Sakkal Majalla" w:hAnsi="Sakkal Majalla" w:cs="Sakkal Majalla"/>
+              </w:rPr>
+              <w:t>3</w:t>
+            </w:r>
+            <w:r>
+              <w:rPr>
+                <w:rFonts w:ascii="Sakkal Majalla" w:hAnsi="Sakkal Majalla" w:cs="Sakkal Majalla"/>
+              </w:rPr>
+              <w:t>0</w:t>
+            </w:r>
+          </w:p>
+        </w:tc>
+        <w:tc>
+          <w:tcPr>
+            <w:tcW w:w="5400" w:type="dxa"/>
+          </w:tcPr>
+          <w:p>
+            <w:pPr>
+              <w:cnfStyle w:val="000000100000" w:firstRow="0" w:lastRow="0" w:firstColumn="0" w:lastColumn="0" w:oddVBand="0" w:evenVBand="0" w:oddHBand="1" w:evenHBand="0" w:firstRowFirstColumn="0" w:firstRowLastColumn="0" w:lastRowFirstColumn="0" w:lastRowLastColumn="0"/>
+              <w:rPr>
+                <w:rFonts w:ascii="Sakkal Majalla" w:hAnsi="Sakkal Majalla" w:cs="Sakkal Majalla"/>
+              </w:rPr>
+            </w:pPr>
+            <w:r>
+              <w:rPr>
+                <w:rFonts w:ascii="Sakkal Majalla" w:hAnsi="Sakkal Majalla" w:cs="Sakkal Majalla"/>
+              </w:rPr>
+              <w:t>Chat application with Django channels and Redis</w:t>
             </w:r>
           </w:p>
         </w:tc>
@@ -3041,24 +3205,24 @@
                 <w:rFonts w:ascii="Sakkal Majalla" w:hAnsi="Sakkal Majalla" w:cs="Sakkal Majalla"/>
               </w:rPr>
             </w:pPr>
-            <w:hyperlink r:id="rId15" w:history="1">
-              <w:proofErr w:type="spellStart"/>
-              <w:r>
-                <w:rPr>
-                  <w:rStyle w:val="Hyperlink"/>
-                  <w:rFonts w:ascii="Sakkal Majalla" w:hAnsi="Sakkal Majalla" w:cs="Sakkal Majalla"/>
-                </w:rPr>
-                <w:t>Zenrows</w:t>
-              </w:r>
-              <w:proofErr w:type="spellEnd"/>
-              <w:r>
-                <w:rPr>
-                  <w:rStyle w:val="Hyperlink"/>
-                  <w:rFonts w:ascii="Sakkal Majalla" w:hAnsi="Sakkal Majalla" w:cs="Sakkal Majalla"/>
-                </w:rPr>
-                <w:t xml:space="preserve"> Scrapy Splash</w:t>
-              </w:r>
-            </w:hyperlink>
+            <w:r>
+              <w:rPr>
+                <w:rFonts w:ascii="Sakkal Majalla" w:hAnsi="Sakkal Majalla" w:cs="Sakkal Majalla"/>
+              </w:rPr>
+              <w:t>For Django appl</w:t>
+            </w:r>
+            <w:r>
+              <w:rPr>
+                <w:rFonts w:ascii="Sakkal Majalla" w:hAnsi="Sakkal Majalla" w:cs="Sakkal Majalla"/>
+              </w:rPr>
+              <w:t>i</w:t>
+            </w:r>
+            <w:r>
+              <w:rPr>
+                <w:rFonts w:ascii="Sakkal Majalla" w:hAnsi="Sakkal Majalla" w:cs="Sakkal Majalla"/>
+              </w:rPr>
+              <w:t>cations</w:t>
+            </w:r>
           </w:p>
         </w:tc>
         <w:tc>
@@ -3069,7 +3233,7 @@
             <w:pPr>
               <w:cnfStyle w:val="000000100000" w:firstRow="0" w:lastRow="0" w:firstColumn="0" w:lastColumn="0" w:oddVBand="0" w:evenVBand="0" w:oddHBand="1" w:evenHBand="0" w:firstRowFirstColumn="0" w:firstRowLastColumn="0" w:lastRowFirstColumn="0" w:lastRowLastColumn="0"/>
               <w:rPr>
-                <w:rFonts w:ascii="Sakkal Majalla" w:hAnsi="Sakkal Majalla" w:cs="Sakkal Majalla"/>
+                <w:rFonts w:ascii="Sakkal Majalla" w:hAnsi="Sakkal Majalla" w:cs="Sakkal Majalla" w:hint="cs"/>
               </w:rPr>
             </w:pPr>
           </w:p>
@@ -3079,35 +3243,35 @@
     <w:p>
       <w:pPr>
         <w:rPr>
-          <w:rFonts w:ascii="Sakkal Majalla" w:hAnsi="Sakkal Majalla" w:cs="Sakkal Majalla"/>
+          <w:rFonts w:ascii="Sakkal Majalla" w:hAnsi="Sakkal Majalla" w:cs="Sakkal Majalla" w:hint="cs"/>
         </w:rPr>
       </w:pPr>
     </w:p>
     <w:p>
       <w:pPr>
         <w:rPr>
-          <w:rFonts w:ascii="Sakkal Majalla" w:hAnsi="Sakkal Majalla" w:cs="Sakkal Majalla"/>
+          <w:rFonts w:ascii="Sakkal Majalla" w:hAnsi="Sakkal Majalla" w:cs="Sakkal Majalla" w:hint="cs"/>
         </w:rPr>
       </w:pPr>
     </w:p>
     <w:p>
       <w:pPr>
         <w:rPr>
-          <w:rFonts w:ascii="Sakkal Majalla" w:hAnsi="Sakkal Majalla" w:cs="Sakkal Majalla"/>
+          <w:rFonts w:ascii="Sakkal Majalla" w:hAnsi="Sakkal Majalla" w:cs="Sakkal Majalla" w:hint="cs"/>
         </w:rPr>
       </w:pPr>
     </w:p>
     <w:p>
       <w:pPr>
         <w:rPr>
-          <w:rFonts w:ascii="Sakkal Majalla" w:hAnsi="Sakkal Majalla" w:cs="Sakkal Majalla"/>
+          <w:rFonts w:ascii="Sakkal Majalla" w:hAnsi="Sakkal Majalla" w:cs="Sakkal Majalla" w:hint="cs"/>
         </w:rPr>
       </w:pPr>
     </w:p>
     <w:p>
       <w:pPr>
         <w:rPr>
-          <w:rFonts w:ascii="Sakkal Majalla" w:hAnsi="Sakkal Majalla" w:cs="Sakkal Majalla"/>
+          <w:rFonts w:ascii="Sakkal Majalla" w:hAnsi="Sakkal Majalla" w:cs="Sakkal Majalla" w:hint="cs"/>
         </w:rPr>
       </w:pPr>
     </w:p>
@@ -3136,7 +3300,7 @@
             <w:pPr>
               <w:jc w:val="center"/>
               <w:rPr>
-                <w:rFonts w:ascii="Sakkal Majalla" w:hAnsi="Sakkal Majalla" w:cs="Sakkal Majalla"/>
+                <w:rFonts w:ascii="Sakkal Majalla" w:hAnsi="Sakkal Majalla" w:cs="Sakkal Majalla" w:hint="cs"/>
               </w:rPr>
             </w:pPr>
             <w:r>
@@ -3156,7 +3320,7 @@
               <w:jc w:val="center"/>
               <w:cnfStyle w:val="100000000000" w:firstRow="1" w:lastRow="0" w:firstColumn="0" w:lastColumn="0" w:oddVBand="0" w:evenVBand="0" w:oddHBand="0" w:evenHBand="0" w:firstRowFirstColumn="0" w:firstRowLastColumn="0" w:lastRowFirstColumn="0" w:lastRowLastColumn="0"/>
               <w:rPr>
-                <w:rFonts w:ascii="Sakkal Majalla" w:hAnsi="Sakkal Majalla" w:cs="Sakkal Majalla"/>
+                <w:rFonts w:ascii="Sakkal Majalla" w:hAnsi="Sakkal Majalla" w:cs="Sakkal Majalla" w:hint="cs"/>
               </w:rPr>
             </w:pPr>
             <w:r>
@@ -3176,7 +3340,7 @@
               <w:jc w:val="center"/>
               <w:cnfStyle w:val="100000000000" w:firstRow="1" w:lastRow="0" w:firstColumn="0" w:lastColumn="0" w:oddVBand="0" w:evenVBand="0" w:oddHBand="0" w:evenHBand="0" w:firstRowFirstColumn="0" w:firstRowLastColumn="0" w:lastRowFirstColumn="0" w:lastRowLastColumn="0"/>
               <w:rPr>
-                <w:rFonts w:ascii="Sakkal Majalla" w:hAnsi="Sakkal Majalla" w:cs="Sakkal Majalla"/>
+                <w:rFonts w:ascii="Sakkal Majalla" w:hAnsi="Sakkal Majalla" w:cs="Sakkal Majalla" w:hint="cs"/>
               </w:rPr>
             </w:pPr>
             <w:r>
@@ -3198,7 +3362,7 @@
             <w:pPr>
               <w:jc w:val="center"/>
               <w:rPr>
-                <w:rFonts w:ascii="Sakkal Majalla" w:hAnsi="Sakkal Majalla" w:cs="Sakkal Majalla"/>
+                <w:rFonts w:ascii="Sakkal Majalla" w:hAnsi="Sakkal Majalla" w:cs="Sakkal Majalla" w:hint="cs"/>
               </w:rPr>
             </w:pPr>
             <w:r>
@@ -3218,7 +3382,7 @@
               <w:jc w:val="center"/>
               <w:cnfStyle w:val="000000000000" w:firstRow="0" w:lastRow="0" w:firstColumn="0" w:lastColumn="0" w:oddVBand="0" w:evenVBand="0" w:oddHBand="0" w:evenHBand="0" w:firstRowFirstColumn="0" w:firstRowLastColumn="0" w:lastRowFirstColumn="0" w:lastRowLastColumn="0"/>
               <w:rPr>
-                <w:rFonts w:ascii="Sakkal Majalla" w:hAnsi="Sakkal Majalla" w:cs="Sakkal Majalla"/>
+                <w:rFonts w:ascii="Sakkal Majalla" w:hAnsi="Sakkal Majalla" w:cs="Sakkal Majalla" w:hint="cs"/>
               </w:rPr>
             </w:pPr>
             <w:hyperlink r:id="rId16" w:history="1">
@@ -3240,7 +3404,7 @@
             <w:pPr>
               <w:cnfStyle w:val="000000000000" w:firstRow="0" w:lastRow="0" w:firstColumn="0" w:lastColumn="0" w:oddVBand="0" w:evenVBand="0" w:oddHBand="0" w:evenHBand="0" w:firstRowFirstColumn="0" w:firstRowLastColumn="0" w:lastRowFirstColumn="0" w:lastRowLastColumn="0"/>
               <w:rPr>
-                <w:rFonts w:ascii="Sakkal Majalla" w:hAnsi="Sakkal Majalla" w:cs="Sakkal Majalla"/>
+                <w:rFonts w:ascii="Sakkal Majalla" w:hAnsi="Sakkal Majalla" w:cs="Sakkal Majalla" w:hint="cs"/>
               </w:rPr>
             </w:pPr>
           </w:p>
@@ -3256,7 +3420,7 @@
             <w:pPr>
               <w:jc w:val="center"/>
               <w:rPr>
-                <w:rFonts w:ascii="Sakkal Majalla" w:hAnsi="Sakkal Majalla" w:cs="Sakkal Majalla"/>
+                <w:rFonts w:ascii="Sakkal Majalla" w:hAnsi="Sakkal Majalla" w:cs="Sakkal Majalla" w:hint="cs"/>
               </w:rPr>
             </w:pPr>
             <w:r>
@@ -3276,7 +3440,7 @@
               <w:jc w:val="center"/>
               <w:cnfStyle w:val="000000000000" w:firstRow="0" w:lastRow="0" w:firstColumn="0" w:lastColumn="0" w:oddVBand="0" w:evenVBand="0" w:oddHBand="0" w:evenHBand="0" w:firstRowFirstColumn="0" w:firstRowLastColumn="0" w:lastRowFirstColumn="0" w:lastRowLastColumn="0"/>
               <w:rPr>
-                <w:rFonts w:ascii="Sakkal Majalla" w:hAnsi="Sakkal Majalla" w:cs="Sakkal Majalla"/>
+                <w:rFonts w:ascii="Sakkal Majalla" w:hAnsi="Sakkal Majalla" w:cs="Sakkal Majalla" w:hint="cs"/>
               </w:rPr>
             </w:pPr>
             <w:hyperlink r:id="rId17" w:history="1">
@@ -3298,7 +3462,7 @@
             <w:pPr>
               <w:cnfStyle w:val="000000000000" w:firstRow="0" w:lastRow="0" w:firstColumn="0" w:lastColumn="0" w:oddVBand="0" w:evenVBand="0" w:oddHBand="0" w:evenHBand="0" w:firstRowFirstColumn="0" w:firstRowLastColumn="0" w:lastRowFirstColumn="0" w:lastRowLastColumn="0"/>
               <w:rPr>
-                <w:rFonts w:ascii="Sakkal Majalla" w:hAnsi="Sakkal Majalla" w:cs="Sakkal Majalla"/>
+                <w:rFonts w:ascii="Sakkal Majalla" w:hAnsi="Sakkal Majalla" w:cs="Sakkal Majalla" w:hint="cs"/>
               </w:rPr>
             </w:pPr>
           </w:p>
@@ -3314,7 +3478,7 @@
             <w:pPr>
               <w:jc w:val="center"/>
               <w:rPr>
-                <w:rFonts w:ascii="Sakkal Majalla" w:hAnsi="Sakkal Majalla" w:cs="Sakkal Majalla"/>
+                <w:rFonts w:ascii="Sakkal Majalla" w:hAnsi="Sakkal Majalla" w:cs="Sakkal Majalla" w:hint="cs"/>
               </w:rPr>
             </w:pPr>
             <w:r>
@@ -3334,7 +3498,7 @@
               <w:jc w:val="center"/>
               <w:cnfStyle w:val="000000000000" w:firstRow="0" w:lastRow="0" w:firstColumn="0" w:lastColumn="0" w:oddVBand="0" w:evenVBand="0" w:oddHBand="0" w:evenHBand="0" w:firstRowFirstColumn="0" w:firstRowLastColumn="0" w:lastRowFirstColumn="0" w:lastRowLastColumn="0"/>
               <w:rPr>
-                <w:rFonts w:ascii="Sakkal Majalla" w:hAnsi="Sakkal Majalla" w:cs="Sakkal Majalla"/>
+                <w:rFonts w:ascii="Sakkal Majalla" w:hAnsi="Sakkal Majalla" w:cs="Sakkal Majalla" w:hint="cs"/>
               </w:rPr>
             </w:pPr>
             <w:hyperlink r:id="rId18" w:history="1">
@@ -3356,7 +3520,7 @@
             <w:pPr>
               <w:cnfStyle w:val="000000000000" w:firstRow="0" w:lastRow="0" w:firstColumn="0" w:lastColumn="0" w:oddVBand="0" w:evenVBand="0" w:oddHBand="0" w:evenHBand="0" w:firstRowFirstColumn="0" w:firstRowLastColumn="0" w:lastRowFirstColumn="0" w:lastRowLastColumn="0"/>
               <w:rPr>
-                <w:rFonts w:ascii="Sakkal Majalla" w:hAnsi="Sakkal Majalla" w:cs="Sakkal Majalla"/>
+                <w:rFonts w:ascii="Sakkal Majalla" w:hAnsi="Sakkal Majalla" w:cs="Sakkal Majalla" w:hint="cs"/>
               </w:rPr>
             </w:pPr>
           </w:p>
@@ -3372,7 +3536,7 @@
             <w:pPr>
               <w:jc w:val="center"/>
               <w:rPr>
-                <w:rFonts w:ascii="Sakkal Majalla" w:hAnsi="Sakkal Majalla" w:cs="Sakkal Majalla"/>
+                <w:rFonts w:ascii="Sakkal Majalla" w:hAnsi="Sakkal Majalla" w:cs="Sakkal Majalla" w:hint="cs"/>
               </w:rPr>
             </w:pPr>
             <w:r>
@@ -3392,7 +3556,7 @@
               <w:jc w:val="center"/>
               <w:cnfStyle w:val="000000000000" w:firstRow="0" w:lastRow="0" w:firstColumn="0" w:lastColumn="0" w:oddVBand="0" w:evenVBand="0" w:oddHBand="0" w:evenHBand="0" w:firstRowFirstColumn="0" w:firstRowLastColumn="0" w:lastRowFirstColumn="0" w:lastRowLastColumn="0"/>
               <w:rPr>
-                <w:rFonts w:ascii="Sakkal Majalla" w:hAnsi="Sakkal Majalla" w:cs="Sakkal Majalla"/>
+                <w:rFonts w:ascii="Sakkal Majalla" w:hAnsi="Sakkal Majalla" w:cs="Sakkal Majalla" w:hint="cs"/>
               </w:rPr>
             </w:pPr>
             <w:hyperlink r:id="rId19" w:history="1">
@@ -3401,23 +3565,7 @@
                   <w:rStyle w:val="Hyperlink"/>
                   <w:rFonts w:ascii="Sakkal Majalla" w:hAnsi="Sakkal Majalla" w:cs="Sakkal Majalla" w:hint="cs"/>
                 </w:rPr>
-                <w:t xml:space="preserve">Blog for logging, </w:t>
-              </w:r>
-              <w:proofErr w:type="spellStart"/>
-              <w:r>
-                <w:rPr>
-                  <w:rStyle w:val="Hyperlink"/>
-                  <w:rFonts w:ascii="Sakkal Majalla" w:hAnsi="Sakkal Majalla" w:cs="Sakkal Majalla" w:hint="cs"/>
-                </w:rPr>
-                <w:t>OpenTelemetry</w:t>
-              </w:r>
-              <w:proofErr w:type="spellEnd"/>
-              <w:r>
-                <w:rPr>
-                  <w:rStyle w:val="Hyperlink"/>
-                  <w:rFonts w:ascii="Sakkal Majalla" w:hAnsi="Sakkal Majalla" w:cs="Sakkal Majalla" w:hint="cs"/>
-                </w:rPr>
-                <w:t>, Loki, Elasticsearch, etc.</w:t>
+                <w:t>Blog for logging, OpenTelemetry, Loki, Elasticsearch, etc.</w:t>
               </w:r>
             </w:hyperlink>
           </w:p>
@@ -3430,7 +3578,7 @@
             <w:pPr>
               <w:cnfStyle w:val="000000000000" w:firstRow="0" w:lastRow="0" w:firstColumn="0" w:lastColumn="0" w:oddVBand="0" w:evenVBand="0" w:oddHBand="0" w:evenHBand="0" w:firstRowFirstColumn="0" w:firstRowLastColumn="0" w:lastRowFirstColumn="0" w:lastRowLastColumn="0"/>
               <w:rPr>
-                <w:rFonts w:ascii="Sakkal Majalla" w:hAnsi="Sakkal Majalla" w:cs="Sakkal Majalla"/>
+                <w:rFonts w:ascii="Sakkal Majalla" w:hAnsi="Sakkal Majalla" w:cs="Sakkal Majalla" w:hint="cs"/>
               </w:rPr>
             </w:pPr>
           </w:p>
@@ -3446,7 +3594,7 @@
             <w:pPr>
               <w:jc w:val="center"/>
               <w:rPr>
-                <w:rFonts w:ascii="Sakkal Majalla" w:hAnsi="Sakkal Majalla" w:cs="Sakkal Majalla"/>
+                <w:rFonts w:ascii="Sakkal Majalla" w:hAnsi="Sakkal Majalla" w:cs="Sakkal Majalla" w:hint="cs"/>
               </w:rPr>
             </w:pPr>
             <w:r>
@@ -3466,7 +3614,7 @@
               <w:jc w:val="center"/>
               <w:cnfStyle w:val="000000000000" w:firstRow="0" w:lastRow="0" w:firstColumn="0" w:lastColumn="0" w:oddVBand="0" w:evenVBand="0" w:oddHBand="0" w:evenHBand="0" w:firstRowFirstColumn="0" w:firstRowLastColumn="0" w:lastRowFirstColumn="0" w:lastRowLastColumn="0"/>
               <w:rPr>
-                <w:rFonts w:ascii="Sakkal Majalla" w:hAnsi="Sakkal Majalla" w:cs="Sakkal Majalla"/>
+                <w:rFonts w:ascii="Sakkal Majalla" w:hAnsi="Sakkal Majalla" w:cs="Sakkal Majalla" w:hint="cs"/>
               </w:rPr>
             </w:pPr>
             <w:hyperlink r:id="rId20" w:history="1">
@@ -3494,7 +3642,7 @@
             <w:pPr>
               <w:cnfStyle w:val="000000000000" w:firstRow="0" w:lastRow="0" w:firstColumn="0" w:lastColumn="0" w:oddVBand="0" w:evenVBand="0" w:oddHBand="0" w:evenHBand="0" w:firstRowFirstColumn="0" w:firstRowLastColumn="0" w:lastRowFirstColumn="0" w:lastRowLastColumn="0"/>
               <w:rPr>
-                <w:rFonts w:ascii="Sakkal Majalla" w:hAnsi="Sakkal Majalla" w:cs="Sakkal Majalla"/>
+                <w:rFonts w:ascii="Sakkal Majalla" w:hAnsi="Sakkal Majalla" w:cs="Sakkal Majalla" w:hint="cs"/>
               </w:rPr>
             </w:pPr>
           </w:p>
@@ -3523,11 +3671,15 @@
             <w:pPr>
               <w:jc w:val="center"/>
               <w:cnfStyle w:val="000000000000" w:firstRow="0" w:lastRow="0" w:firstColumn="0" w:lastColumn="0" w:oddVBand="0" w:evenVBand="0" w:oddHBand="0" w:evenHBand="0" w:firstRowFirstColumn="0" w:firstRowLastColumn="0" w:lastRowFirstColumn="0" w:lastRowLastColumn="0"/>
+              <w:rPr>
+                <w:rFonts w:ascii="Sakkal Majalla" w:hAnsi="Sakkal Majalla" w:cs="Sakkal Majalla" w:hint="cs"/>
+              </w:rPr>
             </w:pPr>
             <w:hyperlink r:id="rId21" w:history="1">
               <w:r>
                 <w:rPr>
                   <w:rStyle w:val="Hyperlink"/>
+                  <w:rFonts w:ascii="Sakkal Majalla" w:hAnsi="Sakkal Majalla" w:cs="Sakkal Majalla" w:hint="cs"/>
                 </w:rPr>
                 <w:t>https://www.scraping.club/</w:t>
               </w:r>
@@ -3542,7 +3694,7 @@
             <w:pPr>
               <w:cnfStyle w:val="000000000000" w:firstRow="0" w:lastRow="0" w:firstColumn="0" w:lastColumn="0" w:oddVBand="0" w:evenVBand="0" w:oddHBand="0" w:evenHBand="0" w:firstRowFirstColumn="0" w:firstRowLastColumn="0" w:lastRowFirstColumn="0" w:lastRowLastColumn="0"/>
               <w:rPr>
-                <w:rFonts w:ascii="Sakkal Majalla" w:hAnsi="Sakkal Majalla" w:cs="Sakkal Majalla"/>
+                <w:rFonts w:ascii="Sakkal Majalla" w:hAnsi="Sakkal Majalla" w:cs="Sakkal Majalla" w:hint="cs"/>
               </w:rPr>
             </w:pPr>
           </w:p>
@@ -3552,7 +3704,7 @@
     <w:p>
       <w:pPr>
         <w:rPr>
-          <w:rFonts w:ascii="Sakkal Majalla" w:hAnsi="Sakkal Majalla" w:cs="Sakkal Majalla"/>
+          <w:rFonts w:ascii="Sakkal Majalla" w:hAnsi="Sakkal Majalla" w:cs="Sakkal Majalla" w:hint="cs"/>
         </w:rPr>
       </w:pPr>
     </w:p>

</xml_diff>

<commit_message>
Adding Pytest Search Topics & Pytest For E-Commerce Applciation API Endpoints --samples-only
</commit_message>
<xml_diff>
--- a/Search-Topics-01.docx
+++ b/Search-Topics-01.docx
@@ -1253,57 +1253,29 @@
               <w:rPr>
                 <w:rFonts w:ascii="Sakkal Majalla" w:hAnsi="Sakkal Majalla" w:cs="Sakkal Majalla" w:hint="cs"/>
               </w:rPr>
-              <w:t>events.test_</w:t>
-            </w:r>
-            <w:proofErr w:type="gramStart"/>
-            <w:r>
-              <w:rPr>
-                <w:rFonts w:ascii="Sakkal Majalla" w:hAnsi="Sakkal Majalla" w:cs="Sakkal Majalla" w:hint="cs"/>
-              </w:rPr>
-              <w:t>stop.connect</w:t>
-            </w:r>
-            <w:proofErr w:type="gramEnd"/>
-            <w:r>
-              <w:rPr>
-                <w:rFonts w:ascii="Sakkal Majalla" w:hAnsi="Sakkal Majalla" w:cs="Sakkal Majalla" w:hint="cs"/>
-              </w:rPr>
-              <w:t>(check_sla)</w:t>
-            </w:r>
-          </w:p>
-          <w:p>
-            <w:pPr>
-              <w:cnfStyle w:val="000000100000" w:firstRow="0" w:lastRow="0" w:firstColumn="0" w:lastColumn="0" w:oddVBand="0" w:evenVBand="0" w:oddHBand="1" w:evenHBand="0" w:firstRowFirstColumn="0" w:firstRowLastColumn="0" w:lastRowFirstColumn="0" w:lastRowLastColumn="0"/>
-              <w:rPr>
-                <w:rFonts w:ascii="Sakkal Majalla" w:hAnsi="Sakkal Majalla" w:cs="Sakkal Majalla"/>
-              </w:rPr>
-            </w:pPr>
-          </w:p>
-          <w:p>
-            <w:pPr>
-              <w:cnfStyle w:val="000000100000" w:firstRow="0" w:lastRow="0" w:firstColumn="0" w:lastColumn="0" w:oddVBand="0" w:evenVBand="0" w:oddHBand="1" w:evenHBand="0" w:firstRowFirstColumn="0" w:firstRowLastColumn="0" w:lastRowFirstColumn="0" w:lastRowLastColumn="0"/>
-              <w:rPr>
-                <w:rFonts w:ascii="Sakkal Majalla" w:hAnsi="Sakkal Majalla" w:cs="Sakkal Majalla"/>
-              </w:rPr>
-            </w:pPr>
-            <w:r>
-              <w:rPr>
-                <w:rFonts w:ascii="Sakkal Majalla" w:hAnsi="Sakkal Majalla" w:cs="Sakkal Majalla" w:hint="cs"/>
-              </w:rPr>
-              <w:t>def check_</w:t>
-            </w:r>
-            <w:proofErr w:type="gramStart"/>
-            <w:r>
-              <w:rPr>
-                <w:rFonts w:ascii="Sakkal Majalla" w:hAnsi="Sakkal Majalla" w:cs="Sakkal Majalla" w:hint="cs"/>
-              </w:rPr>
-              <w:t>sla(</w:t>
-            </w:r>
-            <w:proofErr w:type="gramEnd"/>
-            <w:r>
-              <w:rPr>
-                <w:rFonts w:ascii="Sakkal Majalla" w:hAnsi="Sakkal Majalla" w:cs="Sakkal Majalla" w:hint="cs"/>
-              </w:rPr>
-              <w:t>environment, **kwargs):</w:t>
+              <w:t>events.test_stop.connect(check_sla)</w:t>
+            </w:r>
+          </w:p>
+          <w:p>
+            <w:pPr>
+              <w:cnfStyle w:val="000000100000" w:firstRow="0" w:lastRow="0" w:firstColumn="0" w:lastColumn="0" w:oddVBand="0" w:evenVBand="0" w:oddHBand="1" w:evenHBand="0" w:firstRowFirstColumn="0" w:firstRowLastColumn="0" w:lastRowFirstColumn="0" w:lastRowLastColumn="0"/>
+              <w:rPr>
+                <w:rFonts w:ascii="Sakkal Majalla" w:hAnsi="Sakkal Majalla" w:cs="Sakkal Majalla"/>
+              </w:rPr>
+            </w:pPr>
+          </w:p>
+          <w:p>
+            <w:pPr>
+              <w:cnfStyle w:val="000000100000" w:firstRow="0" w:lastRow="0" w:firstColumn="0" w:lastColumn="0" w:oddVBand="0" w:evenVBand="0" w:oddHBand="1" w:evenHBand="0" w:firstRowFirstColumn="0" w:firstRowLastColumn="0" w:lastRowFirstColumn="0" w:lastRowLastColumn="0"/>
+              <w:rPr>
+                <w:rFonts w:ascii="Sakkal Majalla" w:hAnsi="Sakkal Majalla" w:cs="Sakkal Majalla"/>
+              </w:rPr>
+            </w:pPr>
+            <w:r>
+              <w:rPr>
+                <w:rFonts w:ascii="Sakkal Majalla" w:hAnsi="Sakkal Majalla" w:cs="Sakkal Majalla" w:hint="cs"/>
+              </w:rPr>
+              <w:t>def check_sla(environment, **kwargs):</w:t>
             </w:r>
           </w:p>
           <w:p>
@@ -1331,35 +1303,7 @@
               <w:rPr>
                 <w:rFonts w:ascii="Sakkal Majalla" w:hAnsi="Sakkal Majalla" w:cs="Sakkal Majalla" w:hint="cs"/>
               </w:rPr>
-              <w:t xml:space="preserve">    failure_rate = </w:t>
-            </w:r>
-            <w:proofErr w:type="gramStart"/>
-            <w:r>
-              <w:rPr>
-                <w:rFonts w:ascii="Sakkal Majalla" w:hAnsi="Sakkal Majalla" w:cs="Sakkal Majalla" w:hint="cs"/>
-              </w:rPr>
-              <w:t>environment.stats</w:t>
-            </w:r>
-            <w:proofErr w:type="gramEnd"/>
-            <w:r>
-              <w:rPr>
-                <w:rFonts w:ascii="Sakkal Majalla" w:hAnsi="Sakkal Majalla" w:cs="Sakkal Majalla" w:hint="cs"/>
-              </w:rPr>
-              <w:t>.</w:t>
-            </w:r>
-            <w:proofErr w:type="gramStart"/>
-            <w:r>
-              <w:rPr>
-                <w:rFonts w:ascii="Sakkal Majalla" w:hAnsi="Sakkal Majalla" w:cs="Sakkal Majalla" w:hint="cs"/>
-              </w:rPr>
-              <w:t>total.fail</w:t>
-            </w:r>
-            <w:proofErr w:type="gramEnd"/>
-            <w:r>
-              <w:rPr>
-                <w:rFonts w:ascii="Sakkal Majalla" w:hAnsi="Sakkal Majalla" w:cs="Sakkal Majalla" w:hint="cs"/>
-              </w:rPr>
-              <w:t>_ratio</w:t>
+              <w:t xml:space="preserve">    failure_rate = environment.stats.total.fail_ratio</w:t>
             </w:r>
           </w:p>
           <w:p>
@@ -1401,64 +1345,36 @@
               <w:rPr>
                 <w:rFonts w:ascii="Sakkal Majalla" w:hAnsi="Sakkal Majalla" w:cs="Sakkal Majalla" w:hint="cs"/>
               </w:rPr>
+              <w:t xml:space="preserve">        print("FAIL: Average response time exceeds 500ms")</w:t>
+            </w:r>
+          </w:p>
+          <w:p>
+            <w:pPr>
+              <w:cnfStyle w:val="000000100000" w:firstRow="0" w:lastRow="0" w:firstColumn="0" w:lastColumn="0" w:oddVBand="0" w:evenVBand="0" w:oddHBand="1" w:evenHBand="0" w:firstRowFirstColumn="0" w:firstRowLastColumn="0" w:lastRowFirstColumn="0" w:lastRowLastColumn="0"/>
+              <w:rPr>
+                <w:rFonts w:ascii="Sakkal Majalla" w:hAnsi="Sakkal Majalla" w:cs="Sakkal Majalla"/>
+              </w:rPr>
+            </w:pPr>
+            <w:r>
+              <w:rPr>
+                <w:rFonts w:ascii="Sakkal Majalla" w:hAnsi="Sakkal Majalla" w:cs="Sakkal Majalla" w:hint="cs"/>
+              </w:rPr>
+              <w:t xml:space="preserve">        sys.exit(1)</w:t>
+            </w:r>
+          </w:p>
+          <w:p>
+            <w:pPr>
+              <w:cnfStyle w:val="000000100000" w:firstRow="0" w:lastRow="0" w:firstColumn="0" w:lastColumn="0" w:oddVBand="0" w:evenVBand="0" w:oddHBand="1" w:evenHBand="0" w:firstRowFirstColumn="0" w:firstRowLastColumn="0" w:lastRowFirstColumn="0" w:lastRowLastColumn="0"/>
+              <w:rPr>
+                <w:rFonts w:ascii="Sakkal Majalla" w:hAnsi="Sakkal Majalla" w:cs="Sakkal Majalla"/>
+              </w:rPr>
+            </w:pPr>
+            <w:r>
+              <w:rPr>
+                <w:rFonts w:ascii="Sakkal Majalla" w:hAnsi="Sakkal Majalla" w:cs="Sakkal Majalla" w:hint="cs"/>
+              </w:rPr>
               <w:t xml:space="preserve">        </w:t>
             </w:r>
-            <w:proofErr w:type="gramStart"/>
-            <w:r>
-              <w:rPr>
-                <w:rFonts w:ascii="Sakkal Majalla" w:hAnsi="Sakkal Majalla" w:cs="Sakkal Majalla" w:hint="cs"/>
-              </w:rPr>
-              <w:t>print(</w:t>
-            </w:r>
-            <w:proofErr w:type="gramEnd"/>
-            <w:r>
-              <w:rPr>
-                <w:rFonts w:ascii="Sakkal Majalla" w:hAnsi="Sakkal Majalla" w:cs="Sakkal Majalla" w:hint="cs"/>
-              </w:rPr>
-              <w:t>"FAIL: Average response time exceeds 500ms")</w:t>
-            </w:r>
-          </w:p>
-          <w:p>
-            <w:pPr>
-              <w:cnfStyle w:val="000000100000" w:firstRow="0" w:lastRow="0" w:firstColumn="0" w:lastColumn="0" w:oddVBand="0" w:evenVBand="0" w:oddHBand="1" w:evenHBand="0" w:firstRowFirstColumn="0" w:firstRowLastColumn="0" w:lastRowFirstColumn="0" w:lastRowLastColumn="0"/>
-              <w:rPr>
-                <w:rFonts w:ascii="Sakkal Majalla" w:hAnsi="Sakkal Majalla" w:cs="Sakkal Majalla"/>
-              </w:rPr>
-            </w:pPr>
-            <w:r>
-              <w:rPr>
-                <w:rFonts w:ascii="Sakkal Majalla" w:hAnsi="Sakkal Majalla" w:cs="Sakkal Majalla" w:hint="cs"/>
-              </w:rPr>
-              <w:t xml:space="preserve">        </w:t>
-            </w:r>
-            <w:proofErr w:type="gramStart"/>
-            <w:r>
-              <w:rPr>
-                <w:rFonts w:ascii="Sakkal Majalla" w:hAnsi="Sakkal Majalla" w:cs="Sakkal Majalla" w:hint="cs"/>
-              </w:rPr>
-              <w:t>sys.exit</w:t>
-            </w:r>
-            <w:proofErr w:type="gramEnd"/>
-            <w:r>
-              <w:rPr>
-                <w:rFonts w:ascii="Sakkal Majalla" w:hAnsi="Sakkal Majalla" w:cs="Sakkal Majalla" w:hint="cs"/>
-              </w:rPr>
-              <w:t>(1)</w:t>
-            </w:r>
-          </w:p>
-          <w:p>
-            <w:pPr>
-              <w:cnfStyle w:val="000000100000" w:firstRow="0" w:lastRow="0" w:firstColumn="0" w:lastColumn="0" w:oddVBand="0" w:evenVBand="0" w:oddHBand="1" w:evenHBand="0" w:firstRowFirstColumn="0" w:firstRowLastColumn="0" w:lastRowFirstColumn="0" w:lastRowLastColumn="0"/>
-              <w:rPr>
-                <w:rFonts w:ascii="Sakkal Majalla" w:hAnsi="Sakkal Majalla" w:cs="Sakkal Majalla"/>
-              </w:rPr>
-            </w:pPr>
-            <w:r>
-              <w:rPr>
-                <w:rFonts w:ascii="Sakkal Majalla" w:hAnsi="Sakkal Majalla" w:cs="Sakkal Majalla" w:hint="cs"/>
-              </w:rPr>
-              <w:t xml:space="preserve">        </w:t>
-            </w:r>
           </w:p>
           <w:p>
             <w:pPr>
@@ -1485,21 +1401,7 @@
               <w:rPr>
                 <w:rFonts w:ascii="Sakkal Majalla" w:hAnsi="Sakkal Majalla" w:cs="Sakkal Majalla" w:hint="cs"/>
               </w:rPr>
-              <w:t xml:space="preserve">        </w:t>
-            </w:r>
-            <w:proofErr w:type="gramStart"/>
-            <w:r>
-              <w:rPr>
-                <w:rFonts w:ascii="Sakkal Majalla" w:hAnsi="Sakkal Majalla" w:cs="Sakkal Majalla" w:hint="cs"/>
-              </w:rPr>
-              <w:t>print(</w:t>
-            </w:r>
-            <w:proofErr w:type="gramEnd"/>
-            <w:r>
-              <w:rPr>
-                <w:rFonts w:ascii="Sakkal Majalla" w:hAnsi="Sakkal Majalla" w:cs="Sakkal Majalla" w:hint="cs"/>
-              </w:rPr>
-              <w:t>f"FAIL: Error rate {failure_rate} exceeds threshold")</w:t>
+              <w:t xml:space="preserve">        print(f"FAIL: Error rate {failure_rate} exceeds threshold")</w:t>
             </w:r>
           </w:p>
           <w:p>
@@ -1515,21 +1417,7 @@
               <w:rPr>
                 <w:rFonts w:ascii="Sakkal Majalla" w:hAnsi="Sakkal Majalla" w:cs="Sakkal Majalla" w:hint="cs"/>
               </w:rPr>
-              <w:t xml:space="preserve">        </w:t>
-            </w:r>
-            <w:proofErr w:type="gramStart"/>
-            <w:r>
-              <w:rPr>
-                <w:rFonts w:ascii="Sakkal Majalla" w:hAnsi="Sakkal Majalla" w:cs="Sakkal Majalla" w:hint="cs"/>
-              </w:rPr>
-              <w:t>sys.exit</w:t>
-            </w:r>
-            <w:proofErr w:type="gramEnd"/>
-            <w:r>
-              <w:rPr>
-                <w:rFonts w:ascii="Sakkal Majalla" w:hAnsi="Sakkal Majalla" w:cs="Sakkal Majalla" w:hint="cs"/>
-              </w:rPr>
-              <w:t>(1)</w:t>
+              <w:t xml:space="preserve">        sys.exit(1)</w:t>
             </w:r>
           </w:p>
         </w:tc>
@@ -1615,21 +1503,7 @@
               <w:rPr>
                 <w:rFonts w:ascii="Sakkal Majalla" w:hAnsi="Sakkal Majalla" w:cs="Sakkal Majalla" w:hint="cs"/>
               </w:rPr>
-              <w:t xml:space="preserve">Network Latency Simulation: Use tools like </w:t>
-            </w:r>
-            <w:proofErr w:type="spellStart"/>
-            <w:r>
-              <w:rPr>
-                <w:rFonts w:ascii="Sakkal Majalla" w:hAnsi="Sakkal Majalla" w:cs="Sakkal Majalla" w:hint="cs"/>
-              </w:rPr>
-              <w:t>tc</w:t>
-            </w:r>
-            <w:proofErr w:type="spellEnd"/>
-            <w:r>
-              <w:rPr>
-                <w:rFonts w:ascii="Sakkal Majalla" w:hAnsi="Sakkal Majalla" w:cs="Sakkal Majalla" w:hint="cs"/>
-              </w:rPr>
-              <w:t xml:space="preserve"> (Linux) or Network Link Conditioner (macOS) to simulate slow networks if testing mobile-first apps (relevant if you later combine with Flutter frontend testing).</w:t>
+              <w:t>Network Latency Simulation: Use tools like tc (Linux) or Network Link Conditioner (macOS) to simulate slow networks if testing mobile-first apps (relevant if you later combine with Flutter frontend testing).</w:t>
             </w:r>
           </w:p>
         </w:tc>
@@ -1967,21 +1841,7 @@
               <w:rPr>
                 <w:rFonts w:ascii="Sakkal Majalla" w:hAnsi="Sakkal Majalla" w:cs="Sakkal Majalla" w:hint="cs"/>
               </w:rPr>
-              <w:t xml:space="preserve">For global SaaS, run tests from multiple regions (AWS us-east, </w:t>
-            </w:r>
-            <w:proofErr w:type="spellStart"/>
-            <w:r>
-              <w:rPr>
-                <w:rFonts w:ascii="Sakkal Majalla" w:hAnsi="Sakkal Majalla" w:cs="Sakkal Majalla" w:hint="cs"/>
-              </w:rPr>
-              <w:t>eu</w:t>
-            </w:r>
-            <w:proofErr w:type="spellEnd"/>
-            <w:r>
-              <w:rPr>
-                <w:rFonts w:ascii="Sakkal Majalla" w:hAnsi="Sakkal Majalla" w:cs="Sakkal Majalla" w:hint="cs"/>
-              </w:rPr>
-              <w:t>-west, ap-south).</w:t>
+              <w:t>For global SaaS, run tests from multiple regions (AWS us-east, eu-west, ap-south).</w:t>
             </w:r>
           </w:p>
           <w:p>
@@ -2378,21 +2238,7 @@
               <w:rPr>
                 <w:rFonts w:ascii="Sakkal Majalla" w:hAnsi="Sakkal Majalla" w:cs="Sakkal Majalla" w:hint="cs"/>
               </w:rPr>
-              <w:t>Profile Before Optimizing: Never guess bottlenecks. Use profilers (</w:t>
-            </w:r>
-            <w:proofErr w:type="spellStart"/>
-            <w:r>
-              <w:rPr>
-                <w:rFonts w:ascii="Sakkal Majalla" w:hAnsi="Sakkal Majalla" w:cs="Sakkal Majalla" w:hint="cs"/>
-              </w:rPr>
-              <w:t>cProfile</w:t>
-            </w:r>
-            <w:proofErr w:type="spellEnd"/>
-            <w:r>
-              <w:rPr>
-                <w:rFonts w:ascii="Sakkal Majalla" w:hAnsi="Sakkal Majalla" w:cs="Sakkal Majalla" w:hint="cs"/>
-              </w:rPr>
-              <w:t xml:space="preserve"> for Python, async-profiler for Java) during load tests to pinpoint exact lines of code causing delays.</w:t>
+              <w:t>Profile Before Optimizing: Never guess bottlenecks. Use profilers (cProfile for Python, async-profiler for Java) during load tests to pinpoint exact lines of code causing delays.</w:t>
             </w:r>
           </w:p>
         </w:tc>
@@ -2515,23 +2361,7 @@
                   <w:rStyle w:val="Hyperlink"/>
                   <w:rFonts w:ascii="Sakkal Majalla" w:hAnsi="Sakkal Majalla" w:cs="Sakkal Majalla" w:hint="cs"/>
                 </w:rPr>
-                <w:t xml:space="preserve">Search Videos </w:t>
-              </w:r>
-              <w:proofErr w:type="gramStart"/>
-              <w:r>
-                <w:rPr>
-                  <w:rStyle w:val="Hyperlink"/>
-                  <w:rFonts w:ascii="Sakkal Majalla" w:hAnsi="Sakkal Majalla" w:cs="Sakkal Majalla" w:hint="cs"/>
-                </w:rPr>
-                <w:t>By</w:t>
-              </w:r>
-              <w:proofErr w:type="gramEnd"/>
-              <w:r>
-                <w:rPr>
-                  <w:rStyle w:val="Hyperlink"/>
-                  <w:rFonts w:ascii="Sakkal Majalla" w:hAnsi="Sakkal Majalla" w:cs="Sakkal Majalla" w:hint="cs"/>
-                </w:rPr>
-                <w:t xml:space="preserve"> Picture Using Elasticsearch</w:t>
+                <w:t>Search Videos By Picture Using Elasticsearch</w:t>
               </w:r>
             </w:hyperlink>
           </w:p>
@@ -2567,23 +2397,7 @@
                   <w:rStyle w:val="Hyperlink"/>
                   <w:rFonts w:ascii="Sakkal Majalla" w:hAnsi="Sakkal Majalla" w:cs="Sakkal Majalla" w:hint="cs"/>
                 </w:rPr>
-                <w:t xml:space="preserve">Real-Time AI Search Tool in Python </w:t>
-              </w:r>
-              <w:proofErr w:type="gramStart"/>
-              <w:r>
-                <w:rPr>
-                  <w:rStyle w:val="Hyperlink"/>
-                  <w:rFonts w:ascii="Sakkal Majalla" w:hAnsi="Sakkal Majalla" w:cs="Sakkal Majalla" w:hint="cs"/>
-                </w:rPr>
-                <w:t>And</w:t>
-              </w:r>
-              <w:proofErr w:type="gramEnd"/>
-              <w:r>
-                <w:rPr>
-                  <w:rStyle w:val="Hyperlink"/>
-                  <w:rFonts w:ascii="Sakkal Majalla" w:hAnsi="Sakkal Majalla" w:cs="Sakkal Majalla" w:hint="cs"/>
-                </w:rPr>
-                <w:t xml:space="preserve"> Elasticsearch</w:t>
+                <w:t>Real-Time AI Search Tool in Python And Elasticsearch</w:t>
               </w:r>
             </w:hyperlink>
           </w:p>
@@ -2843,21 +2657,7 @@
               <w:rPr>
                 <w:rFonts w:ascii="Sakkal Majalla" w:hAnsi="Sakkal Majalla" w:cs="Sakkal Majalla" w:hint="cs"/>
               </w:rPr>
-              <w:t xml:space="preserve">Information Retrieval </w:t>
-            </w:r>
-            <w:proofErr w:type="gramStart"/>
-            <w:r>
-              <w:rPr>
-                <w:rFonts w:ascii="Sakkal Majalla" w:hAnsi="Sakkal Majalla" w:cs="Sakkal Majalla" w:hint="cs"/>
-              </w:rPr>
-              <w:t>With</w:t>
-            </w:r>
-            <w:proofErr w:type="gramEnd"/>
-            <w:r>
-              <w:rPr>
-                <w:rFonts w:ascii="Sakkal Majalla" w:hAnsi="Sakkal Majalla" w:cs="Sakkal Majalla" w:hint="cs"/>
-              </w:rPr>
-              <w:t xml:space="preserve"> Python</w:t>
+              <w:t>Information Retrieval With Python</w:t>
             </w:r>
             <w:r>
               <w:rPr>
@@ -3126,21 +2926,7 @@
               <w:rPr>
                 <w:rFonts w:ascii="Sakkal Majalla" w:hAnsi="Sakkal Majalla" w:cs="Sakkal Majalla" w:hint="cs"/>
               </w:rPr>
-              <w:t xml:space="preserve">Elasticsearch for </w:t>
-            </w:r>
-            <w:proofErr w:type="spellStart"/>
-            <w:r>
-              <w:rPr>
-                <w:rFonts w:ascii="Sakkal Majalla" w:hAnsi="Sakkal Majalla" w:cs="Sakkal Majalla" w:hint="cs"/>
-              </w:rPr>
-              <w:t>geotemporal</w:t>
-            </w:r>
-            <w:proofErr w:type="spellEnd"/>
-            <w:r>
-              <w:rPr>
-                <w:rFonts w:ascii="Sakkal Majalla" w:hAnsi="Sakkal Majalla" w:cs="Sakkal Majalla" w:hint="cs"/>
-              </w:rPr>
-              <w:t xml:space="preserve"> data.</w:t>
+              <w:t>Elasticsearch for geotemporal data.</w:t>
             </w:r>
           </w:p>
         </w:tc>
@@ -3243,21 +3029,12 @@
               </w:rPr>
             </w:pPr>
             <w:hyperlink r:id="rId15" w:history="1">
-              <w:proofErr w:type="spellStart"/>
               <w:r>
                 <w:rPr>
                   <w:rStyle w:val="Hyperlink"/>
                   <w:rFonts w:ascii="Sakkal Majalla" w:hAnsi="Sakkal Majalla" w:cs="Sakkal Majalla" w:hint="cs"/>
                 </w:rPr>
-                <w:t>Zenrows</w:t>
-              </w:r>
-              <w:proofErr w:type="spellEnd"/>
-              <w:r>
-                <w:rPr>
-                  <w:rStyle w:val="Hyperlink"/>
-                  <w:rFonts w:ascii="Sakkal Majalla" w:hAnsi="Sakkal Majalla" w:cs="Sakkal Majalla" w:hint="cs"/>
-                </w:rPr>
-                <w:t xml:space="preserve"> Scrapy Splash</w:t>
+                <w:t>Zenrows Scrapy Splash</w:t>
               </w:r>
             </w:hyperlink>
           </w:p>
@@ -3639,6 +3416,14 @@
               <w:t>.</w:t>
             </w:r>
           </w:p>
+          <w:p>
+            <w:pPr>
+              <w:cnfStyle w:val="000000000000" w:firstRow="0" w:lastRow="0" w:firstColumn="0" w:lastColumn="0" w:oddVBand="0" w:evenVBand="0" w:oddHBand="0" w:evenHBand="0" w:firstRowFirstColumn="0" w:firstRowLastColumn="0" w:lastRowFirstColumn="0" w:lastRowLastColumn="0"/>
+              <w:rPr>
+                <w:rFonts w:ascii="Sakkal Majalla" w:hAnsi="Sakkal Majalla" w:cs="Sakkal Majalla"/>
+              </w:rPr>
+            </w:pPr>
+          </w:p>
         </w:tc>
         <w:tc>
           <w:tcPr>
@@ -3675,27 +3460,1823 @@
         </w:tc>
       </w:tr>
     </w:tbl>
-    <w:p>
-      <w:pPr>
-        <w:rPr>
-          <w:rFonts w:ascii="Sakkal Majalla" w:hAnsi="Sakkal Majalla" w:cs="Sakkal Majalla"/>
-        </w:rPr>
-      </w:pPr>
-    </w:p>
-    <w:p>
-      <w:pPr>
-        <w:rPr>
-          <w:rFonts w:ascii="Sakkal Majalla" w:hAnsi="Sakkal Majalla" w:cs="Sakkal Majalla"/>
-        </w:rPr>
-      </w:pPr>
-    </w:p>
-    <w:p>
-      <w:pPr>
-        <w:rPr>
-          <w:rFonts w:ascii="Sakkal Majalla" w:hAnsi="Sakkal Majalla" w:cs="Sakkal Majalla"/>
-        </w:rPr>
-      </w:pPr>
-    </w:p>
+    <w:tbl>
+      <w:tblPr>
+        <w:tblStyle w:val="GridTable6Colorful-Accent2"/>
+        <w:tblW w:w="12060" w:type="dxa"/>
+        <w:tblInd w:w="-1355" w:type="dxa"/>
+        <w:tblLook w:val="04A0" w:firstRow="1" w:lastRow="0" w:firstColumn="1" w:lastColumn="0" w:noHBand="0" w:noVBand="1"/>
+      </w:tblPr>
+      <w:tblGrid>
+        <w:gridCol w:w="810"/>
+        <w:gridCol w:w="5400"/>
+        <w:gridCol w:w="4860"/>
+        <w:gridCol w:w="990"/>
+      </w:tblGrid>
+      <w:tr>
+        <w:trPr>
+          <w:cnfStyle w:val="100000000000" w:firstRow="1" w:lastRow="0" w:firstColumn="0" w:lastColumn="0" w:oddVBand="0" w:evenVBand="0" w:oddHBand="0" w:evenHBand="0" w:firstRowFirstColumn="0" w:firstRowLastColumn="0" w:lastRowFirstColumn="0" w:lastRowLastColumn="0"/>
+        </w:trPr>
+        <w:tc>
+          <w:tcPr>
+            <w:cnfStyle w:val="001000000000" w:firstRow="0" w:lastRow="0" w:firstColumn="1" w:lastColumn="0" w:oddVBand="0" w:evenVBand="0" w:oddHBand="0" w:evenHBand="0" w:firstRowFirstColumn="0" w:firstRowLastColumn="0" w:lastRowFirstColumn="0" w:lastRowLastColumn="0"/>
+            <w:tcW w:w="810" w:type="dxa"/>
+          </w:tcPr>
+          <w:p>
+            <w:pPr>
+              <w:jc w:val="center"/>
+              <w:rPr>
+                <w:rFonts w:ascii="Sakkal Majalla" w:hAnsi="Sakkal Majalla" w:cs="Sakkal Majalla"/>
+              </w:rPr>
+            </w:pPr>
+            <w:r>
+              <w:rPr>
+                <w:rFonts w:ascii="Sakkal Majalla" w:hAnsi="Sakkal Majalla" w:cs="Sakkal Majalla" w:hint="cs"/>
+              </w:rPr>
+              <w:lastRenderedPageBreak/>
+              <w:t>Id</w:t>
+            </w:r>
+          </w:p>
+        </w:tc>
+        <w:tc>
+          <w:tcPr>
+            <w:tcW w:w="5400" w:type="dxa"/>
+          </w:tcPr>
+          <w:p>
+            <w:pPr>
+              <w:jc w:val="center"/>
+              <w:cnfStyle w:val="100000000000" w:firstRow="1" w:lastRow="0" w:firstColumn="0" w:lastColumn="0" w:oddVBand="0" w:evenVBand="0" w:oddHBand="0" w:evenHBand="0" w:firstRowFirstColumn="0" w:firstRowLastColumn="0" w:lastRowFirstColumn="0" w:lastRowLastColumn="0"/>
+              <w:rPr>
+                <w:rFonts w:ascii="Sakkal Majalla" w:hAnsi="Sakkal Majalla" w:cs="Sakkal Majalla"/>
+              </w:rPr>
+            </w:pPr>
+            <w:r>
+              <w:rPr>
+                <w:rFonts w:ascii="Sakkal Majalla" w:hAnsi="Sakkal Majalla" w:cs="Sakkal Majalla" w:hint="cs"/>
+              </w:rPr>
+              <w:t>Search</w:t>
+            </w:r>
+          </w:p>
+        </w:tc>
+        <w:tc>
+          <w:tcPr>
+            <w:tcW w:w="4860" w:type="dxa"/>
+          </w:tcPr>
+          <w:p>
+            <w:pPr>
+              <w:jc w:val="center"/>
+              <w:cnfStyle w:val="100000000000" w:firstRow="1" w:lastRow="0" w:firstColumn="0" w:lastColumn="0" w:oddVBand="0" w:evenVBand="0" w:oddHBand="0" w:evenHBand="0" w:firstRowFirstColumn="0" w:firstRowLastColumn="0" w:lastRowFirstColumn="0" w:lastRowLastColumn="0"/>
+              <w:rPr>
+                <w:rFonts w:ascii="Sakkal Majalla" w:hAnsi="Sakkal Majalla" w:cs="Sakkal Majalla"/>
+              </w:rPr>
+            </w:pPr>
+            <w:r>
+              <w:rPr>
+                <w:rFonts w:ascii="Sakkal Majalla" w:hAnsi="Sakkal Majalla" w:cs="Sakkal Majalla" w:hint="cs"/>
+              </w:rPr>
+              <w:t>Topic</w:t>
+            </w:r>
+          </w:p>
+        </w:tc>
+        <w:tc>
+          <w:tcPr>
+            <w:tcW w:w="990" w:type="dxa"/>
+          </w:tcPr>
+          <w:p>
+            <w:pPr>
+              <w:jc w:val="center"/>
+              <w:cnfStyle w:val="100000000000" w:firstRow="1" w:lastRow="0" w:firstColumn="0" w:lastColumn="0" w:oddVBand="0" w:evenVBand="0" w:oddHBand="0" w:evenHBand="0" w:firstRowFirstColumn="0" w:firstRowLastColumn="0" w:lastRowFirstColumn="0" w:lastRowLastColumn="0"/>
+              <w:rPr>
+                <w:rFonts w:ascii="Sakkal Majalla" w:hAnsi="Sakkal Majalla" w:cs="Sakkal Majalla"/>
+              </w:rPr>
+            </w:pPr>
+            <w:r>
+              <w:rPr>
+                <w:rFonts w:ascii="Sakkal Majalla" w:hAnsi="Sakkal Majalla" w:cs="Sakkal Majalla" w:hint="cs"/>
+              </w:rPr>
+              <w:t>Done</w:t>
+            </w:r>
+          </w:p>
+        </w:tc>
+      </w:tr>
+      <w:tr>
+        <w:trPr>
+          <w:cnfStyle w:val="000000100000" w:firstRow="0" w:lastRow="0" w:firstColumn="0" w:lastColumn="0" w:oddVBand="0" w:evenVBand="0" w:oddHBand="1" w:evenHBand="0" w:firstRowFirstColumn="0" w:firstRowLastColumn="0" w:lastRowFirstColumn="0" w:lastRowLastColumn="0"/>
+        </w:trPr>
+        <w:tc>
+          <w:tcPr>
+            <w:cnfStyle w:val="001000000000" w:firstRow="0" w:lastRow="0" w:firstColumn="1" w:lastColumn="0" w:oddVBand="0" w:evenVBand="0" w:oddHBand="0" w:evenHBand="0" w:firstRowFirstColumn="0" w:firstRowLastColumn="0" w:lastRowFirstColumn="0" w:lastRowLastColumn="0"/>
+            <w:tcW w:w="810" w:type="dxa"/>
+          </w:tcPr>
+          <w:p>
+            <w:pPr>
+              <w:jc w:val="center"/>
+              <w:rPr>
+                <w:rFonts w:ascii="Sakkal Majalla" w:hAnsi="Sakkal Majalla" w:cs="Sakkal Majalla"/>
+              </w:rPr>
+            </w:pPr>
+            <w:r>
+              <w:rPr>
+                <w:rFonts w:ascii="Sakkal Majalla" w:hAnsi="Sakkal Majalla" w:cs="Sakkal Majalla"/>
+              </w:rPr>
+              <w:t>32</w:t>
+            </w:r>
+          </w:p>
+        </w:tc>
+        <w:tc>
+          <w:tcPr>
+            <w:tcW w:w="5400" w:type="dxa"/>
+          </w:tcPr>
+          <w:p>
+            <w:pPr>
+              <w:cnfStyle w:val="000000100000" w:firstRow="0" w:lastRow="0" w:firstColumn="0" w:lastColumn="0" w:oddVBand="0" w:evenVBand="0" w:oddHBand="1" w:evenHBand="0" w:firstRowFirstColumn="0" w:firstRowLastColumn="0" w:lastRowFirstColumn="0" w:lastRowLastColumn="0"/>
+              <w:rPr>
+                <w:rFonts w:ascii="Sakkal Majalla" w:hAnsi="Sakkal Majalla" w:cs="Sakkal Majalla"/>
+              </w:rPr>
+            </w:pPr>
+            <w:r>
+              <w:rPr>
+                <w:rFonts w:ascii="Sakkal Majalla" w:hAnsi="Sakkal Majalla" w:cs="Sakkal Majalla"/>
+              </w:rPr>
+              <w:t>A complete example project structure for this B2B document testing scenario</w:t>
+            </w:r>
+          </w:p>
+        </w:tc>
+        <w:tc>
+          <w:tcPr>
+            <w:tcW w:w="4860" w:type="dxa"/>
+          </w:tcPr>
+          <w:p>
+            <w:pPr>
+              <w:jc w:val="center"/>
+              <w:cnfStyle w:val="000000100000" w:firstRow="0" w:lastRow="0" w:firstColumn="0" w:lastColumn="0" w:oddVBand="0" w:evenVBand="0" w:oddHBand="1" w:evenHBand="0" w:firstRowFirstColumn="0" w:firstRowLastColumn="0" w:lastRowFirstColumn="0" w:lastRowLastColumn="0"/>
+              <w:rPr>
+                <w:rFonts w:ascii="Sakkal Majalla" w:hAnsi="Sakkal Majalla" w:cs="Sakkal Majalla"/>
+              </w:rPr>
+            </w:pPr>
+            <w:r>
+              <w:rPr>
+                <w:rFonts w:ascii="Sakkal Majalla" w:hAnsi="Sakkal Majalla" w:cs="Sakkal Majalla"/>
+              </w:rPr>
+              <w:t>Pytest For B2B E-Commerce Appl</w:t>
+            </w:r>
+            <w:r>
+              <w:rPr>
+                <w:rFonts w:ascii="Sakkal Majalla" w:hAnsi="Sakkal Majalla" w:cs="Sakkal Majalla"/>
+              </w:rPr>
+              <w:t>i</w:t>
+            </w:r>
+            <w:r>
+              <w:rPr>
+                <w:rFonts w:ascii="Sakkal Majalla" w:hAnsi="Sakkal Majalla" w:cs="Sakkal Majalla"/>
+              </w:rPr>
+              <w:t>cations</w:t>
+            </w:r>
+          </w:p>
+        </w:tc>
+        <w:tc>
+          <w:tcPr>
+            <w:tcW w:w="990" w:type="dxa"/>
+          </w:tcPr>
+          <w:p>
+            <w:pPr>
+              <w:cnfStyle w:val="000000100000" w:firstRow="0" w:lastRow="0" w:firstColumn="0" w:lastColumn="0" w:oddVBand="0" w:evenVBand="0" w:oddHBand="1" w:evenHBand="0" w:firstRowFirstColumn="0" w:firstRowLastColumn="0" w:lastRowFirstColumn="0" w:lastRowLastColumn="0"/>
+              <w:rPr>
+                <w:rFonts w:ascii="Sakkal Majalla" w:hAnsi="Sakkal Majalla" w:cs="Sakkal Majalla"/>
+              </w:rPr>
+            </w:pPr>
+          </w:p>
+        </w:tc>
+      </w:tr>
+      <w:tr>
+        <w:tc>
+          <w:tcPr>
+            <w:cnfStyle w:val="001000000000" w:firstRow="0" w:lastRow="0" w:firstColumn="1" w:lastColumn="0" w:oddVBand="0" w:evenVBand="0" w:oddHBand="0" w:evenHBand="0" w:firstRowFirstColumn="0" w:firstRowLastColumn="0" w:lastRowFirstColumn="0" w:lastRowLastColumn="0"/>
+            <w:tcW w:w="810" w:type="dxa"/>
+          </w:tcPr>
+          <w:p>
+            <w:pPr>
+              <w:jc w:val="center"/>
+              <w:rPr>
+                <w:rFonts w:ascii="Sakkal Majalla" w:hAnsi="Sakkal Majalla" w:cs="Sakkal Majalla"/>
+              </w:rPr>
+            </w:pPr>
+          </w:p>
+        </w:tc>
+        <w:tc>
+          <w:tcPr>
+            <w:tcW w:w="5400" w:type="dxa"/>
+          </w:tcPr>
+          <w:p>
+            <w:pPr>
+              <w:cnfStyle w:val="000000000000" w:firstRow="0" w:lastRow="0" w:firstColumn="0" w:lastColumn="0" w:oddVBand="0" w:evenVBand="0" w:oddHBand="0" w:evenHBand="0" w:firstRowFirstColumn="0" w:firstRowLastColumn="0" w:lastRowFirstColumn="0" w:lastRowLastColumn="0"/>
+              <w:rPr>
+                <w:rFonts w:ascii="Sakkal Majalla" w:hAnsi="Sakkal Majalla" w:cs="Sakkal Majalla"/>
+              </w:rPr>
+            </w:pPr>
+            <w:r>
+              <w:rPr>
+                <w:rFonts w:ascii="Sakkal Majalla" w:hAnsi="Sakkal Majalla" w:cs="Sakkal Majalla"/>
+              </w:rPr>
+              <w:t>D</w:t>
+            </w:r>
+            <w:r>
+              <w:rPr>
+                <w:rFonts w:ascii="Sakkal Majalla" w:hAnsi="Sakkal Majalla" w:cs="Sakkal Majalla"/>
+              </w:rPr>
+              <w:t>ive deeper into any specific pattern (e.g., VCR cassette management, testcontainers setup, or Great Expectations integration)</w:t>
+            </w:r>
+          </w:p>
+        </w:tc>
+        <w:tc>
+          <w:tcPr>
+            <w:tcW w:w="4860" w:type="dxa"/>
+          </w:tcPr>
+          <w:p>
+            <w:pPr>
+              <w:jc w:val="center"/>
+              <w:cnfStyle w:val="000000000000" w:firstRow="0" w:lastRow="0" w:firstColumn="0" w:lastColumn="0" w:oddVBand="0" w:evenVBand="0" w:oddHBand="0" w:evenHBand="0" w:firstRowFirstColumn="0" w:firstRowLastColumn="0" w:lastRowFirstColumn="0" w:lastRowLastColumn="0"/>
+              <w:rPr>
+                <w:rFonts w:ascii="Sakkal Majalla" w:hAnsi="Sakkal Majalla" w:cs="Sakkal Majalla"/>
+              </w:rPr>
+            </w:pPr>
+            <w:r>
+              <w:rPr>
+                <w:rFonts w:ascii="Sakkal Majalla" w:hAnsi="Sakkal Majalla" w:cs="Sakkal Majalla"/>
+              </w:rPr>
+              <w:t>Pytest with Automation Packages and tools</w:t>
+            </w:r>
+          </w:p>
+        </w:tc>
+        <w:tc>
+          <w:tcPr>
+            <w:tcW w:w="990" w:type="dxa"/>
+          </w:tcPr>
+          <w:p>
+            <w:pPr>
+              <w:cnfStyle w:val="000000000000" w:firstRow="0" w:lastRow="0" w:firstColumn="0" w:lastColumn="0" w:oddVBand="0" w:evenVBand="0" w:oddHBand="0" w:evenHBand="0" w:firstRowFirstColumn="0" w:firstRowLastColumn="0" w:lastRowFirstColumn="0" w:lastRowLastColumn="0"/>
+              <w:rPr>
+                <w:rFonts w:ascii="Sakkal Majalla" w:hAnsi="Sakkal Majalla" w:cs="Sakkal Majalla"/>
+              </w:rPr>
+            </w:pPr>
+          </w:p>
+        </w:tc>
+      </w:tr>
+      <w:tr>
+        <w:trPr>
+          <w:cnfStyle w:val="000000100000" w:firstRow="0" w:lastRow="0" w:firstColumn="0" w:lastColumn="0" w:oddVBand="0" w:evenVBand="0" w:oddHBand="1" w:evenHBand="0" w:firstRowFirstColumn="0" w:firstRowLastColumn="0" w:lastRowFirstColumn="0" w:lastRowLastColumn="0"/>
+        </w:trPr>
+        <w:tc>
+          <w:tcPr>
+            <w:cnfStyle w:val="001000000000" w:firstRow="0" w:lastRow="0" w:firstColumn="1" w:lastColumn="0" w:oddVBand="0" w:evenVBand="0" w:oddHBand="0" w:evenHBand="0" w:firstRowFirstColumn="0" w:firstRowLastColumn="0" w:lastRowFirstColumn="0" w:lastRowLastColumn="0"/>
+            <w:tcW w:w="810" w:type="dxa"/>
+          </w:tcPr>
+          <w:p>
+            <w:pPr>
+              <w:jc w:val="center"/>
+              <w:rPr>
+                <w:rFonts w:ascii="Sakkal Majalla" w:hAnsi="Sakkal Majalla" w:cs="Sakkal Majalla"/>
+              </w:rPr>
+            </w:pPr>
+          </w:p>
+        </w:tc>
+        <w:tc>
+          <w:tcPr>
+            <w:tcW w:w="5400" w:type="dxa"/>
+          </w:tcPr>
+          <w:p>
+            <w:pPr>
+              <w:cnfStyle w:val="000000100000" w:firstRow="0" w:lastRow="0" w:firstColumn="0" w:lastColumn="0" w:oddVBand="0" w:evenVBand="0" w:oddHBand="1" w:evenHBand="0" w:firstRowFirstColumn="0" w:firstRowLastColumn="0" w:lastRowFirstColumn="0" w:lastRowLastColumn="0"/>
+              <w:rPr>
+                <w:rFonts w:ascii="Sakkal Majalla" w:hAnsi="Sakkal Majalla" w:cs="Sakkal Majalla"/>
+              </w:rPr>
+            </w:pPr>
+          </w:p>
+        </w:tc>
+        <w:tc>
+          <w:tcPr>
+            <w:tcW w:w="4860" w:type="dxa"/>
+          </w:tcPr>
+          <w:p>
+            <w:pPr>
+              <w:jc w:val="center"/>
+              <w:cnfStyle w:val="000000100000" w:firstRow="0" w:lastRow="0" w:firstColumn="0" w:lastColumn="0" w:oddVBand="0" w:evenVBand="0" w:oddHBand="1" w:evenHBand="0" w:firstRowFirstColumn="0" w:firstRowLastColumn="0" w:lastRowFirstColumn="0" w:lastRowLastColumn="0"/>
+              <w:rPr>
+                <w:rFonts w:ascii="Sakkal Majalla" w:hAnsi="Sakkal Majalla" w:cs="Sakkal Majalla"/>
+              </w:rPr>
+            </w:pPr>
+          </w:p>
+        </w:tc>
+        <w:tc>
+          <w:tcPr>
+            <w:tcW w:w="990" w:type="dxa"/>
+          </w:tcPr>
+          <w:p>
+            <w:pPr>
+              <w:cnfStyle w:val="000000100000" w:firstRow="0" w:lastRow="0" w:firstColumn="0" w:lastColumn="0" w:oddVBand="0" w:evenVBand="0" w:oddHBand="1" w:evenHBand="0" w:firstRowFirstColumn="0" w:firstRowLastColumn="0" w:lastRowFirstColumn="0" w:lastRowLastColumn="0"/>
+              <w:rPr>
+                <w:rFonts w:ascii="Sakkal Majalla" w:hAnsi="Sakkal Majalla" w:cs="Sakkal Majalla"/>
+              </w:rPr>
+            </w:pPr>
+          </w:p>
+        </w:tc>
+      </w:tr>
+      <w:tr>
+        <w:tc>
+          <w:tcPr>
+            <w:cnfStyle w:val="001000000000" w:firstRow="0" w:lastRow="0" w:firstColumn="1" w:lastColumn="0" w:oddVBand="0" w:evenVBand="0" w:oddHBand="0" w:evenHBand="0" w:firstRowFirstColumn="0" w:firstRowLastColumn="0" w:lastRowFirstColumn="0" w:lastRowLastColumn="0"/>
+            <w:tcW w:w="810" w:type="dxa"/>
+          </w:tcPr>
+          <w:p>
+            <w:pPr>
+              <w:jc w:val="center"/>
+              <w:rPr>
+                <w:rFonts w:ascii="Sakkal Majalla" w:hAnsi="Sakkal Majalla" w:cs="Sakkal Majalla"/>
+              </w:rPr>
+            </w:pPr>
+          </w:p>
+        </w:tc>
+        <w:tc>
+          <w:tcPr>
+            <w:tcW w:w="5400" w:type="dxa"/>
+          </w:tcPr>
+          <w:p>
+            <w:pPr>
+              <w:cnfStyle w:val="000000000000" w:firstRow="0" w:lastRow="0" w:firstColumn="0" w:lastColumn="0" w:oddVBand="0" w:evenVBand="0" w:oddHBand="0" w:evenHBand="0" w:firstRowFirstColumn="0" w:firstRowLastColumn="0" w:lastRowFirstColumn="0" w:lastRowLastColumn="0"/>
+              <w:rPr>
+                <w:rFonts w:ascii="Sakkal Majalla" w:hAnsi="Sakkal Majalla" w:cs="Sakkal Majalla"/>
+              </w:rPr>
+            </w:pPr>
+          </w:p>
+        </w:tc>
+        <w:tc>
+          <w:tcPr>
+            <w:tcW w:w="4860" w:type="dxa"/>
+          </w:tcPr>
+          <w:p>
+            <w:pPr>
+              <w:jc w:val="center"/>
+              <w:cnfStyle w:val="000000000000" w:firstRow="0" w:lastRow="0" w:firstColumn="0" w:lastColumn="0" w:oddVBand="0" w:evenVBand="0" w:oddHBand="0" w:evenHBand="0" w:firstRowFirstColumn="0" w:firstRowLastColumn="0" w:lastRowFirstColumn="0" w:lastRowLastColumn="0"/>
+              <w:rPr>
+                <w:rFonts w:ascii="Sakkal Majalla" w:hAnsi="Sakkal Majalla" w:cs="Sakkal Majalla"/>
+              </w:rPr>
+            </w:pPr>
+          </w:p>
+        </w:tc>
+        <w:tc>
+          <w:tcPr>
+            <w:tcW w:w="990" w:type="dxa"/>
+          </w:tcPr>
+          <w:p>
+            <w:pPr>
+              <w:cnfStyle w:val="000000000000" w:firstRow="0" w:lastRow="0" w:firstColumn="0" w:lastColumn="0" w:oddVBand="0" w:evenVBand="0" w:oddHBand="0" w:evenHBand="0" w:firstRowFirstColumn="0" w:firstRowLastColumn="0" w:lastRowFirstColumn="0" w:lastRowLastColumn="0"/>
+              <w:rPr>
+                <w:rFonts w:ascii="Sakkal Majalla" w:hAnsi="Sakkal Majalla" w:cs="Sakkal Majalla"/>
+              </w:rPr>
+            </w:pPr>
+          </w:p>
+        </w:tc>
+      </w:tr>
+      <w:tr>
+        <w:trPr>
+          <w:cnfStyle w:val="000000100000" w:firstRow="0" w:lastRow="0" w:firstColumn="0" w:lastColumn="0" w:oddVBand="0" w:evenVBand="0" w:oddHBand="1" w:evenHBand="0" w:firstRowFirstColumn="0" w:firstRowLastColumn="0" w:lastRowFirstColumn="0" w:lastRowLastColumn="0"/>
+        </w:trPr>
+        <w:tc>
+          <w:tcPr>
+            <w:cnfStyle w:val="001000000000" w:firstRow="0" w:lastRow="0" w:firstColumn="1" w:lastColumn="0" w:oddVBand="0" w:evenVBand="0" w:oddHBand="0" w:evenHBand="0" w:firstRowFirstColumn="0" w:firstRowLastColumn="0" w:lastRowFirstColumn="0" w:lastRowLastColumn="0"/>
+            <w:tcW w:w="810" w:type="dxa"/>
+          </w:tcPr>
+          <w:p>
+            <w:pPr>
+              <w:jc w:val="center"/>
+              <w:rPr>
+                <w:rFonts w:ascii="Sakkal Majalla" w:hAnsi="Sakkal Majalla" w:cs="Sakkal Majalla"/>
+              </w:rPr>
+            </w:pPr>
+          </w:p>
+        </w:tc>
+        <w:tc>
+          <w:tcPr>
+            <w:tcW w:w="5400" w:type="dxa"/>
+          </w:tcPr>
+          <w:p>
+            <w:pPr>
+              <w:cnfStyle w:val="000000100000" w:firstRow="0" w:lastRow="0" w:firstColumn="0" w:lastColumn="0" w:oddVBand="0" w:evenVBand="0" w:oddHBand="1" w:evenHBand="0" w:firstRowFirstColumn="0" w:firstRowLastColumn="0" w:lastRowFirstColumn="0" w:lastRowLastColumn="0"/>
+              <w:rPr>
+                <w:rFonts w:ascii="Sakkal Majalla" w:hAnsi="Sakkal Majalla" w:cs="Sakkal Majalla"/>
+              </w:rPr>
+            </w:pPr>
+          </w:p>
+        </w:tc>
+        <w:tc>
+          <w:tcPr>
+            <w:tcW w:w="4860" w:type="dxa"/>
+          </w:tcPr>
+          <w:p>
+            <w:pPr>
+              <w:jc w:val="center"/>
+              <w:cnfStyle w:val="000000100000" w:firstRow="0" w:lastRow="0" w:firstColumn="0" w:lastColumn="0" w:oddVBand="0" w:evenVBand="0" w:oddHBand="1" w:evenHBand="0" w:firstRowFirstColumn="0" w:firstRowLastColumn="0" w:lastRowFirstColumn="0" w:lastRowLastColumn="0"/>
+              <w:rPr>
+                <w:rFonts w:ascii="Sakkal Majalla" w:hAnsi="Sakkal Majalla" w:cs="Sakkal Majalla"/>
+              </w:rPr>
+            </w:pPr>
+          </w:p>
+        </w:tc>
+        <w:tc>
+          <w:tcPr>
+            <w:tcW w:w="990" w:type="dxa"/>
+          </w:tcPr>
+          <w:p>
+            <w:pPr>
+              <w:cnfStyle w:val="000000100000" w:firstRow="0" w:lastRow="0" w:firstColumn="0" w:lastColumn="0" w:oddVBand="0" w:evenVBand="0" w:oddHBand="1" w:evenHBand="0" w:firstRowFirstColumn="0" w:firstRowLastColumn="0" w:lastRowFirstColumn="0" w:lastRowLastColumn="0"/>
+              <w:rPr>
+                <w:rFonts w:ascii="Sakkal Majalla" w:hAnsi="Sakkal Majalla" w:cs="Sakkal Majalla"/>
+              </w:rPr>
+            </w:pPr>
+          </w:p>
+        </w:tc>
+      </w:tr>
+      <w:tr>
+        <w:tc>
+          <w:tcPr>
+            <w:cnfStyle w:val="001000000000" w:firstRow="0" w:lastRow="0" w:firstColumn="1" w:lastColumn="0" w:oddVBand="0" w:evenVBand="0" w:oddHBand="0" w:evenHBand="0" w:firstRowFirstColumn="0" w:firstRowLastColumn="0" w:lastRowFirstColumn="0" w:lastRowLastColumn="0"/>
+            <w:tcW w:w="810" w:type="dxa"/>
+          </w:tcPr>
+          <w:p>
+            <w:pPr>
+              <w:jc w:val="center"/>
+              <w:rPr>
+                <w:rFonts w:ascii="Sakkal Majalla" w:hAnsi="Sakkal Majalla" w:cs="Sakkal Majalla"/>
+              </w:rPr>
+            </w:pPr>
+          </w:p>
+        </w:tc>
+        <w:tc>
+          <w:tcPr>
+            <w:tcW w:w="5400" w:type="dxa"/>
+          </w:tcPr>
+          <w:p>
+            <w:pPr>
+              <w:cnfStyle w:val="000000000000" w:firstRow="0" w:lastRow="0" w:firstColumn="0" w:lastColumn="0" w:oddVBand="0" w:evenVBand="0" w:oddHBand="0" w:evenHBand="0" w:firstRowFirstColumn="0" w:firstRowLastColumn="0" w:lastRowFirstColumn="0" w:lastRowLastColumn="0"/>
+              <w:rPr>
+                <w:rFonts w:ascii="Sakkal Majalla" w:hAnsi="Sakkal Majalla" w:cs="Sakkal Majalla"/>
+              </w:rPr>
+            </w:pPr>
+          </w:p>
+        </w:tc>
+        <w:tc>
+          <w:tcPr>
+            <w:tcW w:w="4860" w:type="dxa"/>
+          </w:tcPr>
+          <w:p>
+            <w:pPr>
+              <w:jc w:val="center"/>
+              <w:cnfStyle w:val="000000000000" w:firstRow="0" w:lastRow="0" w:firstColumn="0" w:lastColumn="0" w:oddVBand="0" w:evenVBand="0" w:oddHBand="0" w:evenHBand="0" w:firstRowFirstColumn="0" w:firstRowLastColumn="0" w:lastRowFirstColumn="0" w:lastRowLastColumn="0"/>
+              <w:rPr>
+                <w:rFonts w:ascii="Sakkal Majalla" w:hAnsi="Sakkal Majalla" w:cs="Sakkal Majalla"/>
+              </w:rPr>
+            </w:pPr>
+          </w:p>
+        </w:tc>
+        <w:tc>
+          <w:tcPr>
+            <w:tcW w:w="990" w:type="dxa"/>
+          </w:tcPr>
+          <w:p>
+            <w:pPr>
+              <w:cnfStyle w:val="000000000000" w:firstRow="0" w:lastRow="0" w:firstColumn="0" w:lastColumn="0" w:oddVBand="0" w:evenVBand="0" w:oddHBand="0" w:evenHBand="0" w:firstRowFirstColumn="0" w:firstRowLastColumn="0" w:lastRowFirstColumn="0" w:lastRowLastColumn="0"/>
+              <w:rPr>
+                <w:rFonts w:ascii="Sakkal Majalla" w:hAnsi="Sakkal Majalla" w:cs="Sakkal Majalla"/>
+              </w:rPr>
+            </w:pPr>
+          </w:p>
+        </w:tc>
+      </w:tr>
+      <w:tr>
+        <w:trPr>
+          <w:cnfStyle w:val="000000100000" w:firstRow="0" w:lastRow="0" w:firstColumn="0" w:lastColumn="0" w:oddVBand="0" w:evenVBand="0" w:oddHBand="1" w:evenHBand="0" w:firstRowFirstColumn="0" w:firstRowLastColumn="0" w:lastRowFirstColumn="0" w:lastRowLastColumn="0"/>
+        </w:trPr>
+        <w:tc>
+          <w:tcPr>
+            <w:cnfStyle w:val="001000000000" w:firstRow="0" w:lastRow="0" w:firstColumn="1" w:lastColumn="0" w:oddVBand="0" w:evenVBand="0" w:oddHBand="0" w:evenHBand="0" w:firstRowFirstColumn="0" w:firstRowLastColumn="0" w:lastRowFirstColumn="0" w:lastRowLastColumn="0"/>
+            <w:tcW w:w="810" w:type="dxa"/>
+          </w:tcPr>
+          <w:p>
+            <w:pPr>
+              <w:jc w:val="center"/>
+              <w:rPr>
+                <w:rFonts w:ascii="Sakkal Majalla" w:hAnsi="Sakkal Majalla" w:cs="Sakkal Majalla"/>
+              </w:rPr>
+            </w:pPr>
+          </w:p>
+        </w:tc>
+        <w:tc>
+          <w:tcPr>
+            <w:tcW w:w="5400" w:type="dxa"/>
+          </w:tcPr>
+          <w:p>
+            <w:pPr>
+              <w:cnfStyle w:val="000000100000" w:firstRow="0" w:lastRow="0" w:firstColumn="0" w:lastColumn="0" w:oddVBand="0" w:evenVBand="0" w:oddHBand="1" w:evenHBand="0" w:firstRowFirstColumn="0" w:firstRowLastColumn="0" w:lastRowFirstColumn="0" w:lastRowLastColumn="0"/>
+              <w:rPr>
+                <w:rFonts w:ascii="Sakkal Majalla" w:hAnsi="Sakkal Majalla" w:cs="Sakkal Majalla"/>
+              </w:rPr>
+            </w:pPr>
+          </w:p>
+        </w:tc>
+        <w:tc>
+          <w:tcPr>
+            <w:tcW w:w="4860" w:type="dxa"/>
+          </w:tcPr>
+          <w:p>
+            <w:pPr>
+              <w:jc w:val="center"/>
+              <w:cnfStyle w:val="000000100000" w:firstRow="0" w:lastRow="0" w:firstColumn="0" w:lastColumn="0" w:oddVBand="0" w:evenVBand="0" w:oddHBand="1" w:evenHBand="0" w:firstRowFirstColumn="0" w:firstRowLastColumn="0" w:lastRowFirstColumn="0" w:lastRowLastColumn="0"/>
+              <w:rPr>
+                <w:rFonts w:ascii="Sakkal Majalla" w:hAnsi="Sakkal Majalla" w:cs="Sakkal Majalla"/>
+              </w:rPr>
+            </w:pPr>
+          </w:p>
+        </w:tc>
+        <w:tc>
+          <w:tcPr>
+            <w:tcW w:w="990" w:type="dxa"/>
+          </w:tcPr>
+          <w:p>
+            <w:pPr>
+              <w:cnfStyle w:val="000000100000" w:firstRow="0" w:lastRow="0" w:firstColumn="0" w:lastColumn="0" w:oddVBand="0" w:evenVBand="0" w:oddHBand="1" w:evenHBand="0" w:firstRowFirstColumn="0" w:firstRowLastColumn="0" w:lastRowFirstColumn="0" w:lastRowLastColumn="0"/>
+              <w:rPr>
+                <w:rFonts w:ascii="Sakkal Majalla" w:hAnsi="Sakkal Majalla" w:cs="Sakkal Majalla"/>
+              </w:rPr>
+            </w:pPr>
+          </w:p>
+        </w:tc>
+      </w:tr>
+      <w:tr>
+        <w:tc>
+          <w:tcPr>
+            <w:cnfStyle w:val="001000000000" w:firstRow="0" w:lastRow="0" w:firstColumn="1" w:lastColumn="0" w:oddVBand="0" w:evenVBand="0" w:oddHBand="0" w:evenHBand="0" w:firstRowFirstColumn="0" w:firstRowLastColumn="0" w:lastRowFirstColumn="0" w:lastRowLastColumn="0"/>
+            <w:tcW w:w="810" w:type="dxa"/>
+          </w:tcPr>
+          <w:p>
+            <w:pPr>
+              <w:jc w:val="center"/>
+              <w:rPr>
+                <w:rFonts w:ascii="Sakkal Majalla" w:hAnsi="Sakkal Majalla" w:cs="Sakkal Majalla"/>
+              </w:rPr>
+            </w:pPr>
+          </w:p>
+        </w:tc>
+        <w:tc>
+          <w:tcPr>
+            <w:tcW w:w="5400" w:type="dxa"/>
+          </w:tcPr>
+          <w:p>
+            <w:pPr>
+              <w:cnfStyle w:val="000000000000" w:firstRow="0" w:lastRow="0" w:firstColumn="0" w:lastColumn="0" w:oddVBand="0" w:evenVBand="0" w:oddHBand="0" w:evenHBand="0" w:firstRowFirstColumn="0" w:firstRowLastColumn="0" w:lastRowFirstColumn="0" w:lastRowLastColumn="0"/>
+              <w:rPr>
+                <w:rFonts w:ascii="Sakkal Majalla" w:hAnsi="Sakkal Majalla" w:cs="Sakkal Majalla"/>
+              </w:rPr>
+            </w:pPr>
+          </w:p>
+        </w:tc>
+        <w:tc>
+          <w:tcPr>
+            <w:tcW w:w="4860" w:type="dxa"/>
+          </w:tcPr>
+          <w:p>
+            <w:pPr>
+              <w:jc w:val="center"/>
+              <w:cnfStyle w:val="000000000000" w:firstRow="0" w:lastRow="0" w:firstColumn="0" w:lastColumn="0" w:oddVBand="0" w:evenVBand="0" w:oddHBand="0" w:evenHBand="0" w:firstRowFirstColumn="0" w:firstRowLastColumn="0" w:lastRowFirstColumn="0" w:lastRowLastColumn="0"/>
+              <w:rPr>
+                <w:rFonts w:ascii="Sakkal Majalla" w:hAnsi="Sakkal Majalla" w:cs="Sakkal Majalla"/>
+              </w:rPr>
+            </w:pPr>
+          </w:p>
+        </w:tc>
+        <w:tc>
+          <w:tcPr>
+            <w:tcW w:w="990" w:type="dxa"/>
+          </w:tcPr>
+          <w:p>
+            <w:pPr>
+              <w:cnfStyle w:val="000000000000" w:firstRow="0" w:lastRow="0" w:firstColumn="0" w:lastColumn="0" w:oddVBand="0" w:evenVBand="0" w:oddHBand="0" w:evenHBand="0" w:firstRowFirstColumn="0" w:firstRowLastColumn="0" w:lastRowFirstColumn="0" w:lastRowLastColumn="0"/>
+              <w:rPr>
+                <w:rFonts w:ascii="Sakkal Majalla" w:hAnsi="Sakkal Majalla" w:cs="Sakkal Majalla"/>
+              </w:rPr>
+            </w:pPr>
+          </w:p>
+        </w:tc>
+      </w:tr>
+      <w:tr>
+        <w:trPr>
+          <w:cnfStyle w:val="000000100000" w:firstRow="0" w:lastRow="0" w:firstColumn="0" w:lastColumn="0" w:oddVBand="0" w:evenVBand="0" w:oddHBand="1" w:evenHBand="0" w:firstRowFirstColumn="0" w:firstRowLastColumn="0" w:lastRowFirstColumn="0" w:lastRowLastColumn="0"/>
+        </w:trPr>
+        <w:tc>
+          <w:tcPr>
+            <w:cnfStyle w:val="001000000000" w:firstRow="0" w:lastRow="0" w:firstColumn="1" w:lastColumn="0" w:oddVBand="0" w:evenVBand="0" w:oddHBand="0" w:evenHBand="0" w:firstRowFirstColumn="0" w:firstRowLastColumn="0" w:lastRowFirstColumn="0" w:lastRowLastColumn="0"/>
+            <w:tcW w:w="810" w:type="dxa"/>
+          </w:tcPr>
+          <w:p>
+            <w:pPr>
+              <w:jc w:val="center"/>
+              <w:rPr>
+                <w:rFonts w:ascii="Sakkal Majalla" w:hAnsi="Sakkal Majalla" w:cs="Sakkal Majalla"/>
+              </w:rPr>
+            </w:pPr>
+          </w:p>
+        </w:tc>
+        <w:tc>
+          <w:tcPr>
+            <w:tcW w:w="5400" w:type="dxa"/>
+          </w:tcPr>
+          <w:p>
+            <w:pPr>
+              <w:cnfStyle w:val="000000100000" w:firstRow="0" w:lastRow="0" w:firstColumn="0" w:lastColumn="0" w:oddVBand="0" w:evenVBand="0" w:oddHBand="1" w:evenHBand="0" w:firstRowFirstColumn="0" w:firstRowLastColumn="0" w:lastRowFirstColumn="0" w:lastRowLastColumn="0"/>
+              <w:rPr>
+                <w:rFonts w:ascii="Sakkal Majalla" w:hAnsi="Sakkal Majalla" w:cs="Sakkal Majalla"/>
+              </w:rPr>
+            </w:pPr>
+          </w:p>
+        </w:tc>
+        <w:tc>
+          <w:tcPr>
+            <w:tcW w:w="4860" w:type="dxa"/>
+          </w:tcPr>
+          <w:p>
+            <w:pPr>
+              <w:jc w:val="center"/>
+              <w:cnfStyle w:val="000000100000" w:firstRow="0" w:lastRow="0" w:firstColumn="0" w:lastColumn="0" w:oddVBand="0" w:evenVBand="0" w:oddHBand="1" w:evenHBand="0" w:firstRowFirstColumn="0" w:firstRowLastColumn="0" w:lastRowFirstColumn="0" w:lastRowLastColumn="0"/>
+              <w:rPr>
+                <w:rFonts w:ascii="Sakkal Majalla" w:hAnsi="Sakkal Majalla" w:cs="Sakkal Majalla"/>
+              </w:rPr>
+            </w:pPr>
+          </w:p>
+        </w:tc>
+        <w:tc>
+          <w:tcPr>
+            <w:tcW w:w="990" w:type="dxa"/>
+          </w:tcPr>
+          <w:p>
+            <w:pPr>
+              <w:cnfStyle w:val="000000100000" w:firstRow="0" w:lastRow="0" w:firstColumn="0" w:lastColumn="0" w:oddVBand="0" w:evenVBand="0" w:oddHBand="1" w:evenHBand="0" w:firstRowFirstColumn="0" w:firstRowLastColumn="0" w:lastRowFirstColumn="0" w:lastRowLastColumn="0"/>
+              <w:rPr>
+                <w:rFonts w:ascii="Sakkal Majalla" w:hAnsi="Sakkal Majalla" w:cs="Sakkal Majalla"/>
+              </w:rPr>
+            </w:pPr>
+          </w:p>
+        </w:tc>
+      </w:tr>
+      <w:tr>
+        <w:tc>
+          <w:tcPr>
+            <w:cnfStyle w:val="001000000000" w:firstRow="0" w:lastRow="0" w:firstColumn="1" w:lastColumn="0" w:oddVBand="0" w:evenVBand="0" w:oddHBand="0" w:evenHBand="0" w:firstRowFirstColumn="0" w:firstRowLastColumn="0" w:lastRowFirstColumn="0" w:lastRowLastColumn="0"/>
+            <w:tcW w:w="810" w:type="dxa"/>
+          </w:tcPr>
+          <w:p>
+            <w:pPr>
+              <w:jc w:val="center"/>
+              <w:rPr>
+                <w:rFonts w:ascii="Sakkal Majalla" w:hAnsi="Sakkal Majalla" w:cs="Sakkal Majalla"/>
+              </w:rPr>
+            </w:pPr>
+          </w:p>
+        </w:tc>
+        <w:tc>
+          <w:tcPr>
+            <w:tcW w:w="5400" w:type="dxa"/>
+          </w:tcPr>
+          <w:p>
+            <w:pPr>
+              <w:cnfStyle w:val="000000000000" w:firstRow="0" w:lastRow="0" w:firstColumn="0" w:lastColumn="0" w:oddVBand="0" w:evenVBand="0" w:oddHBand="0" w:evenHBand="0" w:firstRowFirstColumn="0" w:firstRowLastColumn="0" w:lastRowFirstColumn="0" w:lastRowLastColumn="0"/>
+              <w:rPr>
+                <w:rFonts w:ascii="Sakkal Majalla" w:hAnsi="Sakkal Majalla" w:cs="Sakkal Majalla"/>
+              </w:rPr>
+            </w:pPr>
+          </w:p>
+        </w:tc>
+        <w:tc>
+          <w:tcPr>
+            <w:tcW w:w="4860" w:type="dxa"/>
+          </w:tcPr>
+          <w:p>
+            <w:pPr>
+              <w:jc w:val="center"/>
+              <w:cnfStyle w:val="000000000000" w:firstRow="0" w:lastRow="0" w:firstColumn="0" w:lastColumn="0" w:oddVBand="0" w:evenVBand="0" w:oddHBand="0" w:evenHBand="0" w:firstRowFirstColumn="0" w:firstRowLastColumn="0" w:lastRowFirstColumn="0" w:lastRowLastColumn="0"/>
+              <w:rPr>
+                <w:rFonts w:ascii="Sakkal Majalla" w:hAnsi="Sakkal Majalla" w:cs="Sakkal Majalla"/>
+              </w:rPr>
+            </w:pPr>
+          </w:p>
+        </w:tc>
+        <w:tc>
+          <w:tcPr>
+            <w:tcW w:w="990" w:type="dxa"/>
+          </w:tcPr>
+          <w:p>
+            <w:pPr>
+              <w:cnfStyle w:val="000000000000" w:firstRow="0" w:lastRow="0" w:firstColumn="0" w:lastColumn="0" w:oddVBand="0" w:evenVBand="0" w:oddHBand="0" w:evenHBand="0" w:firstRowFirstColumn="0" w:firstRowLastColumn="0" w:lastRowFirstColumn="0" w:lastRowLastColumn="0"/>
+              <w:rPr>
+                <w:rFonts w:ascii="Sakkal Majalla" w:hAnsi="Sakkal Majalla" w:cs="Sakkal Majalla"/>
+              </w:rPr>
+            </w:pPr>
+          </w:p>
+        </w:tc>
+      </w:tr>
+      <w:tr>
+        <w:trPr>
+          <w:cnfStyle w:val="000000100000" w:firstRow="0" w:lastRow="0" w:firstColumn="0" w:lastColumn="0" w:oddVBand="0" w:evenVBand="0" w:oddHBand="1" w:evenHBand="0" w:firstRowFirstColumn="0" w:firstRowLastColumn="0" w:lastRowFirstColumn="0" w:lastRowLastColumn="0"/>
+        </w:trPr>
+        <w:tc>
+          <w:tcPr>
+            <w:cnfStyle w:val="001000000000" w:firstRow="0" w:lastRow="0" w:firstColumn="1" w:lastColumn="0" w:oddVBand="0" w:evenVBand="0" w:oddHBand="0" w:evenHBand="0" w:firstRowFirstColumn="0" w:firstRowLastColumn="0" w:lastRowFirstColumn="0" w:lastRowLastColumn="0"/>
+            <w:tcW w:w="810" w:type="dxa"/>
+          </w:tcPr>
+          <w:p>
+            <w:pPr>
+              <w:jc w:val="center"/>
+              <w:rPr>
+                <w:rFonts w:ascii="Sakkal Majalla" w:hAnsi="Sakkal Majalla" w:cs="Sakkal Majalla"/>
+              </w:rPr>
+            </w:pPr>
+          </w:p>
+        </w:tc>
+        <w:tc>
+          <w:tcPr>
+            <w:tcW w:w="5400" w:type="dxa"/>
+          </w:tcPr>
+          <w:p>
+            <w:pPr>
+              <w:cnfStyle w:val="000000100000" w:firstRow="0" w:lastRow="0" w:firstColumn="0" w:lastColumn="0" w:oddVBand="0" w:evenVBand="0" w:oddHBand="1" w:evenHBand="0" w:firstRowFirstColumn="0" w:firstRowLastColumn="0" w:lastRowFirstColumn="0" w:lastRowLastColumn="0"/>
+              <w:rPr>
+                <w:rFonts w:ascii="Sakkal Majalla" w:hAnsi="Sakkal Majalla" w:cs="Sakkal Majalla"/>
+              </w:rPr>
+            </w:pPr>
+          </w:p>
+        </w:tc>
+        <w:tc>
+          <w:tcPr>
+            <w:tcW w:w="4860" w:type="dxa"/>
+          </w:tcPr>
+          <w:p>
+            <w:pPr>
+              <w:jc w:val="center"/>
+              <w:cnfStyle w:val="000000100000" w:firstRow="0" w:lastRow="0" w:firstColumn="0" w:lastColumn="0" w:oddVBand="0" w:evenVBand="0" w:oddHBand="1" w:evenHBand="0" w:firstRowFirstColumn="0" w:firstRowLastColumn="0" w:lastRowFirstColumn="0" w:lastRowLastColumn="0"/>
+              <w:rPr>
+                <w:rFonts w:ascii="Sakkal Majalla" w:hAnsi="Sakkal Majalla" w:cs="Sakkal Majalla"/>
+              </w:rPr>
+            </w:pPr>
+          </w:p>
+        </w:tc>
+        <w:tc>
+          <w:tcPr>
+            <w:tcW w:w="990" w:type="dxa"/>
+          </w:tcPr>
+          <w:p>
+            <w:pPr>
+              <w:cnfStyle w:val="000000100000" w:firstRow="0" w:lastRow="0" w:firstColumn="0" w:lastColumn="0" w:oddVBand="0" w:evenVBand="0" w:oddHBand="1" w:evenHBand="0" w:firstRowFirstColumn="0" w:firstRowLastColumn="0" w:lastRowFirstColumn="0" w:lastRowLastColumn="0"/>
+              <w:rPr>
+                <w:rFonts w:ascii="Sakkal Majalla" w:hAnsi="Sakkal Majalla" w:cs="Sakkal Majalla"/>
+              </w:rPr>
+            </w:pPr>
+          </w:p>
+        </w:tc>
+      </w:tr>
+      <w:tr>
+        <w:tc>
+          <w:tcPr>
+            <w:cnfStyle w:val="001000000000" w:firstRow="0" w:lastRow="0" w:firstColumn="1" w:lastColumn="0" w:oddVBand="0" w:evenVBand="0" w:oddHBand="0" w:evenHBand="0" w:firstRowFirstColumn="0" w:firstRowLastColumn="0" w:lastRowFirstColumn="0" w:lastRowLastColumn="0"/>
+            <w:tcW w:w="810" w:type="dxa"/>
+          </w:tcPr>
+          <w:p>
+            <w:pPr>
+              <w:jc w:val="center"/>
+              <w:rPr>
+                <w:rFonts w:ascii="Sakkal Majalla" w:hAnsi="Sakkal Majalla" w:cs="Sakkal Majalla"/>
+              </w:rPr>
+            </w:pPr>
+          </w:p>
+        </w:tc>
+        <w:tc>
+          <w:tcPr>
+            <w:tcW w:w="5400" w:type="dxa"/>
+          </w:tcPr>
+          <w:p>
+            <w:pPr>
+              <w:cnfStyle w:val="000000000000" w:firstRow="0" w:lastRow="0" w:firstColumn="0" w:lastColumn="0" w:oddVBand="0" w:evenVBand="0" w:oddHBand="0" w:evenHBand="0" w:firstRowFirstColumn="0" w:firstRowLastColumn="0" w:lastRowFirstColumn="0" w:lastRowLastColumn="0"/>
+              <w:rPr>
+                <w:rFonts w:ascii="Sakkal Majalla" w:hAnsi="Sakkal Majalla" w:cs="Sakkal Majalla"/>
+              </w:rPr>
+            </w:pPr>
+          </w:p>
+        </w:tc>
+        <w:tc>
+          <w:tcPr>
+            <w:tcW w:w="4860" w:type="dxa"/>
+          </w:tcPr>
+          <w:p>
+            <w:pPr>
+              <w:jc w:val="center"/>
+              <w:cnfStyle w:val="000000000000" w:firstRow="0" w:lastRow="0" w:firstColumn="0" w:lastColumn="0" w:oddVBand="0" w:evenVBand="0" w:oddHBand="0" w:evenHBand="0" w:firstRowFirstColumn="0" w:firstRowLastColumn="0" w:lastRowFirstColumn="0" w:lastRowLastColumn="0"/>
+              <w:rPr>
+                <w:rFonts w:ascii="Sakkal Majalla" w:hAnsi="Sakkal Majalla" w:cs="Sakkal Majalla"/>
+              </w:rPr>
+            </w:pPr>
+          </w:p>
+        </w:tc>
+        <w:tc>
+          <w:tcPr>
+            <w:tcW w:w="990" w:type="dxa"/>
+          </w:tcPr>
+          <w:p>
+            <w:pPr>
+              <w:cnfStyle w:val="000000000000" w:firstRow="0" w:lastRow="0" w:firstColumn="0" w:lastColumn="0" w:oddVBand="0" w:evenVBand="0" w:oddHBand="0" w:evenHBand="0" w:firstRowFirstColumn="0" w:firstRowLastColumn="0" w:lastRowFirstColumn="0" w:lastRowLastColumn="0"/>
+              <w:rPr>
+                <w:rFonts w:ascii="Sakkal Majalla" w:hAnsi="Sakkal Majalla" w:cs="Sakkal Majalla"/>
+              </w:rPr>
+            </w:pPr>
+          </w:p>
+        </w:tc>
+      </w:tr>
+      <w:tr>
+        <w:trPr>
+          <w:cnfStyle w:val="000000100000" w:firstRow="0" w:lastRow="0" w:firstColumn="0" w:lastColumn="0" w:oddVBand="0" w:evenVBand="0" w:oddHBand="1" w:evenHBand="0" w:firstRowFirstColumn="0" w:firstRowLastColumn="0" w:lastRowFirstColumn="0" w:lastRowLastColumn="0"/>
+        </w:trPr>
+        <w:tc>
+          <w:tcPr>
+            <w:cnfStyle w:val="001000000000" w:firstRow="0" w:lastRow="0" w:firstColumn="1" w:lastColumn="0" w:oddVBand="0" w:evenVBand="0" w:oddHBand="0" w:evenHBand="0" w:firstRowFirstColumn="0" w:firstRowLastColumn="0" w:lastRowFirstColumn="0" w:lastRowLastColumn="0"/>
+            <w:tcW w:w="810" w:type="dxa"/>
+          </w:tcPr>
+          <w:p>
+            <w:pPr>
+              <w:jc w:val="center"/>
+              <w:rPr>
+                <w:rFonts w:ascii="Sakkal Majalla" w:hAnsi="Sakkal Majalla" w:cs="Sakkal Majalla"/>
+              </w:rPr>
+            </w:pPr>
+          </w:p>
+        </w:tc>
+        <w:tc>
+          <w:tcPr>
+            <w:tcW w:w="5400" w:type="dxa"/>
+          </w:tcPr>
+          <w:p>
+            <w:pPr>
+              <w:cnfStyle w:val="000000100000" w:firstRow="0" w:lastRow="0" w:firstColumn="0" w:lastColumn="0" w:oddVBand="0" w:evenVBand="0" w:oddHBand="1" w:evenHBand="0" w:firstRowFirstColumn="0" w:firstRowLastColumn="0" w:lastRowFirstColumn="0" w:lastRowLastColumn="0"/>
+              <w:rPr>
+                <w:rFonts w:ascii="Sakkal Majalla" w:hAnsi="Sakkal Majalla" w:cs="Sakkal Majalla"/>
+              </w:rPr>
+            </w:pPr>
+          </w:p>
+        </w:tc>
+        <w:tc>
+          <w:tcPr>
+            <w:tcW w:w="4860" w:type="dxa"/>
+          </w:tcPr>
+          <w:p>
+            <w:pPr>
+              <w:jc w:val="center"/>
+              <w:cnfStyle w:val="000000100000" w:firstRow="0" w:lastRow="0" w:firstColumn="0" w:lastColumn="0" w:oddVBand="0" w:evenVBand="0" w:oddHBand="1" w:evenHBand="0" w:firstRowFirstColumn="0" w:firstRowLastColumn="0" w:lastRowFirstColumn="0" w:lastRowLastColumn="0"/>
+              <w:rPr>
+                <w:rFonts w:ascii="Sakkal Majalla" w:hAnsi="Sakkal Majalla" w:cs="Sakkal Majalla"/>
+              </w:rPr>
+            </w:pPr>
+          </w:p>
+        </w:tc>
+        <w:tc>
+          <w:tcPr>
+            <w:tcW w:w="990" w:type="dxa"/>
+          </w:tcPr>
+          <w:p>
+            <w:pPr>
+              <w:cnfStyle w:val="000000100000" w:firstRow="0" w:lastRow="0" w:firstColumn="0" w:lastColumn="0" w:oddVBand="0" w:evenVBand="0" w:oddHBand="1" w:evenHBand="0" w:firstRowFirstColumn="0" w:firstRowLastColumn="0" w:lastRowFirstColumn="0" w:lastRowLastColumn="0"/>
+              <w:rPr>
+                <w:rFonts w:ascii="Sakkal Majalla" w:hAnsi="Sakkal Majalla" w:cs="Sakkal Majalla"/>
+              </w:rPr>
+            </w:pPr>
+          </w:p>
+        </w:tc>
+      </w:tr>
+      <w:tr>
+        <w:tc>
+          <w:tcPr>
+            <w:cnfStyle w:val="001000000000" w:firstRow="0" w:lastRow="0" w:firstColumn="1" w:lastColumn="0" w:oddVBand="0" w:evenVBand="0" w:oddHBand="0" w:evenHBand="0" w:firstRowFirstColumn="0" w:firstRowLastColumn="0" w:lastRowFirstColumn="0" w:lastRowLastColumn="0"/>
+            <w:tcW w:w="810" w:type="dxa"/>
+          </w:tcPr>
+          <w:p>
+            <w:pPr>
+              <w:jc w:val="center"/>
+              <w:rPr>
+                <w:rFonts w:ascii="Sakkal Majalla" w:hAnsi="Sakkal Majalla" w:cs="Sakkal Majalla"/>
+              </w:rPr>
+            </w:pPr>
+          </w:p>
+        </w:tc>
+        <w:tc>
+          <w:tcPr>
+            <w:tcW w:w="5400" w:type="dxa"/>
+          </w:tcPr>
+          <w:p>
+            <w:pPr>
+              <w:cnfStyle w:val="000000000000" w:firstRow="0" w:lastRow="0" w:firstColumn="0" w:lastColumn="0" w:oddVBand="0" w:evenVBand="0" w:oddHBand="0" w:evenHBand="0" w:firstRowFirstColumn="0" w:firstRowLastColumn="0" w:lastRowFirstColumn="0" w:lastRowLastColumn="0"/>
+              <w:rPr>
+                <w:rFonts w:ascii="Sakkal Majalla" w:hAnsi="Sakkal Majalla" w:cs="Sakkal Majalla"/>
+              </w:rPr>
+            </w:pPr>
+          </w:p>
+        </w:tc>
+        <w:tc>
+          <w:tcPr>
+            <w:tcW w:w="4860" w:type="dxa"/>
+          </w:tcPr>
+          <w:p>
+            <w:pPr>
+              <w:jc w:val="center"/>
+              <w:cnfStyle w:val="000000000000" w:firstRow="0" w:lastRow="0" w:firstColumn="0" w:lastColumn="0" w:oddVBand="0" w:evenVBand="0" w:oddHBand="0" w:evenHBand="0" w:firstRowFirstColumn="0" w:firstRowLastColumn="0" w:lastRowFirstColumn="0" w:lastRowLastColumn="0"/>
+              <w:rPr>
+                <w:rFonts w:ascii="Sakkal Majalla" w:hAnsi="Sakkal Majalla" w:cs="Sakkal Majalla"/>
+              </w:rPr>
+            </w:pPr>
+          </w:p>
+        </w:tc>
+        <w:tc>
+          <w:tcPr>
+            <w:tcW w:w="990" w:type="dxa"/>
+          </w:tcPr>
+          <w:p>
+            <w:pPr>
+              <w:cnfStyle w:val="000000000000" w:firstRow="0" w:lastRow="0" w:firstColumn="0" w:lastColumn="0" w:oddVBand="0" w:evenVBand="0" w:oddHBand="0" w:evenHBand="0" w:firstRowFirstColumn="0" w:firstRowLastColumn="0" w:lastRowFirstColumn="0" w:lastRowLastColumn="0"/>
+              <w:rPr>
+                <w:rFonts w:ascii="Sakkal Majalla" w:hAnsi="Sakkal Majalla" w:cs="Sakkal Majalla"/>
+              </w:rPr>
+            </w:pPr>
+          </w:p>
+        </w:tc>
+      </w:tr>
+      <w:tr>
+        <w:trPr>
+          <w:cnfStyle w:val="000000100000" w:firstRow="0" w:lastRow="0" w:firstColumn="0" w:lastColumn="0" w:oddVBand="0" w:evenVBand="0" w:oddHBand="1" w:evenHBand="0" w:firstRowFirstColumn="0" w:firstRowLastColumn="0" w:lastRowFirstColumn="0" w:lastRowLastColumn="0"/>
+        </w:trPr>
+        <w:tc>
+          <w:tcPr>
+            <w:cnfStyle w:val="001000000000" w:firstRow="0" w:lastRow="0" w:firstColumn="1" w:lastColumn="0" w:oddVBand="0" w:evenVBand="0" w:oddHBand="0" w:evenHBand="0" w:firstRowFirstColumn="0" w:firstRowLastColumn="0" w:lastRowFirstColumn="0" w:lastRowLastColumn="0"/>
+            <w:tcW w:w="810" w:type="dxa"/>
+          </w:tcPr>
+          <w:p>
+            <w:pPr>
+              <w:jc w:val="center"/>
+              <w:rPr>
+                <w:rFonts w:ascii="Sakkal Majalla" w:hAnsi="Sakkal Majalla" w:cs="Sakkal Majalla"/>
+              </w:rPr>
+            </w:pPr>
+          </w:p>
+        </w:tc>
+        <w:tc>
+          <w:tcPr>
+            <w:tcW w:w="5400" w:type="dxa"/>
+          </w:tcPr>
+          <w:p>
+            <w:pPr>
+              <w:cnfStyle w:val="000000100000" w:firstRow="0" w:lastRow="0" w:firstColumn="0" w:lastColumn="0" w:oddVBand="0" w:evenVBand="0" w:oddHBand="1" w:evenHBand="0" w:firstRowFirstColumn="0" w:firstRowLastColumn="0" w:lastRowFirstColumn="0" w:lastRowLastColumn="0"/>
+              <w:rPr>
+                <w:rFonts w:ascii="Sakkal Majalla" w:hAnsi="Sakkal Majalla" w:cs="Sakkal Majalla"/>
+              </w:rPr>
+            </w:pPr>
+          </w:p>
+        </w:tc>
+        <w:tc>
+          <w:tcPr>
+            <w:tcW w:w="4860" w:type="dxa"/>
+          </w:tcPr>
+          <w:p>
+            <w:pPr>
+              <w:jc w:val="center"/>
+              <w:cnfStyle w:val="000000100000" w:firstRow="0" w:lastRow="0" w:firstColumn="0" w:lastColumn="0" w:oddVBand="0" w:evenVBand="0" w:oddHBand="1" w:evenHBand="0" w:firstRowFirstColumn="0" w:firstRowLastColumn="0" w:lastRowFirstColumn="0" w:lastRowLastColumn="0"/>
+              <w:rPr>
+                <w:rFonts w:ascii="Sakkal Majalla" w:hAnsi="Sakkal Majalla" w:cs="Sakkal Majalla"/>
+              </w:rPr>
+            </w:pPr>
+          </w:p>
+        </w:tc>
+        <w:tc>
+          <w:tcPr>
+            <w:tcW w:w="990" w:type="dxa"/>
+          </w:tcPr>
+          <w:p>
+            <w:pPr>
+              <w:cnfStyle w:val="000000100000" w:firstRow="0" w:lastRow="0" w:firstColumn="0" w:lastColumn="0" w:oddVBand="0" w:evenVBand="0" w:oddHBand="1" w:evenHBand="0" w:firstRowFirstColumn="0" w:firstRowLastColumn="0" w:lastRowFirstColumn="0" w:lastRowLastColumn="0"/>
+              <w:rPr>
+                <w:rFonts w:ascii="Sakkal Majalla" w:hAnsi="Sakkal Majalla" w:cs="Sakkal Majalla"/>
+              </w:rPr>
+            </w:pPr>
+          </w:p>
+        </w:tc>
+      </w:tr>
+      <w:tr>
+        <w:tc>
+          <w:tcPr>
+            <w:cnfStyle w:val="001000000000" w:firstRow="0" w:lastRow="0" w:firstColumn="1" w:lastColumn="0" w:oddVBand="0" w:evenVBand="0" w:oddHBand="0" w:evenHBand="0" w:firstRowFirstColumn="0" w:firstRowLastColumn="0" w:lastRowFirstColumn="0" w:lastRowLastColumn="0"/>
+            <w:tcW w:w="810" w:type="dxa"/>
+          </w:tcPr>
+          <w:p>
+            <w:pPr>
+              <w:jc w:val="center"/>
+              <w:rPr>
+                <w:rFonts w:ascii="Sakkal Majalla" w:hAnsi="Sakkal Majalla" w:cs="Sakkal Majalla"/>
+              </w:rPr>
+            </w:pPr>
+          </w:p>
+        </w:tc>
+        <w:tc>
+          <w:tcPr>
+            <w:tcW w:w="5400" w:type="dxa"/>
+          </w:tcPr>
+          <w:p>
+            <w:pPr>
+              <w:cnfStyle w:val="000000000000" w:firstRow="0" w:lastRow="0" w:firstColumn="0" w:lastColumn="0" w:oddVBand="0" w:evenVBand="0" w:oddHBand="0" w:evenHBand="0" w:firstRowFirstColumn="0" w:firstRowLastColumn="0" w:lastRowFirstColumn="0" w:lastRowLastColumn="0"/>
+              <w:rPr>
+                <w:rFonts w:ascii="Sakkal Majalla" w:hAnsi="Sakkal Majalla" w:cs="Sakkal Majalla"/>
+              </w:rPr>
+            </w:pPr>
+          </w:p>
+        </w:tc>
+        <w:tc>
+          <w:tcPr>
+            <w:tcW w:w="4860" w:type="dxa"/>
+          </w:tcPr>
+          <w:p>
+            <w:pPr>
+              <w:jc w:val="center"/>
+              <w:cnfStyle w:val="000000000000" w:firstRow="0" w:lastRow="0" w:firstColumn="0" w:lastColumn="0" w:oddVBand="0" w:evenVBand="0" w:oddHBand="0" w:evenHBand="0" w:firstRowFirstColumn="0" w:firstRowLastColumn="0" w:lastRowFirstColumn="0" w:lastRowLastColumn="0"/>
+              <w:rPr>
+                <w:rFonts w:ascii="Sakkal Majalla" w:hAnsi="Sakkal Majalla" w:cs="Sakkal Majalla"/>
+              </w:rPr>
+            </w:pPr>
+          </w:p>
+        </w:tc>
+        <w:tc>
+          <w:tcPr>
+            <w:tcW w:w="990" w:type="dxa"/>
+          </w:tcPr>
+          <w:p>
+            <w:pPr>
+              <w:cnfStyle w:val="000000000000" w:firstRow="0" w:lastRow="0" w:firstColumn="0" w:lastColumn="0" w:oddVBand="0" w:evenVBand="0" w:oddHBand="0" w:evenHBand="0" w:firstRowFirstColumn="0" w:firstRowLastColumn="0" w:lastRowFirstColumn="0" w:lastRowLastColumn="0"/>
+              <w:rPr>
+                <w:rFonts w:ascii="Sakkal Majalla" w:hAnsi="Sakkal Majalla" w:cs="Sakkal Majalla"/>
+              </w:rPr>
+            </w:pPr>
+          </w:p>
+        </w:tc>
+      </w:tr>
+      <w:tr>
+        <w:trPr>
+          <w:cnfStyle w:val="000000100000" w:firstRow="0" w:lastRow="0" w:firstColumn="0" w:lastColumn="0" w:oddVBand="0" w:evenVBand="0" w:oddHBand="1" w:evenHBand="0" w:firstRowFirstColumn="0" w:firstRowLastColumn="0" w:lastRowFirstColumn="0" w:lastRowLastColumn="0"/>
+        </w:trPr>
+        <w:tc>
+          <w:tcPr>
+            <w:cnfStyle w:val="001000000000" w:firstRow="0" w:lastRow="0" w:firstColumn="1" w:lastColumn="0" w:oddVBand="0" w:evenVBand="0" w:oddHBand="0" w:evenHBand="0" w:firstRowFirstColumn="0" w:firstRowLastColumn="0" w:lastRowFirstColumn="0" w:lastRowLastColumn="0"/>
+            <w:tcW w:w="810" w:type="dxa"/>
+          </w:tcPr>
+          <w:p>
+            <w:pPr>
+              <w:jc w:val="center"/>
+              <w:rPr>
+                <w:rFonts w:ascii="Sakkal Majalla" w:hAnsi="Sakkal Majalla" w:cs="Sakkal Majalla"/>
+              </w:rPr>
+            </w:pPr>
+          </w:p>
+        </w:tc>
+        <w:tc>
+          <w:tcPr>
+            <w:tcW w:w="5400" w:type="dxa"/>
+          </w:tcPr>
+          <w:p>
+            <w:pPr>
+              <w:cnfStyle w:val="000000100000" w:firstRow="0" w:lastRow="0" w:firstColumn="0" w:lastColumn="0" w:oddVBand="0" w:evenVBand="0" w:oddHBand="1" w:evenHBand="0" w:firstRowFirstColumn="0" w:firstRowLastColumn="0" w:lastRowFirstColumn="0" w:lastRowLastColumn="0"/>
+              <w:rPr>
+                <w:rFonts w:ascii="Sakkal Majalla" w:hAnsi="Sakkal Majalla" w:cs="Sakkal Majalla"/>
+              </w:rPr>
+            </w:pPr>
+          </w:p>
+        </w:tc>
+        <w:tc>
+          <w:tcPr>
+            <w:tcW w:w="4860" w:type="dxa"/>
+          </w:tcPr>
+          <w:p>
+            <w:pPr>
+              <w:jc w:val="center"/>
+              <w:cnfStyle w:val="000000100000" w:firstRow="0" w:lastRow="0" w:firstColumn="0" w:lastColumn="0" w:oddVBand="0" w:evenVBand="0" w:oddHBand="1" w:evenHBand="0" w:firstRowFirstColumn="0" w:firstRowLastColumn="0" w:lastRowFirstColumn="0" w:lastRowLastColumn="0"/>
+              <w:rPr>
+                <w:rFonts w:ascii="Sakkal Majalla" w:hAnsi="Sakkal Majalla" w:cs="Sakkal Majalla"/>
+              </w:rPr>
+            </w:pPr>
+          </w:p>
+        </w:tc>
+        <w:tc>
+          <w:tcPr>
+            <w:tcW w:w="990" w:type="dxa"/>
+          </w:tcPr>
+          <w:p>
+            <w:pPr>
+              <w:cnfStyle w:val="000000100000" w:firstRow="0" w:lastRow="0" w:firstColumn="0" w:lastColumn="0" w:oddVBand="0" w:evenVBand="0" w:oddHBand="1" w:evenHBand="0" w:firstRowFirstColumn="0" w:firstRowLastColumn="0" w:lastRowFirstColumn="0" w:lastRowLastColumn="0"/>
+              <w:rPr>
+                <w:rFonts w:ascii="Sakkal Majalla" w:hAnsi="Sakkal Majalla" w:cs="Sakkal Majalla"/>
+              </w:rPr>
+            </w:pPr>
+          </w:p>
+        </w:tc>
+      </w:tr>
+      <w:tr>
+        <w:tc>
+          <w:tcPr>
+            <w:cnfStyle w:val="001000000000" w:firstRow="0" w:lastRow="0" w:firstColumn="1" w:lastColumn="0" w:oddVBand="0" w:evenVBand="0" w:oddHBand="0" w:evenHBand="0" w:firstRowFirstColumn="0" w:firstRowLastColumn="0" w:lastRowFirstColumn="0" w:lastRowLastColumn="0"/>
+            <w:tcW w:w="810" w:type="dxa"/>
+          </w:tcPr>
+          <w:p>
+            <w:pPr>
+              <w:jc w:val="center"/>
+              <w:rPr>
+                <w:rFonts w:ascii="Sakkal Majalla" w:hAnsi="Sakkal Majalla" w:cs="Sakkal Majalla"/>
+              </w:rPr>
+            </w:pPr>
+          </w:p>
+        </w:tc>
+        <w:tc>
+          <w:tcPr>
+            <w:tcW w:w="5400" w:type="dxa"/>
+          </w:tcPr>
+          <w:p>
+            <w:pPr>
+              <w:cnfStyle w:val="000000000000" w:firstRow="0" w:lastRow="0" w:firstColumn="0" w:lastColumn="0" w:oddVBand="0" w:evenVBand="0" w:oddHBand="0" w:evenHBand="0" w:firstRowFirstColumn="0" w:firstRowLastColumn="0" w:lastRowFirstColumn="0" w:lastRowLastColumn="0"/>
+              <w:rPr>
+                <w:rFonts w:ascii="Sakkal Majalla" w:hAnsi="Sakkal Majalla" w:cs="Sakkal Majalla"/>
+              </w:rPr>
+            </w:pPr>
+          </w:p>
+        </w:tc>
+        <w:tc>
+          <w:tcPr>
+            <w:tcW w:w="4860" w:type="dxa"/>
+          </w:tcPr>
+          <w:p>
+            <w:pPr>
+              <w:jc w:val="center"/>
+              <w:cnfStyle w:val="000000000000" w:firstRow="0" w:lastRow="0" w:firstColumn="0" w:lastColumn="0" w:oddVBand="0" w:evenVBand="0" w:oddHBand="0" w:evenHBand="0" w:firstRowFirstColumn="0" w:firstRowLastColumn="0" w:lastRowFirstColumn="0" w:lastRowLastColumn="0"/>
+              <w:rPr>
+                <w:rFonts w:ascii="Sakkal Majalla" w:hAnsi="Sakkal Majalla" w:cs="Sakkal Majalla"/>
+              </w:rPr>
+            </w:pPr>
+          </w:p>
+        </w:tc>
+        <w:tc>
+          <w:tcPr>
+            <w:tcW w:w="990" w:type="dxa"/>
+          </w:tcPr>
+          <w:p>
+            <w:pPr>
+              <w:cnfStyle w:val="000000000000" w:firstRow="0" w:lastRow="0" w:firstColumn="0" w:lastColumn="0" w:oddVBand="0" w:evenVBand="0" w:oddHBand="0" w:evenHBand="0" w:firstRowFirstColumn="0" w:firstRowLastColumn="0" w:lastRowFirstColumn="0" w:lastRowLastColumn="0"/>
+              <w:rPr>
+                <w:rFonts w:ascii="Sakkal Majalla" w:hAnsi="Sakkal Majalla" w:cs="Sakkal Majalla"/>
+              </w:rPr>
+            </w:pPr>
+          </w:p>
+        </w:tc>
+      </w:tr>
+      <w:tr>
+        <w:trPr>
+          <w:cnfStyle w:val="000000100000" w:firstRow="0" w:lastRow="0" w:firstColumn="0" w:lastColumn="0" w:oddVBand="0" w:evenVBand="0" w:oddHBand="1" w:evenHBand="0" w:firstRowFirstColumn="0" w:firstRowLastColumn="0" w:lastRowFirstColumn="0" w:lastRowLastColumn="0"/>
+        </w:trPr>
+        <w:tc>
+          <w:tcPr>
+            <w:cnfStyle w:val="001000000000" w:firstRow="0" w:lastRow="0" w:firstColumn="1" w:lastColumn="0" w:oddVBand="0" w:evenVBand="0" w:oddHBand="0" w:evenHBand="0" w:firstRowFirstColumn="0" w:firstRowLastColumn="0" w:lastRowFirstColumn="0" w:lastRowLastColumn="0"/>
+            <w:tcW w:w="810" w:type="dxa"/>
+          </w:tcPr>
+          <w:p>
+            <w:pPr>
+              <w:jc w:val="center"/>
+              <w:rPr>
+                <w:rFonts w:ascii="Sakkal Majalla" w:hAnsi="Sakkal Majalla" w:cs="Sakkal Majalla"/>
+              </w:rPr>
+            </w:pPr>
+          </w:p>
+        </w:tc>
+        <w:tc>
+          <w:tcPr>
+            <w:tcW w:w="5400" w:type="dxa"/>
+          </w:tcPr>
+          <w:p>
+            <w:pPr>
+              <w:cnfStyle w:val="000000100000" w:firstRow="0" w:lastRow="0" w:firstColumn="0" w:lastColumn="0" w:oddVBand="0" w:evenVBand="0" w:oddHBand="1" w:evenHBand="0" w:firstRowFirstColumn="0" w:firstRowLastColumn="0" w:lastRowFirstColumn="0" w:lastRowLastColumn="0"/>
+              <w:rPr>
+                <w:rFonts w:ascii="Sakkal Majalla" w:hAnsi="Sakkal Majalla" w:cs="Sakkal Majalla"/>
+              </w:rPr>
+            </w:pPr>
+          </w:p>
+        </w:tc>
+        <w:tc>
+          <w:tcPr>
+            <w:tcW w:w="4860" w:type="dxa"/>
+          </w:tcPr>
+          <w:p>
+            <w:pPr>
+              <w:jc w:val="center"/>
+              <w:cnfStyle w:val="000000100000" w:firstRow="0" w:lastRow="0" w:firstColumn="0" w:lastColumn="0" w:oddVBand="0" w:evenVBand="0" w:oddHBand="1" w:evenHBand="0" w:firstRowFirstColumn="0" w:firstRowLastColumn="0" w:lastRowFirstColumn="0" w:lastRowLastColumn="0"/>
+              <w:rPr>
+                <w:rFonts w:ascii="Sakkal Majalla" w:hAnsi="Sakkal Majalla" w:cs="Sakkal Majalla"/>
+              </w:rPr>
+            </w:pPr>
+          </w:p>
+        </w:tc>
+        <w:tc>
+          <w:tcPr>
+            <w:tcW w:w="990" w:type="dxa"/>
+          </w:tcPr>
+          <w:p>
+            <w:pPr>
+              <w:cnfStyle w:val="000000100000" w:firstRow="0" w:lastRow="0" w:firstColumn="0" w:lastColumn="0" w:oddVBand="0" w:evenVBand="0" w:oddHBand="1" w:evenHBand="0" w:firstRowFirstColumn="0" w:firstRowLastColumn="0" w:lastRowFirstColumn="0" w:lastRowLastColumn="0"/>
+              <w:rPr>
+                <w:rFonts w:ascii="Sakkal Majalla" w:hAnsi="Sakkal Majalla" w:cs="Sakkal Majalla"/>
+              </w:rPr>
+            </w:pPr>
+          </w:p>
+        </w:tc>
+      </w:tr>
+      <w:tr>
+        <w:tc>
+          <w:tcPr>
+            <w:cnfStyle w:val="001000000000" w:firstRow="0" w:lastRow="0" w:firstColumn="1" w:lastColumn="0" w:oddVBand="0" w:evenVBand="0" w:oddHBand="0" w:evenHBand="0" w:firstRowFirstColumn="0" w:firstRowLastColumn="0" w:lastRowFirstColumn="0" w:lastRowLastColumn="0"/>
+            <w:tcW w:w="810" w:type="dxa"/>
+          </w:tcPr>
+          <w:p>
+            <w:pPr>
+              <w:jc w:val="center"/>
+              <w:rPr>
+                <w:rFonts w:ascii="Sakkal Majalla" w:hAnsi="Sakkal Majalla" w:cs="Sakkal Majalla"/>
+              </w:rPr>
+            </w:pPr>
+          </w:p>
+        </w:tc>
+        <w:tc>
+          <w:tcPr>
+            <w:tcW w:w="5400" w:type="dxa"/>
+          </w:tcPr>
+          <w:p>
+            <w:pPr>
+              <w:cnfStyle w:val="000000000000" w:firstRow="0" w:lastRow="0" w:firstColumn="0" w:lastColumn="0" w:oddVBand="0" w:evenVBand="0" w:oddHBand="0" w:evenHBand="0" w:firstRowFirstColumn="0" w:firstRowLastColumn="0" w:lastRowFirstColumn="0" w:lastRowLastColumn="0"/>
+              <w:rPr>
+                <w:rFonts w:ascii="Sakkal Majalla" w:hAnsi="Sakkal Majalla" w:cs="Sakkal Majalla"/>
+              </w:rPr>
+            </w:pPr>
+          </w:p>
+        </w:tc>
+        <w:tc>
+          <w:tcPr>
+            <w:tcW w:w="4860" w:type="dxa"/>
+          </w:tcPr>
+          <w:p>
+            <w:pPr>
+              <w:jc w:val="center"/>
+              <w:cnfStyle w:val="000000000000" w:firstRow="0" w:lastRow="0" w:firstColumn="0" w:lastColumn="0" w:oddVBand="0" w:evenVBand="0" w:oddHBand="0" w:evenHBand="0" w:firstRowFirstColumn="0" w:firstRowLastColumn="0" w:lastRowFirstColumn="0" w:lastRowLastColumn="0"/>
+              <w:rPr>
+                <w:rFonts w:ascii="Sakkal Majalla" w:hAnsi="Sakkal Majalla" w:cs="Sakkal Majalla"/>
+              </w:rPr>
+            </w:pPr>
+          </w:p>
+        </w:tc>
+        <w:tc>
+          <w:tcPr>
+            <w:tcW w:w="990" w:type="dxa"/>
+          </w:tcPr>
+          <w:p>
+            <w:pPr>
+              <w:cnfStyle w:val="000000000000" w:firstRow="0" w:lastRow="0" w:firstColumn="0" w:lastColumn="0" w:oddVBand="0" w:evenVBand="0" w:oddHBand="0" w:evenHBand="0" w:firstRowFirstColumn="0" w:firstRowLastColumn="0" w:lastRowFirstColumn="0" w:lastRowLastColumn="0"/>
+              <w:rPr>
+                <w:rFonts w:ascii="Sakkal Majalla" w:hAnsi="Sakkal Majalla" w:cs="Sakkal Majalla"/>
+              </w:rPr>
+            </w:pPr>
+          </w:p>
+        </w:tc>
+      </w:tr>
+      <w:tr>
+        <w:trPr>
+          <w:cnfStyle w:val="000000100000" w:firstRow="0" w:lastRow="0" w:firstColumn="0" w:lastColumn="0" w:oddVBand="0" w:evenVBand="0" w:oddHBand="1" w:evenHBand="0" w:firstRowFirstColumn="0" w:firstRowLastColumn="0" w:lastRowFirstColumn="0" w:lastRowLastColumn="0"/>
+        </w:trPr>
+        <w:tc>
+          <w:tcPr>
+            <w:cnfStyle w:val="001000000000" w:firstRow="0" w:lastRow="0" w:firstColumn="1" w:lastColumn="0" w:oddVBand="0" w:evenVBand="0" w:oddHBand="0" w:evenHBand="0" w:firstRowFirstColumn="0" w:firstRowLastColumn="0" w:lastRowFirstColumn="0" w:lastRowLastColumn="0"/>
+            <w:tcW w:w="810" w:type="dxa"/>
+          </w:tcPr>
+          <w:p>
+            <w:pPr>
+              <w:jc w:val="center"/>
+              <w:rPr>
+                <w:rFonts w:ascii="Sakkal Majalla" w:hAnsi="Sakkal Majalla" w:cs="Sakkal Majalla"/>
+              </w:rPr>
+            </w:pPr>
+          </w:p>
+        </w:tc>
+        <w:tc>
+          <w:tcPr>
+            <w:tcW w:w="5400" w:type="dxa"/>
+          </w:tcPr>
+          <w:p>
+            <w:pPr>
+              <w:cnfStyle w:val="000000100000" w:firstRow="0" w:lastRow="0" w:firstColumn="0" w:lastColumn="0" w:oddVBand="0" w:evenVBand="0" w:oddHBand="1" w:evenHBand="0" w:firstRowFirstColumn="0" w:firstRowLastColumn="0" w:lastRowFirstColumn="0" w:lastRowLastColumn="0"/>
+              <w:rPr>
+                <w:rFonts w:ascii="Sakkal Majalla" w:hAnsi="Sakkal Majalla" w:cs="Sakkal Majalla"/>
+              </w:rPr>
+            </w:pPr>
+          </w:p>
+        </w:tc>
+        <w:tc>
+          <w:tcPr>
+            <w:tcW w:w="4860" w:type="dxa"/>
+          </w:tcPr>
+          <w:p>
+            <w:pPr>
+              <w:jc w:val="center"/>
+              <w:cnfStyle w:val="000000100000" w:firstRow="0" w:lastRow="0" w:firstColumn="0" w:lastColumn="0" w:oddVBand="0" w:evenVBand="0" w:oddHBand="1" w:evenHBand="0" w:firstRowFirstColumn="0" w:firstRowLastColumn="0" w:lastRowFirstColumn="0" w:lastRowLastColumn="0"/>
+              <w:rPr>
+                <w:rFonts w:ascii="Sakkal Majalla" w:hAnsi="Sakkal Majalla" w:cs="Sakkal Majalla"/>
+              </w:rPr>
+            </w:pPr>
+          </w:p>
+        </w:tc>
+        <w:tc>
+          <w:tcPr>
+            <w:tcW w:w="990" w:type="dxa"/>
+          </w:tcPr>
+          <w:p>
+            <w:pPr>
+              <w:cnfStyle w:val="000000100000" w:firstRow="0" w:lastRow="0" w:firstColumn="0" w:lastColumn="0" w:oddVBand="0" w:evenVBand="0" w:oddHBand="1" w:evenHBand="0" w:firstRowFirstColumn="0" w:firstRowLastColumn="0" w:lastRowFirstColumn="0" w:lastRowLastColumn="0"/>
+              <w:rPr>
+                <w:rFonts w:ascii="Sakkal Majalla" w:hAnsi="Sakkal Majalla" w:cs="Sakkal Majalla"/>
+              </w:rPr>
+            </w:pPr>
+          </w:p>
+        </w:tc>
+      </w:tr>
+      <w:tr>
+        <w:tc>
+          <w:tcPr>
+            <w:cnfStyle w:val="001000000000" w:firstRow="0" w:lastRow="0" w:firstColumn="1" w:lastColumn="0" w:oddVBand="0" w:evenVBand="0" w:oddHBand="0" w:evenHBand="0" w:firstRowFirstColumn="0" w:firstRowLastColumn="0" w:lastRowFirstColumn="0" w:lastRowLastColumn="0"/>
+            <w:tcW w:w="810" w:type="dxa"/>
+          </w:tcPr>
+          <w:p>
+            <w:pPr>
+              <w:jc w:val="center"/>
+              <w:rPr>
+                <w:rFonts w:ascii="Sakkal Majalla" w:hAnsi="Sakkal Majalla" w:cs="Sakkal Majalla"/>
+              </w:rPr>
+            </w:pPr>
+          </w:p>
+        </w:tc>
+        <w:tc>
+          <w:tcPr>
+            <w:tcW w:w="5400" w:type="dxa"/>
+          </w:tcPr>
+          <w:p>
+            <w:pPr>
+              <w:cnfStyle w:val="000000000000" w:firstRow="0" w:lastRow="0" w:firstColumn="0" w:lastColumn="0" w:oddVBand="0" w:evenVBand="0" w:oddHBand="0" w:evenHBand="0" w:firstRowFirstColumn="0" w:firstRowLastColumn="0" w:lastRowFirstColumn="0" w:lastRowLastColumn="0"/>
+              <w:rPr>
+                <w:rFonts w:ascii="Sakkal Majalla" w:hAnsi="Sakkal Majalla" w:cs="Sakkal Majalla"/>
+              </w:rPr>
+            </w:pPr>
+          </w:p>
+        </w:tc>
+        <w:tc>
+          <w:tcPr>
+            <w:tcW w:w="4860" w:type="dxa"/>
+          </w:tcPr>
+          <w:p>
+            <w:pPr>
+              <w:jc w:val="center"/>
+              <w:cnfStyle w:val="000000000000" w:firstRow="0" w:lastRow="0" w:firstColumn="0" w:lastColumn="0" w:oddVBand="0" w:evenVBand="0" w:oddHBand="0" w:evenHBand="0" w:firstRowFirstColumn="0" w:firstRowLastColumn="0" w:lastRowFirstColumn="0" w:lastRowLastColumn="0"/>
+              <w:rPr>
+                <w:rFonts w:ascii="Sakkal Majalla" w:hAnsi="Sakkal Majalla" w:cs="Sakkal Majalla"/>
+              </w:rPr>
+            </w:pPr>
+          </w:p>
+        </w:tc>
+        <w:tc>
+          <w:tcPr>
+            <w:tcW w:w="990" w:type="dxa"/>
+          </w:tcPr>
+          <w:p>
+            <w:pPr>
+              <w:cnfStyle w:val="000000000000" w:firstRow="0" w:lastRow="0" w:firstColumn="0" w:lastColumn="0" w:oddVBand="0" w:evenVBand="0" w:oddHBand="0" w:evenHBand="0" w:firstRowFirstColumn="0" w:firstRowLastColumn="0" w:lastRowFirstColumn="0" w:lastRowLastColumn="0"/>
+              <w:rPr>
+                <w:rFonts w:ascii="Sakkal Majalla" w:hAnsi="Sakkal Majalla" w:cs="Sakkal Majalla"/>
+              </w:rPr>
+            </w:pPr>
+          </w:p>
+        </w:tc>
+      </w:tr>
+      <w:tr>
+        <w:trPr>
+          <w:cnfStyle w:val="000000100000" w:firstRow="0" w:lastRow="0" w:firstColumn="0" w:lastColumn="0" w:oddVBand="0" w:evenVBand="0" w:oddHBand="1" w:evenHBand="0" w:firstRowFirstColumn="0" w:firstRowLastColumn="0" w:lastRowFirstColumn="0" w:lastRowLastColumn="0"/>
+        </w:trPr>
+        <w:tc>
+          <w:tcPr>
+            <w:cnfStyle w:val="001000000000" w:firstRow="0" w:lastRow="0" w:firstColumn="1" w:lastColumn="0" w:oddVBand="0" w:evenVBand="0" w:oddHBand="0" w:evenHBand="0" w:firstRowFirstColumn="0" w:firstRowLastColumn="0" w:lastRowFirstColumn="0" w:lastRowLastColumn="0"/>
+            <w:tcW w:w="810" w:type="dxa"/>
+          </w:tcPr>
+          <w:p>
+            <w:pPr>
+              <w:jc w:val="center"/>
+              <w:rPr>
+                <w:rFonts w:ascii="Sakkal Majalla" w:hAnsi="Sakkal Majalla" w:cs="Sakkal Majalla"/>
+              </w:rPr>
+            </w:pPr>
+          </w:p>
+        </w:tc>
+        <w:tc>
+          <w:tcPr>
+            <w:tcW w:w="5400" w:type="dxa"/>
+          </w:tcPr>
+          <w:p>
+            <w:pPr>
+              <w:cnfStyle w:val="000000100000" w:firstRow="0" w:lastRow="0" w:firstColumn="0" w:lastColumn="0" w:oddVBand="0" w:evenVBand="0" w:oddHBand="1" w:evenHBand="0" w:firstRowFirstColumn="0" w:firstRowLastColumn="0" w:lastRowFirstColumn="0" w:lastRowLastColumn="0"/>
+              <w:rPr>
+                <w:rFonts w:ascii="Sakkal Majalla" w:hAnsi="Sakkal Majalla" w:cs="Sakkal Majalla"/>
+              </w:rPr>
+            </w:pPr>
+          </w:p>
+        </w:tc>
+        <w:tc>
+          <w:tcPr>
+            <w:tcW w:w="4860" w:type="dxa"/>
+          </w:tcPr>
+          <w:p>
+            <w:pPr>
+              <w:jc w:val="center"/>
+              <w:cnfStyle w:val="000000100000" w:firstRow="0" w:lastRow="0" w:firstColumn="0" w:lastColumn="0" w:oddVBand="0" w:evenVBand="0" w:oddHBand="1" w:evenHBand="0" w:firstRowFirstColumn="0" w:firstRowLastColumn="0" w:lastRowFirstColumn="0" w:lastRowLastColumn="0"/>
+              <w:rPr>
+                <w:rFonts w:ascii="Sakkal Majalla" w:hAnsi="Sakkal Majalla" w:cs="Sakkal Majalla"/>
+              </w:rPr>
+            </w:pPr>
+          </w:p>
+        </w:tc>
+        <w:tc>
+          <w:tcPr>
+            <w:tcW w:w="990" w:type="dxa"/>
+          </w:tcPr>
+          <w:p>
+            <w:pPr>
+              <w:cnfStyle w:val="000000100000" w:firstRow="0" w:lastRow="0" w:firstColumn="0" w:lastColumn="0" w:oddVBand="0" w:evenVBand="0" w:oddHBand="1" w:evenHBand="0" w:firstRowFirstColumn="0" w:firstRowLastColumn="0" w:lastRowFirstColumn="0" w:lastRowLastColumn="0"/>
+              <w:rPr>
+                <w:rFonts w:ascii="Sakkal Majalla" w:hAnsi="Sakkal Majalla" w:cs="Sakkal Majalla"/>
+              </w:rPr>
+            </w:pPr>
+          </w:p>
+        </w:tc>
+      </w:tr>
+      <w:tr>
+        <w:tc>
+          <w:tcPr>
+            <w:cnfStyle w:val="001000000000" w:firstRow="0" w:lastRow="0" w:firstColumn="1" w:lastColumn="0" w:oddVBand="0" w:evenVBand="0" w:oddHBand="0" w:evenHBand="0" w:firstRowFirstColumn="0" w:firstRowLastColumn="0" w:lastRowFirstColumn="0" w:lastRowLastColumn="0"/>
+            <w:tcW w:w="810" w:type="dxa"/>
+          </w:tcPr>
+          <w:p>
+            <w:pPr>
+              <w:jc w:val="center"/>
+              <w:rPr>
+                <w:rFonts w:ascii="Sakkal Majalla" w:hAnsi="Sakkal Majalla" w:cs="Sakkal Majalla"/>
+              </w:rPr>
+            </w:pPr>
+          </w:p>
+        </w:tc>
+        <w:tc>
+          <w:tcPr>
+            <w:tcW w:w="5400" w:type="dxa"/>
+          </w:tcPr>
+          <w:p>
+            <w:pPr>
+              <w:cnfStyle w:val="000000000000" w:firstRow="0" w:lastRow="0" w:firstColumn="0" w:lastColumn="0" w:oddVBand="0" w:evenVBand="0" w:oddHBand="0" w:evenHBand="0" w:firstRowFirstColumn="0" w:firstRowLastColumn="0" w:lastRowFirstColumn="0" w:lastRowLastColumn="0"/>
+              <w:rPr>
+                <w:rFonts w:ascii="Sakkal Majalla" w:hAnsi="Sakkal Majalla" w:cs="Sakkal Majalla"/>
+              </w:rPr>
+            </w:pPr>
+          </w:p>
+        </w:tc>
+        <w:tc>
+          <w:tcPr>
+            <w:tcW w:w="4860" w:type="dxa"/>
+          </w:tcPr>
+          <w:p>
+            <w:pPr>
+              <w:jc w:val="center"/>
+              <w:cnfStyle w:val="000000000000" w:firstRow="0" w:lastRow="0" w:firstColumn="0" w:lastColumn="0" w:oddVBand="0" w:evenVBand="0" w:oddHBand="0" w:evenHBand="0" w:firstRowFirstColumn="0" w:firstRowLastColumn="0" w:lastRowFirstColumn="0" w:lastRowLastColumn="0"/>
+              <w:rPr>
+                <w:rFonts w:ascii="Sakkal Majalla" w:hAnsi="Sakkal Majalla" w:cs="Sakkal Majalla"/>
+              </w:rPr>
+            </w:pPr>
+          </w:p>
+        </w:tc>
+        <w:tc>
+          <w:tcPr>
+            <w:tcW w:w="990" w:type="dxa"/>
+          </w:tcPr>
+          <w:p>
+            <w:pPr>
+              <w:cnfStyle w:val="000000000000" w:firstRow="0" w:lastRow="0" w:firstColumn="0" w:lastColumn="0" w:oddVBand="0" w:evenVBand="0" w:oddHBand="0" w:evenHBand="0" w:firstRowFirstColumn="0" w:firstRowLastColumn="0" w:lastRowFirstColumn="0" w:lastRowLastColumn="0"/>
+              <w:rPr>
+                <w:rFonts w:ascii="Sakkal Majalla" w:hAnsi="Sakkal Majalla" w:cs="Sakkal Majalla"/>
+              </w:rPr>
+            </w:pPr>
+          </w:p>
+        </w:tc>
+      </w:tr>
+      <w:tr>
+        <w:trPr>
+          <w:cnfStyle w:val="000000100000" w:firstRow="0" w:lastRow="0" w:firstColumn="0" w:lastColumn="0" w:oddVBand="0" w:evenVBand="0" w:oddHBand="1" w:evenHBand="0" w:firstRowFirstColumn="0" w:firstRowLastColumn="0" w:lastRowFirstColumn="0" w:lastRowLastColumn="0"/>
+        </w:trPr>
+        <w:tc>
+          <w:tcPr>
+            <w:cnfStyle w:val="001000000000" w:firstRow="0" w:lastRow="0" w:firstColumn="1" w:lastColumn="0" w:oddVBand="0" w:evenVBand="0" w:oddHBand="0" w:evenHBand="0" w:firstRowFirstColumn="0" w:firstRowLastColumn="0" w:lastRowFirstColumn="0" w:lastRowLastColumn="0"/>
+            <w:tcW w:w="810" w:type="dxa"/>
+          </w:tcPr>
+          <w:p>
+            <w:pPr>
+              <w:jc w:val="center"/>
+              <w:rPr>
+                <w:rFonts w:ascii="Sakkal Majalla" w:hAnsi="Sakkal Majalla" w:cs="Sakkal Majalla"/>
+              </w:rPr>
+            </w:pPr>
+          </w:p>
+        </w:tc>
+        <w:tc>
+          <w:tcPr>
+            <w:tcW w:w="5400" w:type="dxa"/>
+          </w:tcPr>
+          <w:p>
+            <w:pPr>
+              <w:cnfStyle w:val="000000100000" w:firstRow="0" w:lastRow="0" w:firstColumn="0" w:lastColumn="0" w:oddVBand="0" w:evenVBand="0" w:oddHBand="1" w:evenHBand="0" w:firstRowFirstColumn="0" w:firstRowLastColumn="0" w:lastRowFirstColumn="0" w:lastRowLastColumn="0"/>
+              <w:rPr>
+                <w:rFonts w:ascii="Sakkal Majalla" w:hAnsi="Sakkal Majalla" w:cs="Sakkal Majalla"/>
+              </w:rPr>
+            </w:pPr>
+          </w:p>
+        </w:tc>
+        <w:tc>
+          <w:tcPr>
+            <w:tcW w:w="4860" w:type="dxa"/>
+          </w:tcPr>
+          <w:p>
+            <w:pPr>
+              <w:jc w:val="center"/>
+              <w:cnfStyle w:val="000000100000" w:firstRow="0" w:lastRow="0" w:firstColumn="0" w:lastColumn="0" w:oddVBand="0" w:evenVBand="0" w:oddHBand="1" w:evenHBand="0" w:firstRowFirstColumn="0" w:firstRowLastColumn="0" w:lastRowFirstColumn="0" w:lastRowLastColumn="0"/>
+              <w:rPr>
+                <w:rFonts w:ascii="Sakkal Majalla" w:hAnsi="Sakkal Majalla" w:cs="Sakkal Majalla"/>
+              </w:rPr>
+            </w:pPr>
+          </w:p>
+        </w:tc>
+        <w:tc>
+          <w:tcPr>
+            <w:tcW w:w="990" w:type="dxa"/>
+          </w:tcPr>
+          <w:p>
+            <w:pPr>
+              <w:cnfStyle w:val="000000100000" w:firstRow="0" w:lastRow="0" w:firstColumn="0" w:lastColumn="0" w:oddVBand="0" w:evenVBand="0" w:oddHBand="1" w:evenHBand="0" w:firstRowFirstColumn="0" w:firstRowLastColumn="0" w:lastRowFirstColumn="0" w:lastRowLastColumn="0"/>
+              <w:rPr>
+                <w:rFonts w:ascii="Sakkal Majalla" w:hAnsi="Sakkal Majalla" w:cs="Sakkal Majalla"/>
+              </w:rPr>
+            </w:pPr>
+          </w:p>
+        </w:tc>
+      </w:tr>
+      <w:tr>
+        <w:tc>
+          <w:tcPr>
+            <w:cnfStyle w:val="001000000000" w:firstRow="0" w:lastRow="0" w:firstColumn="1" w:lastColumn="0" w:oddVBand="0" w:evenVBand="0" w:oddHBand="0" w:evenHBand="0" w:firstRowFirstColumn="0" w:firstRowLastColumn="0" w:lastRowFirstColumn="0" w:lastRowLastColumn="0"/>
+            <w:tcW w:w="810" w:type="dxa"/>
+          </w:tcPr>
+          <w:p>
+            <w:pPr>
+              <w:jc w:val="center"/>
+              <w:rPr>
+                <w:rFonts w:ascii="Sakkal Majalla" w:hAnsi="Sakkal Majalla" w:cs="Sakkal Majalla"/>
+              </w:rPr>
+            </w:pPr>
+          </w:p>
+        </w:tc>
+        <w:tc>
+          <w:tcPr>
+            <w:tcW w:w="5400" w:type="dxa"/>
+          </w:tcPr>
+          <w:p>
+            <w:pPr>
+              <w:cnfStyle w:val="000000000000" w:firstRow="0" w:lastRow="0" w:firstColumn="0" w:lastColumn="0" w:oddVBand="0" w:evenVBand="0" w:oddHBand="0" w:evenHBand="0" w:firstRowFirstColumn="0" w:firstRowLastColumn="0" w:lastRowFirstColumn="0" w:lastRowLastColumn="0"/>
+              <w:rPr>
+                <w:rFonts w:ascii="Sakkal Majalla" w:hAnsi="Sakkal Majalla" w:cs="Sakkal Majalla"/>
+              </w:rPr>
+            </w:pPr>
+          </w:p>
+        </w:tc>
+        <w:tc>
+          <w:tcPr>
+            <w:tcW w:w="4860" w:type="dxa"/>
+          </w:tcPr>
+          <w:p>
+            <w:pPr>
+              <w:jc w:val="center"/>
+              <w:cnfStyle w:val="000000000000" w:firstRow="0" w:lastRow="0" w:firstColumn="0" w:lastColumn="0" w:oddVBand="0" w:evenVBand="0" w:oddHBand="0" w:evenHBand="0" w:firstRowFirstColumn="0" w:firstRowLastColumn="0" w:lastRowFirstColumn="0" w:lastRowLastColumn="0"/>
+              <w:rPr>
+                <w:rFonts w:ascii="Sakkal Majalla" w:hAnsi="Sakkal Majalla" w:cs="Sakkal Majalla"/>
+              </w:rPr>
+            </w:pPr>
+          </w:p>
+        </w:tc>
+        <w:tc>
+          <w:tcPr>
+            <w:tcW w:w="990" w:type="dxa"/>
+          </w:tcPr>
+          <w:p>
+            <w:pPr>
+              <w:cnfStyle w:val="000000000000" w:firstRow="0" w:lastRow="0" w:firstColumn="0" w:lastColumn="0" w:oddVBand="0" w:evenVBand="0" w:oddHBand="0" w:evenHBand="0" w:firstRowFirstColumn="0" w:firstRowLastColumn="0" w:lastRowFirstColumn="0" w:lastRowLastColumn="0"/>
+              <w:rPr>
+                <w:rFonts w:ascii="Sakkal Majalla" w:hAnsi="Sakkal Majalla" w:cs="Sakkal Majalla"/>
+              </w:rPr>
+            </w:pPr>
+          </w:p>
+        </w:tc>
+      </w:tr>
+      <w:tr>
+        <w:trPr>
+          <w:cnfStyle w:val="000000100000" w:firstRow="0" w:lastRow="0" w:firstColumn="0" w:lastColumn="0" w:oddVBand="0" w:evenVBand="0" w:oddHBand="1" w:evenHBand="0" w:firstRowFirstColumn="0" w:firstRowLastColumn="0" w:lastRowFirstColumn="0" w:lastRowLastColumn="0"/>
+        </w:trPr>
+        <w:tc>
+          <w:tcPr>
+            <w:cnfStyle w:val="001000000000" w:firstRow="0" w:lastRow="0" w:firstColumn="1" w:lastColumn="0" w:oddVBand="0" w:evenVBand="0" w:oddHBand="0" w:evenHBand="0" w:firstRowFirstColumn="0" w:firstRowLastColumn="0" w:lastRowFirstColumn="0" w:lastRowLastColumn="0"/>
+            <w:tcW w:w="810" w:type="dxa"/>
+          </w:tcPr>
+          <w:p>
+            <w:pPr>
+              <w:jc w:val="center"/>
+              <w:rPr>
+                <w:rFonts w:ascii="Sakkal Majalla" w:hAnsi="Sakkal Majalla" w:cs="Sakkal Majalla"/>
+              </w:rPr>
+            </w:pPr>
+          </w:p>
+        </w:tc>
+        <w:tc>
+          <w:tcPr>
+            <w:tcW w:w="5400" w:type="dxa"/>
+          </w:tcPr>
+          <w:p>
+            <w:pPr>
+              <w:cnfStyle w:val="000000100000" w:firstRow="0" w:lastRow="0" w:firstColumn="0" w:lastColumn="0" w:oddVBand="0" w:evenVBand="0" w:oddHBand="1" w:evenHBand="0" w:firstRowFirstColumn="0" w:firstRowLastColumn="0" w:lastRowFirstColumn="0" w:lastRowLastColumn="0"/>
+              <w:rPr>
+                <w:rFonts w:ascii="Sakkal Majalla" w:hAnsi="Sakkal Majalla" w:cs="Sakkal Majalla"/>
+              </w:rPr>
+            </w:pPr>
+          </w:p>
+        </w:tc>
+        <w:tc>
+          <w:tcPr>
+            <w:tcW w:w="4860" w:type="dxa"/>
+          </w:tcPr>
+          <w:p>
+            <w:pPr>
+              <w:jc w:val="center"/>
+              <w:cnfStyle w:val="000000100000" w:firstRow="0" w:lastRow="0" w:firstColumn="0" w:lastColumn="0" w:oddVBand="0" w:evenVBand="0" w:oddHBand="1" w:evenHBand="0" w:firstRowFirstColumn="0" w:firstRowLastColumn="0" w:lastRowFirstColumn="0" w:lastRowLastColumn="0"/>
+              <w:rPr>
+                <w:rFonts w:ascii="Sakkal Majalla" w:hAnsi="Sakkal Majalla" w:cs="Sakkal Majalla"/>
+              </w:rPr>
+            </w:pPr>
+          </w:p>
+        </w:tc>
+        <w:tc>
+          <w:tcPr>
+            <w:tcW w:w="990" w:type="dxa"/>
+          </w:tcPr>
+          <w:p>
+            <w:pPr>
+              <w:cnfStyle w:val="000000100000" w:firstRow="0" w:lastRow="0" w:firstColumn="0" w:lastColumn="0" w:oddVBand="0" w:evenVBand="0" w:oddHBand="1" w:evenHBand="0" w:firstRowFirstColumn="0" w:firstRowLastColumn="0" w:lastRowFirstColumn="0" w:lastRowLastColumn="0"/>
+              <w:rPr>
+                <w:rFonts w:ascii="Sakkal Majalla" w:hAnsi="Sakkal Majalla" w:cs="Sakkal Majalla"/>
+              </w:rPr>
+            </w:pPr>
+          </w:p>
+        </w:tc>
+      </w:tr>
+      <w:tr>
+        <w:tc>
+          <w:tcPr>
+            <w:cnfStyle w:val="001000000000" w:firstRow="0" w:lastRow="0" w:firstColumn="1" w:lastColumn="0" w:oddVBand="0" w:evenVBand="0" w:oddHBand="0" w:evenHBand="0" w:firstRowFirstColumn="0" w:firstRowLastColumn="0" w:lastRowFirstColumn="0" w:lastRowLastColumn="0"/>
+            <w:tcW w:w="810" w:type="dxa"/>
+          </w:tcPr>
+          <w:p>
+            <w:pPr>
+              <w:jc w:val="center"/>
+              <w:rPr>
+                <w:rFonts w:ascii="Sakkal Majalla" w:hAnsi="Sakkal Majalla" w:cs="Sakkal Majalla"/>
+              </w:rPr>
+            </w:pPr>
+          </w:p>
+        </w:tc>
+        <w:tc>
+          <w:tcPr>
+            <w:tcW w:w="5400" w:type="dxa"/>
+          </w:tcPr>
+          <w:p>
+            <w:pPr>
+              <w:cnfStyle w:val="000000000000" w:firstRow="0" w:lastRow="0" w:firstColumn="0" w:lastColumn="0" w:oddVBand="0" w:evenVBand="0" w:oddHBand="0" w:evenHBand="0" w:firstRowFirstColumn="0" w:firstRowLastColumn="0" w:lastRowFirstColumn="0" w:lastRowLastColumn="0"/>
+              <w:rPr>
+                <w:rFonts w:ascii="Sakkal Majalla" w:hAnsi="Sakkal Majalla" w:cs="Sakkal Majalla"/>
+              </w:rPr>
+            </w:pPr>
+          </w:p>
+        </w:tc>
+        <w:tc>
+          <w:tcPr>
+            <w:tcW w:w="4860" w:type="dxa"/>
+          </w:tcPr>
+          <w:p>
+            <w:pPr>
+              <w:jc w:val="center"/>
+              <w:cnfStyle w:val="000000000000" w:firstRow="0" w:lastRow="0" w:firstColumn="0" w:lastColumn="0" w:oddVBand="0" w:evenVBand="0" w:oddHBand="0" w:evenHBand="0" w:firstRowFirstColumn="0" w:firstRowLastColumn="0" w:lastRowFirstColumn="0" w:lastRowLastColumn="0"/>
+              <w:rPr>
+                <w:rFonts w:ascii="Sakkal Majalla" w:hAnsi="Sakkal Majalla" w:cs="Sakkal Majalla"/>
+              </w:rPr>
+            </w:pPr>
+          </w:p>
+        </w:tc>
+        <w:tc>
+          <w:tcPr>
+            <w:tcW w:w="990" w:type="dxa"/>
+          </w:tcPr>
+          <w:p>
+            <w:pPr>
+              <w:cnfStyle w:val="000000000000" w:firstRow="0" w:lastRow="0" w:firstColumn="0" w:lastColumn="0" w:oddVBand="0" w:evenVBand="0" w:oddHBand="0" w:evenHBand="0" w:firstRowFirstColumn="0" w:firstRowLastColumn="0" w:lastRowFirstColumn="0" w:lastRowLastColumn="0"/>
+              <w:rPr>
+                <w:rFonts w:ascii="Sakkal Majalla" w:hAnsi="Sakkal Majalla" w:cs="Sakkal Majalla"/>
+              </w:rPr>
+            </w:pPr>
+          </w:p>
+        </w:tc>
+      </w:tr>
+      <w:tr>
+        <w:trPr>
+          <w:cnfStyle w:val="000000100000" w:firstRow="0" w:lastRow="0" w:firstColumn="0" w:lastColumn="0" w:oddVBand="0" w:evenVBand="0" w:oddHBand="1" w:evenHBand="0" w:firstRowFirstColumn="0" w:firstRowLastColumn="0" w:lastRowFirstColumn="0" w:lastRowLastColumn="0"/>
+        </w:trPr>
+        <w:tc>
+          <w:tcPr>
+            <w:cnfStyle w:val="001000000000" w:firstRow="0" w:lastRow="0" w:firstColumn="1" w:lastColumn="0" w:oddVBand="0" w:evenVBand="0" w:oddHBand="0" w:evenHBand="0" w:firstRowFirstColumn="0" w:firstRowLastColumn="0" w:lastRowFirstColumn="0" w:lastRowLastColumn="0"/>
+            <w:tcW w:w="810" w:type="dxa"/>
+          </w:tcPr>
+          <w:p>
+            <w:pPr>
+              <w:jc w:val="center"/>
+              <w:rPr>
+                <w:rFonts w:ascii="Sakkal Majalla" w:hAnsi="Sakkal Majalla" w:cs="Sakkal Majalla"/>
+              </w:rPr>
+            </w:pPr>
+          </w:p>
+        </w:tc>
+        <w:tc>
+          <w:tcPr>
+            <w:tcW w:w="5400" w:type="dxa"/>
+          </w:tcPr>
+          <w:p>
+            <w:pPr>
+              <w:cnfStyle w:val="000000100000" w:firstRow="0" w:lastRow="0" w:firstColumn="0" w:lastColumn="0" w:oddVBand="0" w:evenVBand="0" w:oddHBand="1" w:evenHBand="0" w:firstRowFirstColumn="0" w:firstRowLastColumn="0" w:lastRowFirstColumn="0" w:lastRowLastColumn="0"/>
+              <w:rPr>
+                <w:rFonts w:ascii="Sakkal Majalla" w:hAnsi="Sakkal Majalla" w:cs="Sakkal Majalla"/>
+              </w:rPr>
+            </w:pPr>
+          </w:p>
+        </w:tc>
+        <w:tc>
+          <w:tcPr>
+            <w:tcW w:w="4860" w:type="dxa"/>
+          </w:tcPr>
+          <w:p>
+            <w:pPr>
+              <w:jc w:val="center"/>
+              <w:cnfStyle w:val="000000100000" w:firstRow="0" w:lastRow="0" w:firstColumn="0" w:lastColumn="0" w:oddVBand="0" w:evenVBand="0" w:oddHBand="1" w:evenHBand="0" w:firstRowFirstColumn="0" w:firstRowLastColumn="0" w:lastRowFirstColumn="0" w:lastRowLastColumn="0"/>
+              <w:rPr>
+                <w:rFonts w:ascii="Sakkal Majalla" w:hAnsi="Sakkal Majalla" w:cs="Sakkal Majalla"/>
+              </w:rPr>
+            </w:pPr>
+          </w:p>
+        </w:tc>
+        <w:tc>
+          <w:tcPr>
+            <w:tcW w:w="990" w:type="dxa"/>
+          </w:tcPr>
+          <w:p>
+            <w:pPr>
+              <w:cnfStyle w:val="000000100000" w:firstRow="0" w:lastRow="0" w:firstColumn="0" w:lastColumn="0" w:oddVBand="0" w:evenVBand="0" w:oddHBand="1" w:evenHBand="0" w:firstRowFirstColumn="0" w:firstRowLastColumn="0" w:lastRowFirstColumn="0" w:lastRowLastColumn="0"/>
+              <w:rPr>
+                <w:rFonts w:ascii="Sakkal Majalla" w:hAnsi="Sakkal Majalla" w:cs="Sakkal Majalla"/>
+              </w:rPr>
+            </w:pPr>
+          </w:p>
+        </w:tc>
+      </w:tr>
+    </w:tbl>
     <w:p>
       <w:pPr>
         <w:rPr>
@@ -3713,7 +5294,7 @@
     <w:tbl>
       <w:tblPr>
         <w:tblStyle w:val="GridTable1Light-Accent3"/>
-        <w:tblpPr w:leftFromText="180" w:rightFromText="180" w:horzAnchor="margin" w:tblpXSpec="center" w:tblpY="-265"/>
+        <w:tblpPr w:leftFromText="180" w:rightFromText="180" w:vertAnchor="page" w:horzAnchor="margin" w:tblpXSpec="center" w:tblpY="804"/>
         <w:tblW w:w="12060" w:type="dxa"/>
         <w:tblLook w:val="04A0" w:firstRow="1" w:lastRow="0" w:firstColumn="1" w:lastColumn="0" w:noHBand="0" w:noVBand="1"/>
       </w:tblPr>
@@ -3742,6 +5323,7 @@
               <w:rPr>
                 <w:rFonts w:ascii="Sakkal Majalla" w:hAnsi="Sakkal Majalla" w:cs="Sakkal Majalla" w:hint="cs"/>
               </w:rPr>
+              <w:lastRenderedPageBreak/>
               <w:t>Id</w:t>
             </w:r>
           </w:p>
@@ -4000,23 +5582,7 @@
                   <w:rStyle w:val="Hyperlink"/>
                   <w:rFonts w:ascii="Sakkal Majalla" w:hAnsi="Sakkal Majalla" w:cs="Sakkal Majalla" w:hint="cs"/>
                 </w:rPr>
-                <w:t xml:space="preserve">Blog for logging, </w:t>
-              </w:r>
-              <w:proofErr w:type="spellStart"/>
-              <w:r>
-                <w:rPr>
-                  <w:rStyle w:val="Hyperlink"/>
-                  <w:rFonts w:ascii="Sakkal Majalla" w:hAnsi="Sakkal Majalla" w:cs="Sakkal Majalla" w:hint="cs"/>
-                </w:rPr>
-                <w:t>OpenTelemetry</w:t>
-              </w:r>
-              <w:proofErr w:type="spellEnd"/>
-              <w:r>
-                <w:rPr>
-                  <w:rStyle w:val="Hyperlink"/>
-                  <w:rFonts w:ascii="Sakkal Majalla" w:hAnsi="Sakkal Majalla" w:cs="Sakkal Majalla" w:hint="cs"/>
-                </w:rPr>
-                <w:t>, Loki, Elasticsearch, etc.</w:t>
+                <w:t>Blog for logging, OpenTelemetry, Loki, Elasticsearch, etc.</w:t>
               </w:r>
             </w:hyperlink>
           </w:p>
@@ -4112,6 +5678,12 @@
                 <w:rFonts w:ascii="Sakkal Majalla" w:hAnsi="Sakkal Majalla" w:cs="Sakkal Majalla"/>
               </w:rPr>
             </w:pPr>
+            <w:r>
+              <w:rPr>
+                <w:rFonts w:ascii="Sakkal Majalla" w:hAnsi="Sakkal Majalla" w:cs="Sakkal Majalla"/>
+              </w:rPr>
+              <w:t>6</w:t>
+            </w:r>
           </w:p>
         </w:tc>
         <w:tc>
@@ -5469,6 +7041,7 @@
   <w:style w:type="paragraph" w:default="1" w:styleId="Normal">
     <w:name w:val="Normal"/>
     <w:qFormat/>
+    <w:rsid w:val="00111A71"/>
   </w:style>
   <w:style w:type="paragraph" w:styleId="Heading1">
     <w:name w:val="heading 1"/>
@@ -5672,7 +7245,6 @@
   <w:style w:type="character" w:default="1" w:styleId="DefaultParagraphFont">
     <w:name w:val="Default Paragraph Font"/>
     <w:uiPriority w:val="1"/>
-    <w:semiHidden/>
     <w:unhideWhenUsed/>
   </w:style>
   <w:style w:type="table" w:default="1" w:styleId="TableNormal">
@@ -6346,6 +7918,146 @@
       </w:rPr>
     </w:tblStylePr>
   </w:style>
+  <w:style w:type="table" w:styleId="GridTable6Colorful-Accent2">
+    <w:name w:val="Grid Table 6 Colorful Accent 2"/>
+    <w:basedOn w:val="TableNormal"/>
+    <w:uiPriority w:val="51"/>
+    <w:rsid w:val="00111A71"/>
+    <w:pPr>
+      <w:spacing w:after="0" w:line="240" w:lineRule="auto"/>
+    </w:pPr>
+    <w:rPr>
+      <w:color w:val="BF4E14" w:themeColor="accent2" w:themeShade="BF"/>
+    </w:rPr>
+    <w:tblPr>
+      <w:tblStyleRowBandSize w:val="1"/>
+      <w:tblStyleColBandSize w:val="1"/>
+      <w:tblBorders>
+        <w:top w:val="single" w:sz="4" w:space="0" w:color="F1A983" w:themeColor="accent2" w:themeTint="99"/>
+        <w:left w:val="single" w:sz="4" w:space="0" w:color="F1A983" w:themeColor="accent2" w:themeTint="99"/>
+        <w:bottom w:val="single" w:sz="4" w:space="0" w:color="F1A983" w:themeColor="accent2" w:themeTint="99"/>
+        <w:right w:val="single" w:sz="4" w:space="0" w:color="F1A983" w:themeColor="accent2" w:themeTint="99"/>
+        <w:insideH w:val="single" w:sz="4" w:space="0" w:color="F1A983" w:themeColor="accent2" w:themeTint="99"/>
+        <w:insideV w:val="single" w:sz="4" w:space="0" w:color="F1A983" w:themeColor="accent2" w:themeTint="99"/>
+      </w:tblBorders>
+    </w:tblPr>
+    <w:tblStylePr w:type="firstRow">
+      <w:rPr>
+        <w:b/>
+        <w:bCs/>
+      </w:rPr>
+      <w:tblPr/>
+      <w:tcPr>
+        <w:tcBorders>
+          <w:bottom w:val="single" w:sz="12" w:space="0" w:color="F1A983" w:themeColor="accent2" w:themeTint="99"/>
+        </w:tcBorders>
+      </w:tcPr>
+    </w:tblStylePr>
+    <w:tblStylePr w:type="lastRow">
+      <w:rPr>
+        <w:b/>
+        <w:bCs/>
+      </w:rPr>
+      <w:tblPr/>
+      <w:tcPr>
+        <w:tcBorders>
+          <w:top w:val="double" w:sz="4" w:space="0" w:color="F1A983" w:themeColor="accent2" w:themeTint="99"/>
+        </w:tcBorders>
+      </w:tcPr>
+    </w:tblStylePr>
+    <w:tblStylePr w:type="firstCol">
+      <w:rPr>
+        <w:b/>
+        <w:bCs/>
+      </w:rPr>
+    </w:tblStylePr>
+    <w:tblStylePr w:type="lastCol">
+      <w:rPr>
+        <w:b/>
+        <w:bCs/>
+      </w:rPr>
+    </w:tblStylePr>
+    <w:tblStylePr w:type="band1Vert">
+      <w:tblPr/>
+      <w:tcPr>
+        <w:shd w:val="clear" w:color="auto" w:fill="FAE2D5" w:themeFill="accent2" w:themeFillTint="33"/>
+      </w:tcPr>
+    </w:tblStylePr>
+    <w:tblStylePr w:type="band1Horz">
+      <w:tblPr/>
+      <w:tcPr>
+        <w:shd w:val="clear" w:color="auto" w:fill="FAE2D5" w:themeFill="accent2" w:themeFillTint="33"/>
+      </w:tcPr>
+    </w:tblStylePr>
+  </w:style>
+  <w:style w:type="character" w:styleId="CommentReference">
+    <w:name w:val="annotation reference"/>
+    <w:basedOn w:val="DefaultParagraphFont"/>
+    <w:uiPriority w:val="99"/>
+    <w:semiHidden/>
+    <w:unhideWhenUsed/>
+    <w:rsid w:val="00111A71"/>
+    <w:rPr>
+      <w:sz w:val="16"/>
+      <w:szCs w:val="16"/>
+    </w:rPr>
+  </w:style>
+  <w:style w:type="paragraph" w:styleId="CommentText">
+    <w:name w:val="annotation text"/>
+    <w:basedOn w:val="Normal"/>
+    <w:link w:val="CommentTextChar"/>
+    <w:uiPriority w:val="99"/>
+    <w:semiHidden/>
+    <w:unhideWhenUsed/>
+    <w:rsid w:val="00111A71"/>
+    <w:pPr>
+      <w:spacing w:line="240" w:lineRule="auto"/>
+    </w:pPr>
+    <w:rPr>
+      <w:sz w:val="20"/>
+      <w:szCs w:val="20"/>
+    </w:rPr>
+  </w:style>
+  <w:style w:type="character" w:customStyle="1" w:styleId="CommentTextChar">
+    <w:name w:val="Comment Text Char"/>
+    <w:basedOn w:val="DefaultParagraphFont"/>
+    <w:link w:val="CommentText"/>
+    <w:uiPriority w:val="99"/>
+    <w:semiHidden/>
+    <w:rsid w:val="00111A71"/>
+    <w:rPr>
+      <w:sz w:val="20"/>
+      <w:szCs w:val="20"/>
+    </w:rPr>
+  </w:style>
+  <w:style w:type="paragraph" w:styleId="CommentSubject">
+    <w:name w:val="annotation subject"/>
+    <w:basedOn w:val="CommentText"/>
+    <w:next w:val="CommentText"/>
+    <w:link w:val="CommentSubjectChar"/>
+    <w:uiPriority w:val="99"/>
+    <w:semiHidden/>
+    <w:unhideWhenUsed/>
+    <w:rsid w:val="00111A71"/>
+    <w:rPr>
+      <w:b/>
+      <w:bCs/>
+    </w:rPr>
+  </w:style>
+  <w:style w:type="character" w:customStyle="1" w:styleId="CommentSubjectChar">
+    <w:name w:val="Comment Subject Char"/>
+    <w:basedOn w:val="CommentTextChar"/>
+    <w:link w:val="CommentSubject"/>
+    <w:uiPriority w:val="99"/>
+    <w:semiHidden/>
+    <w:rsid w:val="00111A71"/>
+    <w:rPr>
+      <w:b/>
+      <w:bCs/>
+      <w:sz w:val="20"/>
+      <w:szCs w:val="20"/>
+    </w:rPr>
+  </w:style>
 </w:styles>
 </file>
 

</xml_diff>

<commit_message>
Organize Tables In Search File & Adding Data Engineering And Data Pipelining For Tasks Like Testing Automation And Scraping Data
</commit_message>
<xml_diff>
--- a/Search-Topics-01.docx
+++ b/Search-Topics-01.docx
@@ -1687,8 +1687,8 @@
     <w:tbl>
       <w:tblPr>
         <w:tblStyle w:val="PlainTable1"/>
+        <w:tblpPr w:leftFromText="180" w:rightFromText="180" w:vertAnchor="page" w:horzAnchor="margin" w:tblpXSpec="center" w:tblpY="223"/>
         <w:tblW w:w="12060" w:type="dxa"/>
-        <w:tblInd w:w="-1355" w:type="dxa"/>
         <w:tblLook w:val="04A0" w:firstRow="1" w:lastRow="0" w:firstColumn="1" w:lastColumn="0" w:noHBand="0" w:noVBand="1"/>
       </w:tblPr>
       <w:tblGrid>
@@ -3378,12 +3378,6 @@
                 <w:rFonts w:ascii="Sakkal Majalla" w:hAnsi="Sakkal Majalla" w:cs="Sakkal Majalla"/>
               </w:rPr>
             </w:pPr>
-            <w:r>
-              <w:rPr>
-                <w:rFonts w:ascii="Sakkal Majalla" w:hAnsi="Sakkal Majalla" w:cs="Sakkal Majalla"/>
-              </w:rPr>
-              <w:t>31</w:t>
-            </w:r>
           </w:p>
         </w:tc>
         <w:tc>
@@ -3397,32 +3391,6 @@
                 <w:rFonts w:ascii="Sakkal Majalla" w:hAnsi="Sakkal Majalla" w:cs="Sakkal Majalla"/>
               </w:rPr>
             </w:pPr>
-            <w:r>
-              <w:rPr>
-                <w:rFonts w:ascii="Sakkal Majalla" w:hAnsi="Sakkal Majalla" w:cs="Sakkal Majalla"/>
-              </w:rPr>
-              <w:t>Self-learning</w:t>
-            </w:r>
-            <w:r>
-              <w:rPr>
-                <w:rFonts w:ascii="Sakkal Majalla" w:hAnsi="Sakkal Majalla" w:cs="Sakkal Majalla"/>
-              </w:rPr>
-              <w:t xml:space="preserve"> systems</w:t>
-            </w:r>
-            <w:r>
-              <w:rPr>
-                <w:rFonts w:ascii="Sakkal Majalla" w:hAnsi="Sakkal Majalla" w:cs="Sakkal Majalla"/>
-              </w:rPr>
-              <w:t>.</w:t>
-            </w:r>
-          </w:p>
-          <w:p>
-            <w:pPr>
-              <w:cnfStyle w:val="000000000000" w:firstRow="0" w:lastRow="0" w:firstColumn="0" w:lastColumn="0" w:oddVBand="0" w:evenVBand="0" w:oddHBand="0" w:evenHBand="0" w:firstRowFirstColumn="0" w:firstRowLastColumn="0" w:lastRowFirstColumn="0" w:lastRowLastColumn="0"/>
-              <w:rPr>
-                <w:rFonts w:ascii="Sakkal Majalla" w:hAnsi="Sakkal Majalla" w:cs="Sakkal Majalla"/>
-              </w:rPr>
-            </w:pPr>
           </w:p>
         </w:tc>
         <w:tc>
@@ -3437,12 +3405,6 @@
                 <w:rFonts w:ascii="Sakkal Majalla" w:hAnsi="Sakkal Majalla" w:cs="Sakkal Majalla"/>
               </w:rPr>
             </w:pPr>
-            <w:r>
-              <w:rPr>
-                <w:rFonts w:ascii="Sakkal Majalla" w:hAnsi="Sakkal Majalla" w:cs="Sakkal Majalla"/>
-              </w:rPr>
-              <w:t>Search for systems to clean, validate, check truth, etc., of the data</w:t>
-            </w:r>
           </w:p>
         </w:tc>
         <w:tc>
@@ -3460,6 +3422,9 @@
         </w:tc>
       </w:tr>
     </w:tbl>
+    <w:p/>
+    <w:p/>
+    <w:p/>
     <w:tbl>
       <w:tblPr>
         <w:tblStyle w:val="GridTable6Colorful-Accent2"/>
@@ -3579,7 +3544,7 @@
               <w:rPr>
                 <w:rFonts w:ascii="Sakkal Majalla" w:hAnsi="Sakkal Majalla" w:cs="Sakkal Majalla"/>
               </w:rPr>
-              <w:t>32</w:t>
+              <w:t>31</w:t>
             </w:r>
           </w:p>
         </w:tc>
@@ -3598,7 +3563,7 @@
               <w:rPr>
                 <w:rFonts w:ascii="Sakkal Majalla" w:hAnsi="Sakkal Majalla" w:cs="Sakkal Majalla"/>
               </w:rPr>
-              <w:t>A complete example project structure for this B2B document testing scenario</w:t>
+              <w:t>Self-learning systems.</w:t>
             </w:r>
           </w:p>
         </w:tc>
@@ -3618,19 +3583,7 @@
               <w:rPr>
                 <w:rFonts w:ascii="Sakkal Majalla" w:hAnsi="Sakkal Majalla" w:cs="Sakkal Majalla"/>
               </w:rPr>
-              <w:t>Pytest For B2B E-Commerce Appl</w:t>
-            </w:r>
-            <w:r>
-              <w:rPr>
-                <w:rFonts w:ascii="Sakkal Majalla" w:hAnsi="Sakkal Majalla" w:cs="Sakkal Majalla"/>
-              </w:rPr>
-              <w:t>i</w:t>
-            </w:r>
-            <w:r>
-              <w:rPr>
-                <w:rFonts w:ascii="Sakkal Majalla" w:hAnsi="Sakkal Majalla" w:cs="Sakkal Majalla"/>
-              </w:rPr>
-              <w:t>cations</w:t>
+              <w:t>Search for systems that clean, validate, and verify data. Also, investigate systems that analyze users’ tone and provide feedback on their questions. Use these insights to improve and develop the data-cleaning, validation, and verification system.</w:t>
             </w:r>
           </w:p>
         </w:tc>
@@ -3661,6 +3614,12 @@
                 <w:rFonts w:ascii="Sakkal Majalla" w:hAnsi="Sakkal Majalla" w:cs="Sakkal Majalla"/>
               </w:rPr>
             </w:pPr>
+            <w:r>
+              <w:rPr>
+                <w:rFonts w:ascii="Sakkal Majalla" w:hAnsi="Sakkal Majalla" w:cs="Sakkal Majalla"/>
+              </w:rPr>
+              <w:t>32</w:t>
+            </w:r>
           </w:p>
         </w:tc>
         <w:tc>
@@ -3678,13 +3637,7 @@
               <w:rPr>
                 <w:rFonts w:ascii="Sakkal Majalla" w:hAnsi="Sakkal Majalla" w:cs="Sakkal Majalla"/>
               </w:rPr>
-              <w:t>D</w:t>
-            </w:r>
-            <w:r>
-              <w:rPr>
-                <w:rFonts w:ascii="Sakkal Majalla" w:hAnsi="Sakkal Majalla" w:cs="Sakkal Majalla"/>
-              </w:rPr>
-              <w:t>ive deeper into any specific pattern (e.g., VCR cassette management, testcontainers setup, or Great Expectations integration)</w:t>
+              <w:t>A complete example project structure for this B2B document testing scenario</w:t>
             </w:r>
           </w:p>
         </w:tc>
@@ -3704,7 +3657,7 @@
               <w:rPr>
                 <w:rFonts w:ascii="Sakkal Majalla" w:hAnsi="Sakkal Majalla" w:cs="Sakkal Majalla"/>
               </w:rPr>
-              <w:t>Pytest with Automation Packages and tools</w:t>
+              <w:t>Pytest For B2B E-Commerce Applications</w:t>
             </w:r>
           </w:p>
         </w:tc>
@@ -3738,6 +3691,12 @@
                 <w:rFonts w:ascii="Sakkal Majalla" w:hAnsi="Sakkal Majalla" w:cs="Sakkal Majalla"/>
               </w:rPr>
             </w:pPr>
+            <w:r>
+              <w:rPr>
+                <w:rFonts w:ascii="Sakkal Majalla" w:hAnsi="Sakkal Majalla" w:cs="Sakkal Majalla"/>
+              </w:rPr>
+              <w:t>33</w:t>
+            </w:r>
           </w:p>
         </w:tc>
         <w:tc>
@@ -3751,6 +3710,18 @@
                 <w:rFonts w:ascii="Sakkal Majalla" w:hAnsi="Sakkal Majalla" w:cs="Sakkal Majalla"/>
               </w:rPr>
             </w:pPr>
+            <w:r>
+              <w:rPr>
+                <w:rFonts w:ascii="Sakkal Majalla" w:hAnsi="Sakkal Majalla" w:cs="Sakkal Majalla"/>
+              </w:rPr>
+              <w:t>D</w:t>
+            </w:r>
+            <w:r>
+              <w:rPr>
+                <w:rFonts w:ascii="Sakkal Majalla" w:hAnsi="Sakkal Majalla" w:cs="Sakkal Majalla"/>
+              </w:rPr>
+              <w:t>ive deeper into any specific pattern (e.g., VCR cassette management, testcontainers setup, or Great Expectations integration)</w:t>
+            </w:r>
           </w:p>
         </w:tc>
         <w:tc>
@@ -3765,6 +3736,12 @@
                 <w:rFonts w:ascii="Sakkal Majalla" w:hAnsi="Sakkal Majalla" w:cs="Sakkal Majalla"/>
               </w:rPr>
             </w:pPr>
+            <w:r>
+              <w:rPr>
+                <w:rFonts w:ascii="Sakkal Majalla" w:hAnsi="Sakkal Majalla" w:cs="Sakkal Majalla"/>
+              </w:rPr>
+              <w:t>Pytest with Automation Packages and tools</w:t>
+            </w:r>
           </w:p>
         </w:tc>
         <w:tc>
@@ -3794,6 +3771,12 @@
                 <w:rFonts w:ascii="Sakkal Majalla" w:hAnsi="Sakkal Majalla" w:cs="Sakkal Majalla"/>
               </w:rPr>
             </w:pPr>
+            <w:r>
+              <w:rPr>
+                <w:rFonts w:ascii="Sakkal Majalla" w:hAnsi="Sakkal Majalla" w:cs="Sakkal Majalla"/>
+              </w:rPr>
+              <w:t>34</w:t>
+            </w:r>
           </w:p>
         </w:tc>
         <w:tc>
@@ -3807,6 +3790,18 @@
                 <w:rFonts w:ascii="Sakkal Majalla" w:hAnsi="Sakkal Majalla" w:cs="Sakkal Majalla"/>
               </w:rPr>
             </w:pPr>
+            <w:r>
+              <w:rPr>
+                <w:rFonts w:ascii="Sakkal Majalla" w:hAnsi="Sakkal Majalla" w:cs="Sakkal Majalla"/>
+              </w:rPr>
+              <w:t>Guidance</w:t>
+            </w:r>
+            <w:r>
+              <w:rPr>
+                <w:rFonts w:ascii="Sakkal Majalla" w:hAnsi="Sakkal Majalla" w:cs="Sakkal Majalla"/>
+              </w:rPr>
+              <w:t xml:space="preserve"> on selecting between orchestration tools (Prefect vs Dagster vs Airflow)</w:t>
+            </w:r>
           </w:p>
         </w:tc>
         <w:tc>
@@ -5269,6 +5264,62 @@
           <w:p>
             <w:pPr>
               <w:cnfStyle w:val="000000100000" w:firstRow="0" w:lastRow="0" w:firstColumn="0" w:lastColumn="0" w:oddVBand="0" w:evenVBand="0" w:oddHBand="1" w:evenHBand="0" w:firstRowFirstColumn="0" w:firstRowLastColumn="0" w:lastRowFirstColumn="0" w:lastRowLastColumn="0"/>
+              <w:rPr>
+                <w:rFonts w:ascii="Sakkal Majalla" w:hAnsi="Sakkal Majalla" w:cs="Sakkal Majalla"/>
+              </w:rPr>
+            </w:pPr>
+          </w:p>
+        </w:tc>
+      </w:tr>
+      <w:tr>
+        <w:tc>
+          <w:tcPr>
+            <w:cnfStyle w:val="001000000000" w:firstRow="0" w:lastRow="0" w:firstColumn="1" w:lastColumn="0" w:oddVBand="0" w:evenVBand="0" w:oddHBand="0" w:evenHBand="0" w:firstRowFirstColumn="0" w:firstRowLastColumn="0" w:lastRowFirstColumn="0" w:lastRowLastColumn="0"/>
+            <w:tcW w:w="810" w:type="dxa"/>
+          </w:tcPr>
+          <w:p>
+            <w:pPr>
+              <w:jc w:val="center"/>
+              <w:rPr>
+                <w:rFonts w:ascii="Sakkal Majalla" w:hAnsi="Sakkal Majalla" w:cs="Sakkal Majalla"/>
+              </w:rPr>
+            </w:pPr>
+          </w:p>
+        </w:tc>
+        <w:tc>
+          <w:tcPr>
+            <w:tcW w:w="5400" w:type="dxa"/>
+          </w:tcPr>
+          <w:p>
+            <w:pPr>
+              <w:cnfStyle w:val="000000000000" w:firstRow="0" w:lastRow="0" w:firstColumn="0" w:lastColumn="0" w:oddVBand="0" w:evenVBand="0" w:oddHBand="0" w:evenHBand="0" w:firstRowFirstColumn="0" w:firstRowLastColumn="0" w:lastRowFirstColumn="0" w:lastRowLastColumn="0"/>
+              <w:rPr>
+                <w:rFonts w:ascii="Sakkal Majalla" w:hAnsi="Sakkal Majalla" w:cs="Sakkal Majalla"/>
+              </w:rPr>
+            </w:pPr>
+          </w:p>
+        </w:tc>
+        <w:tc>
+          <w:tcPr>
+            <w:tcW w:w="4860" w:type="dxa"/>
+          </w:tcPr>
+          <w:p>
+            <w:pPr>
+              <w:jc w:val="center"/>
+              <w:cnfStyle w:val="000000000000" w:firstRow="0" w:lastRow="0" w:firstColumn="0" w:lastColumn="0" w:oddVBand="0" w:evenVBand="0" w:oddHBand="0" w:evenHBand="0" w:firstRowFirstColumn="0" w:firstRowLastColumn="0" w:lastRowFirstColumn="0" w:lastRowLastColumn="0"/>
+              <w:rPr>
+                <w:rFonts w:ascii="Sakkal Majalla" w:hAnsi="Sakkal Majalla" w:cs="Sakkal Majalla"/>
+              </w:rPr>
+            </w:pPr>
+          </w:p>
+        </w:tc>
+        <w:tc>
+          <w:tcPr>
+            <w:tcW w:w="990" w:type="dxa"/>
+          </w:tcPr>
+          <w:p>
+            <w:pPr>
+              <w:cnfStyle w:val="000000000000" w:firstRow="0" w:lastRow="0" w:firstColumn="0" w:lastColumn="0" w:oddVBand="0" w:evenVBand="0" w:oddHBand="0" w:evenHBand="0" w:firstRowFirstColumn="0" w:firstRowLastColumn="0" w:lastRowFirstColumn="0" w:lastRowLastColumn="0"/>
               <w:rPr>
                 <w:rFonts w:ascii="Sakkal Majalla" w:hAnsi="Sakkal Majalla" w:cs="Sakkal Majalla"/>
               </w:rPr>
@@ -5323,7 +5374,6 @@
               <w:rPr>
                 <w:rFonts w:ascii="Sakkal Majalla" w:hAnsi="Sakkal Majalla" w:cs="Sakkal Majalla" w:hint="cs"/>
               </w:rPr>
-              <w:lastRenderedPageBreak/>
               <w:t>Id</w:t>
             </w:r>
           </w:p>

</xml_diff>

<commit_message>
Adding Search Notes & Articles
</commit_message>
<xml_diff>
--- a/Search-Topics-01.docx
+++ b/Search-Topics-01.docx
@@ -1503,7 +1503,21 @@
               <w:rPr>
                 <w:rFonts w:ascii="Sakkal Majalla" w:hAnsi="Sakkal Majalla" w:cs="Sakkal Majalla" w:hint="cs"/>
               </w:rPr>
-              <w:t>Network Latency Simulation: Use tools like tc (Linux) or Network Link Conditioner (macOS) to simulate slow networks if testing mobile-first apps (relevant if you later combine with Flutter frontend testing).</w:t>
+              <w:t xml:space="preserve">Network Latency Simulation: Use tools like </w:t>
+            </w:r>
+            <w:proofErr w:type="spellStart"/>
+            <w:r>
+              <w:rPr>
+                <w:rFonts w:ascii="Sakkal Majalla" w:hAnsi="Sakkal Majalla" w:cs="Sakkal Majalla" w:hint="cs"/>
+              </w:rPr>
+              <w:t>tc</w:t>
+            </w:r>
+            <w:proofErr w:type="spellEnd"/>
+            <w:r>
+              <w:rPr>
+                <w:rFonts w:ascii="Sakkal Majalla" w:hAnsi="Sakkal Majalla" w:cs="Sakkal Majalla" w:hint="cs"/>
+              </w:rPr>
+              <w:t xml:space="preserve"> (Linux) or Network Link Conditioner (macOS) to simulate slow networks if testing mobile-first apps (relevant if you later combine with Flutter frontend testing).</w:t>
             </w:r>
           </w:p>
         </w:tc>
@@ -1841,7 +1855,21 @@
               <w:rPr>
                 <w:rFonts w:ascii="Sakkal Majalla" w:hAnsi="Sakkal Majalla" w:cs="Sakkal Majalla" w:hint="cs"/>
               </w:rPr>
-              <w:t>For global SaaS, run tests from multiple regions (AWS us-east, eu-west, ap-south).</w:t>
+              <w:t xml:space="preserve">For global SaaS, run tests from multiple regions (AWS us-east, </w:t>
+            </w:r>
+            <w:proofErr w:type="spellStart"/>
+            <w:r>
+              <w:rPr>
+                <w:rFonts w:ascii="Sakkal Majalla" w:hAnsi="Sakkal Majalla" w:cs="Sakkal Majalla" w:hint="cs"/>
+              </w:rPr>
+              <w:t>eu</w:t>
+            </w:r>
+            <w:proofErr w:type="spellEnd"/>
+            <w:r>
+              <w:rPr>
+                <w:rFonts w:ascii="Sakkal Majalla" w:hAnsi="Sakkal Majalla" w:cs="Sakkal Majalla" w:hint="cs"/>
+              </w:rPr>
+              <w:t>-west, ap-south).</w:t>
             </w:r>
           </w:p>
           <w:p>
@@ -2238,7 +2266,21 @@
               <w:rPr>
                 <w:rFonts w:ascii="Sakkal Majalla" w:hAnsi="Sakkal Majalla" w:cs="Sakkal Majalla" w:hint="cs"/>
               </w:rPr>
-              <w:t>Profile Before Optimizing: Never guess bottlenecks. Use profilers (cProfile for Python, async-profiler for Java) during load tests to pinpoint exact lines of code causing delays.</w:t>
+              <w:t>Profile Before Optimizing: Never guess bottlenecks. Use profilers (</w:t>
+            </w:r>
+            <w:proofErr w:type="spellStart"/>
+            <w:r>
+              <w:rPr>
+                <w:rFonts w:ascii="Sakkal Majalla" w:hAnsi="Sakkal Majalla" w:cs="Sakkal Majalla" w:hint="cs"/>
+              </w:rPr>
+              <w:t>cProfile</w:t>
+            </w:r>
+            <w:proofErr w:type="spellEnd"/>
+            <w:r>
+              <w:rPr>
+                <w:rFonts w:ascii="Sakkal Majalla" w:hAnsi="Sakkal Majalla" w:cs="Sakkal Majalla" w:hint="cs"/>
+              </w:rPr>
+              <w:t xml:space="preserve"> for Python, async-profiler for Java) during load tests to pinpoint exact lines of code causing delays.</w:t>
             </w:r>
           </w:p>
         </w:tc>
@@ -2926,7 +2968,21 @@
               <w:rPr>
                 <w:rFonts w:ascii="Sakkal Majalla" w:hAnsi="Sakkal Majalla" w:cs="Sakkal Majalla" w:hint="cs"/>
               </w:rPr>
-              <w:t>Elasticsearch for geotemporal data.</w:t>
+              <w:t xml:space="preserve">Elasticsearch for </w:t>
+            </w:r>
+            <w:proofErr w:type="spellStart"/>
+            <w:r>
+              <w:rPr>
+                <w:rFonts w:ascii="Sakkal Majalla" w:hAnsi="Sakkal Majalla" w:cs="Sakkal Majalla" w:hint="cs"/>
+              </w:rPr>
+              <w:t>geotemporal</w:t>
+            </w:r>
+            <w:proofErr w:type="spellEnd"/>
+            <w:r>
+              <w:rPr>
+                <w:rFonts w:ascii="Sakkal Majalla" w:hAnsi="Sakkal Majalla" w:cs="Sakkal Majalla" w:hint="cs"/>
+              </w:rPr>
+              <w:t xml:space="preserve"> data.</w:t>
             </w:r>
           </w:p>
         </w:tc>
@@ -3029,12 +3085,21 @@
               </w:rPr>
             </w:pPr>
             <w:hyperlink r:id="rId15" w:history="1">
+              <w:proofErr w:type="spellStart"/>
               <w:r>
                 <w:rPr>
                   <w:rStyle w:val="Hyperlink"/>
                   <w:rFonts w:ascii="Sakkal Majalla" w:hAnsi="Sakkal Majalla" w:cs="Sakkal Majalla" w:hint="cs"/>
                 </w:rPr>
-                <w:t>Zenrows Scrapy Splash</w:t>
+                <w:t>Zenrows</w:t>
+              </w:r>
+              <w:proofErr w:type="spellEnd"/>
+              <w:r>
+                <w:rPr>
+                  <w:rStyle w:val="Hyperlink"/>
+                  <w:rFonts w:ascii="Sakkal Majalla" w:hAnsi="Sakkal Majalla" w:cs="Sakkal Majalla" w:hint="cs"/>
+                </w:rPr>
+                <w:t xml:space="preserve"> Scrapy Splash</w:t>
               </w:r>
             </w:hyperlink>
           </w:p>
@@ -3365,63 +3430,8 @@
           </w:p>
         </w:tc>
       </w:tr>
-      <w:tr>
-        <w:tc>
-          <w:tcPr>
-            <w:cnfStyle w:val="001000000000" w:firstRow="0" w:lastRow="0" w:firstColumn="1" w:lastColumn="0" w:oddVBand="0" w:evenVBand="0" w:oddHBand="0" w:evenHBand="0" w:firstRowFirstColumn="0" w:firstRowLastColumn="0" w:lastRowFirstColumn="0" w:lastRowLastColumn="0"/>
-            <w:tcW w:w="810" w:type="dxa"/>
-          </w:tcPr>
-          <w:p>
-            <w:pPr>
-              <w:jc w:val="center"/>
-              <w:rPr>
-                <w:rFonts w:ascii="Sakkal Majalla" w:hAnsi="Sakkal Majalla" w:cs="Sakkal Majalla"/>
-              </w:rPr>
-            </w:pPr>
-          </w:p>
-        </w:tc>
-        <w:tc>
-          <w:tcPr>
-            <w:tcW w:w="5400" w:type="dxa"/>
-          </w:tcPr>
-          <w:p>
-            <w:pPr>
-              <w:cnfStyle w:val="000000000000" w:firstRow="0" w:lastRow="0" w:firstColumn="0" w:lastColumn="0" w:oddVBand="0" w:evenVBand="0" w:oddHBand="0" w:evenHBand="0" w:firstRowFirstColumn="0" w:firstRowLastColumn="0" w:lastRowFirstColumn="0" w:lastRowLastColumn="0"/>
-              <w:rPr>
-                <w:rFonts w:ascii="Sakkal Majalla" w:hAnsi="Sakkal Majalla" w:cs="Sakkal Majalla"/>
-              </w:rPr>
-            </w:pPr>
-          </w:p>
-        </w:tc>
-        <w:tc>
-          <w:tcPr>
-            <w:tcW w:w="4860" w:type="dxa"/>
-          </w:tcPr>
-          <w:p>
-            <w:pPr>
-              <w:jc w:val="center"/>
-              <w:cnfStyle w:val="000000000000" w:firstRow="0" w:lastRow="0" w:firstColumn="0" w:lastColumn="0" w:oddVBand="0" w:evenVBand="0" w:oddHBand="0" w:evenHBand="0" w:firstRowFirstColumn="0" w:firstRowLastColumn="0" w:lastRowFirstColumn="0" w:lastRowLastColumn="0"/>
-              <w:rPr>
-                <w:rFonts w:ascii="Sakkal Majalla" w:hAnsi="Sakkal Majalla" w:cs="Sakkal Majalla"/>
-              </w:rPr>
-            </w:pPr>
-          </w:p>
-        </w:tc>
-        <w:tc>
-          <w:tcPr>
-            <w:tcW w:w="990" w:type="dxa"/>
-          </w:tcPr>
-          <w:p>
-            <w:pPr>
-              <w:cnfStyle w:val="000000000000" w:firstRow="0" w:lastRow="0" w:firstColumn="0" w:lastColumn="0" w:oddVBand="0" w:evenVBand="0" w:oddHBand="0" w:evenHBand="0" w:firstRowFirstColumn="0" w:firstRowLastColumn="0" w:lastRowFirstColumn="0" w:lastRowLastColumn="0"/>
-              <w:rPr>
-                <w:rFonts w:ascii="Sakkal Majalla" w:hAnsi="Sakkal Majalla" w:cs="Sakkal Majalla"/>
-              </w:rPr>
-            </w:pPr>
-          </w:p>
-        </w:tc>
-      </w:tr>
     </w:tbl>
+    <w:p/>
     <w:p/>
     <w:p/>
     <w:p/>
@@ -3653,11 +3663,19 @@
                 <w:rFonts w:ascii="Sakkal Majalla" w:hAnsi="Sakkal Majalla" w:cs="Sakkal Majalla"/>
               </w:rPr>
             </w:pPr>
-            <w:r>
-              <w:rPr>
-                <w:rFonts w:ascii="Sakkal Majalla" w:hAnsi="Sakkal Majalla" w:cs="Sakkal Majalla"/>
-              </w:rPr>
-              <w:t>Pytest For B2B E-Commerce Applications</w:t>
+            <w:proofErr w:type="spellStart"/>
+            <w:r>
+              <w:rPr>
+                <w:rFonts w:ascii="Sakkal Majalla" w:hAnsi="Sakkal Majalla" w:cs="Sakkal Majalla"/>
+              </w:rPr>
+              <w:t>Pytest</w:t>
+            </w:r>
+            <w:proofErr w:type="spellEnd"/>
+            <w:r>
+              <w:rPr>
+                <w:rFonts w:ascii="Sakkal Majalla" w:hAnsi="Sakkal Majalla" w:cs="Sakkal Majalla"/>
+              </w:rPr>
+              <w:t xml:space="preserve"> For B2B E-Commerce Applications</w:t>
             </w:r>
           </w:p>
         </w:tc>
@@ -3720,7 +3738,21 @@
               <w:rPr>
                 <w:rFonts w:ascii="Sakkal Majalla" w:hAnsi="Sakkal Majalla" w:cs="Sakkal Majalla"/>
               </w:rPr>
-              <w:t>ive deeper into any specific pattern (e.g., VCR cassette management, testcontainers setup, or Great Expectations integration)</w:t>
+              <w:t xml:space="preserve">ive deeper into any specific pattern (e.g., VCR cassette management, </w:t>
+            </w:r>
+            <w:proofErr w:type="spellStart"/>
+            <w:r>
+              <w:rPr>
+                <w:rFonts w:ascii="Sakkal Majalla" w:hAnsi="Sakkal Majalla" w:cs="Sakkal Majalla"/>
+              </w:rPr>
+              <w:t>testcontainers</w:t>
+            </w:r>
+            <w:proofErr w:type="spellEnd"/>
+            <w:r>
+              <w:rPr>
+                <w:rFonts w:ascii="Sakkal Majalla" w:hAnsi="Sakkal Majalla" w:cs="Sakkal Majalla"/>
+              </w:rPr>
+              <w:t xml:space="preserve"> setup, or Great Expectations integration)</w:t>
             </w:r>
           </w:p>
         </w:tc>
@@ -3736,11 +3768,19 @@
                 <w:rFonts w:ascii="Sakkal Majalla" w:hAnsi="Sakkal Majalla" w:cs="Sakkal Majalla"/>
               </w:rPr>
             </w:pPr>
-            <w:r>
-              <w:rPr>
-                <w:rFonts w:ascii="Sakkal Majalla" w:hAnsi="Sakkal Majalla" w:cs="Sakkal Majalla"/>
-              </w:rPr>
-              <w:t>Pytest with Automation Packages and tools</w:t>
+            <w:proofErr w:type="spellStart"/>
+            <w:r>
+              <w:rPr>
+                <w:rFonts w:ascii="Sakkal Majalla" w:hAnsi="Sakkal Majalla" w:cs="Sakkal Majalla"/>
+              </w:rPr>
+              <w:t>Pytest</w:t>
+            </w:r>
+            <w:proofErr w:type="spellEnd"/>
+            <w:r>
+              <w:rPr>
+                <w:rFonts w:ascii="Sakkal Majalla" w:hAnsi="Sakkal Majalla" w:cs="Sakkal Majalla"/>
+              </w:rPr>
+              <w:t xml:space="preserve"> with Automation Packages and tools</w:t>
             </w:r>
           </w:p>
         </w:tc>
@@ -3800,7 +3840,21 @@
               <w:rPr>
                 <w:rFonts w:ascii="Sakkal Majalla" w:hAnsi="Sakkal Majalla" w:cs="Sakkal Majalla"/>
               </w:rPr>
-              <w:t xml:space="preserve"> on selecting between orchestration tools (Prefect vs Dagster vs Airflow)</w:t>
+              <w:t xml:space="preserve"> on selecting between orchestration tools (Prefect vs </w:t>
+            </w:r>
+            <w:proofErr w:type="spellStart"/>
+            <w:r>
+              <w:rPr>
+                <w:rFonts w:ascii="Sakkal Majalla" w:hAnsi="Sakkal Majalla" w:cs="Sakkal Majalla"/>
+              </w:rPr>
+              <w:t>Dagster</w:t>
+            </w:r>
+            <w:proofErr w:type="spellEnd"/>
+            <w:r>
+              <w:rPr>
+                <w:rFonts w:ascii="Sakkal Majalla" w:hAnsi="Sakkal Majalla" w:cs="Sakkal Majalla"/>
+              </w:rPr>
+              <w:t xml:space="preserve"> vs Airflow)</w:t>
             </w:r>
           </w:p>
         </w:tc>
@@ -3848,6 +3902,12 @@
                 <w:rFonts w:ascii="Sakkal Majalla" w:hAnsi="Sakkal Majalla" w:cs="Sakkal Majalla"/>
               </w:rPr>
             </w:pPr>
+            <w:r>
+              <w:rPr>
+                <w:rFonts w:ascii="Sakkal Majalla" w:hAnsi="Sakkal Majalla" w:cs="Sakkal Majalla"/>
+              </w:rPr>
+              <w:t>35</w:t>
+            </w:r>
           </w:p>
         </w:tc>
         <w:tc>
@@ -3861,6 +3921,12 @@
                 <w:rFonts w:ascii="Sakkal Majalla" w:hAnsi="Sakkal Majalla" w:cs="Sakkal Majalla"/>
               </w:rPr>
             </w:pPr>
+            <w:r>
+              <w:rPr>
+                <w:rFonts w:ascii="Sakkal Majalla" w:hAnsi="Sakkal Majalla" w:cs="Sakkal Majalla"/>
+              </w:rPr>
+              <w:t>Scraping sites with infinite scrolling</w:t>
+            </w:r>
           </w:p>
         </w:tc>
         <w:tc>
@@ -5632,7 +5698,23 @@
                   <w:rStyle w:val="Hyperlink"/>
                   <w:rFonts w:ascii="Sakkal Majalla" w:hAnsi="Sakkal Majalla" w:cs="Sakkal Majalla" w:hint="cs"/>
                 </w:rPr>
-                <w:t>Blog for logging, OpenTelemetry, Loki, Elasticsearch, etc.</w:t>
+                <w:t xml:space="preserve">Blog for logging, </w:t>
+              </w:r>
+              <w:proofErr w:type="spellStart"/>
+              <w:r>
+                <w:rPr>
+                  <w:rStyle w:val="Hyperlink"/>
+                  <w:rFonts w:ascii="Sakkal Majalla" w:hAnsi="Sakkal Majalla" w:cs="Sakkal Majalla" w:hint="cs"/>
+                </w:rPr>
+                <w:t>OpenTelemetry</w:t>
+              </w:r>
+              <w:proofErr w:type="spellEnd"/>
+              <w:r>
+                <w:rPr>
+                  <w:rStyle w:val="Hyperlink"/>
+                  <w:rFonts w:ascii="Sakkal Majalla" w:hAnsi="Sakkal Majalla" w:cs="Sakkal Majalla" w:hint="cs"/>
+                </w:rPr>
+                <w:t>, Loki, Elasticsearch, etc.</w:t>
               </w:r>
             </w:hyperlink>
           </w:p>
@@ -5757,6 +5839,120 @@
                 <w:t>https://www.scraping.club/</w:t>
               </w:r>
             </w:hyperlink>
+          </w:p>
+        </w:tc>
+        <w:tc>
+          <w:tcPr>
+            <w:tcW w:w="3155" w:type="dxa"/>
+          </w:tcPr>
+          <w:p>
+            <w:pPr>
+              <w:cnfStyle w:val="000000000000" w:firstRow="0" w:lastRow="0" w:firstColumn="0" w:lastColumn="0" w:oddVBand="0" w:evenVBand="0" w:oddHBand="0" w:evenHBand="0" w:firstRowFirstColumn="0" w:firstRowLastColumn="0" w:lastRowFirstColumn="0" w:lastRowLastColumn="0"/>
+              <w:rPr>
+                <w:rFonts w:ascii="Sakkal Majalla" w:hAnsi="Sakkal Majalla" w:cs="Sakkal Majalla"/>
+              </w:rPr>
+            </w:pPr>
+          </w:p>
+        </w:tc>
+      </w:tr>
+      <w:tr>
+        <w:tc>
+          <w:tcPr>
+            <w:cnfStyle w:val="001000000000" w:firstRow="0" w:lastRow="0" w:firstColumn="1" w:lastColumn="0" w:oddVBand="0" w:evenVBand="0" w:oddHBand="0" w:evenHBand="0" w:firstRowFirstColumn="0" w:firstRowLastColumn="0" w:lastRowFirstColumn="0" w:lastRowLastColumn="0"/>
+            <w:tcW w:w="1170" w:type="dxa"/>
+          </w:tcPr>
+          <w:p>
+            <w:pPr>
+              <w:jc w:val="center"/>
+              <w:rPr>
+                <w:rFonts w:ascii="Sakkal Majalla" w:hAnsi="Sakkal Majalla" w:cs="Sakkal Majalla"/>
+              </w:rPr>
+            </w:pPr>
+            <w:r>
+              <w:rPr>
+                <w:rFonts w:ascii="Sakkal Majalla" w:hAnsi="Sakkal Majalla" w:cs="Sakkal Majalla"/>
+              </w:rPr>
+              <w:t>7</w:t>
+            </w:r>
+          </w:p>
+        </w:tc>
+        <w:tc>
+          <w:tcPr>
+            <w:tcW w:w="7735" w:type="dxa"/>
+          </w:tcPr>
+          <w:p>
+            <w:pPr>
+              <w:jc w:val="center"/>
+              <w:cnfStyle w:val="000000000000" w:firstRow="0" w:lastRow="0" w:firstColumn="0" w:lastColumn="0" w:oddVBand="0" w:evenVBand="0" w:oddHBand="0" w:evenHBand="0" w:firstRowFirstColumn="0" w:firstRowLastColumn="0" w:lastRowFirstColumn="0" w:lastRowLastColumn="0"/>
+            </w:pPr>
+            <w:hyperlink r:id="rId22" w:history="1">
+              <w:r>
+                <w:rPr>
+                  <w:rStyle w:val="Hyperlink"/>
+                </w:rPr>
+                <w:t>https://substack.thewebscraping.club/t/wsf0th</w:t>
+              </w:r>
+            </w:hyperlink>
+            <w:r>
+              <w:t xml:space="preserve"> </w:t>
+            </w:r>
+          </w:p>
+        </w:tc>
+        <w:tc>
+          <w:tcPr>
+            <w:tcW w:w="3155" w:type="dxa"/>
+          </w:tcPr>
+          <w:p>
+            <w:pPr>
+              <w:cnfStyle w:val="000000000000" w:firstRow="0" w:lastRow="0" w:firstColumn="0" w:lastColumn="0" w:oddVBand="0" w:evenVBand="0" w:oddHBand="0" w:evenHBand="0" w:firstRowFirstColumn="0" w:firstRowLastColumn="0" w:lastRowFirstColumn="0" w:lastRowLastColumn="0"/>
+              <w:rPr>
+                <w:rFonts w:ascii="Sakkal Majalla" w:hAnsi="Sakkal Majalla" w:cs="Sakkal Majalla"/>
+              </w:rPr>
+            </w:pPr>
+          </w:p>
+        </w:tc>
+      </w:tr>
+      <w:tr>
+        <w:tc>
+          <w:tcPr>
+            <w:cnfStyle w:val="001000000000" w:firstRow="0" w:lastRow="0" w:firstColumn="1" w:lastColumn="0" w:oddVBand="0" w:evenVBand="0" w:oddHBand="0" w:evenHBand="0" w:firstRowFirstColumn="0" w:firstRowLastColumn="0" w:lastRowFirstColumn="0" w:lastRowLastColumn="0"/>
+            <w:tcW w:w="1170" w:type="dxa"/>
+          </w:tcPr>
+          <w:p>
+            <w:pPr>
+              <w:jc w:val="center"/>
+              <w:rPr>
+                <w:rFonts w:ascii="Sakkal Majalla" w:hAnsi="Sakkal Majalla" w:cs="Sakkal Majalla"/>
+              </w:rPr>
+            </w:pPr>
+            <w:r>
+              <w:rPr>
+                <w:rFonts w:ascii="Sakkal Majalla" w:hAnsi="Sakkal Majalla" w:cs="Sakkal Majalla"/>
+              </w:rPr>
+              <w:t>8</w:t>
+            </w:r>
+          </w:p>
+        </w:tc>
+        <w:tc>
+          <w:tcPr>
+            <w:tcW w:w="7735" w:type="dxa"/>
+          </w:tcPr>
+          <w:p>
+            <w:pPr>
+              <w:jc w:val="center"/>
+              <w:cnfStyle w:val="000000000000" w:firstRow="0" w:lastRow="0" w:firstColumn="0" w:lastColumn="0" w:oddVBand="0" w:evenVBand="0" w:oddHBand="0" w:evenHBand="0" w:firstRowFirstColumn="0" w:firstRowLastColumn="0" w:lastRowFirstColumn="0" w:lastRowLastColumn="0"/>
+            </w:pPr>
+            <w:hyperlink r:id="rId23" w:history="1">
+              <w:r>
+                <w:rPr>
+                  <w:rStyle w:val="Hyperlink"/>
+                </w:rPr>
+                <w:t>https://www.scraping.club/t/the-lab</w:t>
+              </w:r>
+            </w:hyperlink>
+            <w:r>
+              <w:t xml:space="preserve"> </w:t>
+            </w:r>
           </w:p>
         </w:tc>
         <w:tc>
@@ -7295,6 +7491,7 @@
   <w:style w:type="character" w:default="1" w:styleId="DefaultParagraphFont">
     <w:name w:val="Default Paragraph Font"/>
     <w:uiPriority w:val="1"/>
+    <w:semiHidden/>
     <w:unhideWhenUsed/>
   </w:style>
   <w:style w:type="table" w:default="1" w:styleId="TableNormal">

</xml_diff>